<commit_message>
feat: update Mang Phat trien Dang roles (12 TV kiem tra ho so Dang & cam tinh Doan, 7 TV backup truc ban nhan ban cung)
</commit_message>
<xml_diff>
--- a/De_An_Tai_Cau_Truc_Ban_TCKT_Doan_Vu.docx
+++ b/De_An_Tai_Cau_Truc_Ban_TCKT_Doan_Vu.docx
@@ -684,9 +684,9 @@
             <w:r>
               <w:t>• 01 Trưởng mảng &amp; 01 Phó mảng</w:t>
               <w:br/>
-              <w:t>• 12 Thành viên (Chia 6 Cặp bài trùng phụ trách 12 đơn vị cơ sở)</w:t>
+              <w:t>• 12 Thành viên (Chia 6 Cặp bài trùng phụ trách 12 đơn vị cơ sở) kiểm tra hồ sơ Đảng &amp; lớp cảm tình Đoàn</w:t>
               <w:br/>
-              <w:t>• 07 Thành viên chuyên trách thẩm tra lý lịch &amp; hồ sơ Đảng</w:t>
+              <w:t>• 07 Thành viên còn lại: Không trực tiếp phụ trách 12 đơn vị cơ sở mà là backup, luân phiên trực ban cho các bạn còn lại để có thể linh hoạt tiếp nhận hồ sơ bản cứng của các đơn vị lên nộp</w:t>
             </w:r>
           </w:p>
         </w:tc>
@@ -859,7 +859,7 @@
         <w:rPr>
           <w:sz w:val="23"/>
         </w:rPr>
-        <w:t>Nhiệm vụ thường xuyên:</w:t>
+        <w:t>Phân công và nhiệm vụ tác nghiệp:</w:t>
       </w:r>
     </w:p>
     <w:p>
@@ -871,7 +871,7 @@
         <w:rPr>
           <w:sz w:val="23"/>
         </w:rPr>
-        <w:t>- Công tác Kết nạp Đoàn: Theo dõi chỉ tiêu; hướng dẫn cơ sở mở lớp cảm tình Đoàn; kiểm tra hồ sơ kết nạp Đoàn viên mới (NQ kết nạp, Sổ đoàn viên, Thẻ đoàn) trước khi trình VP Đoàn ký duyệt và cấp phát.</w:t>
+        <w:t>- 12 Thành viên phụ trách cơ sở (Chia 6 Cặp bài trùng): Trực tiếp kiểm tra hồ sơ Đảng, danh sách ĐVƯT, chỉ tiêu và lớp cảm tình Đoàn của 12 đơn vị cơ sở.</w:t>
       </w:r>
     </w:p>
     <w:p>
@@ -883,7 +883,7 @@
         <w:rPr>
           <w:sz w:val="23"/>
         </w:rPr>
-        <w:t>- Công tác Phát triển Đảng: Quản lý danh sách Cảm tình Đảng, ĐVƯT; thu thập, kiểm tra hồ sơ phát triển Đảng, thẩm tra lý lịch đoàn viên.</w:t>
+        <w:t>- 07 Thành viên còn lại: Không trực tiếp phụ trách 12 đơn vị cơ sở mà đóng vai trò là lực lượng backup, luân phiên trực ban cho các bạn còn lại để có thể linh hoạt tiếp nhận hồ sơ bản cứng của các đơn vị lên nộp tại văn phòng/bàn trực.</w:t>
       </w:r>
     </w:p>
     <w:p>
@@ -895,7 +895,7 @@
         <w:rPr>
           <w:sz w:val="23"/>
         </w:rPr>
-        <w:t>- Đối chiếu số liệu: Đối chiếu hồ sơ bản cứng với Hệ thống Hồ sơ Đảng trước khi nộp lên Văn phòng Đoàn.</w:t>
+        <w:t>- Đối chiếu số liệu: Thẩm định hồ sơ bản cứng, đối soát với Hệ thống Hồ sơ Đảng trước khi nộp lên Văn phòng Đoàn Đại học.</w:t>
       </w:r>
     </w:p>
     <w:p>
@@ -1055,7 +1055,7 @@
         <w:rPr>
           <w:sz w:val="23"/>
         </w:rPr>
-        <w:t>- Công tác Truyền thông nghiệp vụ (Bộ phận chuyên trách): Quản trị Fanpage chính thức của Ban TCKT; lên content và thiết kế ấn phẩm (Infographic) hướng dẫn nghiệp vụ (kết nạp Đoàn, chuyển sinh hoạt, hồ sơ Đảng, tính ĐRL, cẩm nang QLDV); thiết kế ấn phẩm các chiến dịch lớn.</w:t>
+        <w:t>- Công tác Truyền thông nghiệp vụ &amp; Kênh Fanpage (Bộ phận chuyên trách): Quản trị và phát triển Fanpage Ban TCKT; sản xuất nội dung (Content) và thiết kế đồ họa (Infographic) tuyên truyền Điều lệ Đoàn, các mốc thời gian quy trình, hướng dẫn nghiệp vụ chuẩn cho cán bộ Đoàn cơ sở; thực hiện các ấn phẩm truyền hình ảnh của Ban.</w:t>
       </w:r>
     </w:p>
     <w:p>
@@ -1067,7 +1067,7 @@
         <w:rPr>
           <w:sz w:val="23"/>
         </w:rPr>
-        <w:t>Sản phẩm đầu ra (Deliverables): 100% Quyết định chuẩn y/thành lập ban hành đúng thể thức trong 3 - 5 ngày làm việc; Sổ công văn, biên bản họp và con dấu được quản lý chặt chẽ; Bộ Infographic nghiệp vụ trực quan và Fanpage hoạt động liên tục, hiệu quả.</w:t>
+        <w:t>Sản phẩm đầu ra (Deliverables): 100% Quyết định nhân sự, chuẩn y được ban hành đúng quy chuẩn; Sổ sách và con dấu được quản lý tuyệt đối an toàn; Ấn phẩm truyền thông định kỳ chất lượng cao.</w:t>
       </w:r>
     </w:p>
     <w:p>
@@ -1153,7 +1153,7 @@
         <w:rPr>
           <w:sz w:val="23"/>
         </w:rPr>
-        <w:t>Thành viên các mảng: Chia thành các Cặp bài trùng phụ trách chính và backup giữa 2 đơn vị cơ sở (tiền kiểm hồ sơ trong 24h, bọc lót khi bạn bận thi cử); cùng lực lượng thành viên chuyên trách thực hiện các nghiệp vụ chuyên sâu theo từng mảng.</w:t>
+        <w:t>Thành viên các mảng: Chia thành các Cặp bài trùng phụ trách chính và backup giữa 2 đơn vị cơ sở (tiền kiểm hồ sơ trong 24h, bọc lót khi bạn bận thi cử); cùng lực lượng thành viên chuyên trách/backup thực hiện các nghiệp vụ chuyên sâu theo từng mảng. Riêng Mảng Phát triển Đảng: 12 TV (6 cặp) kiểm tra hồ sơ Đảng &amp; lớp cảm tình Đoàn 12 đơn vị; 07 TV còn lại không trực tiếp phụ trách cơ sở mà làm backup, luân phiên trực ban để tiếp nhận hồ sơ bản cứng linh hoạt.</w:t>
       </w:r>
     </w:p>
     <w:p>

</xml_diff>

<commit_message>
feat: integrate 2026-2027 action plan (15 tasks, 4 depts) and unit criteria (950 pts) into web and docx
</commit_message>
<xml_diff>
--- a/De_An_Tai_Cau_Truc_Ban_TCKT_Doan_Vu.docx
+++ b/De_An_Tai_Cau_Truc_Ban_TCKT_Doan_Vu.docx
@@ -6959,6 +6959,4330 @@
         <w:t>Bổ sung số, ngày của các văn bản nội bộ áp dụng; tên chính thức của 12 đơn vị; danh sách nhân sự; phân cấp thẩm quyền; lịch trực; nền tảng được chấp thuận và mốc T0. Định biên, thời hạn và tiêu chí trong phương án 04 mảng là các nội dung đề xuất để cấp có thẩm quyền xem xét, cho ý kiến trước khi triển khai.</w:t>
       </w:r>
     </w:p>
+    <w:p>
+      <w:r>
+        <w:br w:type="page"/>
+      </w:r>
+    </w:p>
+    <w:p>
+      <w:pPr>
+        <w:spacing w:before="360" w:after="120"/>
+      </w:pPr>
+      <w:r>
+        <w:rPr>
+          <w:rFonts w:ascii="Times New Roman" w:hAnsi="Times New Roman"/>
+          <w:b/>
+          <w:color w:val="00458C"/>
+          <w:sz w:val="28"/>
+        </w:rPr>
+        <w:t>XII. KẾ HOẠCH HOẠT ĐỘNG VÀ BỘ TIÊU CHÍ THI ĐUA NĂM HỌC 2026 - 2027</w:t>
+      </w:r>
+    </w:p>
+    <w:p>
+      <w:pPr>
+        <w:spacing w:after="160" w:line="300" w:lineRule="auto"/>
+        <w:ind w:firstLine="562"/>
+      </w:pPr>
+      <w:r>
+        <w:t>Nhằm cụ thể hóa Đề án Tái cấu trúc thành chương trình hành động thực tiễn trong năm học 2026 - 2027, Ban Tổ chức - Kiểm tra xác lập Kế hoạch hoạt động trọng tâm gồm 15 đầu việc lớn phân kỳ theo 12 tháng, đồng thời phân công trách nhiệm chủ trì, phối hợp rõ ràng cho 04 Mảng chuyên môn và ban hành Bộ Tiêu chí chấm điểm thi đua cơ sở (thang điểm 950 điểm chuẩn kèm điểm thưởng và điểm phạt) làm căn cứ đánh giá, xếp loại thi đua cuối năm đối với 12 Đoàn trường, Liên chi đoàn trực thuộc.</w:t>
+      </w:r>
+    </w:p>
+    <w:p>
+      <w:pPr>
+        <w:spacing w:before="240" w:after="80"/>
+      </w:pPr>
+      <w:r>
+        <w:rPr>
+          <w:rFonts w:ascii="Times New Roman" w:hAnsi="Times New Roman"/>
+          <w:b/>
+          <w:sz w:val="26"/>
+        </w:rPr>
+        <w:t>1. Ma trận Kế hoạch 15 Hoạt động trọng tâm và Phân công 04 Mảng chuyên môn</w:t>
+      </w:r>
+    </w:p>
+    <w:p>
+      <w:pPr>
+        <w:spacing w:after="120" w:line="300" w:lineRule="auto"/>
+        <w:ind w:firstLine="562"/>
+      </w:pPr>
+      <w:r>
+        <w:t>Dưới đây là bảng phân công chi tiết 15 hoạt động lớn của Ban TCKT trong năm học 2026 - 2027 gắn với mảng chủ trì, mảng phối hợp và sản phẩm đầu ra bắt buộc:</w:t>
+      </w:r>
+    </w:p>
+    <w:tbl>
+      <w:tblPr>
+        <w:tblW w:type="auto" w:w="0"/>
+        <w:jc w:val="center"/>
+        <w:tblLayout w:type="fixed"/>
+        <w:tblLook w:firstColumn="1" w:firstRow="1" w:lastColumn="0" w:lastRow="0" w:noHBand="0" w:noVBand="1" w:val="04A0"/>
+        <w:tblBorders>
+          <w:top w:val="single" w:sz="4" w:space="0" w:color="CBD5E1"/>
+          <w:bottom w:val="single" w:sz="4" w:space="0" w:color="CBD5E1"/>
+          <w:left w:val="single" w:sz="4" w:space="0" w:color="CBD5E1"/>
+          <w:right w:val="single" w:sz="4" w:space="0" w:color="CBD5E1"/>
+          <w:insideH w:val="single" w:sz="4" w:space="0" w:color="CBD5E1"/>
+          <w:insideV w:val="single" w:sz="4" w:space="0" w:color="CBD5E1"/>
+        </w:tblBorders>
+      </w:tblPr>
+      <w:tblGrid>
+        <w:gridCol w:w="1559"/>
+        <w:gridCol w:w="1559"/>
+        <w:gridCol w:w="1559"/>
+        <w:gridCol w:w="1559"/>
+        <w:gridCol w:w="1559"/>
+        <w:gridCol w:w="1559"/>
+      </w:tblGrid>
+      <w:tr>
+        <w:tc>
+          <w:tcPr>
+            <w:tcW w:type="dxa" w:w="576"/>
+            <w:shd w:fill="00458C"/>
+            <w:tcMar>
+              <w:top w:w="100" w:type="dxa"/>
+              <w:bottom w:w="100" w:type="dxa"/>
+              <w:left w:w="80" w:type="dxa"/>
+              <w:right w:w="80" w:type="dxa"/>
+            </w:tcMar>
+          </w:tcPr>
+          <w:p>
+            <w:pPr>
+              <w:jc w:val="center"/>
+            </w:pPr>
+            <w:r>
+              <w:rPr>
+                <w:rFonts w:ascii="Times New Roman" w:hAnsi="Times New Roman"/>
+                <w:b/>
+                <w:color w:val="FFFFFF"/>
+                <w:sz w:val="20"/>
+              </w:rPr>
+              <w:t>STT</w:t>
+            </w:r>
+          </w:p>
+        </w:tc>
+        <w:tc>
+          <w:tcPr>
+            <w:tcW w:type="dxa" w:w="3168"/>
+            <w:shd w:fill="00458C"/>
+            <w:tcMar>
+              <w:top w:w="100" w:type="dxa"/>
+              <w:bottom w:w="100" w:type="dxa"/>
+              <w:left w:w="80" w:type="dxa"/>
+              <w:right w:w="80" w:type="dxa"/>
+            </w:tcMar>
+          </w:tcPr>
+          <w:p>
+            <w:pPr>
+              <w:jc w:val="center"/>
+            </w:pPr>
+            <w:r>
+              <w:rPr>
+                <w:rFonts w:ascii="Times New Roman" w:hAnsi="Times New Roman"/>
+                <w:b/>
+                <w:color w:val="FFFFFF"/>
+                <w:sz w:val="20"/>
+              </w:rPr>
+              <w:t>Nội dung hoạt động trọng tâm</w:t>
+            </w:r>
+          </w:p>
+        </w:tc>
+        <w:tc>
+          <w:tcPr>
+            <w:tcW w:type="dxa" w:w="1296"/>
+            <w:shd w:fill="00458C"/>
+            <w:tcMar>
+              <w:top w:w="100" w:type="dxa"/>
+              <w:bottom w:w="100" w:type="dxa"/>
+              <w:left w:w="80" w:type="dxa"/>
+              <w:right w:w="80" w:type="dxa"/>
+            </w:tcMar>
+          </w:tcPr>
+          <w:p>
+            <w:pPr>
+              <w:jc w:val="center"/>
+            </w:pPr>
+            <w:r>
+              <w:rPr>
+                <w:rFonts w:ascii="Times New Roman" w:hAnsi="Times New Roman"/>
+                <w:b/>
+                <w:color w:val="FFFFFF"/>
+                <w:sz w:val="20"/>
+              </w:rPr>
+              <w:t>Thời gian</w:t>
+            </w:r>
+          </w:p>
+        </w:tc>
+        <w:tc>
+          <w:tcPr>
+            <w:tcW w:type="dxa" w:w="1440"/>
+            <w:shd w:fill="00458C"/>
+            <w:tcMar>
+              <w:top w:w="100" w:type="dxa"/>
+              <w:bottom w:w="100" w:type="dxa"/>
+              <w:left w:w="80" w:type="dxa"/>
+              <w:right w:w="80" w:type="dxa"/>
+            </w:tcMar>
+          </w:tcPr>
+          <w:p>
+            <w:pPr>
+              <w:jc w:val="center"/>
+            </w:pPr>
+            <w:r>
+              <w:rPr>
+                <w:rFonts w:ascii="Times New Roman" w:hAnsi="Times New Roman"/>
+                <w:b/>
+                <w:color w:val="FFFFFF"/>
+                <w:sz w:val="20"/>
+              </w:rPr>
+              <w:t>Mảng Chủ trì</w:t>
+            </w:r>
+          </w:p>
+        </w:tc>
+        <w:tc>
+          <w:tcPr>
+            <w:tcW w:type="dxa" w:w="1296"/>
+            <w:shd w:fill="00458C"/>
+            <w:tcMar>
+              <w:top w:w="100" w:type="dxa"/>
+              <w:bottom w:w="100" w:type="dxa"/>
+              <w:left w:w="80" w:type="dxa"/>
+              <w:right w:w="80" w:type="dxa"/>
+            </w:tcMar>
+          </w:tcPr>
+          <w:p>
+            <w:pPr>
+              <w:jc w:val="center"/>
+            </w:pPr>
+            <w:r>
+              <w:rPr>
+                <w:rFonts w:ascii="Times New Roman" w:hAnsi="Times New Roman"/>
+                <w:b/>
+                <w:color w:val="FFFFFF"/>
+                <w:sz w:val="20"/>
+              </w:rPr>
+              <w:t>Mảng Phối hợp</w:t>
+            </w:r>
+          </w:p>
+        </w:tc>
+        <w:tc>
+          <w:tcPr>
+            <w:tcW w:type="dxa" w:w="2016"/>
+            <w:shd w:fill="00458C"/>
+            <w:tcMar>
+              <w:top w:w="100" w:type="dxa"/>
+              <w:bottom w:w="100" w:type="dxa"/>
+              <w:left w:w="80" w:type="dxa"/>
+              <w:right w:w="80" w:type="dxa"/>
+            </w:tcMar>
+          </w:tcPr>
+          <w:p>
+            <w:pPr>
+              <w:jc w:val="center"/>
+            </w:pPr>
+            <w:r>
+              <w:rPr>
+                <w:rFonts w:ascii="Times New Roman" w:hAnsi="Times New Roman"/>
+                <w:b/>
+                <w:color w:val="FFFFFF"/>
+                <w:sz w:val="20"/>
+              </w:rPr>
+              <w:t>Sản phẩm đầu ra</w:t>
+            </w:r>
+          </w:p>
+        </w:tc>
+      </w:tr>
+      <w:tr>
+        <w:tc>
+          <w:tcPr>
+            <w:tcW w:type="dxa" w:w="576"/>
+            <w:shd w:fill="F8FAFC"/>
+            <w:tcMar>
+              <w:top w:w="80" w:type="dxa"/>
+              <w:bottom w:w="80" w:type="dxa"/>
+              <w:left w:w="70" w:type="dxa"/>
+              <w:right w:w="70" w:type="dxa"/>
+            </w:tcMar>
+          </w:tcPr>
+          <w:p>
+            <w:pPr>
+              <w:spacing w:line="276" w:lineRule="auto"/>
+              <w:jc w:val="center"/>
+            </w:pPr>
+            <w:r>
+              <w:rPr>
+                <w:rFonts w:ascii="Times New Roman" w:hAnsi="Times New Roman"/>
+                <w:b/>
+                <w:sz w:val="19"/>
+              </w:rPr>
+              <w:t>1</w:t>
+            </w:r>
+          </w:p>
+        </w:tc>
+        <w:tc>
+          <w:tcPr>
+            <w:tcW w:type="dxa" w:w="3168"/>
+            <w:shd w:fill="F8FAFC"/>
+            <w:tcMar>
+              <w:top w:w="80" w:type="dxa"/>
+              <w:bottom w:w="80" w:type="dxa"/>
+              <w:left w:w="70" w:type="dxa"/>
+              <w:right w:w="70" w:type="dxa"/>
+            </w:tcMar>
+          </w:tcPr>
+          <w:p>
+            <w:pPr>
+              <w:spacing w:line="276" w:lineRule="auto"/>
+              <w:jc w:val="left"/>
+            </w:pPr>
+            <w:r>
+              <w:rPr>
+                <w:rFonts w:ascii="Times New Roman" w:hAnsi="Times New Roman"/>
+                <w:sz w:val="19"/>
+              </w:rPr>
+              <w:t>Tuyển thành viên các Ban chuyên môn Đoàn Đại học</w:t>
+            </w:r>
+          </w:p>
+        </w:tc>
+        <w:tc>
+          <w:tcPr>
+            <w:tcW w:type="dxa" w:w="1296"/>
+            <w:shd w:fill="F8FAFC"/>
+            <w:tcMar>
+              <w:top w:w="80" w:type="dxa"/>
+              <w:bottom w:w="80" w:type="dxa"/>
+              <w:left w:w="70" w:type="dxa"/>
+              <w:right w:w="70" w:type="dxa"/>
+            </w:tcMar>
+          </w:tcPr>
+          <w:p>
+            <w:pPr>
+              <w:spacing w:line="276" w:lineRule="auto"/>
+              <w:jc w:val="center"/>
+            </w:pPr>
+            <w:r>
+              <w:rPr>
+                <w:rFonts w:ascii="Times New Roman" w:hAnsi="Times New Roman"/>
+                <w:sz w:val="19"/>
+              </w:rPr>
+              <w:t>9/2026</w:t>
+            </w:r>
+          </w:p>
+        </w:tc>
+        <w:tc>
+          <w:tcPr>
+            <w:tcW w:type="dxa" w:w="1440"/>
+            <w:shd w:fill="F8FAFC"/>
+            <w:tcMar>
+              <w:top w:w="80" w:type="dxa"/>
+              <w:bottom w:w="80" w:type="dxa"/>
+              <w:left w:w="70" w:type="dxa"/>
+              <w:right w:w="70" w:type="dxa"/>
+            </w:tcMar>
+          </w:tcPr>
+          <w:p>
+            <w:pPr>
+              <w:spacing w:line="276" w:lineRule="auto"/>
+              <w:jc w:val="center"/>
+            </w:pPr>
+            <w:r>
+              <w:rPr>
+                <w:rFonts w:ascii="Times New Roman" w:hAnsi="Times New Roman"/>
+                <w:b/>
+                <w:color w:val="005BAC"/>
+                <w:sz w:val="19"/>
+              </w:rPr>
+              <w:t>Mảng 1</w:t>
+            </w:r>
+          </w:p>
+        </w:tc>
+        <w:tc>
+          <w:tcPr>
+            <w:tcW w:type="dxa" w:w="1296"/>
+            <w:shd w:fill="F8FAFC"/>
+            <w:tcMar>
+              <w:top w:w="80" w:type="dxa"/>
+              <w:bottom w:w="80" w:type="dxa"/>
+              <w:left w:w="70" w:type="dxa"/>
+              <w:right w:w="70" w:type="dxa"/>
+            </w:tcMar>
+          </w:tcPr>
+          <w:p>
+            <w:pPr>
+              <w:spacing w:line="276" w:lineRule="auto"/>
+              <w:jc w:val="center"/>
+            </w:pPr>
+            <w:r>
+              <w:rPr>
+                <w:rFonts w:ascii="Times New Roman" w:hAnsi="Times New Roman"/>
+                <w:sz w:val="19"/>
+              </w:rPr>
+              <w:t>Mảng 4</w:t>
+            </w:r>
+          </w:p>
+        </w:tc>
+        <w:tc>
+          <w:tcPr>
+            <w:tcW w:type="dxa" w:w="2016"/>
+            <w:shd w:fill="F8FAFC"/>
+            <w:tcMar>
+              <w:top w:w="80" w:type="dxa"/>
+              <w:bottom w:w="80" w:type="dxa"/>
+              <w:left w:w="70" w:type="dxa"/>
+              <w:right w:w="70" w:type="dxa"/>
+            </w:tcMar>
+          </w:tcPr>
+          <w:p>
+            <w:pPr>
+              <w:spacing w:line="276" w:lineRule="auto"/>
+              <w:jc w:val="left"/>
+            </w:pPr>
+            <w:r>
+              <w:rPr>
+                <w:rFonts w:ascii="Times New Roman" w:hAnsi="Times New Roman"/>
+                <w:sz w:val="19"/>
+              </w:rPr>
+              <w:t>Danh sách trúng tuyển; hồ sơ nhân sự Ban.</w:t>
+            </w:r>
+          </w:p>
+        </w:tc>
+      </w:tr>
+      <w:tr>
+        <w:tc>
+          <w:tcPr>
+            <w:tcW w:type="dxa" w:w="576"/>
+            <w:shd w:fill="FFFFFF"/>
+            <w:tcMar>
+              <w:top w:w="80" w:type="dxa"/>
+              <w:bottom w:w="80" w:type="dxa"/>
+              <w:left w:w="70" w:type="dxa"/>
+              <w:right w:w="70" w:type="dxa"/>
+            </w:tcMar>
+          </w:tcPr>
+          <w:p>
+            <w:pPr>
+              <w:spacing w:line="276" w:lineRule="auto"/>
+              <w:jc w:val="center"/>
+            </w:pPr>
+            <w:r>
+              <w:rPr>
+                <w:rFonts w:ascii="Times New Roman" w:hAnsi="Times New Roman"/>
+                <w:b/>
+                <w:sz w:val="19"/>
+              </w:rPr>
+              <w:t>2</w:t>
+            </w:r>
+          </w:p>
+        </w:tc>
+        <w:tc>
+          <w:tcPr>
+            <w:tcW w:type="dxa" w:w="3168"/>
+            <w:shd w:fill="FFFFFF"/>
+            <w:tcMar>
+              <w:top w:w="80" w:type="dxa"/>
+              <w:bottom w:w="80" w:type="dxa"/>
+              <w:left w:w="70" w:type="dxa"/>
+              <w:right w:w="70" w:type="dxa"/>
+            </w:tcMar>
+          </w:tcPr>
+          <w:p>
+            <w:pPr>
+              <w:spacing w:line="276" w:lineRule="auto"/>
+              <w:jc w:val="left"/>
+            </w:pPr>
+            <w:r>
+              <w:rPr>
+                <w:rFonts w:ascii="Times New Roman" w:hAnsi="Times New Roman"/>
+                <w:sz w:val="19"/>
+              </w:rPr>
+              <w:t>Đại hội các Chi đoàn + Thành lập Chi đoàn K71</w:t>
+            </w:r>
+          </w:p>
+        </w:tc>
+        <w:tc>
+          <w:tcPr>
+            <w:tcW w:type="dxa" w:w="1296"/>
+            <w:shd w:fill="FFFFFF"/>
+            <w:tcMar>
+              <w:top w:w="80" w:type="dxa"/>
+              <w:bottom w:w="80" w:type="dxa"/>
+              <w:left w:w="70" w:type="dxa"/>
+              <w:right w:w="70" w:type="dxa"/>
+            </w:tcMar>
+          </w:tcPr>
+          <w:p>
+            <w:pPr>
+              <w:spacing w:line="276" w:lineRule="auto"/>
+              <w:jc w:val="center"/>
+            </w:pPr>
+            <w:r>
+              <w:rPr>
+                <w:rFonts w:ascii="Times New Roman" w:hAnsi="Times New Roman"/>
+                <w:sz w:val="19"/>
+              </w:rPr>
+              <w:t>10 - 11/2026</w:t>
+            </w:r>
+          </w:p>
+        </w:tc>
+        <w:tc>
+          <w:tcPr>
+            <w:tcW w:type="dxa" w:w="1440"/>
+            <w:shd w:fill="FFFFFF"/>
+            <w:tcMar>
+              <w:top w:w="80" w:type="dxa"/>
+              <w:bottom w:w="80" w:type="dxa"/>
+              <w:left w:w="70" w:type="dxa"/>
+              <w:right w:w="70" w:type="dxa"/>
+            </w:tcMar>
+          </w:tcPr>
+          <w:p>
+            <w:pPr>
+              <w:spacing w:line="276" w:lineRule="auto"/>
+              <w:jc w:val="center"/>
+            </w:pPr>
+            <w:r>
+              <w:rPr>
+                <w:rFonts w:ascii="Times New Roman" w:hAnsi="Times New Roman"/>
+                <w:b/>
+                <w:color w:val="005BAC"/>
+                <w:sz w:val="19"/>
+              </w:rPr>
+              <w:t>Mảng 1</w:t>
+            </w:r>
+          </w:p>
+        </w:tc>
+        <w:tc>
+          <w:tcPr>
+            <w:tcW w:type="dxa" w:w="1296"/>
+            <w:shd w:fill="FFFFFF"/>
+            <w:tcMar>
+              <w:top w:w="80" w:type="dxa"/>
+              <w:bottom w:w="80" w:type="dxa"/>
+              <w:left w:w="70" w:type="dxa"/>
+              <w:right w:w="70" w:type="dxa"/>
+            </w:tcMar>
+          </w:tcPr>
+          <w:p>
+            <w:pPr>
+              <w:spacing w:line="276" w:lineRule="auto"/>
+              <w:jc w:val="center"/>
+            </w:pPr>
+            <w:r>
+              <w:rPr>
+                <w:rFonts w:ascii="Times New Roman" w:hAnsi="Times New Roman"/>
+                <w:sz w:val="19"/>
+              </w:rPr>
+              <w:t>Mảng 2</w:t>
+            </w:r>
+          </w:p>
+        </w:tc>
+        <w:tc>
+          <w:tcPr>
+            <w:tcW w:type="dxa" w:w="2016"/>
+            <w:shd w:fill="FFFFFF"/>
+            <w:tcMar>
+              <w:top w:w="80" w:type="dxa"/>
+              <w:bottom w:w="80" w:type="dxa"/>
+              <w:left w:w="70" w:type="dxa"/>
+              <w:right w:w="70" w:type="dxa"/>
+            </w:tcMar>
+          </w:tcPr>
+          <w:p>
+            <w:pPr>
+              <w:spacing w:line="276" w:lineRule="auto"/>
+              <w:jc w:val="left"/>
+            </w:pPr>
+            <w:r>
+              <w:rPr>
+                <w:rFonts w:ascii="Times New Roman" w:hAnsi="Times New Roman"/>
+                <w:sz w:val="19"/>
+              </w:rPr>
+              <w:t>Nghị quyết chuẩn y BCH; cây tổ chức K71 trên QLDV.</w:t>
+            </w:r>
+          </w:p>
+        </w:tc>
+      </w:tr>
+      <w:tr>
+        <w:tc>
+          <w:tcPr>
+            <w:tcW w:type="dxa" w:w="576"/>
+            <w:shd w:fill="F8FAFC"/>
+            <w:tcMar>
+              <w:top w:w="80" w:type="dxa"/>
+              <w:bottom w:w="80" w:type="dxa"/>
+              <w:left w:w="70" w:type="dxa"/>
+              <w:right w:w="70" w:type="dxa"/>
+            </w:tcMar>
+          </w:tcPr>
+          <w:p>
+            <w:pPr>
+              <w:spacing w:line="276" w:lineRule="auto"/>
+              <w:jc w:val="center"/>
+            </w:pPr>
+            <w:r>
+              <w:rPr>
+                <w:rFonts w:ascii="Times New Roman" w:hAnsi="Times New Roman"/>
+                <w:b/>
+                <w:sz w:val="19"/>
+              </w:rPr>
+              <w:t>3</w:t>
+            </w:r>
+          </w:p>
+        </w:tc>
+        <w:tc>
+          <w:tcPr>
+            <w:tcW w:type="dxa" w:w="3168"/>
+            <w:shd w:fill="F8FAFC"/>
+            <w:tcMar>
+              <w:top w:w="80" w:type="dxa"/>
+              <w:bottom w:w="80" w:type="dxa"/>
+              <w:left w:w="70" w:type="dxa"/>
+              <w:right w:w="70" w:type="dxa"/>
+            </w:tcMar>
+          </w:tcPr>
+          <w:p>
+            <w:pPr>
+              <w:spacing w:line="276" w:lineRule="auto"/>
+              <w:jc w:val="left"/>
+            </w:pPr>
+            <w:r>
+              <w:rPr>
+                <w:rFonts w:ascii="Times New Roman" w:hAnsi="Times New Roman"/>
+                <w:sz w:val="19"/>
+              </w:rPr>
+              <w:t>Ra mắt Ban Cán sự năm nhất K71</w:t>
+            </w:r>
+          </w:p>
+        </w:tc>
+        <w:tc>
+          <w:tcPr>
+            <w:tcW w:type="dxa" w:w="1296"/>
+            <w:shd w:fill="F8FAFC"/>
+            <w:tcMar>
+              <w:top w:w="80" w:type="dxa"/>
+              <w:bottom w:w="80" w:type="dxa"/>
+              <w:left w:w="70" w:type="dxa"/>
+              <w:right w:w="70" w:type="dxa"/>
+            </w:tcMar>
+          </w:tcPr>
+          <w:p>
+            <w:pPr>
+              <w:spacing w:line="276" w:lineRule="auto"/>
+              <w:jc w:val="center"/>
+            </w:pPr>
+            <w:r>
+              <w:rPr>
+                <w:rFonts w:ascii="Times New Roman" w:hAnsi="Times New Roman"/>
+                <w:sz w:val="19"/>
+              </w:rPr>
+              <w:t>11/2026</w:t>
+            </w:r>
+          </w:p>
+        </w:tc>
+        <w:tc>
+          <w:tcPr>
+            <w:tcW w:type="dxa" w:w="1440"/>
+            <w:shd w:fill="F8FAFC"/>
+            <w:tcMar>
+              <w:top w:w="80" w:type="dxa"/>
+              <w:bottom w:w="80" w:type="dxa"/>
+              <w:left w:w="70" w:type="dxa"/>
+              <w:right w:w="70" w:type="dxa"/>
+            </w:tcMar>
+          </w:tcPr>
+          <w:p>
+            <w:pPr>
+              <w:spacing w:line="276" w:lineRule="auto"/>
+              <w:jc w:val="center"/>
+            </w:pPr>
+            <w:r>
+              <w:rPr>
+                <w:rFonts w:ascii="Times New Roman" w:hAnsi="Times New Roman"/>
+                <w:b/>
+                <w:color w:val="005BAC"/>
+                <w:sz w:val="19"/>
+              </w:rPr>
+              <w:t>Mảng 1</w:t>
+            </w:r>
+          </w:p>
+        </w:tc>
+        <w:tc>
+          <w:tcPr>
+            <w:tcW w:type="dxa" w:w="1296"/>
+            <w:shd w:fill="F8FAFC"/>
+            <w:tcMar>
+              <w:top w:w="80" w:type="dxa"/>
+              <w:bottom w:w="80" w:type="dxa"/>
+              <w:left w:w="70" w:type="dxa"/>
+              <w:right w:w="70" w:type="dxa"/>
+            </w:tcMar>
+          </w:tcPr>
+          <w:p>
+            <w:pPr>
+              <w:spacing w:line="276" w:lineRule="auto"/>
+              <w:jc w:val="center"/>
+            </w:pPr>
+            <w:r>
+              <w:rPr>
+                <w:rFonts w:ascii="Times New Roman" w:hAnsi="Times New Roman"/>
+                <w:sz w:val="19"/>
+              </w:rPr>
+              <w:t>Mảng 4</w:t>
+            </w:r>
+          </w:p>
+        </w:tc>
+        <w:tc>
+          <w:tcPr>
+            <w:tcW w:type="dxa" w:w="2016"/>
+            <w:shd w:fill="F8FAFC"/>
+            <w:tcMar>
+              <w:top w:w="80" w:type="dxa"/>
+              <w:bottom w:w="80" w:type="dxa"/>
+              <w:left w:w="70" w:type="dxa"/>
+              <w:right w:w="70" w:type="dxa"/>
+            </w:tcMar>
+          </w:tcPr>
+          <w:p>
+            <w:pPr>
+              <w:spacing w:line="276" w:lineRule="auto"/>
+              <w:jc w:val="left"/>
+            </w:pPr>
+            <w:r>
+              <w:rPr>
+                <w:rFonts w:ascii="Times New Roman" w:hAnsi="Times New Roman"/>
+                <w:sz w:val="19"/>
+              </w:rPr>
+              <w:t>Hội nghị ra mắt; danh sách Ban Cán sự các lớp K71.</w:t>
+            </w:r>
+          </w:p>
+        </w:tc>
+      </w:tr>
+      <w:tr>
+        <w:tc>
+          <w:tcPr>
+            <w:tcW w:type="dxa" w:w="576"/>
+            <w:shd w:fill="FFFFFF"/>
+            <w:tcMar>
+              <w:top w:w="80" w:type="dxa"/>
+              <w:bottom w:w="80" w:type="dxa"/>
+              <w:left w:w="70" w:type="dxa"/>
+              <w:right w:w="70" w:type="dxa"/>
+            </w:tcMar>
+          </w:tcPr>
+          <w:p>
+            <w:pPr>
+              <w:spacing w:line="276" w:lineRule="auto"/>
+              <w:jc w:val="center"/>
+            </w:pPr>
+            <w:r>
+              <w:rPr>
+                <w:rFonts w:ascii="Times New Roman" w:hAnsi="Times New Roman"/>
+                <w:b/>
+                <w:sz w:val="19"/>
+              </w:rPr>
+              <w:t>4</w:t>
+            </w:r>
+          </w:p>
+        </w:tc>
+        <w:tc>
+          <w:tcPr>
+            <w:tcW w:type="dxa" w:w="3168"/>
+            <w:shd w:fill="FFFFFF"/>
+            <w:tcMar>
+              <w:top w:w="80" w:type="dxa"/>
+              <w:bottom w:w="80" w:type="dxa"/>
+              <w:left w:w="70" w:type="dxa"/>
+              <w:right w:w="70" w:type="dxa"/>
+            </w:tcMar>
+          </w:tcPr>
+          <w:p>
+            <w:pPr>
+              <w:spacing w:line="276" w:lineRule="auto"/>
+              <w:jc w:val="left"/>
+            </w:pPr>
+            <w:r>
+              <w:rPr>
+                <w:rFonts w:ascii="Times New Roman" w:hAnsi="Times New Roman"/>
+                <w:sz w:val="19"/>
+              </w:rPr>
+              <w:t>Đóng dấu tiếp nhận sổ Đoàn K71</w:t>
+            </w:r>
+          </w:p>
+        </w:tc>
+        <w:tc>
+          <w:tcPr>
+            <w:tcW w:type="dxa" w:w="1296"/>
+            <w:shd w:fill="FFFFFF"/>
+            <w:tcMar>
+              <w:top w:w="80" w:type="dxa"/>
+              <w:bottom w:w="80" w:type="dxa"/>
+              <w:left w:w="70" w:type="dxa"/>
+              <w:right w:w="70" w:type="dxa"/>
+            </w:tcMar>
+          </w:tcPr>
+          <w:p>
+            <w:pPr>
+              <w:spacing w:line="276" w:lineRule="auto"/>
+              <w:jc w:val="center"/>
+            </w:pPr>
+            <w:r>
+              <w:rPr>
+                <w:rFonts w:ascii="Times New Roman" w:hAnsi="Times New Roman"/>
+                <w:sz w:val="19"/>
+              </w:rPr>
+              <w:t>12/2026</w:t>
+            </w:r>
+          </w:p>
+        </w:tc>
+        <w:tc>
+          <w:tcPr>
+            <w:tcW w:type="dxa" w:w="1440"/>
+            <w:shd w:fill="FFFFFF"/>
+            <w:tcMar>
+              <w:top w:w="80" w:type="dxa"/>
+              <w:bottom w:w="80" w:type="dxa"/>
+              <w:left w:w="70" w:type="dxa"/>
+              <w:right w:w="70" w:type="dxa"/>
+            </w:tcMar>
+          </w:tcPr>
+          <w:p>
+            <w:pPr>
+              <w:spacing w:line="276" w:lineRule="auto"/>
+              <w:jc w:val="center"/>
+            </w:pPr>
+            <w:r>
+              <w:rPr>
+                <w:rFonts w:ascii="Times New Roman" w:hAnsi="Times New Roman"/>
+                <w:b/>
+                <w:color w:val="005BAC"/>
+                <w:sz w:val="19"/>
+              </w:rPr>
+              <w:t>Mảng 1</w:t>
+            </w:r>
+          </w:p>
+        </w:tc>
+        <w:tc>
+          <w:tcPr>
+            <w:tcW w:type="dxa" w:w="1296"/>
+            <w:shd w:fill="FFFFFF"/>
+            <w:tcMar>
+              <w:top w:w="80" w:type="dxa"/>
+              <w:bottom w:w="80" w:type="dxa"/>
+              <w:left w:w="70" w:type="dxa"/>
+              <w:right w:w="70" w:type="dxa"/>
+            </w:tcMar>
+          </w:tcPr>
+          <w:p>
+            <w:pPr>
+              <w:spacing w:line="276" w:lineRule="auto"/>
+              <w:jc w:val="center"/>
+            </w:pPr>
+            <w:r>
+              <w:rPr>
+                <w:rFonts w:ascii="Times New Roman" w:hAnsi="Times New Roman"/>
+                <w:sz w:val="19"/>
+              </w:rPr>
+              <w:t>Mảng 2</w:t>
+            </w:r>
+          </w:p>
+        </w:tc>
+        <w:tc>
+          <w:tcPr>
+            <w:tcW w:type="dxa" w:w="2016"/>
+            <w:shd w:fill="FFFFFF"/>
+            <w:tcMar>
+              <w:top w:w="80" w:type="dxa"/>
+              <w:bottom w:w="80" w:type="dxa"/>
+              <w:left w:w="70" w:type="dxa"/>
+              <w:right w:w="70" w:type="dxa"/>
+            </w:tcMar>
+          </w:tcPr>
+          <w:p>
+            <w:pPr>
+              <w:spacing w:line="276" w:lineRule="auto"/>
+              <w:jc w:val="left"/>
+            </w:pPr>
+            <w:r>
+              <w:rPr>
+                <w:rFonts w:ascii="Times New Roman" w:hAnsi="Times New Roman"/>
+                <w:sz w:val="19"/>
+              </w:rPr>
+              <w:t>100% sổ Đoàn K71 được vào sổ và đóng dấu tiếp nhận.</w:t>
+            </w:r>
+          </w:p>
+        </w:tc>
+      </w:tr>
+      <w:tr>
+        <w:tc>
+          <w:tcPr>
+            <w:tcW w:type="dxa" w:w="576"/>
+            <w:shd w:fill="F8FAFC"/>
+            <w:tcMar>
+              <w:top w:w="80" w:type="dxa"/>
+              <w:bottom w:w="80" w:type="dxa"/>
+              <w:left w:w="70" w:type="dxa"/>
+              <w:right w:w="70" w:type="dxa"/>
+            </w:tcMar>
+          </w:tcPr>
+          <w:p>
+            <w:pPr>
+              <w:spacing w:line="276" w:lineRule="auto"/>
+              <w:jc w:val="center"/>
+            </w:pPr>
+            <w:r>
+              <w:rPr>
+                <w:rFonts w:ascii="Times New Roman" w:hAnsi="Times New Roman"/>
+                <w:b/>
+                <w:sz w:val="19"/>
+              </w:rPr>
+              <w:t>5</w:t>
+            </w:r>
+          </w:p>
+        </w:tc>
+        <w:tc>
+          <w:tcPr>
+            <w:tcW w:type="dxa" w:w="3168"/>
+            <w:shd w:fill="F8FAFC"/>
+            <w:tcMar>
+              <w:top w:w="80" w:type="dxa"/>
+              <w:bottom w:w="80" w:type="dxa"/>
+              <w:left w:w="70" w:type="dxa"/>
+              <w:right w:w="70" w:type="dxa"/>
+            </w:tcMar>
+          </w:tcPr>
+          <w:p>
+            <w:pPr>
+              <w:spacing w:line="276" w:lineRule="auto"/>
+              <w:jc w:val="left"/>
+            </w:pPr>
+            <w:r>
+              <w:rPr>
+                <w:rFonts w:ascii="Times New Roman" w:hAnsi="Times New Roman"/>
+                <w:sz w:val="19"/>
+              </w:rPr>
+              <w:t>Hỗ trợ thu Đoàn phí K71 và công nợ K70, K69, K68</w:t>
+            </w:r>
+          </w:p>
+        </w:tc>
+        <w:tc>
+          <w:tcPr>
+            <w:tcW w:type="dxa" w:w="1296"/>
+            <w:shd w:fill="F8FAFC"/>
+            <w:tcMar>
+              <w:top w:w="80" w:type="dxa"/>
+              <w:bottom w:w="80" w:type="dxa"/>
+              <w:left w:w="70" w:type="dxa"/>
+              <w:right w:w="70" w:type="dxa"/>
+            </w:tcMar>
+          </w:tcPr>
+          <w:p>
+            <w:pPr>
+              <w:spacing w:line="276" w:lineRule="auto"/>
+              <w:jc w:val="center"/>
+            </w:pPr>
+            <w:r>
+              <w:rPr>
+                <w:rFonts w:ascii="Times New Roman" w:hAnsi="Times New Roman"/>
+                <w:sz w:val="19"/>
+              </w:rPr>
+              <w:t>01/2027</w:t>
+            </w:r>
+          </w:p>
+        </w:tc>
+        <w:tc>
+          <w:tcPr>
+            <w:tcW w:type="dxa" w:w="1440"/>
+            <w:shd w:fill="F8FAFC"/>
+            <w:tcMar>
+              <w:top w:w="80" w:type="dxa"/>
+              <w:bottom w:w="80" w:type="dxa"/>
+              <w:left w:w="70" w:type="dxa"/>
+              <w:right w:w="70" w:type="dxa"/>
+            </w:tcMar>
+          </w:tcPr>
+          <w:p>
+            <w:pPr>
+              <w:spacing w:line="276" w:lineRule="auto"/>
+              <w:jc w:val="center"/>
+            </w:pPr>
+            <w:r>
+              <w:rPr>
+                <w:rFonts w:ascii="Times New Roman" w:hAnsi="Times New Roman"/>
+                <w:b/>
+                <w:color w:val="005BAC"/>
+                <w:sz w:val="19"/>
+              </w:rPr>
+              <w:t>Mảng 1</w:t>
+            </w:r>
+          </w:p>
+        </w:tc>
+        <w:tc>
+          <w:tcPr>
+            <w:tcW w:type="dxa" w:w="1296"/>
+            <w:shd w:fill="F8FAFC"/>
+            <w:tcMar>
+              <w:top w:w="80" w:type="dxa"/>
+              <w:bottom w:w="80" w:type="dxa"/>
+              <w:left w:w="70" w:type="dxa"/>
+              <w:right w:w="70" w:type="dxa"/>
+            </w:tcMar>
+          </w:tcPr>
+          <w:p>
+            <w:pPr>
+              <w:spacing w:line="276" w:lineRule="auto"/>
+              <w:jc w:val="center"/>
+            </w:pPr>
+            <w:r>
+              <w:rPr>
+                <w:rFonts w:ascii="Times New Roman" w:hAnsi="Times New Roman"/>
+                <w:sz w:val="19"/>
+              </w:rPr>
+              <w:t>Mảng 2</w:t>
+            </w:r>
+          </w:p>
+        </w:tc>
+        <w:tc>
+          <w:tcPr>
+            <w:tcW w:type="dxa" w:w="2016"/>
+            <w:shd w:fill="F8FAFC"/>
+            <w:tcMar>
+              <w:top w:w="80" w:type="dxa"/>
+              <w:bottom w:w="80" w:type="dxa"/>
+              <w:left w:w="70" w:type="dxa"/>
+              <w:right w:w="70" w:type="dxa"/>
+            </w:tcMar>
+          </w:tcPr>
+          <w:p>
+            <w:pPr>
+              <w:spacing w:line="276" w:lineRule="auto"/>
+              <w:jc w:val="left"/>
+            </w:pPr>
+            <w:r>
+              <w:rPr>
+                <w:rFonts w:ascii="Times New Roman" w:hAnsi="Times New Roman"/>
+                <w:sz w:val="19"/>
+              </w:rPr>
+              <w:t>Biên lai thu; bảng tổng hợp đối soát đoàn phí 12 đơn vị.</w:t>
+            </w:r>
+          </w:p>
+        </w:tc>
+      </w:tr>
+      <w:tr>
+        <w:tc>
+          <w:tcPr>
+            <w:tcW w:type="dxa" w:w="576"/>
+            <w:shd w:fill="FFFFFF"/>
+            <w:tcMar>
+              <w:top w:w="80" w:type="dxa"/>
+              <w:bottom w:w="80" w:type="dxa"/>
+              <w:left w:w="70" w:type="dxa"/>
+              <w:right w:w="70" w:type="dxa"/>
+            </w:tcMar>
+          </w:tcPr>
+          <w:p>
+            <w:pPr>
+              <w:spacing w:line="276" w:lineRule="auto"/>
+              <w:jc w:val="center"/>
+            </w:pPr>
+            <w:r>
+              <w:rPr>
+                <w:rFonts w:ascii="Times New Roman" w:hAnsi="Times New Roman"/>
+                <w:b/>
+                <w:sz w:val="19"/>
+              </w:rPr>
+              <w:t>6</w:t>
+            </w:r>
+          </w:p>
+        </w:tc>
+        <w:tc>
+          <w:tcPr>
+            <w:tcW w:type="dxa" w:w="3168"/>
+            <w:shd w:fill="FFFFFF"/>
+            <w:tcMar>
+              <w:top w:w="80" w:type="dxa"/>
+              <w:bottom w:w="80" w:type="dxa"/>
+              <w:left w:w="70" w:type="dxa"/>
+              <w:right w:w="70" w:type="dxa"/>
+            </w:tcMar>
+          </w:tcPr>
+          <w:p>
+            <w:pPr>
+              <w:spacing w:line="276" w:lineRule="auto"/>
+              <w:jc w:val="left"/>
+            </w:pPr>
+            <w:r>
+              <w:rPr>
+                <w:rFonts w:ascii="Times New Roman" w:hAnsi="Times New Roman"/>
+                <w:sz w:val="19"/>
+              </w:rPr>
+              <w:t>Kết nạp Đoàn viên mới đợt 1 (chào mừng 26/3)</w:t>
+            </w:r>
+          </w:p>
+        </w:tc>
+        <w:tc>
+          <w:tcPr>
+            <w:tcW w:type="dxa" w:w="1296"/>
+            <w:shd w:fill="FFFFFF"/>
+            <w:tcMar>
+              <w:top w:w="80" w:type="dxa"/>
+              <w:bottom w:w="80" w:type="dxa"/>
+              <w:left w:w="70" w:type="dxa"/>
+              <w:right w:w="70" w:type="dxa"/>
+            </w:tcMar>
+          </w:tcPr>
+          <w:p>
+            <w:pPr>
+              <w:spacing w:line="276" w:lineRule="auto"/>
+              <w:jc w:val="center"/>
+            </w:pPr>
+            <w:r>
+              <w:rPr>
+                <w:rFonts w:ascii="Times New Roman" w:hAnsi="Times New Roman"/>
+                <w:sz w:val="19"/>
+              </w:rPr>
+              <w:t>03/2027</w:t>
+            </w:r>
+          </w:p>
+        </w:tc>
+        <w:tc>
+          <w:tcPr>
+            <w:tcW w:type="dxa" w:w="1440"/>
+            <w:shd w:fill="FFFFFF"/>
+            <w:tcMar>
+              <w:top w:w="80" w:type="dxa"/>
+              <w:bottom w:w="80" w:type="dxa"/>
+              <w:left w:w="70" w:type="dxa"/>
+              <w:right w:w="70" w:type="dxa"/>
+            </w:tcMar>
+          </w:tcPr>
+          <w:p>
+            <w:pPr>
+              <w:spacing w:line="276" w:lineRule="auto"/>
+              <w:jc w:val="center"/>
+            </w:pPr>
+            <w:r>
+              <w:rPr>
+                <w:rFonts w:ascii="Times New Roman" w:hAnsi="Times New Roman"/>
+                <w:b/>
+                <w:color w:val="005BAC"/>
+                <w:sz w:val="19"/>
+              </w:rPr>
+              <w:t>Mảng 1</w:t>
+            </w:r>
+          </w:p>
+        </w:tc>
+        <w:tc>
+          <w:tcPr>
+            <w:tcW w:type="dxa" w:w="1296"/>
+            <w:shd w:fill="FFFFFF"/>
+            <w:tcMar>
+              <w:top w:w="80" w:type="dxa"/>
+              <w:bottom w:w="80" w:type="dxa"/>
+              <w:left w:w="70" w:type="dxa"/>
+              <w:right w:w="70" w:type="dxa"/>
+            </w:tcMar>
+          </w:tcPr>
+          <w:p>
+            <w:pPr>
+              <w:spacing w:line="276" w:lineRule="auto"/>
+              <w:jc w:val="center"/>
+            </w:pPr>
+            <w:r>
+              <w:rPr>
+                <w:rFonts w:ascii="Times New Roman" w:hAnsi="Times New Roman"/>
+                <w:sz w:val="19"/>
+              </w:rPr>
+              <w:t>Mảng 4</w:t>
+            </w:r>
+          </w:p>
+        </w:tc>
+        <w:tc>
+          <w:tcPr>
+            <w:tcW w:type="dxa" w:w="2016"/>
+            <w:shd w:fill="FFFFFF"/>
+            <w:tcMar>
+              <w:top w:w="80" w:type="dxa"/>
+              <w:bottom w:w="80" w:type="dxa"/>
+              <w:left w:w="70" w:type="dxa"/>
+              <w:right w:w="70" w:type="dxa"/>
+            </w:tcMar>
+          </w:tcPr>
+          <w:p>
+            <w:pPr>
+              <w:spacing w:line="276" w:lineRule="auto"/>
+              <w:jc w:val="left"/>
+            </w:pPr>
+            <w:r>
+              <w:rPr>
+                <w:rFonts w:ascii="Times New Roman" w:hAnsi="Times New Roman"/>
+                <w:sz w:val="19"/>
+              </w:rPr>
+              <w:t>Hồ sơ kết nạp đợt 1; Nghị quyết kết nạp; lễ trao huy hiệu.</w:t>
+            </w:r>
+          </w:p>
+        </w:tc>
+      </w:tr>
+      <w:tr>
+        <w:tc>
+          <w:tcPr>
+            <w:tcW w:type="dxa" w:w="576"/>
+            <w:shd w:fill="F8FAFC"/>
+            <w:tcMar>
+              <w:top w:w="80" w:type="dxa"/>
+              <w:bottom w:w="80" w:type="dxa"/>
+              <w:left w:w="70" w:type="dxa"/>
+              <w:right w:w="70" w:type="dxa"/>
+            </w:tcMar>
+          </w:tcPr>
+          <w:p>
+            <w:pPr>
+              <w:spacing w:line="276" w:lineRule="auto"/>
+              <w:jc w:val="center"/>
+            </w:pPr>
+            <w:r>
+              <w:rPr>
+                <w:rFonts w:ascii="Times New Roman" w:hAnsi="Times New Roman"/>
+                <w:b/>
+                <w:sz w:val="19"/>
+              </w:rPr>
+              <w:t>7</w:t>
+            </w:r>
+          </w:p>
+        </w:tc>
+        <w:tc>
+          <w:tcPr>
+            <w:tcW w:type="dxa" w:w="3168"/>
+            <w:shd w:fill="F8FAFC"/>
+            <w:tcMar>
+              <w:top w:w="80" w:type="dxa"/>
+              <w:bottom w:w="80" w:type="dxa"/>
+              <w:left w:w="70" w:type="dxa"/>
+              <w:right w:w="70" w:type="dxa"/>
+            </w:tcMar>
+          </w:tcPr>
+          <w:p>
+            <w:pPr>
+              <w:spacing w:line="276" w:lineRule="auto"/>
+              <w:jc w:val="left"/>
+            </w:pPr>
+            <w:r>
+              <w:rPr>
+                <w:rFonts w:ascii="Times New Roman" w:hAnsi="Times New Roman"/>
+                <w:sz w:val="19"/>
+              </w:rPr>
+              <w:t>Làm thẻ Đoàn viên K71</w:t>
+            </w:r>
+          </w:p>
+        </w:tc>
+        <w:tc>
+          <w:tcPr>
+            <w:tcW w:type="dxa" w:w="1296"/>
+            <w:shd w:fill="F8FAFC"/>
+            <w:tcMar>
+              <w:top w:w="80" w:type="dxa"/>
+              <w:bottom w:w="80" w:type="dxa"/>
+              <w:left w:w="70" w:type="dxa"/>
+              <w:right w:w="70" w:type="dxa"/>
+            </w:tcMar>
+          </w:tcPr>
+          <w:p>
+            <w:pPr>
+              <w:spacing w:line="276" w:lineRule="auto"/>
+              <w:jc w:val="center"/>
+            </w:pPr>
+            <w:r>
+              <w:rPr>
+                <w:rFonts w:ascii="Times New Roman" w:hAnsi="Times New Roman"/>
+                <w:sz w:val="19"/>
+              </w:rPr>
+              <w:t>02 - 03/2027</w:t>
+            </w:r>
+          </w:p>
+        </w:tc>
+        <w:tc>
+          <w:tcPr>
+            <w:tcW w:type="dxa" w:w="1440"/>
+            <w:shd w:fill="F8FAFC"/>
+            <w:tcMar>
+              <w:top w:w="80" w:type="dxa"/>
+              <w:bottom w:w="80" w:type="dxa"/>
+              <w:left w:w="70" w:type="dxa"/>
+              <w:right w:w="70" w:type="dxa"/>
+            </w:tcMar>
+          </w:tcPr>
+          <w:p>
+            <w:pPr>
+              <w:spacing w:line="276" w:lineRule="auto"/>
+              <w:jc w:val="center"/>
+            </w:pPr>
+            <w:r>
+              <w:rPr>
+                <w:rFonts w:ascii="Times New Roman" w:hAnsi="Times New Roman"/>
+                <w:b/>
+                <w:color w:val="005BAC"/>
+                <w:sz w:val="19"/>
+              </w:rPr>
+              <w:t>Mảng 1</w:t>
+            </w:r>
+          </w:p>
+        </w:tc>
+        <w:tc>
+          <w:tcPr>
+            <w:tcW w:type="dxa" w:w="1296"/>
+            <w:shd w:fill="F8FAFC"/>
+            <w:tcMar>
+              <w:top w:w="80" w:type="dxa"/>
+              <w:bottom w:w="80" w:type="dxa"/>
+              <w:left w:w="70" w:type="dxa"/>
+              <w:right w:w="70" w:type="dxa"/>
+            </w:tcMar>
+          </w:tcPr>
+          <w:p>
+            <w:pPr>
+              <w:spacing w:line="276" w:lineRule="auto"/>
+              <w:jc w:val="center"/>
+            </w:pPr>
+            <w:r>
+              <w:rPr>
+                <w:rFonts w:ascii="Times New Roman" w:hAnsi="Times New Roman"/>
+                <w:sz w:val="19"/>
+              </w:rPr>
+              <w:t>Mảng 2</w:t>
+            </w:r>
+          </w:p>
+        </w:tc>
+        <w:tc>
+          <w:tcPr>
+            <w:tcW w:type="dxa" w:w="2016"/>
+            <w:shd w:fill="F8FAFC"/>
+            <w:tcMar>
+              <w:top w:w="80" w:type="dxa"/>
+              <w:bottom w:w="80" w:type="dxa"/>
+              <w:left w:w="70" w:type="dxa"/>
+              <w:right w:w="70" w:type="dxa"/>
+            </w:tcMar>
+          </w:tcPr>
+          <w:p>
+            <w:pPr>
+              <w:spacing w:line="276" w:lineRule="auto"/>
+              <w:jc w:val="left"/>
+            </w:pPr>
+            <w:r>
+              <w:rPr>
+                <w:rFonts w:ascii="Times New Roman" w:hAnsi="Times New Roman"/>
+                <w:sz w:val="19"/>
+              </w:rPr>
+              <w:t>Thẻ đoàn viên vật lý &amp; thẻ đoàn viên điện tử QLDV.</w:t>
+            </w:r>
+          </w:p>
+        </w:tc>
+      </w:tr>
+      <w:tr>
+        <w:tc>
+          <w:tcPr>
+            <w:tcW w:type="dxa" w:w="576"/>
+            <w:shd w:fill="FFFFFF"/>
+            <w:tcMar>
+              <w:top w:w="80" w:type="dxa"/>
+              <w:bottom w:w="80" w:type="dxa"/>
+              <w:left w:w="70" w:type="dxa"/>
+              <w:right w:w="70" w:type="dxa"/>
+            </w:tcMar>
+          </w:tcPr>
+          <w:p>
+            <w:pPr>
+              <w:spacing w:line="276" w:lineRule="auto"/>
+              <w:jc w:val="center"/>
+            </w:pPr>
+            <w:r>
+              <w:rPr>
+                <w:rFonts w:ascii="Times New Roman" w:hAnsi="Times New Roman"/>
+                <w:b/>
+                <w:sz w:val="19"/>
+              </w:rPr>
+              <w:t>8</w:t>
+            </w:r>
+          </w:p>
+        </w:tc>
+        <w:tc>
+          <w:tcPr>
+            <w:tcW w:type="dxa" w:w="3168"/>
+            <w:shd w:fill="FFFFFF"/>
+            <w:tcMar>
+              <w:top w:w="80" w:type="dxa"/>
+              <w:bottom w:w="80" w:type="dxa"/>
+              <w:left w:w="70" w:type="dxa"/>
+              <w:right w:w="70" w:type="dxa"/>
+            </w:tcMar>
+          </w:tcPr>
+          <w:p>
+            <w:pPr>
+              <w:spacing w:line="276" w:lineRule="auto"/>
+              <w:jc w:val="left"/>
+            </w:pPr>
+            <w:r>
+              <w:rPr>
+                <w:rFonts w:ascii="Times New Roman" w:hAnsi="Times New Roman"/>
+                <w:sz w:val="19"/>
+              </w:rPr>
+              <w:t>Tập huấn cán bộ Đoàn, cán bộ TCKT cơ sở</w:t>
+            </w:r>
+          </w:p>
+        </w:tc>
+        <w:tc>
+          <w:tcPr>
+            <w:tcW w:type="dxa" w:w="1296"/>
+            <w:shd w:fill="FFFFFF"/>
+            <w:tcMar>
+              <w:top w:w="80" w:type="dxa"/>
+              <w:bottom w:w="80" w:type="dxa"/>
+              <w:left w:w="70" w:type="dxa"/>
+              <w:right w:w="70" w:type="dxa"/>
+            </w:tcMar>
+          </w:tcPr>
+          <w:p>
+            <w:pPr>
+              <w:spacing w:line="276" w:lineRule="auto"/>
+              <w:jc w:val="center"/>
+            </w:pPr>
+            <w:r>
+              <w:rPr>
+                <w:rFonts w:ascii="Times New Roman" w:hAnsi="Times New Roman"/>
+                <w:sz w:val="19"/>
+              </w:rPr>
+              <w:t>04/2027</w:t>
+            </w:r>
+          </w:p>
+        </w:tc>
+        <w:tc>
+          <w:tcPr>
+            <w:tcW w:type="dxa" w:w="1440"/>
+            <w:shd w:fill="FFFFFF"/>
+            <w:tcMar>
+              <w:top w:w="80" w:type="dxa"/>
+              <w:bottom w:w="80" w:type="dxa"/>
+              <w:left w:w="70" w:type="dxa"/>
+              <w:right w:w="70" w:type="dxa"/>
+            </w:tcMar>
+          </w:tcPr>
+          <w:p>
+            <w:pPr>
+              <w:spacing w:line="276" w:lineRule="auto"/>
+              <w:jc w:val="center"/>
+            </w:pPr>
+            <w:r>
+              <w:rPr>
+                <w:rFonts w:ascii="Times New Roman" w:hAnsi="Times New Roman"/>
+                <w:b/>
+                <w:color w:val="005BAC"/>
+                <w:sz w:val="19"/>
+              </w:rPr>
+              <w:t>M1, M2, M3</w:t>
+            </w:r>
+          </w:p>
+        </w:tc>
+        <w:tc>
+          <w:tcPr>
+            <w:tcW w:type="dxa" w:w="1296"/>
+            <w:shd w:fill="FFFFFF"/>
+            <w:tcMar>
+              <w:top w:w="80" w:type="dxa"/>
+              <w:bottom w:w="80" w:type="dxa"/>
+              <w:left w:w="70" w:type="dxa"/>
+              <w:right w:w="70" w:type="dxa"/>
+            </w:tcMar>
+          </w:tcPr>
+          <w:p>
+            <w:pPr>
+              <w:spacing w:line="276" w:lineRule="auto"/>
+              <w:jc w:val="center"/>
+            </w:pPr>
+            <w:r>
+              <w:rPr>
+                <w:rFonts w:ascii="Times New Roman" w:hAnsi="Times New Roman"/>
+                <w:sz w:val="19"/>
+              </w:rPr>
+              <w:t>Mảng 4</w:t>
+            </w:r>
+          </w:p>
+        </w:tc>
+        <w:tc>
+          <w:tcPr>
+            <w:tcW w:type="dxa" w:w="2016"/>
+            <w:shd w:fill="FFFFFF"/>
+            <w:tcMar>
+              <w:top w:w="80" w:type="dxa"/>
+              <w:bottom w:w="80" w:type="dxa"/>
+              <w:left w:w="70" w:type="dxa"/>
+              <w:right w:w="70" w:type="dxa"/>
+            </w:tcMar>
+          </w:tcPr>
+          <w:p>
+            <w:pPr>
+              <w:spacing w:line="276" w:lineRule="auto"/>
+              <w:jc w:val="left"/>
+            </w:pPr>
+            <w:r>
+              <w:rPr>
+                <w:rFonts w:ascii="Times New Roman" w:hAnsi="Times New Roman"/>
+                <w:sz w:val="19"/>
+              </w:rPr>
+              <w:t>Tài liệu tập huấn; biên bản kiểm tra nhận thức cán bộ.</w:t>
+            </w:r>
+          </w:p>
+        </w:tc>
+      </w:tr>
+      <w:tr>
+        <w:tc>
+          <w:tcPr>
+            <w:tcW w:type="dxa" w:w="576"/>
+            <w:shd w:fill="F8FAFC"/>
+            <w:tcMar>
+              <w:top w:w="80" w:type="dxa"/>
+              <w:bottom w:w="80" w:type="dxa"/>
+              <w:left w:w="70" w:type="dxa"/>
+              <w:right w:w="70" w:type="dxa"/>
+            </w:tcMar>
+          </w:tcPr>
+          <w:p>
+            <w:pPr>
+              <w:spacing w:line="276" w:lineRule="auto"/>
+              <w:jc w:val="center"/>
+            </w:pPr>
+            <w:r>
+              <w:rPr>
+                <w:rFonts w:ascii="Times New Roman" w:hAnsi="Times New Roman"/>
+                <w:b/>
+                <w:sz w:val="19"/>
+              </w:rPr>
+              <w:t>9</w:t>
+            </w:r>
+          </w:p>
+        </w:tc>
+        <w:tc>
+          <w:tcPr>
+            <w:tcW w:type="dxa" w:w="3168"/>
+            <w:shd w:fill="F8FAFC"/>
+            <w:tcMar>
+              <w:top w:w="80" w:type="dxa"/>
+              <w:bottom w:w="80" w:type="dxa"/>
+              <w:left w:w="70" w:type="dxa"/>
+              <w:right w:w="70" w:type="dxa"/>
+            </w:tcMar>
+          </w:tcPr>
+          <w:p>
+            <w:pPr>
+              <w:spacing w:line="276" w:lineRule="auto"/>
+              <w:jc w:val="left"/>
+            </w:pPr>
+            <w:r>
+              <w:rPr>
+                <w:rFonts w:ascii="Times New Roman" w:hAnsi="Times New Roman"/>
+                <w:sz w:val="19"/>
+              </w:rPr>
+              <w:t>Kết nạp Đoàn viên mới đợt 2 (chào mừng 19/5)</w:t>
+            </w:r>
+          </w:p>
+        </w:tc>
+        <w:tc>
+          <w:tcPr>
+            <w:tcW w:type="dxa" w:w="1296"/>
+            <w:shd w:fill="F8FAFC"/>
+            <w:tcMar>
+              <w:top w:w="80" w:type="dxa"/>
+              <w:bottom w:w="80" w:type="dxa"/>
+              <w:left w:w="70" w:type="dxa"/>
+              <w:right w:w="70" w:type="dxa"/>
+            </w:tcMar>
+          </w:tcPr>
+          <w:p>
+            <w:pPr>
+              <w:spacing w:line="276" w:lineRule="auto"/>
+              <w:jc w:val="center"/>
+            </w:pPr>
+            <w:r>
+              <w:rPr>
+                <w:rFonts w:ascii="Times New Roman" w:hAnsi="Times New Roman"/>
+                <w:sz w:val="19"/>
+              </w:rPr>
+              <w:t>05/2027</w:t>
+            </w:r>
+          </w:p>
+        </w:tc>
+        <w:tc>
+          <w:tcPr>
+            <w:tcW w:type="dxa" w:w="1440"/>
+            <w:shd w:fill="F8FAFC"/>
+            <w:tcMar>
+              <w:top w:w="80" w:type="dxa"/>
+              <w:bottom w:w="80" w:type="dxa"/>
+              <w:left w:w="70" w:type="dxa"/>
+              <w:right w:w="70" w:type="dxa"/>
+            </w:tcMar>
+          </w:tcPr>
+          <w:p>
+            <w:pPr>
+              <w:spacing w:line="276" w:lineRule="auto"/>
+              <w:jc w:val="center"/>
+            </w:pPr>
+            <w:r>
+              <w:rPr>
+                <w:rFonts w:ascii="Times New Roman" w:hAnsi="Times New Roman"/>
+                <w:b/>
+                <w:color w:val="005BAC"/>
+                <w:sz w:val="19"/>
+              </w:rPr>
+              <w:t>Mảng 1</w:t>
+            </w:r>
+          </w:p>
+        </w:tc>
+        <w:tc>
+          <w:tcPr>
+            <w:tcW w:type="dxa" w:w="1296"/>
+            <w:shd w:fill="F8FAFC"/>
+            <w:tcMar>
+              <w:top w:w="80" w:type="dxa"/>
+              <w:bottom w:w="80" w:type="dxa"/>
+              <w:left w:w="70" w:type="dxa"/>
+              <w:right w:w="70" w:type="dxa"/>
+            </w:tcMar>
+          </w:tcPr>
+          <w:p>
+            <w:pPr>
+              <w:spacing w:line="276" w:lineRule="auto"/>
+              <w:jc w:val="center"/>
+            </w:pPr>
+            <w:r>
+              <w:rPr>
+                <w:rFonts w:ascii="Times New Roman" w:hAnsi="Times New Roman"/>
+                <w:sz w:val="19"/>
+              </w:rPr>
+              <w:t>Mảng 4</w:t>
+            </w:r>
+          </w:p>
+        </w:tc>
+        <w:tc>
+          <w:tcPr>
+            <w:tcW w:type="dxa" w:w="2016"/>
+            <w:shd w:fill="F8FAFC"/>
+            <w:tcMar>
+              <w:top w:w="80" w:type="dxa"/>
+              <w:bottom w:w="80" w:type="dxa"/>
+              <w:left w:w="70" w:type="dxa"/>
+              <w:right w:w="70" w:type="dxa"/>
+            </w:tcMar>
+          </w:tcPr>
+          <w:p>
+            <w:pPr>
+              <w:spacing w:line="276" w:lineRule="auto"/>
+              <w:jc w:val="left"/>
+            </w:pPr>
+            <w:r>
+              <w:rPr>
+                <w:rFonts w:ascii="Times New Roman" w:hAnsi="Times New Roman"/>
+                <w:sz w:val="19"/>
+              </w:rPr>
+              <w:t>Hồ sơ kết nạp đợt 2; Nghị quyết và sổ theo dõi đoàn viên.</w:t>
+            </w:r>
+          </w:p>
+        </w:tc>
+      </w:tr>
+      <w:tr>
+        <w:tc>
+          <w:tcPr>
+            <w:tcW w:type="dxa" w:w="576"/>
+            <w:shd w:fill="FFFFFF"/>
+            <w:tcMar>
+              <w:top w:w="80" w:type="dxa"/>
+              <w:bottom w:w="80" w:type="dxa"/>
+              <w:left w:w="70" w:type="dxa"/>
+              <w:right w:w="70" w:type="dxa"/>
+            </w:tcMar>
+          </w:tcPr>
+          <w:p>
+            <w:pPr>
+              <w:spacing w:line="276" w:lineRule="auto"/>
+              <w:jc w:val="center"/>
+            </w:pPr>
+            <w:r>
+              <w:rPr>
+                <w:rFonts w:ascii="Times New Roman" w:hAnsi="Times New Roman"/>
+                <w:b/>
+                <w:sz w:val="19"/>
+              </w:rPr>
+              <w:t>10</w:t>
+            </w:r>
+          </w:p>
+        </w:tc>
+        <w:tc>
+          <w:tcPr>
+            <w:tcW w:type="dxa" w:w="3168"/>
+            <w:shd w:fill="FFFFFF"/>
+            <w:tcMar>
+              <w:top w:w="80" w:type="dxa"/>
+              <w:bottom w:w="80" w:type="dxa"/>
+              <w:left w:w="70" w:type="dxa"/>
+              <w:right w:w="70" w:type="dxa"/>
+            </w:tcMar>
+          </w:tcPr>
+          <w:p>
+            <w:pPr>
+              <w:spacing w:line="276" w:lineRule="auto"/>
+              <w:jc w:val="left"/>
+            </w:pPr>
+            <w:r>
+              <w:rPr>
+                <w:rFonts w:ascii="Times New Roman" w:hAnsi="Times New Roman"/>
+                <w:sz w:val="19"/>
+              </w:rPr>
+              <w:t>Đóng dấu nhận xét năm học sổ Đoàn cuối năm</w:t>
+            </w:r>
+          </w:p>
+        </w:tc>
+        <w:tc>
+          <w:tcPr>
+            <w:tcW w:type="dxa" w:w="1296"/>
+            <w:shd w:fill="FFFFFF"/>
+            <w:tcMar>
+              <w:top w:w="80" w:type="dxa"/>
+              <w:bottom w:w="80" w:type="dxa"/>
+              <w:left w:w="70" w:type="dxa"/>
+              <w:right w:w="70" w:type="dxa"/>
+            </w:tcMar>
+          </w:tcPr>
+          <w:p>
+            <w:pPr>
+              <w:spacing w:line="276" w:lineRule="auto"/>
+              <w:jc w:val="center"/>
+            </w:pPr>
+            <w:r>
+              <w:rPr>
+                <w:rFonts w:ascii="Times New Roman" w:hAnsi="Times New Roman"/>
+                <w:sz w:val="19"/>
+              </w:rPr>
+              <w:t>05 - 06/2027</w:t>
+            </w:r>
+          </w:p>
+        </w:tc>
+        <w:tc>
+          <w:tcPr>
+            <w:tcW w:type="dxa" w:w="1440"/>
+            <w:shd w:fill="FFFFFF"/>
+            <w:tcMar>
+              <w:top w:w="80" w:type="dxa"/>
+              <w:bottom w:w="80" w:type="dxa"/>
+              <w:left w:w="70" w:type="dxa"/>
+              <w:right w:w="70" w:type="dxa"/>
+            </w:tcMar>
+          </w:tcPr>
+          <w:p>
+            <w:pPr>
+              <w:spacing w:line="276" w:lineRule="auto"/>
+              <w:jc w:val="center"/>
+            </w:pPr>
+            <w:r>
+              <w:rPr>
+                <w:rFonts w:ascii="Times New Roman" w:hAnsi="Times New Roman"/>
+                <w:b/>
+                <w:color w:val="005BAC"/>
+                <w:sz w:val="19"/>
+              </w:rPr>
+              <w:t>Mảng 1</w:t>
+            </w:r>
+          </w:p>
+        </w:tc>
+        <w:tc>
+          <w:tcPr>
+            <w:tcW w:type="dxa" w:w="1296"/>
+            <w:shd w:fill="FFFFFF"/>
+            <w:tcMar>
+              <w:top w:w="80" w:type="dxa"/>
+              <w:bottom w:w="80" w:type="dxa"/>
+              <w:left w:w="70" w:type="dxa"/>
+              <w:right w:w="70" w:type="dxa"/>
+            </w:tcMar>
+          </w:tcPr>
+          <w:p>
+            <w:pPr>
+              <w:spacing w:line="276" w:lineRule="auto"/>
+              <w:jc w:val="center"/>
+            </w:pPr>
+            <w:r>
+              <w:rPr>
+                <w:rFonts w:ascii="Times New Roman" w:hAnsi="Times New Roman"/>
+                <w:sz w:val="19"/>
+              </w:rPr>
+              <w:t>Mảng 3</w:t>
+            </w:r>
+          </w:p>
+        </w:tc>
+        <w:tc>
+          <w:tcPr>
+            <w:tcW w:type="dxa" w:w="2016"/>
+            <w:shd w:fill="FFFFFF"/>
+            <w:tcMar>
+              <w:top w:w="80" w:type="dxa"/>
+              <w:bottom w:w="80" w:type="dxa"/>
+              <w:left w:w="70" w:type="dxa"/>
+              <w:right w:w="70" w:type="dxa"/>
+            </w:tcMar>
+          </w:tcPr>
+          <w:p>
+            <w:pPr>
+              <w:spacing w:line="276" w:lineRule="auto"/>
+              <w:jc w:val="left"/>
+            </w:pPr>
+            <w:r>
+              <w:rPr>
+                <w:rFonts w:ascii="Times New Roman" w:hAnsi="Times New Roman"/>
+                <w:sz w:val="19"/>
+              </w:rPr>
+              <w:t>100% sổ Đoàn cơ sở được nhận xét phân loại và đóng dấu.</w:t>
+            </w:r>
+          </w:p>
+        </w:tc>
+      </w:tr>
+      <w:tr>
+        <w:tc>
+          <w:tcPr>
+            <w:tcW w:type="dxa" w:w="576"/>
+            <w:shd w:fill="F8FAFC"/>
+            <w:tcMar>
+              <w:top w:w="80" w:type="dxa"/>
+              <w:bottom w:w="80" w:type="dxa"/>
+              <w:left w:w="70" w:type="dxa"/>
+              <w:right w:w="70" w:type="dxa"/>
+            </w:tcMar>
+          </w:tcPr>
+          <w:p>
+            <w:pPr>
+              <w:spacing w:line="276" w:lineRule="auto"/>
+              <w:jc w:val="center"/>
+            </w:pPr>
+            <w:r>
+              <w:rPr>
+                <w:rFonts w:ascii="Times New Roman" w:hAnsi="Times New Roman"/>
+                <w:b/>
+                <w:sz w:val="19"/>
+              </w:rPr>
+              <w:t>11</w:t>
+            </w:r>
+          </w:p>
+        </w:tc>
+        <w:tc>
+          <w:tcPr>
+            <w:tcW w:type="dxa" w:w="3168"/>
+            <w:shd w:fill="F8FAFC"/>
+            <w:tcMar>
+              <w:top w:w="80" w:type="dxa"/>
+              <w:bottom w:w="80" w:type="dxa"/>
+              <w:left w:w="70" w:type="dxa"/>
+              <w:right w:w="70" w:type="dxa"/>
+            </w:tcMar>
+          </w:tcPr>
+          <w:p>
+            <w:pPr>
+              <w:spacing w:line="276" w:lineRule="auto"/>
+              <w:jc w:val="left"/>
+            </w:pPr>
+            <w:r>
+              <w:rPr>
+                <w:rFonts w:ascii="Times New Roman" w:hAnsi="Times New Roman"/>
+                <w:sz w:val="19"/>
+              </w:rPr>
+              <w:t>Kiểm tra công tác Đoàn cuối năm (12 cơ sở)</w:t>
+            </w:r>
+          </w:p>
+        </w:tc>
+        <w:tc>
+          <w:tcPr>
+            <w:tcW w:type="dxa" w:w="1296"/>
+            <w:shd w:fill="F8FAFC"/>
+            <w:tcMar>
+              <w:top w:w="80" w:type="dxa"/>
+              <w:bottom w:w="80" w:type="dxa"/>
+              <w:left w:w="70" w:type="dxa"/>
+              <w:right w:w="70" w:type="dxa"/>
+            </w:tcMar>
+          </w:tcPr>
+          <w:p>
+            <w:pPr>
+              <w:spacing w:line="276" w:lineRule="auto"/>
+              <w:jc w:val="center"/>
+            </w:pPr>
+            <w:r>
+              <w:rPr>
+                <w:rFonts w:ascii="Times New Roman" w:hAnsi="Times New Roman"/>
+                <w:sz w:val="19"/>
+              </w:rPr>
+              <w:t>06/2027</w:t>
+            </w:r>
+          </w:p>
+        </w:tc>
+        <w:tc>
+          <w:tcPr>
+            <w:tcW w:type="dxa" w:w="1440"/>
+            <w:shd w:fill="F8FAFC"/>
+            <w:tcMar>
+              <w:top w:w="80" w:type="dxa"/>
+              <w:bottom w:w="80" w:type="dxa"/>
+              <w:left w:w="70" w:type="dxa"/>
+              <w:right w:w="70" w:type="dxa"/>
+            </w:tcMar>
+          </w:tcPr>
+          <w:p>
+            <w:pPr>
+              <w:spacing w:line="276" w:lineRule="auto"/>
+              <w:jc w:val="center"/>
+            </w:pPr>
+            <w:r>
+              <w:rPr>
+                <w:rFonts w:ascii="Times New Roman" w:hAnsi="Times New Roman"/>
+                <w:b/>
+                <w:color w:val="005BAC"/>
+                <w:sz w:val="19"/>
+              </w:rPr>
+              <w:t>Mảng 3</w:t>
+            </w:r>
+          </w:p>
+        </w:tc>
+        <w:tc>
+          <w:tcPr>
+            <w:tcW w:type="dxa" w:w="1296"/>
+            <w:shd w:fill="F8FAFC"/>
+            <w:tcMar>
+              <w:top w:w="80" w:type="dxa"/>
+              <w:bottom w:w="80" w:type="dxa"/>
+              <w:left w:w="70" w:type="dxa"/>
+              <w:right w:w="70" w:type="dxa"/>
+            </w:tcMar>
+          </w:tcPr>
+          <w:p>
+            <w:pPr>
+              <w:spacing w:line="276" w:lineRule="auto"/>
+              <w:jc w:val="center"/>
+            </w:pPr>
+            <w:r>
+              <w:rPr>
+                <w:rFonts w:ascii="Times New Roman" w:hAnsi="Times New Roman"/>
+                <w:sz w:val="19"/>
+              </w:rPr>
+              <w:t>Mảng 1</w:t>
+            </w:r>
+          </w:p>
+        </w:tc>
+        <w:tc>
+          <w:tcPr>
+            <w:tcW w:type="dxa" w:w="2016"/>
+            <w:shd w:fill="F8FAFC"/>
+            <w:tcMar>
+              <w:top w:w="80" w:type="dxa"/>
+              <w:bottom w:w="80" w:type="dxa"/>
+              <w:left w:w="70" w:type="dxa"/>
+              <w:right w:w="70" w:type="dxa"/>
+            </w:tcMar>
+          </w:tcPr>
+          <w:p>
+            <w:pPr>
+              <w:spacing w:line="276" w:lineRule="auto"/>
+              <w:jc w:val="left"/>
+            </w:pPr>
+            <w:r>
+              <w:rPr>
+                <w:rFonts w:ascii="Times New Roman" w:hAnsi="Times New Roman"/>
+                <w:sz w:val="19"/>
+              </w:rPr>
+              <w:t>12 Biên bản kiểm tra; bảng chấm điểm giấy tờ 12 đơn vị.</w:t>
+            </w:r>
+          </w:p>
+        </w:tc>
+      </w:tr>
+      <w:tr>
+        <w:tc>
+          <w:tcPr>
+            <w:tcW w:type="dxa" w:w="576"/>
+            <w:shd w:fill="FFFFFF"/>
+            <w:tcMar>
+              <w:top w:w="80" w:type="dxa"/>
+              <w:bottom w:w="80" w:type="dxa"/>
+              <w:left w:w="70" w:type="dxa"/>
+              <w:right w:w="70" w:type="dxa"/>
+            </w:tcMar>
+          </w:tcPr>
+          <w:p>
+            <w:pPr>
+              <w:spacing w:line="276" w:lineRule="auto"/>
+              <w:jc w:val="center"/>
+            </w:pPr>
+            <w:r>
+              <w:rPr>
+                <w:rFonts w:ascii="Times New Roman" w:hAnsi="Times New Roman"/>
+                <w:b/>
+                <w:sz w:val="19"/>
+              </w:rPr>
+              <w:t>12</w:t>
+            </w:r>
+          </w:p>
+        </w:tc>
+        <w:tc>
+          <w:tcPr>
+            <w:tcW w:type="dxa" w:w="3168"/>
+            <w:shd w:fill="FFFFFF"/>
+            <w:tcMar>
+              <w:top w:w="80" w:type="dxa"/>
+              <w:bottom w:w="80" w:type="dxa"/>
+              <w:left w:w="70" w:type="dxa"/>
+              <w:right w:w="70" w:type="dxa"/>
+            </w:tcMar>
+          </w:tcPr>
+          <w:p>
+            <w:pPr>
+              <w:spacing w:line="276" w:lineRule="auto"/>
+              <w:jc w:val="left"/>
+            </w:pPr>
+            <w:r>
+              <w:rPr>
+                <w:rFonts w:ascii="Times New Roman" w:hAnsi="Times New Roman"/>
+                <w:sz w:val="19"/>
+              </w:rPr>
+              <w:t>Báo cáo tổng kết, thi đua khen thưởng 2026 - 2027</w:t>
+            </w:r>
+          </w:p>
+        </w:tc>
+        <w:tc>
+          <w:tcPr>
+            <w:tcW w:type="dxa" w:w="1296"/>
+            <w:shd w:fill="FFFFFF"/>
+            <w:tcMar>
+              <w:top w:w="80" w:type="dxa"/>
+              <w:bottom w:w="80" w:type="dxa"/>
+              <w:left w:w="70" w:type="dxa"/>
+              <w:right w:w="70" w:type="dxa"/>
+            </w:tcMar>
+          </w:tcPr>
+          <w:p>
+            <w:pPr>
+              <w:spacing w:line="276" w:lineRule="auto"/>
+              <w:jc w:val="center"/>
+            </w:pPr>
+            <w:r>
+              <w:rPr>
+                <w:rFonts w:ascii="Times New Roman" w:hAnsi="Times New Roman"/>
+                <w:sz w:val="19"/>
+              </w:rPr>
+              <w:t>06/2027</w:t>
+            </w:r>
+          </w:p>
+        </w:tc>
+        <w:tc>
+          <w:tcPr>
+            <w:tcW w:type="dxa" w:w="1440"/>
+            <w:shd w:fill="FFFFFF"/>
+            <w:tcMar>
+              <w:top w:w="80" w:type="dxa"/>
+              <w:bottom w:w="80" w:type="dxa"/>
+              <w:left w:w="70" w:type="dxa"/>
+              <w:right w:w="70" w:type="dxa"/>
+            </w:tcMar>
+          </w:tcPr>
+          <w:p>
+            <w:pPr>
+              <w:spacing w:line="276" w:lineRule="auto"/>
+              <w:jc w:val="center"/>
+            </w:pPr>
+            <w:r>
+              <w:rPr>
+                <w:rFonts w:ascii="Times New Roman" w:hAnsi="Times New Roman"/>
+                <w:b/>
+                <w:color w:val="005BAC"/>
+                <w:sz w:val="19"/>
+              </w:rPr>
+              <w:t>Mảng 1</w:t>
+            </w:r>
+          </w:p>
+        </w:tc>
+        <w:tc>
+          <w:tcPr>
+            <w:tcW w:type="dxa" w:w="1296"/>
+            <w:shd w:fill="FFFFFF"/>
+            <w:tcMar>
+              <w:top w:w="80" w:type="dxa"/>
+              <w:bottom w:w="80" w:type="dxa"/>
+              <w:left w:w="70" w:type="dxa"/>
+              <w:right w:w="70" w:type="dxa"/>
+            </w:tcMar>
+          </w:tcPr>
+          <w:p>
+            <w:pPr>
+              <w:spacing w:line="276" w:lineRule="auto"/>
+              <w:jc w:val="center"/>
+            </w:pPr>
+            <w:r>
+              <w:rPr>
+                <w:rFonts w:ascii="Times New Roman" w:hAnsi="Times New Roman"/>
+                <w:sz w:val="19"/>
+              </w:rPr>
+              <w:t>M3, M4</w:t>
+            </w:r>
+          </w:p>
+        </w:tc>
+        <w:tc>
+          <w:tcPr>
+            <w:tcW w:type="dxa" w:w="2016"/>
+            <w:shd w:fill="FFFFFF"/>
+            <w:tcMar>
+              <w:top w:w="80" w:type="dxa"/>
+              <w:bottom w:w="80" w:type="dxa"/>
+              <w:left w:w="70" w:type="dxa"/>
+              <w:right w:w="70" w:type="dxa"/>
+            </w:tcMar>
+          </w:tcPr>
+          <w:p>
+            <w:pPr>
+              <w:spacing w:line="276" w:lineRule="auto"/>
+              <w:jc w:val="left"/>
+            </w:pPr>
+            <w:r>
+              <w:rPr>
+                <w:rFonts w:ascii="Times New Roman" w:hAnsi="Times New Roman"/>
+                <w:sz w:val="19"/>
+              </w:rPr>
+              <w:t>Báo cáo tổng kết Ban; quyết định khen thưởng; kỷ yếu năm.</w:t>
+            </w:r>
+          </w:p>
+        </w:tc>
+      </w:tr>
+      <w:tr>
+        <w:tc>
+          <w:tcPr>
+            <w:tcW w:type="dxa" w:w="576"/>
+            <w:shd w:fill="F8FAFC"/>
+            <w:tcMar>
+              <w:top w:w="80" w:type="dxa"/>
+              <w:bottom w:w="80" w:type="dxa"/>
+              <w:left w:w="70" w:type="dxa"/>
+              <w:right w:w="70" w:type="dxa"/>
+            </w:tcMar>
+          </w:tcPr>
+          <w:p>
+            <w:pPr>
+              <w:spacing w:line="276" w:lineRule="auto"/>
+              <w:jc w:val="center"/>
+            </w:pPr>
+            <w:r>
+              <w:rPr>
+                <w:rFonts w:ascii="Times New Roman" w:hAnsi="Times New Roman"/>
+                <w:b/>
+                <w:sz w:val="19"/>
+              </w:rPr>
+              <w:t>13</w:t>
+            </w:r>
+          </w:p>
+        </w:tc>
+        <w:tc>
+          <w:tcPr>
+            <w:tcW w:type="dxa" w:w="3168"/>
+            <w:shd w:fill="F8FAFC"/>
+            <w:tcMar>
+              <w:top w:w="80" w:type="dxa"/>
+              <w:bottom w:w="80" w:type="dxa"/>
+              <w:left w:w="70" w:type="dxa"/>
+              <w:right w:w="70" w:type="dxa"/>
+            </w:tcMar>
+          </w:tcPr>
+          <w:p>
+            <w:pPr>
+              <w:spacing w:line="276" w:lineRule="auto"/>
+              <w:jc w:val="left"/>
+            </w:pPr>
+            <w:r>
+              <w:rPr>
+                <w:rFonts w:ascii="Times New Roman" w:hAnsi="Times New Roman"/>
+                <w:sz w:val="19"/>
+              </w:rPr>
+              <w:t>Triển khai phần mềm Quản lý đoàn viên &amp; App TNVN</w:t>
+            </w:r>
+          </w:p>
+        </w:tc>
+        <w:tc>
+          <w:tcPr>
+            <w:tcW w:type="dxa" w:w="1296"/>
+            <w:shd w:fill="F8FAFC"/>
+            <w:tcMar>
+              <w:top w:w="80" w:type="dxa"/>
+              <w:bottom w:w="80" w:type="dxa"/>
+              <w:left w:w="70" w:type="dxa"/>
+              <w:right w:w="70" w:type="dxa"/>
+            </w:tcMar>
+          </w:tcPr>
+          <w:p>
+            <w:pPr>
+              <w:spacing w:line="276" w:lineRule="auto"/>
+              <w:jc w:val="center"/>
+            </w:pPr>
+            <w:r>
+              <w:rPr>
+                <w:rFonts w:ascii="Times New Roman" w:hAnsi="Times New Roman"/>
+                <w:sz w:val="19"/>
+              </w:rPr>
+              <w:t>Cả năm</w:t>
+            </w:r>
+          </w:p>
+        </w:tc>
+        <w:tc>
+          <w:tcPr>
+            <w:tcW w:type="dxa" w:w="1440"/>
+            <w:shd w:fill="F8FAFC"/>
+            <w:tcMar>
+              <w:top w:w="80" w:type="dxa"/>
+              <w:bottom w:w="80" w:type="dxa"/>
+              <w:left w:w="70" w:type="dxa"/>
+              <w:right w:w="70" w:type="dxa"/>
+            </w:tcMar>
+          </w:tcPr>
+          <w:p>
+            <w:pPr>
+              <w:spacing w:line="276" w:lineRule="auto"/>
+              <w:jc w:val="center"/>
+            </w:pPr>
+            <w:r>
+              <w:rPr>
+                <w:rFonts w:ascii="Times New Roman" w:hAnsi="Times New Roman"/>
+                <w:b/>
+                <w:color w:val="005BAC"/>
+                <w:sz w:val="19"/>
+              </w:rPr>
+              <w:t>Mảng 2</w:t>
+            </w:r>
+          </w:p>
+        </w:tc>
+        <w:tc>
+          <w:tcPr>
+            <w:tcW w:type="dxa" w:w="1296"/>
+            <w:shd w:fill="F8FAFC"/>
+            <w:tcMar>
+              <w:top w:w="80" w:type="dxa"/>
+              <w:bottom w:w="80" w:type="dxa"/>
+              <w:left w:w="70" w:type="dxa"/>
+              <w:right w:w="70" w:type="dxa"/>
+            </w:tcMar>
+          </w:tcPr>
+          <w:p>
+            <w:pPr>
+              <w:spacing w:line="276" w:lineRule="auto"/>
+              <w:jc w:val="center"/>
+            </w:pPr>
+            <w:r>
+              <w:rPr>
+                <w:rFonts w:ascii="Times New Roman" w:hAnsi="Times New Roman"/>
+                <w:sz w:val="19"/>
+              </w:rPr>
+              <w:t>Mảng 1</w:t>
+            </w:r>
+          </w:p>
+        </w:tc>
+        <w:tc>
+          <w:tcPr>
+            <w:tcW w:type="dxa" w:w="2016"/>
+            <w:shd w:fill="F8FAFC"/>
+            <w:tcMar>
+              <w:top w:w="80" w:type="dxa"/>
+              <w:bottom w:w="80" w:type="dxa"/>
+              <w:left w:w="70" w:type="dxa"/>
+              <w:right w:w="70" w:type="dxa"/>
+            </w:tcMar>
+          </w:tcPr>
+          <w:p>
+            <w:pPr>
+              <w:spacing w:line="276" w:lineRule="auto"/>
+              <w:jc w:val="left"/>
+            </w:pPr>
+            <w:r>
+              <w:rPr>
+                <w:rFonts w:ascii="Times New Roman" w:hAnsi="Times New Roman"/>
+                <w:sz w:val="19"/>
+              </w:rPr>
+              <w:t>Tài liệu SHCĐ hàng tháng; 100% ĐV đánh giá xếp loại số.</w:t>
+            </w:r>
+          </w:p>
+        </w:tc>
+      </w:tr>
+      <w:tr>
+        <w:tc>
+          <w:tcPr>
+            <w:tcW w:type="dxa" w:w="576"/>
+            <w:shd w:fill="FFFFFF"/>
+            <w:tcMar>
+              <w:top w:w="80" w:type="dxa"/>
+              <w:bottom w:w="80" w:type="dxa"/>
+              <w:left w:w="70" w:type="dxa"/>
+              <w:right w:w="70" w:type="dxa"/>
+            </w:tcMar>
+          </w:tcPr>
+          <w:p>
+            <w:pPr>
+              <w:spacing w:line="276" w:lineRule="auto"/>
+              <w:jc w:val="center"/>
+            </w:pPr>
+            <w:r>
+              <w:rPr>
+                <w:rFonts w:ascii="Times New Roman" w:hAnsi="Times New Roman"/>
+                <w:b/>
+                <w:sz w:val="19"/>
+              </w:rPr>
+              <w:t>14</w:t>
+            </w:r>
+          </w:p>
+        </w:tc>
+        <w:tc>
+          <w:tcPr>
+            <w:tcW w:type="dxa" w:w="3168"/>
+            <w:shd w:fill="FFFFFF"/>
+            <w:tcMar>
+              <w:top w:w="80" w:type="dxa"/>
+              <w:bottom w:w="80" w:type="dxa"/>
+              <w:left w:w="70" w:type="dxa"/>
+              <w:right w:w="70" w:type="dxa"/>
+            </w:tcMar>
+          </w:tcPr>
+          <w:p>
+            <w:pPr>
+              <w:spacing w:line="276" w:lineRule="auto"/>
+              <w:jc w:val="left"/>
+            </w:pPr>
+            <w:r>
+              <w:rPr>
+                <w:rFonts w:ascii="Times New Roman" w:hAnsi="Times New Roman"/>
+                <w:sz w:val="19"/>
+              </w:rPr>
+              <w:t>Tạo hoạt động &amp; duyệt minh chứng ĐRL cho SV</w:t>
+            </w:r>
+          </w:p>
+        </w:tc>
+        <w:tc>
+          <w:tcPr>
+            <w:tcW w:type="dxa" w:w="1296"/>
+            <w:shd w:fill="FFFFFF"/>
+            <w:tcMar>
+              <w:top w:w="80" w:type="dxa"/>
+              <w:bottom w:w="80" w:type="dxa"/>
+              <w:left w:w="70" w:type="dxa"/>
+              <w:right w:w="70" w:type="dxa"/>
+            </w:tcMar>
+          </w:tcPr>
+          <w:p>
+            <w:pPr>
+              <w:spacing w:line="276" w:lineRule="auto"/>
+              <w:jc w:val="center"/>
+            </w:pPr>
+            <w:r>
+              <w:rPr>
+                <w:rFonts w:ascii="Times New Roman" w:hAnsi="Times New Roman"/>
+                <w:sz w:val="19"/>
+              </w:rPr>
+              <w:t>Cả năm</w:t>
+            </w:r>
+          </w:p>
+        </w:tc>
+        <w:tc>
+          <w:tcPr>
+            <w:tcW w:type="dxa" w:w="1440"/>
+            <w:shd w:fill="FFFFFF"/>
+            <w:tcMar>
+              <w:top w:w="80" w:type="dxa"/>
+              <w:bottom w:w="80" w:type="dxa"/>
+              <w:left w:w="70" w:type="dxa"/>
+              <w:right w:w="70" w:type="dxa"/>
+            </w:tcMar>
+          </w:tcPr>
+          <w:p>
+            <w:pPr>
+              <w:spacing w:line="276" w:lineRule="auto"/>
+              <w:jc w:val="center"/>
+            </w:pPr>
+            <w:r>
+              <w:rPr>
+                <w:rFonts w:ascii="Times New Roman" w:hAnsi="Times New Roman"/>
+                <w:b/>
+                <w:color w:val="005BAC"/>
+                <w:sz w:val="19"/>
+              </w:rPr>
+              <w:t>Mảng 3</w:t>
+            </w:r>
+          </w:p>
+        </w:tc>
+        <w:tc>
+          <w:tcPr>
+            <w:tcW w:type="dxa" w:w="1296"/>
+            <w:shd w:fill="FFFFFF"/>
+            <w:tcMar>
+              <w:top w:w="80" w:type="dxa"/>
+              <w:bottom w:w="80" w:type="dxa"/>
+              <w:left w:w="70" w:type="dxa"/>
+              <w:right w:w="70" w:type="dxa"/>
+            </w:tcMar>
+          </w:tcPr>
+          <w:p>
+            <w:pPr>
+              <w:spacing w:line="276" w:lineRule="auto"/>
+              <w:jc w:val="center"/>
+            </w:pPr>
+            <w:r>
+              <w:rPr>
+                <w:rFonts w:ascii="Times New Roman" w:hAnsi="Times New Roman"/>
+                <w:sz w:val="19"/>
+              </w:rPr>
+              <w:t>Mảng 4</w:t>
+            </w:r>
+          </w:p>
+        </w:tc>
+        <w:tc>
+          <w:tcPr>
+            <w:tcW w:type="dxa" w:w="2016"/>
+            <w:shd w:fill="FFFFFF"/>
+            <w:tcMar>
+              <w:top w:w="80" w:type="dxa"/>
+              <w:bottom w:w="80" w:type="dxa"/>
+              <w:left w:w="70" w:type="dxa"/>
+              <w:right w:w="70" w:type="dxa"/>
+            </w:tcMar>
+          </w:tcPr>
+          <w:p>
+            <w:pPr>
+              <w:spacing w:line="276" w:lineRule="auto"/>
+              <w:jc w:val="left"/>
+            </w:pPr>
+            <w:r>
+              <w:rPr>
+                <w:rFonts w:ascii="Times New Roman" w:hAnsi="Times New Roman"/>
+                <w:sz w:val="19"/>
+              </w:rPr>
+              <w:t>Danh mục mã ĐRL; biên bản hậu kiểm; kết quả giải quyết khiếu nại.</w:t>
+            </w:r>
+          </w:p>
+        </w:tc>
+      </w:tr>
+      <w:tr>
+        <w:tc>
+          <w:tcPr>
+            <w:tcW w:type="dxa" w:w="576"/>
+            <w:shd w:fill="F8FAFC"/>
+            <w:tcMar>
+              <w:top w:w="80" w:type="dxa"/>
+              <w:bottom w:w="80" w:type="dxa"/>
+              <w:left w:w="70" w:type="dxa"/>
+              <w:right w:w="70" w:type="dxa"/>
+            </w:tcMar>
+          </w:tcPr>
+          <w:p>
+            <w:pPr>
+              <w:spacing w:line="276" w:lineRule="auto"/>
+              <w:jc w:val="center"/>
+            </w:pPr>
+            <w:r>
+              <w:rPr>
+                <w:rFonts w:ascii="Times New Roman" w:hAnsi="Times New Roman"/>
+                <w:b/>
+                <w:sz w:val="19"/>
+              </w:rPr>
+              <w:t>15</w:t>
+            </w:r>
+          </w:p>
+        </w:tc>
+        <w:tc>
+          <w:tcPr>
+            <w:tcW w:type="dxa" w:w="3168"/>
+            <w:shd w:fill="F8FAFC"/>
+            <w:tcMar>
+              <w:top w:w="80" w:type="dxa"/>
+              <w:bottom w:w="80" w:type="dxa"/>
+              <w:left w:w="70" w:type="dxa"/>
+              <w:right w:w="70" w:type="dxa"/>
+            </w:tcMar>
+          </w:tcPr>
+          <w:p>
+            <w:pPr>
+              <w:spacing w:line="276" w:lineRule="auto"/>
+              <w:jc w:val="left"/>
+            </w:pPr>
+            <w:r>
+              <w:rPr>
+                <w:rFonts w:ascii="Times New Roman" w:hAnsi="Times New Roman"/>
+                <w:sz w:val="19"/>
+              </w:rPr>
+              <w:t>Công tác kiểm tra, Đảng vụ, kiện toàn xuyên suốt</w:t>
+            </w:r>
+          </w:p>
+        </w:tc>
+        <w:tc>
+          <w:tcPr>
+            <w:tcW w:type="dxa" w:w="1296"/>
+            <w:shd w:fill="F8FAFC"/>
+            <w:tcMar>
+              <w:top w:w="80" w:type="dxa"/>
+              <w:bottom w:w="80" w:type="dxa"/>
+              <w:left w:w="70" w:type="dxa"/>
+              <w:right w:w="70" w:type="dxa"/>
+            </w:tcMar>
+          </w:tcPr>
+          <w:p>
+            <w:pPr>
+              <w:spacing w:line="276" w:lineRule="auto"/>
+              <w:jc w:val="center"/>
+            </w:pPr>
+            <w:r>
+              <w:rPr>
+                <w:rFonts w:ascii="Times New Roman" w:hAnsi="Times New Roman"/>
+                <w:sz w:val="19"/>
+              </w:rPr>
+              <w:t>Cả năm</w:t>
+            </w:r>
+          </w:p>
+        </w:tc>
+        <w:tc>
+          <w:tcPr>
+            <w:tcW w:type="dxa" w:w="1440"/>
+            <w:shd w:fill="F8FAFC"/>
+            <w:tcMar>
+              <w:top w:w="80" w:type="dxa"/>
+              <w:bottom w:w="80" w:type="dxa"/>
+              <w:left w:w="70" w:type="dxa"/>
+              <w:right w:w="70" w:type="dxa"/>
+            </w:tcMar>
+          </w:tcPr>
+          <w:p>
+            <w:pPr>
+              <w:spacing w:line="276" w:lineRule="auto"/>
+              <w:jc w:val="center"/>
+            </w:pPr>
+            <w:r>
+              <w:rPr>
+                <w:rFonts w:ascii="Times New Roman" w:hAnsi="Times New Roman"/>
+                <w:b/>
+                <w:color w:val="005BAC"/>
+                <w:sz w:val="19"/>
+              </w:rPr>
+              <w:t>M2 (Đảng)</w:t>
+              <w:br/>
+              <w:t>M3 (Kiểm tra)</w:t>
+              <w:br/>
+              <w:t>M1 (Kiện toàn)</w:t>
+            </w:r>
+          </w:p>
+        </w:tc>
+        <w:tc>
+          <w:tcPr>
+            <w:tcW w:type="dxa" w:w="1296"/>
+            <w:shd w:fill="F8FAFC"/>
+            <w:tcMar>
+              <w:top w:w="80" w:type="dxa"/>
+              <w:bottom w:w="80" w:type="dxa"/>
+              <w:left w:w="70" w:type="dxa"/>
+              <w:right w:w="70" w:type="dxa"/>
+            </w:tcMar>
+          </w:tcPr>
+          <w:p>
+            <w:pPr>
+              <w:spacing w:line="276" w:lineRule="auto"/>
+              <w:jc w:val="center"/>
+            </w:pPr>
+            <w:r>
+              <w:rPr>
+                <w:rFonts w:ascii="Times New Roman" w:hAnsi="Times New Roman"/>
+                <w:sz w:val="19"/>
+              </w:rPr>
+              <w:t>Lãnh đạo Ban</w:t>
+            </w:r>
+          </w:p>
+        </w:tc>
+        <w:tc>
+          <w:tcPr>
+            <w:tcW w:type="dxa" w:w="2016"/>
+            <w:shd w:fill="F8FAFC"/>
+            <w:tcMar>
+              <w:top w:w="80" w:type="dxa"/>
+              <w:bottom w:w="80" w:type="dxa"/>
+              <w:left w:w="70" w:type="dxa"/>
+              <w:right w:w="70" w:type="dxa"/>
+            </w:tcMar>
+          </w:tcPr>
+          <w:p>
+            <w:pPr>
+              <w:spacing w:line="276" w:lineRule="auto"/>
+              <w:jc w:val="left"/>
+            </w:pPr>
+            <w:r>
+              <w:rPr>
+                <w:rFonts w:ascii="Times New Roman" w:hAnsi="Times New Roman"/>
+                <w:sz w:val="19"/>
+              </w:rPr>
+              <w:t>Báo cáo tiến độ hồ sơ Đảng; thông báo kết luận kiểm tra; QĐ chuẩn y.</w:t>
+            </w:r>
+          </w:p>
+        </w:tc>
+      </w:tr>
+    </w:tbl>
+    <w:p>
+      <w:pPr>
+        <w:spacing w:before="280" w:after="80"/>
+      </w:pPr>
+      <w:r>
+        <w:rPr>
+          <w:rFonts w:ascii="Times New Roman" w:hAnsi="Times New Roman"/>
+          <w:b/>
+          <w:sz w:val="26"/>
+        </w:rPr>
+        <w:t>2. Phân định chi tiết trách nhiệm của 04 Mảng chuyên môn</w:t>
+      </w:r>
+    </w:p>
+    <w:p>
+      <w:pPr>
+        <w:pStyle w:val="ListBullet"/>
+        <w:spacing w:after="80" w:line="288" w:lineRule="auto"/>
+      </w:pPr>
+      <w:r>
+        <w:rPr>
+          <w:rFonts w:ascii="Times New Roman" w:hAnsi="Times New Roman"/>
+          <w:b/>
+          <w:color w:val="00458C"/>
+        </w:rPr>
+        <w:t xml:space="preserve">Mảng 1 (Tổ chức - Đoàn vụ, 20 đồng chí): </w:t>
+      </w:r>
+      <w:r>
+        <w:rPr>
+          <w:rFonts w:ascii="Times New Roman" w:hAnsi="Times New Roman"/>
+          <w:sz w:val="22"/>
+        </w:rPr>
+        <w:t>Đóng vai trò 'xương sống' hành chính của Ban; chủ trì 10/15 nhiệm vụ trọng tâm năm học. Phụ trách trọn gói quy trình phát triển Đoàn (02 đợt kết nạp), Đại hội chi đoàn &amp; thành lập chi đoàn K71, ra mắt Ban Cán sự K71, nghiệp vụ sổ Đoàn (tiếp nhận tháng 12, nhận xét tháng 5-6), thu đoàn phí K71 và công nợ K68-K70, làm thẻ đoàn viên, tổng hợp hồ sơ thi đua khen thưởng và các hội nghị kiện toàn nhân sự cơ sở.</w:t>
+      </w:r>
+    </w:p>
+    <w:p>
+      <w:pPr>
+        <w:pStyle w:val="ListBullet"/>
+        <w:spacing w:after="80" w:line="288" w:lineRule="auto"/>
+      </w:pPr>
+      <w:r>
+        <w:rPr>
+          <w:rFonts w:ascii="Times New Roman" w:hAnsi="Times New Roman"/>
+          <w:b/>
+          <w:color w:val="00458C"/>
+        </w:rPr>
+        <w:t xml:space="preserve">Mảng 2 (Đảng vụ - Chuyển đổi số, 14 đồng chí): </w:t>
+      </w:r>
+      <w:r>
+        <w:rPr>
+          <w:rFonts w:ascii="Times New Roman" w:hAnsi="Times New Roman"/>
+          <w:sz w:val="22"/>
+        </w:rPr>
+        <w:t>Chủ trì toàn diện hạ tầng số và quy trình Đảng vụ. Đảm nhiệm vận hành phần mềm Quản lý đoàn viên (QLDV) và ứng dụng Thanh niên Việt Nam xuyên suốt cả năm học: giám sát đăng tải tài liệu sinh hoạt chi đoàn số hàng tháng, bảo đảm 100% ĐV đăng ký rèn luyện đoàn viên và được cấp thẻ/sổ điện tử, đánh giá xếp loại số; chủ trì thẩm tra, quản lý tiến độ hồ sơ phát triển Đảng, liên kết dữ liệu với Văn phòng Đảng ủy.</w:t>
+      </w:r>
+    </w:p>
+    <w:p>
+      <w:pPr>
+        <w:pStyle w:val="ListBullet"/>
+        <w:spacing w:after="80" w:line="288" w:lineRule="auto"/>
+      </w:pPr>
+      <w:r>
+        <w:rPr>
+          <w:rFonts w:ascii="Times New Roman" w:hAnsi="Times New Roman"/>
+          <w:b/>
+          <w:color w:val="00458C"/>
+        </w:rPr>
+        <w:t xml:space="preserve">Mảng 3 (Kiểm tra - Điểm rèn luyện, 20 đồng chí): </w:t>
+      </w:r>
+      <w:r>
+        <w:rPr>
+          <w:rFonts w:ascii="Times New Roman" w:hAnsi="Times New Roman"/>
+          <w:sz w:val="22"/>
+        </w:rPr>
+        <w:t>Chủ trì nghiệp vụ có tần suất tương tác lớn nhất của Ban. Thẩm định đề án, kiểm duyệt tính chất và cấp mã hoạt động ĐRL xuyên suốt cả năm học; trực ban giải quyết thắc mắc, khiếu nại minh chứng cho sinh viên; chủ trì Đoàn kiểm tra công tác Đoàn và phong trào thanh niên cuối năm đối với 12 cơ sở (tháng 6/2027); thẩm định minh chứng giấy tờ và tính hợp lệ của điểm thi đua.</w:t>
+      </w:r>
+    </w:p>
+    <w:p>
+      <w:pPr>
+        <w:pStyle w:val="ListBullet"/>
+        <w:spacing w:after="80" w:line="288" w:lineRule="auto"/>
+      </w:pPr>
+      <w:r>
+        <w:rPr>
+          <w:rFonts w:ascii="Times New Roman" w:hAnsi="Times New Roman"/>
+          <w:b/>
+          <w:color w:val="00458C"/>
+        </w:rPr>
+        <w:t xml:space="preserve">Mảng 4 (Truyền thông - Sự kiện và Phát triển nội bộ, 10 đồng chí): </w:t>
+      </w:r>
+      <w:r>
+        <w:rPr>
+          <w:rFonts w:ascii="Times New Roman" w:hAnsi="Times New Roman"/>
+          <w:sz w:val="22"/>
+        </w:rPr>
+        <w:t>Đồng hành hỗ trợ toàn diện các hoạt động của Ban và Đoàn Đại học: Xây dựng chiến dịch truyền thông tuyển thành viên (tháng 9/2026); tổ chức Lễ ra mắt Ban Cán sự K71; truyền thông 02 đợt kết nạp Đoàn viên mới; chủ trì công tác hậu cần, tài liệu, địa điểm cho Hội nghị tập huấn cán bộ Đoàn (tháng 4/2027); sản xuất ấn phẩm tổng kết năm học, kỷ yếu Ban và chăm lo đời sống nội bộ.</w:t>
+      </w:r>
+    </w:p>
+    <w:p>
+      <w:pPr>
+        <w:spacing w:before="280" w:after="80"/>
+      </w:pPr>
+      <w:r>
+        <w:rPr>
+          <w:rFonts w:ascii="Times New Roman" w:hAnsi="Times New Roman"/>
+          <w:b/>
+          <w:sz w:val="26"/>
+        </w:rPr>
+        <w:t>3. Bộ Tiêu chí Chấm điểm Thi đua Cơ sở Năm học 2026 - 2027 (Tiêu chí Ban TCKT)</w:t>
+      </w:r>
+    </w:p>
+    <w:p>
+      <w:pPr>
+        <w:spacing w:after="120" w:line="300" w:lineRule="auto"/>
+        <w:ind w:firstLine="562"/>
+      </w:pPr>
+      <w:r>
+        <w:t>Nhằm bảo đảm tính minh bạch, công bằng và định lượng trong đánh giá thi đua, Ban TCKT công bố Khung 11 tiêu chí chấm điểm đối với 12 Đoàn trường, Liên chi đoàn cơ sở với tổng điểm chuẩn là 950 điểm (chưa kể điểm thưởng tối đa 60 điểm và các khoản điểm trừ vi phạm). Các Mảng chuyên môn chịu trách nhiệm theo dõi và thẩm định số liệu cụ thể như sau:</w:t>
+      </w:r>
+    </w:p>
+    <w:tbl>
+      <w:tblPr>
+        <w:tblW w:type="auto" w:w="0"/>
+        <w:jc w:val="center"/>
+        <w:tblLayout w:type="fixed"/>
+        <w:tblLook w:firstColumn="1" w:firstRow="1" w:lastColumn="0" w:lastRow="0" w:noHBand="0" w:noVBand="1" w:val="04A0"/>
+        <w:tblBorders>
+          <w:top w:val="single" w:sz="4" w:space="0" w:color="CBD5E1"/>
+          <w:bottom w:val="single" w:sz="4" w:space="0" w:color="CBD5E1"/>
+          <w:left w:val="single" w:sz="4" w:space="0" w:color="CBD5E1"/>
+          <w:right w:val="single" w:sz="4" w:space="0" w:color="CBD5E1"/>
+          <w:insideH w:val="single" w:sz="4" w:space="0" w:color="CBD5E1"/>
+          <w:insideV w:val="single" w:sz="4" w:space="0" w:color="CBD5E1"/>
+        </w:tblBorders>
+      </w:tblPr>
+      <w:tblGrid>
+        <w:gridCol w:w="1871"/>
+        <w:gridCol w:w="1871"/>
+        <w:gridCol w:w="1871"/>
+        <w:gridCol w:w="1871"/>
+        <w:gridCol w:w="1871"/>
+      </w:tblGrid>
+      <w:tr>
+        <w:tc>
+          <w:tcPr>
+            <w:tcW w:type="dxa" w:w="720"/>
+            <w:shd w:fill="00458C"/>
+            <w:tcMar>
+              <w:top w:w="100" w:type="dxa"/>
+              <w:bottom w:w="100" w:type="dxa"/>
+              <w:left w:w="80" w:type="dxa"/>
+              <w:right w:w="80" w:type="dxa"/>
+            </w:tcMar>
+          </w:tcPr>
+          <w:p>
+            <w:pPr>
+              <w:jc w:val="center"/>
+            </w:pPr>
+            <w:r>
+              <w:rPr>
+                <w:rFonts w:ascii="Times New Roman" w:hAnsi="Times New Roman"/>
+                <w:b/>
+                <w:color w:val="FFFFFF"/>
+                <w:sz w:val="20"/>
+              </w:rPr>
+              <w:t>STT</w:t>
+            </w:r>
+          </w:p>
+        </w:tc>
+        <w:tc>
+          <w:tcPr>
+            <w:tcW w:type="dxa" w:w="3312"/>
+            <w:shd w:fill="00458C"/>
+            <w:tcMar>
+              <w:top w:w="100" w:type="dxa"/>
+              <w:bottom w:w="100" w:type="dxa"/>
+              <w:left w:w="80" w:type="dxa"/>
+              <w:right w:w="80" w:type="dxa"/>
+            </w:tcMar>
+          </w:tcPr>
+          <w:p>
+            <w:pPr>
+              <w:jc w:val="center"/>
+            </w:pPr>
+            <w:r>
+              <w:rPr>
+                <w:rFonts w:ascii="Times New Roman" w:hAnsi="Times New Roman"/>
+                <w:b/>
+                <w:color w:val="FFFFFF"/>
+                <w:sz w:val="20"/>
+              </w:rPr>
+              <w:t>Nhóm Tiêu chí Chấm điểm</w:t>
+            </w:r>
+          </w:p>
+        </w:tc>
+        <w:tc>
+          <w:tcPr>
+            <w:tcW w:type="dxa" w:w="3744"/>
+            <w:shd w:fill="00458C"/>
+            <w:tcMar>
+              <w:top w:w="100" w:type="dxa"/>
+              <w:bottom w:w="100" w:type="dxa"/>
+              <w:left w:w="80" w:type="dxa"/>
+              <w:right w:w="80" w:type="dxa"/>
+            </w:tcMar>
+          </w:tcPr>
+          <w:p>
+            <w:pPr>
+              <w:jc w:val="center"/>
+            </w:pPr>
+            <w:r>
+              <w:rPr>
+                <w:rFonts w:ascii="Times New Roman" w:hAnsi="Times New Roman"/>
+                <w:b/>
+                <w:color w:val="FFFFFF"/>
+                <w:sz w:val="20"/>
+              </w:rPr>
+              <w:t>Nội dung &amp; Cách tính điểm chi tiết</w:t>
+            </w:r>
+          </w:p>
+        </w:tc>
+        <w:tc>
+          <w:tcPr>
+            <w:tcW w:type="dxa" w:w="1152"/>
+            <w:shd w:fill="00458C"/>
+            <w:tcMar>
+              <w:top w:w="100" w:type="dxa"/>
+              <w:bottom w:w="100" w:type="dxa"/>
+              <w:left w:w="80" w:type="dxa"/>
+              <w:right w:w="80" w:type="dxa"/>
+            </w:tcMar>
+          </w:tcPr>
+          <w:p>
+            <w:pPr>
+              <w:jc w:val="center"/>
+            </w:pPr>
+            <w:r>
+              <w:rPr>
+                <w:rFonts w:ascii="Times New Roman" w:hAnsi="Times New Roman"/>
+                <w:b/>
+                <w:color w:val="FFFFFF"/>
+                <w:sz w:val="20"/>
+              </w:rPr>
+              <w:t>Điểm Max</w:t>
+            </w:r>
+          </w:p>
+        </w:tc>
+        <w:tc>
+          <w:tcPr>
+            <w:tcW w:type="dxa" w:w="1296"/>
+            <w:shd w:fill="00458C"/>
+            <w:tcMar>
+              <w:top w:w="100" w:type="dxa"/>
+              <w:bottom w:w="100" w:type="dxa"/>
+              <w:left w:w="80" w:type="dxa"/>
+              <w:right w:w="80" w:type="dxa"/>
+            </w:tcMar>
+          </w:tcPr>
+          <w:p>
+            <w:pPr>
+              <w:jc w:val="center"/>
+            </w:pPr>
+            <w:r>
+              <w:rPr>
+                <w:rFonts w:ascii="Times New Roman" w:hAnsi="Times New Roman"/>
+                <w:b/>
+                <w:color w:val="FFFFFF"/>
+                <w:sz w:val="20"/>
+              </w:rPr>
+              <w:t>Mảng Phụ trách</w:t>
+            </w:r>
+          </w:p>
+        </w:tc>
+      </w:tr>
+      <w:tr>
+        <w:tc>
+          <w:tcPr>
+            <w:tcW w:type="dxa" w:w="720"/>
+            <w:shd w:fill="F8FAFC"/>
+            <w:tcMar>
+              <w:top w:w="80" w:type="dxa"/>
+              <w:bottom w:w="80" w:type="dxa"/>
+              <w:left w:w="70" w:type="dxa"/>
+              <w:right w:w="70" w:type="dxa"/>
+            </w:tcMar>
+          </w:tcPr>
+          <w:p>
+            <w:pPr>
+              <w:spacing w:line="276" w:lineRule="auto"/>
+              <w:jc w:val="center"/>
+            </w:pPr>
+            <w:r>
+              <w:rPr>
+                <w:rFonts w:ascii="Times New Roman" w:hAnsi="Times New Roman"/>
+                <w:b/>
+                <w:sz w:val="19"/>
+              </w:rPr>
+              <w:t>1</w:t>
+            </w:r>
+          </w:p>
+        </w:tc>
+        <w:tc>
+          <w:tcPr>
+            <w:tcW w:type="dxa" w:w="3312"/>
+            <w:shd w:fill="F8FAFC"/>
+            <w:tcMar>
+              <w:top w:w="80" w:type="dxa"/>
+              <w:bottom w:w="80" w:type="dxa"/>
+              <w:left w:w="70" w:type="dxa"/>
+              <w:right w:w="70" w:type="dxa"/>
+            </w:tcMar>
+          </w:tcPr>
+          <w:p>
+            <w:pPr>
+              <w:spacing w:line="276" w:lineRule="auto"/>
+              <w:jc w:val="left"/>
+            </w:pPr>
+            <w:r>
+              <w:rPr>
+                <w:rFonts w:ascii="Times New Roman" w:hAnsi="Times New Roman"/>
+                <w:sz w:val="19"/>
+              </w:rPr>
+              <w:t>Công tác thu chi Đoàn phí</w:t>
+            </w:r>
+          </w:p>
+        </w:tc>
+        <w:tc>
+          <w:tcPr>
+            <w:tcW w:type="dxa" w:w="3744"/>
+            <w:shd w:fill="F8FAFC"/>
+            <w:tcMar>
+              <w:top w:w="80" w:type="dxa"/>
+              <w:bottom w:w="80" w:type="dxa"/>
+              <w:left w:w="70" w:type="dxa"/>
+              <w:right w:w="70" w:type="dxa"/>
+            </w:tcMar>
+          </w:tcPr>
+          <w:p>
+            <w:pPr>
+              <w:spacing w:line="276" w:lineRule="auto"/>
+              <w:jc w:val="left"/>
+            </w:pPr>
+            <w:r>
+              <w:rPr>
+                <w:rFonts w:ascii="Times New Roman" w:hAnsi="Times New Roman"/>
+                <w:sz w:val="19"/>
+              </w:rPr>
+              <w:t>Tính theo tỷ lệ: (Tổng số đoàn viên đóng đoàn phí / tổng số đoàn viên theo danh sách) × 100 điểm.</w:t>
+            </w:r>
+          </w:p>
+        </w:tc>
+        <w:tc>
+          <w:tcPr>
+            <w:tcW w:type="dxa" w:w="1152"/>
+            <w:shd w:fill="F8FAFC"/>
+            <w:tcMar>
+              <w:top w:w="80" w:type="dxa"/>
+              <w:bottom w:w="80" w:type="dxa"/>
+              <w:left w:w="70" w:type="dxa"/>
+              <w:right w:w="70" w:type="dxa"/>
+            </w:tcMar>
+          </w:tcPr>
+          <w:p>
+            <w:pPr>
+              <w:spacing w:line="276" w:lineRule="auto"/>
+              <w:jc w:val="center"/>
+            </w:pPr>
+            <w:r>
+              <w:rPr>
+                <w:rFonts w:ascii="Times New Roman" w:hAnsi="Times New Roman"/>
+                <w:b/>
+                <w:color w:val="005BAC"/>
+                <w:sz w:val="19"/>
+              </w:rPr>
+              <w:t>100</w:t>
+            </w:r>
+          </w:p>
+        </w:tc>
+        <w:tc>
+          <w:tcPr>
+            <w:tcW w:type="dxa" w:w="1296"/>
+            <w:shd w:fill="F8FAFC"/>
+            <w:tcMar>
+              <w:top w:w="80" w:type="dxa"/>
+              <w:bottom w:w="80" w:type="dxa"/>
+              <w:left w:w="70" w:type="dxa"/>
+              <w:right w:w="70" w:type="dxa"/>
+            </w:tcMar>
+          </w:tcPr>
+          <w:p>
+            <w:pPr>
+              <w:spacing w:line="276" w:lineRule="auto"/>
+              <w:jc w:val="center"/>
+            </w:pPr>
+            <w:r>
+              <w:rPr>
+                <w:rFonts w:ascii="Times New Roman" w:hAnsi="Times New Roman"/>
+                <w:b/>
+                <w:sz w:val="19"/>
+              </w:rPr>
+              <w:t>Mảng 1</w:t>
+            </w:r>
+          </w:p>
+        </w:tc>
+      </w:tr>
+      <w:tr>
+        <w:tc>
+          <w:tcPr>
+            <w:tcW w:type="dxa" w:w="720"/>
+            <w:shd w:fill="FFFFFF"/>
+            <w:tcMar>
+              <w:top w:w="80" w:type="dxa"/>
+              <w:bottom w:w="80" w:type="dxa"/>
+              <w:left w:w="70" w:type="dxa"/>
+              <w:right w:w="70" w:type="dxa"/>
+            </w:tcMar>
+          </w:tcPr>
+          <w:p>
+            <w:pPr>
+              <w:spacing w:line="276" w:lineRule="auto"/>
+              <w:jc w:val="center"/>
+            </w:pPr>
+            <w:r>
+              <w:rPr>
+                <w:rFonts w:ascii="Times New Roman" w:hAnsi="Times New Roman"/>
+                <w:b/>
+                <w:sz w:val="19"/>
+              </w:rPr>
+              <w:t>2</w:t>
+            </w:r>
+          </w:p>
+        </w:tc>
+        <w:tc>
+          <w:tcPr>
+            <w:tcW w:type="dxa" w:w="3312"/>
+            <w:shd w:fill="FFFFFF"/>
+            <w:tcMar>
+              <w:top w:w="80" w:type="dxa"/>
+              <w:bottom w:w="80" w:type="dxa"/>
+              <w:left w:w="70" w:type="dxa"/>
+              <w:right w:w="70" w:type="dxa"/>
+            </w:tcMar>
+          </w:tcPr>
+          <w:p>
+            <w:pPr>
+              <w:spacing w:line="276" w:lineRule="auto"/>
+              <w:jc w:val="left"/>
+            </w:pPr>
+            <w:r>
+              <w:rPr>
+                <w:rFonts w:ascii="Times New Roman" w:hAnsi="Times New Roman"/>
+                <w:sz w:val="19"/>
+              </w:rPr>
+              <w:t>Công tác phát triển Đoàn</w:t>
+            </w:r>
+          </w:p>
+        </w:tc>
+        <w:tc>
+          <w:tcPr>
+            <w:tcW w:type="dxa" w:w="3744"/>
+            <w:shd w:fill="FFFFFF"/>
+            <w:tcMar>
+              <w:top w:w="80" w:type="dxa"/>
+              <w:bottom w:w="80" w:type="dxa"/>
+              <w:left w:w="70" w:type="dxa"/>
+              <w:right w:w="70" w:type="dxa"/>
+            </w:tcMar>
+          </w:tcPr>
+          <w:p>
+            <w:pPr>
+              <w:spacing w:line="276" w:lineRule="auto"/>
+              <w:jc w:val="left"/>
+            </w:pPr>
+            <w:r>
+              <w:rPr>
+                <w:rFonts w:ascii="Times New Roman" w:hAnsi="Times New Roman"/>
+                <w:sz w:val="19"/>
+              </w:rPr>
+              <w:t>• Đạt &gt;= 80% so với chỉ tiêu năm học: 50 điểm.</w:t>
+              <w:br/>
+              <w:t>• Đạt &gt;= 50% so với chỉ tiêu năm học: 25 điểm.</w:t>
+            </w:r>
+          </w:p>
+        </w:tc>
+        <w:tc>
+          <w:tcPr>
+            <w:tcW w:type="dxa" w:w="1152"/>
+            <w:shd w:fill="FFFFFF"/>
+            <w:tcMar>
+              <w:top w:w="80" w:type="dxa"/>
+              <w:bottom w:w="80" w:type="dxa"/>
+              <w:left w:w="70" w:type="dxa"/>
+              <w:right w:w="70" w:type="dxa"/>
+            </w:tcMar>
+          </w:tcPr>
+          <w:p>
+            <w:pPr>
+              <w:spacing w:line="276" w:lineRule="auto"/>
+              <w:jc w:val="center"/>
+            </w:pPr>
+            <w:r>
+              <w:rPr>
+                <w:rFonts w:ascii="Times New Roman" w:hAnsi="Times New Roman"/>
+                <w:b/>
+                <w:color w:val="005BAC"/>
+                <w:sz w:val="19"/>
+              </w:rPr>
+              <w:t>50</w:t>
+            </w:r>
+          </w:p>
+        </w:tc>
+        <w:tc>
+          <w:tcPr>
+            <w:tcW w:type="dxa" w:w="1296"/>
+            <w:shd w:fill="FFFFFF"/>
+            <w:tcMar>
+              <w:top w:w="80" w:type="dxa"/>
+              <w:bottom w:w="80" w:type="dxa"/>
+              <w:left w:w="70" w:type="dxa"/>
+              <w:right w:w="70" w:type="dxa"/>
+            </w:tcMar>
+          </w:tcPr>
+          <w:p>
+            <w:pPr>
+              <w:spacing w:line="276" w:lineRule="auto"/>
+              <w:jc w:val="center"/>
+            </w:pPr>
+            <w:r>
+              <w:rPr>
+                <w:rFonts w:ascii="Times New Roman" w:hAnsi="Times New Roman"/>
+                <w:b/>
+                <w:sz w:val="19"/>
+              </w:rPr>
+              <w:t>Mảng 1</w:t>
+            </w:r>
+          </w:p>
+        </w:tc>
+      </w:tr>
+      <w:tr>
+        <w:tc>
+          <w:tcPr>
+            <w:tcW w:type="dxa" w:w="720"/>
+            <w:shd w:fill="F8FAFC"/>
+            <w:tcMar>
+              <w:top w:w="80" w:type="dxa"/>
+              <w:bottom w:w="80" w:type="dxa"/>
+              <w:left w:w="70" w:type="dxa"/>
+              <w:right w:w="70" w:type="dxa"/>
+            </w:tcMar>
+          </w:tcPr>
+          <w:p>
+            <w:pPr>
+              <w:spacing w:line="276" w:lineRule="auto"/>
+              <w:jc w:val="center"/>
+            </w:pPr>
+            <w:r>
+              <w:rPr>
+                <w:rFonts w:ascii="Times New Roman" w:hAnsi="Times New Roman"/>
+                <w:b/>
+                <w:sz w:val="19"/>
+              </w:rPr>
+              <w:t>3</w:t>
+            </w:r>
+          </w:p>
+        </w:tc>
+        <w:tc>
+          <w:tcPr>
+            <w:tcW w:type="dxa" w:w="3312"/>
+            <w:shd w:fill="F8FAFC"/>
+            <w:tcMar>
+              <w:top w:w="80" w:type="dxa"/>
+              <w:bottom w:w="80" w:type="dxa"/>
+              <w:left w:w="70" w:type="dxa"/>
+              <w:right w:w="70" w:type="dxa"/>
+            </w:tcMar>
+          </w:tcPr>
+          <w:p>
+            <w:pPr>
+              <w:spacing w:line="276" w:lineRule="auto"/>
+              <w:jc w:val="left"/>
+            </w:pPr>
+            <w:r>
+              <w:rPr>
+                <w:rFonts w:ascii="Times New Roman" w:hAnsi="Times New Roman"/>
+                <w:sz w:val="19"/>
+              </w:rPr>
+              <w:t>Công tác phát triển Đảng</w:t>
+            </w:r>
+          </w:p>
+        </w:tc>
+        <w:tc>
+          <w:tcPr>
+            <w:tcW w:type="dxa" w:w="3744"/>
+            <w:shd w:fill="F8FAFC"/>
+            <w:tcMar>
+              <w:top w:w="80" w:type="dxa"/>
+              <w:bottom w:w="80" w:type="dxa"/>
+              <w:left w:w="70" w:type="dxa"/>
+              <w:right w:w="70" w:type="dxa"/>
+            </w:tcMar>
+          </w:tcPr>
+          <w:p>
+            <w:pPr>
+              <w:spacing w:line="276" w:lineRule="auto"/>
+              <w:jc w:val="left"/>
+            </w:pPr>
+            <w:r>
+              <w:rPr>
+                <w:rFonts w:ascii="Times New Roman" w:hAnsi="Times New Roman"/>
+                <w:sz w:val="19"/>
+              </w:rPr>
+              <w:t>• Hoàn thành &gt;= 100% chỉ tiêu: 100 điểm.</w:t>
+              <w:br/>
+              <w:t>• Hoàn thành 80% đến dưới 100%: 80 điểm.</w:t>
+              <w:br/>
+              <w:t>• Hoàn thành 50% đến dưới 80%: 60 điểm.</w:t>
+              <w:br/>
+              <w:t>• Dưới 50% nhưng có tạo nguồn, cử học lớp cảm tình Đảng: 40 điểm.</w:t>
+            </w:r>
+          </w:p>
+        </w:tc>
+        <w:tc>
+          <w:tcPr>
+            <w:tcW w:type="dxa" w:w="1152"/>
+            <w:shd w:fill="F8FAFC"/>
+            <w:tcMar>
+              <w:top w:w="80" w:type="dxa"/>
+              <w:bottom w:w="80" w:type="dxa"/>
+              <w:left w:w="70" w:type="dxa"/>
+              <w:right w:w="70" w:type="dxa"/>
+            </w:tcMar>
+          </w:tcPr>
+          <w:p>
+            <w:pPr>
+              <w:spacing w:line="276" w:lineRule="auto"/>
+              <w:jc w:val="center"/>
+            </w:pPr>
+            <w:r>
+              <w:rPr>
+                <w:rFonts w:ascii="Times New Roman" w:hAnsi="Times New Roman"/>
+                <w:b/>
+                <w:color w:val="005BAC"/>
+                <w:sz w:val="19"/>
+              </w:rPr>
+              <w:t>100</w:t>
+            </w:r>
+          </w:p>
+        </w:tc>
+        <w:tc>
+          <w:tcPr>
+            <w:tcW w:type="dxa" w:w="1296"/>
+            <w:shd w:fill="F8FAFC"/>
+            <w:tcMar>
+              <w:top w:w="80" w:type="dxa"/>
+              <w:bottom w:w="80" w:type="dxa"/>
+              <w:left w:w="70" w:type="dxa"/>
+              <w:right w:w="70" w:type="dxa"/>
+            </w:tcMar>
+          </w:tcPr>
+          <w:p>
+            <w:pPr>
+              <w:spacing w:line="276" w:lineRule="auto"/>
+              <w:jc w:val="center"/>
+            </w:pPr>
+            <w:r>
+              <w:rPr>
+                <w:rFonts w:ascii="Times New Roman" w:hAnsi="Times New Roman"/>
+                <w:b/>
+                <w:sz w:val="19"/>
+              </w:rPr>
+              <w:t>Mảng 2</w:t>
+            </w:r>
+          </w:p>
+        </w:tc>
+      </w:tr>
+      <w:tr>
+        <w:tc>
+          <w:tcPr>
+            <w:tcW w:type="dxa" w:w="720"/>
+            <w:shd w:fill="FFFFFF"/>
+            <w:tcMar>
+              <w:top w:w="80" w:type="dxa"/>
+              <w:bottom w:w="80" w:type="dxa"/>
+              <w:left w:w="70" w:type="dxa"/>
+              <w:right w:w="70" w:type="dxa"/>
+            </w:tcMar>
+          </w:tcPr>
+          <w:p>
+            <w:pPr>
+              <w:spacing w:line="276" w:lineRule="auto"/>
+              <w:jc w:val="center"/>
+            </w:pPr>
+            <w:r>
+              <w:rPr>
+                <w:rFonts w:ascii="Times New Roman" w:hAnsi="Times New Roman"/>
+                <w:b/>
+                <w:sz w:val="19"/>
+              </w:rPr>
+              <w:t>4</w:t>
+            </w:r>
+          </w:p>
+        </w:tc>
+        <w:tc>
+          <w:tcPr>
+            <w:tcW w:type="dxa" w:w="3312"/>
+            <w:shd w:fill="FFFFFF"/>
+            <w:tcMar>
+              <w:top w:w="80" w:type="dxa"/>
+              <w:bottom w:w="80" w:type="dxa"/>
+              <w:left w:w="70" w:type="dxa"/>
+              <w:right w:w="70" w:type="dxa"/>
+            </w:tcMar>
+          </w:tcPr>
+          <w:p>
+            <w:pPr>
+              <w:spacing w:line="276" w:lineRule="auto"/>
+              <w:jc w:val="left"/>
+            </w:pPr>
+            <w:r>
+              <w:rPr>
+                <w:rFonts w:ascii="Times New Roman" w:hAnsi="Times New Roman"/>
+                <w:sz w:val="19"/>
+              </w:rPr>
+              <w:t>Đại hội Chi đoàn</w:t>
+            </w:r>
+          </w:p>
+        </w:tc>
+        <w:tc>
+          <w:tcPr>
+            <w:tcW w:type="dxa" w:w="3744"/>
+            <w:shd w:fill="FFFFFF"/>
+            <w:tcMar>
+              <w:top w:w="80" w:type="dxa"/>
+              <w:bottom w:w="80" w:type="dxa"/>
+              <w:left w:w="70" w:type="dxa"/>
+              <w:right w:w="70" w:type="dxa"/>
+            </w:tcMar>
+          </w:tcPr>
+          <w:p>
+            <w:pPr>
+              <w:spacing w:line="276" w:lineRule="auto"/>
+              <w:jc w:val="left"/>
+            </w:pPr>
+            <w:r>
+              <w:rPr>
+                <w:rFonts w:ascii="Times New Roman" w:hAnsi="Times New Roman"/>
+                <w:sz w:val="19"/>
+              </w:rPr>
+              <w:t>• Tổ chức thành công &gt;= 90% số chi đoàn: 150 điểm.</w:t>
+              <w:br/>
+              <w:t>• Tổ chức thành công &gt;= 70%: 120 điểm.</w:t>
+              <w:br/>
+              <w:t>• Tổ chức thành công &gt;= 50%: 100 điểm.</w:t>
+              <w:br/>
+              <w:t>• Tổ chức muộn hạn: tính 50% điểm. Mỗi chi đoàn không tổ chức: trừ 10 điểm.</w:t>
+            </w:r>
+          </w:p>
+        </w:tc>
+        <w:tc>
+          <w:tcPr>
+            <w:tcW w:type="dxa" w:w="1152"/>
+            <w:shd w:fill="FFFFFF"/>
+            <w:tcMar>
+              <w:top w:w="80" w:type="dxa"/>
+              <w:bottom w:w="80" w:type="dxa"/>
+              <w:left w:w="70" w:type="dxa"/>
+              <w:right w:w="70" w:type="dxa"/>
+            </w:tcMar>
+          </w:tcPr>
+          <w:p>
+            <w:pPr>
+              <w:spacing w:line="276" w:lineRule="auto"/>
+              <w:jc w:val="center"/>
+            </w:pPr>
+            <w:r>
+              <w:rPr>
+                <w:rFonts w:ascii="Times New Roman" w:hAnsi="Times New Roman"/>
+                <w:b/>
+                <w:color w:val="005BAC"/>
+                <w:sz w:val="19"/>
+              </w:rPr>
+              <w:t>150</w:t>
+            </w:r>
+          </w:p>
+        </w:tc>
+        <w:tc>
+          <w:tcPr>
+            <w:tcW w:type="dxa" w:w="1296"/>
+            <w:shd w:fill="FFFFFF"/>
+            <w:tcMar>
+              <w:top w:w="80" w:type="dxa"/>
+              <w:bottom w:w="80" w:type="dxa"/>
+              <w:left w:w="70" w:type="dxa"/>
+              <w:right w:w="70" w:type="dxa"/>
+            </w:tcMar>
+          </w:tcPr>
+          <w:p>
+            <w:pPr>
+              <w:spacing w:line="276" w:lineRule="auto"/>
+              <w:jc w:val="center"/>
+            </w:pPr>
+            <w:r>
+              <w:rPr>
+                <w:rFonts w:ascii="Times New Roman" w:hAnsi="Times New Roman"/>
+                <w:b/>
+                <w:sz w:val="19"/>
+              </w:rPr>
+              <w:t>Mảng 1</w:t>
+            </w:r>
+          </w:p>
+        </w:tc>
+      </w:tr>
+      <w:tr>
+        <w:tc>
+          <w:tcPr>
+            <w:tcW w:type="dxa" w:w="720"/>
+            <w:shd w:fill="F8FAFC"/>
+            <w:tcMar>
+              <w:top w:w="80" w:type="dxa"/>
+              <w:bottom w:w="80" w:type="dxa"/>
+              <w:left w:w="70" w:type="dxa"/>
+              <w:right w:w="70" w:type="dxa"/>
+            </w:tcMar>
+          </w:tcPr>
+          <w:p>
+            <w:pPr>
+              <w:spacing w:line="276" w:lineRule="auto"/>
+              <w:jc w:val="center"/>
+            </w:pPr>
+            <w:r>
+              <w:rPr>
+                <w:rFonts w:ascii="Times New Roman" w:hAnsi="Times New Roman"/>
+                <w:b/>
+                <w:sz w:val="19"/>
+              </w:rPr>
+              <w:t>5</w:t>
+            </w:r>
+          </w:p>
+        </w:tc>
+        <w:tc>
+          <w:tcPr>
+            <w:tcW w:type="dxa" w:w="3312"/>
+            <w:shd w:fill="F8FAFC"/>
+            <w:tcMar>
+              <w:top w:w="80" w:type="dxa"/>
+              <w:bottom w:w="80" w:type="dxa"/>
+              <w:left w:w="70" w:type="dxa"/>
+              <w:right w:w="70" w:type="dxa"/>
+            </w:tcMar>
+          </w:tcPr>
+          <w:p>
+            <w:pPr>
+              <w:spacing w:line="276" w:lineRule="auto"/>
+              <w:jc w:val="left"/>
+            </w:pPr>
+            <w:r>
+              <w:rPr>
+                <w:rFonts w:ascii="Times New Roman" w:hAnsi="Times New Roman"/>
+                <w:sz w:val="19"/>
+              </w:rPr>
+              <w:t>Đóng dấu sổ Đoàn hằng năm</w:t>
+            </w:r>
+          </w:p>
+        </w:tc>
+        <w:tc>
+          <w:tcPr>
+            <w:tcW w:type="dxa" w:w="3744"/>
+            <w:shd w:fill="F8FAFC"/>
+            <w:tcMar>
+              <w:top w:w="80" w:type="dxa"/>
+              <w:bottom w:w="80" w:type="dxa"/>
+              <w:left w:w="70" w:type="dxa"/>
+              <w:right w:w="70" w:type="dxa"/>
+            </w:tcMar>
+          </w:tcPr>
+          <w:p>
+            <w:pPr>
+              <w:spacing w:line="276" w:lineRule="auto"/>
+              <w:jc w:val="left"/>
+            </w:pPr>
+            <w:r>
+              <w:rPr>
+                <w:rFonts w:ascii="Times New Roman" w:hAnsi="Times New Roman"/>
+                <w:sz w:val="19"/>
+              </w:rPr>
+              <w:t>• Đóng dấu tiếp nhận hằng năm (50đ): Đúng hạn 50đ | Muộn 25đ | Không làm 0đ.</w:t>
+              <w:br/>
+              <w:t>• Đóng dấu nhận xét hằng năm (50đ): Đúng hạn 50đ | Muộn 25đ | Không làm 0đ.</w:t>
+            </w:r>
+          </w:p>
+        </w:tc>
+        <w:tc>
+          <w:tcPr>
+            <w:tcW w:type="dxa" w:w="1152"/>
+            <w:shd w:fill="F8FAFC"/>
+            <w:tcMar>
+              <w:top w:w="80" w:type="dxa"/>
+              <w:bottom w:w="80" w:type="dxa"/>
+              <w:left w:w="70" w:type="dxa"/>
+              <w:right w:w="70" w:type="dxa"/>
+            </w:tcMar>
+          </w:tcPr>
+          <w:p>
+            <w:pPr>
+              <w:spacing w:line="276" w:lineRule="auto"/>
+              <w:jc w:val="center"/>
+            </w:pPr>
+            <w:r>
+              <w:rPr>
+                <w:rFonts w:ascii="Times New Roman" w:hAnsi="Times New Roman"/>
+                <w:b/>
+                <w:color w:val="005BAC"/>
+                <w:sz w:val="19"/>
+              </w:rPr>
+              <w:t>100</w:t>
+            </w:r>
+          </w:p>
+        </w:tc>
+        <w:tc>
+          <w:tcPr>
+            <w:tcW w:type="dxa" w:w="1296"/>
+            <w:shd w:fill="F8FAFC"/>
+            <w:tcMar>
+              <w:top w:w="80" w:type="dxa"/>
+              <w:bottom w:w="80" w:type="dxa"/>
+              <w:left w:w="70" w:type="dxa"/>
+              <w:right w:w="70" w:type="dxa"/>
+            </w:tcMar>
+          </w:tcPr>
+          <w:p>
+            <w:pPr>
+              <w:spacing w:line="276" w:lineRule="auto"/>
+              <w:jc w:val="center"/>
+            </w:pPr>
+            <w:r>
+              <w:rPr>
+                <w:rFonts w:ascii="Times New Roman" w:hAnsi="Times New Roman"/>
+                <w:b/>
+                <w:sz w:val="19"/>
+              </w:rPr>
+              <w:t>Mảng 1</w:t>
+            </w:r>
+          </w:p>
+        </w:tc>
+      </w:tr>
+      <w:tr>
+        <w:tc>
+          <w:tcPr>
+            <w:tcW w:type="dxa" w:w="720"/>
+            <w:shd w:fill="FFFFFF"/>
+            <w:tcMar>
+              <w:top w:w="80" w:type="dxa"/>
+              <w:bottom w:w="80" w:type="dxa"/>
+              <w:left w:w="70" w:type="dxa"/>
+              <w:right w:w="70" w:type="dxa"/>
+            </w:tcMar>
+          </w:tcPr>
+          <w:p>
+            <w:pPr>
+              <w:spacing w:line="276" w:lineRule="auto"/>
+              <w:jc w:val="center"/>
+            </w:pPr>
+            <w:r>
+              <w:rPr>
+                <w:rFonts w:ascii="Times New Roman" w:hAnsi="Times New Roman"/>
+                <w:b/>
+                <w:sz w:val="19"/>
+              </w:rPr>
+              <w:t>6</w:t>
+            </w:r>
+          </w:p>
+        </w:tc>
+        <w:tc>
+          <w:tcPr>
+            <w:tcW w:type="dxa" w:w="3312"/>
+            <w:shd w:fill="FFFFFF"/>
+            <w:tcMar>
+              <w:top w:w="80" w:type="dxa"/>
+              <w:bottom w:w="80" w:type="dxa"/>
+              <w:left w:w="70" w:type="dxa"/>
+              <w:right w:w="70" w:type="dxa"/>
+            </w:tcMar>
+          </w:tcPr>
+          <w:p>
+            <w:pPr>
+              <w:spacing w:line="276" w:lineRule="auto"/>
+              <w:jc w:val="left"/>
+            </w:pPr>
+            <w:r>
+              <w:rPr>
+                <w:rFonts w:ascii="Times New Roman" w:hAnsi="Times New Roman"/>
+                <w:sz w:val="19"/>
+              </w:rPr>
+              <w:t>Kiểm tra giấy tờ cuối năm</w:t>
+            </w:r>
+          </w:p>
+        </w:tc>
+        <w:tc>
+          <w:tcPr>
+            <w:tcW w:type="dxa" w:w="3744"/>
+            <w:shd w:fill="FFFFFF"/>
+            <w:tcMar>
+              <w:top w:w="80" w:type="dxa"/>
+              <w:bottom w:w="80" w:type="dxa"/>
+              <w:left w:w="70" w:type="dxa"/>
+              <w:right w:w="70" w:type="dxa"/>
+            </w:tcMar>
+          </w:tcPr>
+          <w:p>
+            <w:pPr>
+              <w:spacing w:line="276" w:lineRule="auto"/>
+              <w:jc w:val="left"/>
+            </w:pPr>
+            <w:r>
+              <w:rPr>
+                <w:rFonts w:ascii="Times New Roman" w:hAnsi="Times New Roman"/>
+                <w:sz w:val="19"/>
+              </w:rPr>
+              <w:t>Đoàn kiểm tra Ban TCKT chấm điểm chất lượng sổ sách, hồ sơ đoàn vụ, công văn đi/đến, biên bản họp và tài chính của đơn vị.</w:t>
+            </w:r>
+          </w:p>
+        </w:tc>
+        <w:tc>
+          <w:tcPr>
+            <w:tcW w:type="dxa" w:w="1152"/>
+            <w:shd w:fill="FFFFFF"/>
+            <w:tcMar>
+              <w:top w:w="80" w:type="dxa"/>
+              <w:bottom w:w="80" w:type="dxa"/>
+              <w:left w:w="70" w:type="dxa"/>
+              <w:right w:w="70" w:type="dxa"/>
+            </w:tcMar>
+          </w:tcPr>
+          <w:p>
+            <w:pPr>
+              <w:spacing w:line="276" w:lineRule="auto"/>
+              <w:jc w:val="center"/>
+            </w:pPr>
+            <w:r>
+              <w:rPr>
+                <w:rFonts w:ascii="Times New Roman" w:hAnsi="Times New Roman"/>
+                <w:b/>
+                <w:color w:val="005BAC"/>
+                <w:sz w:val="19"/>
+              </w:rPr>
+              <w:t>200</w:t>
+            </w:r>
+          </w:p>
+        </w:tc>
+        <w:tc>
+          <w:tcPr>
+            <w:tcW w:type="dxa" w:w="1296"/>
+            <w:shd w:fill="FFFFFF"/>
+            <w:tcMar>
+              <w:top w:w="80" w:type="dxa"/>
+              <w:bottom w:w="80" w:type="dxa"/>
+              <w:left w:w="70" w:type="dxa"/>
+              <w:right w:w="70" w:type="dxa"/>
+            </w:tcMar>
+          </w:tcPr>
+          <w:p>
+            <w:pPr>
+              <w:spacing w:line="276" w:lineRule="auto"/>
+              <w:jc w:val="center"/>
+            </w:pPr>
+            <w:r>
+              <w:rPr>
+                <w:rFonts w:ascii="Times New Roman" w:hAnsi="Times New Roman"/>
+                <w:b/>
+                <w:sz w:val="19"/>
+              </w:rPr>
+              <w:t>Mảng 3 (chủ trì)</w:t>
+              <w:br/>
+              <w:t>Mảng 1 (p/h)</w:t>
+            </w:r>
+          </w:p>
+        </w:tc>
+      </w:tr>
+      <w:tr>
+        <w:tc>
+          <w:tcPr>
+            <w:tcW w:type="dxa" w:w="720"/>
+            <w:shd w:fill="F8FAFC"/>
+            <w:tcMar>
+              <w:top w:w="80" w:type="dxa"/>
+              <w:bottom w:w="80" w:type="dxa"/>
+              <w:left w:w="70" w:type="dxa"/>
+              <w:right w:w="70" w:type="dxa"/>
+            </w:tcMar>
+          </w:tcPr>
+          <w:p>
+            <w:pPr>
+              <w:spacing w:line="276" w:lineRule="auto"/>
+              <w:jc w:val="center"/>
+            </w:pPr>
+            <w:r>
+              <w:rPr>
+                <w:rFonts w:ascii="Times New Roman" w:hAnsi="Times New Roman"/>
+                <w:b/>
+                <w:sz w:val="19"/>
+              </w:rPr>
+              <w:t>7</w:t>
+            </w:r>
+          </w:p>
+        </w:tc>
+        <w:tc>
+          <w:tcPr>
+            <w:tcW w:type="dxa" w:w="3312"/>
+            <w:shd w:fill="F8FAFC"/>
+            <w:tcMar>
+              <w:top w:w="80" w:type="dxa"/>
+              <w:bottom w:w="80" w:type="dxa"/>
+              <w:left w:w="70" w:type="dxa"/>
+              <w:right w:w="70" w:type="dxa"/>
+            </w:tcMar>
+          </w:tcPr>
+          <w:p>
+            <w:pPr>
+              <w:spacing w:line="276" w:lineRule="auto"/>
+              <w:jc w:val="left"/>
+            </w:pPr>
+            <w:r>
+              <w:rPr>
+                <w:rFonts w:ascii="Times New Roman" w:hAnsi="Times New Roman"/>
+                <w:sz w:val="19"/>
+              </w:rPr>
+              <w:t>Triển khai phần mềm Quản lý đoàn viên</w:t>
+            </w:r>
+          </w:p>
+        </w:tc>
+        <w:tc>
+          <w:tcPr>
+            <w:tcW w:type="dxa" w:w="3744"/>
+            <w:shd w:fill="F8FAFC"/>
+            <w:tcMar>
+              <w:top w:w="80" w:type="dxa"/>
+              <w:bottom w:w="80" w:type="dxa"/>
+              <w:left w:w="70" w:type="dxa"/>
+              <w:right w:w="70" w:type="dxa"/>
+            </w:tcMar>
+          </w:tcPr>
+          <w:p>
+            <w:pPr>
+              <w:spacing w:line="276" w:lineRule="auto"/>
+              <w:jc w:val="left"/>
+            </w:pPr>
+            <w:r>
+              <w:rPr>
+                <w:rFonts w:ascii="Times New Roman" w:hAnsi="Times New Roman"/>
+                <w:sz w:val="19"/>
+              </w:rPr>
+              <w:t>• Đăng tài liệu SHCĐ hằng tháng trước/tuần 1: 40đ.</w:t>
+              <w:br/>
+              <w:t>• 100% ĐV đăng ký rèn luyện đoàn viên: 40đ.</w:t>
+              <w:br/>
+              <w:t>• 100% ĐV cấp sổ/thẻ ĐV điện tử: 40đ.</w:t>
+              <w:br/>
+              <w:t>• 100% ĐV xếp loại đúng tiến độ: 40đ.</w:t>
+              <w:br/>
+              <w:t>• 50% ĐV hoàn thành xuất sắc nhiệm vụ: 40đ.</w:t>
+              <w:br/>
+              <w:t>• Sai nghiệp vụ xóa tên ĐV: trừ 4đ / 1 ĐV.</w:t>
+            </w:r>
+          </w:p>
+        </w:tc>
+        <w:tc>
+          <w:tcPr>
+            <w:tcW w:type="dxa" w:w="1152"/>
+            <w:shd w:fill="F8FAFC"/>
+            <w:tcMar>
+              <w:top w:w="80" w:type="dxa"/>
+              <w:bottom w:w="80" w:type="dxa"/>
+              <w:left w:w="70" w:type="dxa"/>
+              <w:right w:w="70" w:type="dxa"/>
+            </w:tcMar>
+          </w:tcPr>
+          <w:p>
+            <w:pPr>
+              <w:spacing w:line="276" w:lineRule="auto"/>
+              <w:jc w:val="center"/>
+            </w:pPr>
+            <w:r>
+              <w:rPr>
+                <w:rFonts w:ascii="Times New Roman" w:hAnsi="Times New Roman"/>
+                <w:b/>
+                <w:color w:val="005BAC"/>
+                <w:sz w:val="19"/>
+              </w:rPr>
+              <w:t>200</w:t>
+            </w:r>
+          </w:p>
+        </w:tc>
+        <w:tc>
+          <w:tcPr>
+            <w:tcW w:type="dxa" w:w="1296"/>
+            <w:shd w:fill="F8FAFC"/>
+            <w:tcMar>
+              <w:top w:w="80" w:type="dxa"/>
+              <w:bottom w:w="80" w:type="dxa"/>
+              <w:left w:w="70" w:type="dxa"/>
+              <w:right w:w="70" w:type="dxa"/>
+            </w:tcMar>
+          </w:tcPr>
+          <w:p>
+            <w:pPr>
+              <w:spacing w:line="276" w:lineRule="auto"/>
+              <w:jc w:val="center"/>
+            </w:pPr>
+            <w:r>
+              <w:rPr>
+                <w:rFonts w:ascii="Times New Roman" w:hAnsi="Times New Roman"/>
+                <w:b/>
+                <w:sz w:val="19"/>
+              </w:rPr>
+              <w:t>Mảng 2</w:t>
+            </w:r>
+          </w:p>
+        </w:tc>
+      </w:tr>
+      <w:tr>
+        <w:tc>
+          <w:tcPr>
+            <w:tcW w:type="dxa" w:w="720"/>
+            <w:shd w:fill="FFFFFF"/>
+            <w:tcMar>
+              <w:top w:w="80" w:type="dxa"/>
+              <w:bottom w:w="80" w:type="dxa"/>
+              <w:left w:w="70" w:type="dxa"/>
+              <w:right w:w="70" w:type="dxa"/>
+            </w:tcMar>
+          </w:tcPr>
+          <w:p>
+            <w:pPr>
+              <w:spacing w:line="276" w:lineRule="auto"/>
+              <w:jc w:val="center"/>
+            </w:pPr>
+            <w:r>
+              <w:rPr>
+                <w:rFonts w:ascii="Times New Roman" w:hAnsi="Times New Roman"/>
+                <w:b/>
+                <w:sz w:val="19"/>
+              </w:rPr>
+              <w:t>8</w:t>
+            </w:r>
+          </w:p>
+        </w:tc>
+        <w:tc>
+          <w:tcPr>
+            <w:tcW w:type="dxa" w:w="3312"/>
+            <w:shd w:fill="FFFFFF"/>
+            <w:tcMar>
+              <w:top w:w="80" w:type="dxa"/>
+              <w:bottom w:w="80" w:type="dxa"/>
+              <w:left w:w="70" w:type="dxa"/>
+              <w:right w:w="70" w:type="dxa"/>
+            </w:tcMar>
+          </w:tcPr>
+          <w:p>
+            <w:pPr>
+              <w:spacing w:line="276" w:lineRule="auto"/>
+              <w:jc w:val="left"/>
+            </w:pPr>
+            <w:r>
+              <w:rPr>
+                <w:rFonts w:ascii="Times New Roman" w:hAnsi="Times New Roman"/>
+                <w:sz w:val="19"/>
+              </w:rPr>
+              <w:t>Tương tác đầu mối &amp; Tham gia triệu tập</w:t>
+            </w:r>
+          </w:p>
+        </w:tc>
+        <w:tc>
+          <w:tcPr>
+            <w:tcW w:type="dxa" w:w="3744"/>
+            <w:shd w:fill="FFFFFF"/>
+            <w:tcMar>
+              <w:top w:w="80" w:type="dxa"/>
+              <w:bottom w:w="80" w:type="dxa"/>
+              <w:left w:w="70" w:type="dxa"/>
+              <w:right w:w="70" w:type="dxa"/>
+            </w:tcMar>
+          </w:tcPr>
+          <w:p>
+            <w:pPr>
+              <w:spacing w:line="276" w:lineRule="auto"/>
+              <w:jc w:val="left"/>
+            </w:pPr>
+            <w:r>
+              <w:rPr>
+                <w:rFonts w:ascii="Times New Roman" w:hAnsi="Times New Roman"/>
+                <w:sz w:val="19"/>
+              </w:rPr>
+              <w:t>• Tương tác tích cực, tham gia đầy đủ: 50 điểm.</w:t>
+              <w:br/>
+              <w:t>• Tương tác ít, tham gia ít: 25 điểm.</w:t>
+              <w:br/>
+              <w:t>• Vắng mặt hoặc thiếu thành phần mỗi buổi triệu tập: trừ 10 điểm / buổi.</w:t>
+            </w:r>
+          </w:p>
+        </w:tc>
+        <w:tc>
+          <w:tcPr>
+            <w:tcW w:type="dxa" w:w="1152"/>
+            <w:shd w:fill="FFFFFF"/>
+            <w:tcMar>
+              <w:top w:w="80" w:type="dxa"/>
+              <w:bottom w:w="80" w:type="dxa"/>
+              <w:left w:w="70" w:type="dxa"/>
+              <w:right w:w="70" w:type="dxa"/>
+            </w:tcMar>
+          </w:tcPr>
+          <w:p>
+            <w:pPr>
+              <w:spacing w:line="276" w:lineRule="auto"/>
+              <w:jc w:val="center"/>
+            </w:pPr>
+            <w:r>
+              <w:rPr>
+                <w:rFonts w:ascii="Times New Roman" w:hAnsi="Times New Roman"/>
+                <w:b/>
+                <w:color w:val="005BAC"/>
+                <w:sz w:val="19"/>
+              </w:rPr>
+              <w:t>50</w:t>
+            </w:r>
+          </w:p>
+        </w:tc>
+        <w:tc>
+          <w:tcPr>
+            <w:tcW w:type="dxa" w:w="1296"/>
+            <w:shd w:fill="FFFFFF"/>
+            <w:tcMar>
+              <w:top w:w="80" w:type="dxa"/>
+              <w:bottom w:w="80" w:type="dxa"/>
+              <w:left w:w="70" w:type="dxa"/>
+              <w:right w:w="70" w:type="dxa"/>
+            </w:tcMar>
+          </w:tcPr>
+          <w:p>
+            <w:pPr>
+              <w:spacing w:line="276" w:lineRule="auto"/>
+              <w:jc w:val="center"/>
+            </w:pPr>
+            <w:r>
+              <w:rPr>
+                <w:rFonts w:ascii="Times New Roman" w:hAnsi="Times New Roman"/>
+                <w:b/>
+                <w:sz w:val="19"/>
+              </w:rPr>
+              <w:t>Tổ đầu mối</w:t>
+              <w:br/>
+              <w:t>Lãnh đạo Ban</w:t>
+            </w:r>
+          </w:p>
+        </w:tc>
+      </w:tr>
+      <w:tr>
+        <w:tc>
+          <w:tcPr>
+            <w:tcW w:type="dxa" w:w="720"/>
+            <w:shd w:fill="F8FAFC"/>
+            <w:tcMar>
+              <w:top w:w="80" w:type="dxa"/>
+              <w:bottom w:w="80" w:type="dxa"/>
+              <w:left w:w="70" w:type="dxa"/>
+              <w:right w:w="70" w:type="dxa"/>
+            </w:tcMar>
+          </w:tcPr>
+          <w:p>
+            <w:pPr>
+              <w:spacing w:line="276" w:lineRule="auto"/>
+              <w:jc w:val="center"/>
+            </w:pPr>
+            <w:r>
+              <w:rPr>
+                <w:rFonts w:ascii="Times New Roman" w:hAnsi="Times New Roman"/>
+                <w:b/>
+                <w:sz w:val="19"/>
+              </w:rPr>
+              <w:t>9</w:t>
+            </w:r>
+          </w:p>
+        </w:tc>
+        <w:tc>
+          <w:tcPr>
+            <w:tcW w:type="dxa" w:w="3312"/>
+            <w:shd w:fill="F8FAFC"/>
+            <w:tcMar>
+              <w:top w:w="80" w:type="dxa"/>
+              <w:bottom w:w="80" w:type="dxa"/>
+              <w:left w:w="70" w:type="dxa"/>
+              <w:right w:w="70" w:type="dxa"/>
+            </w:tcMar>
+          </w:tcPr>
+          <w:p>
+            <w:pPr>
+              <w:spacing w:line="276" w:lineRule="auto"/>
+              <w:jc w:val="left"/>
+            </w:pPr>
+            <w:r>
+              <w:rPr>
+                <w:rFonts w:ascii="Times New Roman" w:hAnsi="Times New Roman"/>
+                <w:sz w:val="19"/>
+              </w:rPr>
+              <w:t>Điểm thưởng: Nhân sự tham gia Ban TCKT</w:t>
+            </w:r>
+          </w:p>
+        </w:tc>
+        <w:tc>
+          <w:tcPr>
+            <w:tcW w:type="dxa" w:w="3744"/>
+            <w:shd w:fill="F8FAFC"/>
+            <w:tcMar>
+              <w:top w:w="80" w:type="dxa"/>
+              <w:bottom w:w="80" w:type="dxa"/>
+              <w:left w:w="70" w:type="dxa"/>
+              <w:right w:w="70" w:type="dxa"/>
+            </w:tcMar>
+          </w:tcPr>
+          <w:p>
+            <w:pPr>
+              <w:spacing w:line="276" w:lineRule="auto"/>
+              <w:jc w:val="left"/>
+            </w:pPr>
+            <w:r>
+              <w:rPr>
+                <w:rFonts w:ascii="Times New Roman" w:hAnsi="Times New Roman"/>
+                <w:sz w:val="19"/>
+              </w:rPr>
+              <w:t>• Có thành viên là Thường trực Ban: 20 điểm.</w:t>
+              <w:br/>
+              <w:t>• Có thành viên hoàn thành xuất sắc nhiệm vụ: 30 điểm.</w:t>
+              <w:br/>
+              <w:t>• Có thành viên hoàn thành tốt: 20 điểm.</w:t>
+              <w:br/>
+              <w:t>• Có thành viên tham gia: 10 điểm.</w:t>
+            </w:r>
+          </w:p>
+        </w:tc>
+        <w:tc>
+          <w:tcPr>
+            <w:tcW w:type="dxa" w:w="1152"/>
+            <w:shd w:fill="F8FAFC"/>
+            <w:tcMar>
+              <w:top w:w="80" w:type="dxa"/>
+              <w:bottom w:w="80" w:type="dxa"/>
+              <w:left w:w="70" w:type="dxa"/>
+              <w:right w:w="70" w:type="dxa"/>
+            </w:tcMar>
+          </w:tcPr>
+          <w:p>
+            <w:pPr>
+              <w:spacing w:line="276" w:lineRule="auto"/>
+              <w:jc w:val="center"/>
+            </w:pPr>
+            <w:r>
+              <w:rPr>
+                <w:rFonts w:ascii="Times New Roman" w:hAnsi="Times New Roman"/>
+                <w:b/>
+                <w:color w:val="10B981"/>
+                <w:sz w:val="19"/>
+              </w:rPr>
+              <w:t>+50 (thưởng)</w:t>
+            </w:r>
+          </w:p>
+        </w:tc>
+        <w:tc>
+          <w:tcPr>
+            <w:tcW w:type="dxa" w:w="1296"/>
+            <w:shd w:fill="F8FAFC"/>
+            <w:tcMar>
+              <w:top w:w="80" w:type="dxa"/>
+              <w:bottom w:w="80" w:type="dxa"/>
+              <w:left w:w="70" w:type="dxa"/>
+              <w:right w:w="70" w:type="dxa"/>
+            </w:tcMar>
+          </w:tcPr>
+          <w:p>
+            <w:pPr>
+              <w:spacing w:line="276" w:lineRule="auto"/>
+              <w:jc w:val="center"/>
+            </w:pPr>
+            <w:r>
+              <w:rPr>
+                <w:rFonts w:ascii="Times New Roman" w:hAnsi="Times New Roman"/>
+                <w:b/>
+                <w:sz w:val="19"/>
+              </w:rPr>
+              <w:t>Lãnh đạo Ban</w:t>
+            </w:r>
+          </w:p>
+        </w:tc>
+      </w:tr>
+      <w:tr>
+        <w:tc>
+          <w:tcPr>
+            <w:tcW w:type="dxa" w:w="720"/>
+            <w:shd w:fill="FFFFFF"/>
+            <w:tcMar>
+              <w:top w:w="80" w:type="dxa"/>
+              <w:bottom w:w="80" w:type="dxa"/>
+              <w:left w:w="70" w:type="dxa"/>
+              <w:right w:w="70" w:type="dxa"/>
+            </w:tcMar>
+          </w:tcPr>
+          <w:p>
+            <w:pPr>
+              <w:spacing w:line="276" w:lineRule="auto"/>
+              <w:jc w:val="center"/>
+            </w:pPr>
+            <w:r>
+              <w:rPr>
+                <w:rFonts w:ascii="Times New Roman" w:hAnsi="Times New Roman"/>
+                <w:b/>
+                <w:sz w:val="19"/>
+              </w:rPr>
+              <w:t>10</w:t>
+            </w:r>
+          </w:p>
+        </w:tc>
+        <w:tc>
+          <w:tcPr>
+            <w:tcW w:type="dxa" w:w="3312"/>
+            <w:shd w:fill="FFFFFF"/>
+            <w:tcMar>
+              <w:top w:w="80" w:type="dxa"/>
+              <w:bottom w:w="80" w:type="dxa"/>
+              <w:left w:w="70" w:type="dxa"/>
+              <w:right w:w="70" w:type="dxa"/>
+            </w:tcMar>
+          </w:tcPr>
+          <w:p>
+            <w:pPr>
+              <w:spacing w:line="276" w:lineRule="auto"/>
+              <w:jc w:val="left"/>
+            </w:pPr>
+            <w:r>
+              <w:rPr>
+                <w:rFonts w:ascii="Times New Roman" w:hAnsi="Times New Roman"/>
+                <w:sz w:val="19"/>
+              </w:rPr>
+              <w:t>Điểm thưởng: Đại hội / Hội nghị mẫu</w:t>
+            </w:r>
+          </w:p>
+        </w:tc>
+        <w:tc>
+          <w:tcPr>
+            <w:tcW w:type="dxa" w:w="3744"/>
+            <w:shd w:fill="FFFFFF"/>
+            <w:tcMar>
+              <w:top w:w="80" w:type="dxa"/>
+              <w:bottom w:w="80" w:type="dxa"/>
+              <w:left w:w="70" w:type="dxa"/>
+              <w:right w:w="70" w:type="dxa"/>
+            </w:tcMar>
+          </w:tcPr>
+          <w:p>
+            <w:pPr>
+              <w:spacing w:line="276" w:lineRule="auto"/>
+              <w:jc w:val="left"/>
+            </w:pPr>
+            <w:r>
+              <w:rPr>
+                <w:rFonts w:ascii="Times New Roman" w:hAnsi="Times New Roman"/>
+                <w:sz w:val="19"/>
+              </w:rPr>
+              <w:t>• Đơn vị đăng cai tổ chức Hội nghị / Đại hội Đại biểu mẫu: 10 điểm.</w:t>
+              <w:br/>
+              <w:t>• Không tổ chức Đại hội điểm: 0 điểm.</w:t>
+            </w:r>
+          </w:p>
+        </w:tc>
+        <w:tc>
+          <w:tcPr>
+            <w:tcW w:type="dxa" w:w="1152"/>
+            <w:shd w:fill="FFFFFF"/>
+            <w:tcMar>
+              <w:top w:w="80" w:type="dxa"/>
+              <w:bottom w:w="80" w:type="dxa"/>
+              <w:left w:w="70" w:type="dxa"/>
+              <w:right w:w="70" w:type="dxa"/>
+            </w:tcMar>
+          </w:tcPr>
+          <w:p>
+            <w:pPr>
+              <w:spacing w:line="276" w:lineRule="auto"/>
+              <w:jc w:val="center"/>
+            </w:pPr>
+            <w:r>
+              <w:rPr>
+                <w:rFonts w:ascii="Times New Roman" w:hAnsi="Times New Roman"/>
+                <w:b/>
+                <w:color w:val="10B981"/>
+                <w:sz w:val="19"/>
+              </w:rPr>
+              <w:t>+10 (thưởng)</w:t>
+            </w:r>
+          </w:p>
+        </w:tc>
+        <w:tc>
+          <w:tcPr>
+            <w:tcW w:type="dxa" w:w="1296"/>
+            <w:shd w:fill="FFFFFF"/>
+            <w:tcMar>
+              <w:top w:w="80" w:type="dxa"/>
+              <w:bottom w:w="80" w:type="dxa"/>
+              <w:left w:w="70" w:type="dxa"/>
+              <w:right w:w="70" w:type="dxa"/>
+            </w:tcMar>
+          </w:tcPr>
+          <w:p>
+            <w:pPr>
+              <w:spacing w:line="276" w:lineRule="auto"/>
+              <w:jc w:val="center"/>
+            </w:pPr>
+            <w:r>
+              <w:rPr>
+                <w:rFonts w:ascii="Times New Roman" w:hAnsi="Times New Roman"/>
+                <w:b/>
+                <w:sz w:val="19"/>
+              </w:rPr>
+              <w:t>Mảng 1</w:t>
+            </w:r>
+          </w:p>
+        </w:tc>
+      </w:tr>
+      <w:tr>
+        <w:tc>
+          <w:tcPr>
+            <w:tcW w:type="dxa" w:w="720"/>
+            <w:shd w:fill="F8FAFC"/>
+            <w:tcMar>
+              <w:top w:w="80" w:type="dxa"/>
+              <w:bottom w:w="80" w:type="dxa"/>
+              <w:left w:w="70" w:type="dxa"/>
+              <w:right w:w="70" w:type="dxa"/>
+            </w:tcMar>
+          </w:tcPr>
+          <w:p>
+            <w:pPr>
+              <w:spacing w:line="276" w:lineRule="auto"/>
+              <w:jc w:val="center"/>
+            </w:pPr>
+            <w:r>
+              <w:rPr>
+                <w:rFonts w:ascii="Times New Roman" w:hAnsi="Times New Roman"/>
+                <w:b/>
+                <w:sz w:val="19"/>
+              </w:rPr>
+              <w:t>11</w:t>
+            </w:r>
+          </w:p>
+        </w:tc>
+        <w:tc>
+          <w:tcPr>
+            <w:tcW w:type="dxa" w:w="3312"/>
+            <w:shd w:fill="F8FAFC"/>
+            <w:tcMar>
+              <w:top w:w="80" w:type="dxa"/>
+              <w:bottom w:w="80" w:type="dxa"/>
+              <w:left w:w="70" w:type="dxa"/>
+              <w:right w:w="70" w:type="dxa"/>
+            </w:tcMar>
+          </w:tcPr>
+          <w:p>
+            <w:pPr>
+              <w:spacing w:line="276" w:lineRule="auto"/>
+              <w:jc w:val="left"/>
+            </w:pPr>
+            <w:r>
+              <w:rPr>
+                <w:rFonts w:ascii="Times New Roman" w:hAnsi="Times New Roman"/>
+                <w:sz w:val="19"/>
+              </w:rPr>
+              <w:t>Điểm trừ: Nộp đề án, hồ sơ không đúng hạn</w:t>
+            </w:r>
+          </w:p>
+        </w:tc>
+        <w:tc>
+          <w:tcPr>
+            <w:tcW w:type="dxa" w:w="3744"/>
+            <w:shd w:fill="F8FAFC"/>
+            <w:tcMar>
+              <w:top w:w="80" w:type="dxa"/>
+              <w:bottom w:w="80" w:type="dxa"/>
+              <w:left w:w="70" w:type="dxa"/>
+              <w:right w:w="70" w:type="dxa"/>
+            </w:tcMar>
+          </w:tcPr>
+          <w:p>
+            <w:pPr>
+              <w:spacing w:line="276" w:lineRule="auto"/>
+              <w:jc w:val="left"/>
+            </w:pPr>
+            <w:r>
+              <w:rPr>
+                <w:rFonts w:ascii="Times New Roman" w:hAnsi="Times New Roman"/>
+                <w:sz w:val="19"/>
+              </w:rPr>
+              <w:t>• Bảng chấm điểm, báo cáo cuối năm nộp muộn: -10 điểm / ngày.</w:t>
+              <w:br/>
+              <w:t>• Các giấy tờ khác theo thông báo: -5 điểm / ngày.</w:t>
+              <w:br/>
+              <w:t>• Giấy tờ, hồ sơ phát triển Đảng nộp muộn: -1 điểm / ngày.</w:t>
+            </w:r>
+          </w:p>
+        </w:tc>
+        <w:tc>
+          <w:tcPr>
+            <w:tcW w:type="dxa" w:w="1152"/>
+            <w:shd w:fill="F8FAFC"/>
+            <w:tcMar>
+              <w:top w:w="80" w:type="dxa"/>
+              <w:bottom w:w="80" w:type="dxa"/>
+              <w:left w:w="70" w:type="dxa"/>
+              <w:right w:w="70" w:type="dxa"/>
+            </w:tcMar>
+          </w:tcPr>
+          <w:p>
+            <w:pPr>
+              <w:spacing w:line="276" w:lineRule="auto"/>
+              <w:jc w:val="center"/>
+            </w:pPr>
+            <w:r>
+              <w:rPr>
+                <w:rFonts w:ascii="Times New Roman" w:hAnsi="Times New Roman"/>
+                <w:b/>
+                <w:color w:val="DC2626"/>
+                <w:sz w:val="19"/>
+              </w:rPr>
+              <w:t>Trừ theo ngày</w:t>
+            </w:r>
+          </w:p>
+        </w:tc>
+        <w:tc>
+          <w:tcPr>
+            <w:tcW w:type="dxa" w:w="1296"/>
+            <w:shd w:fill="F8FAFC"/>
+            <w:tcMar>
+              <w:top w:w="80" w:type="dxa"/>
+              <w:bottom w:w="80" w:type="dxa"/>
+              <w:left w:w="70" w:type="dxa"/>
+              <w:right w:w="70" w:type="dxa"/>
+            </w:tcMar>
+          </w:tcPr>
+          <w:p>
+            <w:pPr>
+              <w:spacing w:line="276" w:lineRule="auto"/>
+              <w:jc w:val="center"/>
+            </w:pPr>
+            <w:r>
+              <w:rPr>
+                <w:rFonts w:ascii="Times New Roman" w:hAnsi="Times New Roman"/>
+                <w:b/>
+                <w:sz w:val="19"/>
+              </w:rPr>
+              <w:t>Mảng 3 (giám sát)</w:t>
+              <w:br/>
+              <w:t>Toàn Ban</w:t>
+            </w:r>
+          </w:p>
+        </w:tc>
+      </w:tr>
+    </w:tbl>
     <w:sectPr>
       <w:headerReference w:type="default" r:id="rId10"/>
       <w:footerReference w:type="default" r:id="rId11"/>

</xml_diff>

<commit_message>
feat: update leadership to 01 Head and 03 Vice Heads (68 personnel), remove Kinh trinh line, add 12-Unit Contact Conference to 2026-2027 plan
</commit_message>
<xml_diff>
--- a/De_An_Tai_Cau_Truc_Ban_TCKT_Doan_Vu.docx
+++ b/De_An_Tai_Cau_Truc_Ban_TCKT_Doan_Vu.docx
@@ -55,34 +55,29 @@
       </w:r>
     </w:p>
     <w:p>
-      <w:r>
-        <w:t>Kính trình: Ban Thường vụ Đoàn Đại học Bách khoa Hà Nội.</w:t>
+      <w:pPr>
+        <w:pStyle w:val="Heading1"/>
+      </w:pPr>
+      <w:r>
+        <w:t>I. THỰC TRẠNG VÀ SỰ CẦN THIẾT TÁI CẤU TRÚC</w:t>
       </w:r>
     </w:p>
     <w:p>
       <w:pPr>
-        <w:pStyle w:val="Heading1"/>
-      </w:pPr>
-      <w:r>
-        <w:t>I. THỰC TRẠNG VÀ SỰ CẦN THIẾT TÁI CẤU TRÚC</w:t>
+        <w:pStyle w:val="Heading2"/>
+      </w:pPr>
+      <w:r>
+        <w:t>1. Cơ sở xây dựng và phạm vi đề án</w:t>
       </w:r>
     </w:p>
     <w:p>
-      <w:pPr>
-        <w:pStyle w:val="Heading2"/>
-      </w:pPr>
-      <w:r>
-        <w:t>1. Cơ sở xây dựng và phạm vi đề án</w:t>
+      <w:r>
+        <w:t>Trên cơ sở yêu cầu kiện toàn tổ chức, nâng cao chất lượng công tác tham mưu, hướng dẫn, theo dõi và kiểm tra nghiệp vụ tại các Đoàn trường, Liên chi đoàn, Ban Tổ chức - Kiểm tra xây dựng phương án tái cấu trúc gắn với chuẩn hóa quy trình và đẩy mạnh chuyển đổi số.</w:t>
       </w:r>
     </w:p>
     <w:p>
       <w:r>
-        <w:t>Trên cơ sở yêu cầu kiện toàn tổ chức, nâng cao chất lượng công tác tham mưu, hướng dẫn, theo dõi và kiểm tra nghiệp vụ tại các Đoàn trường, Liên chi đoàn, Ban Tổ chức - Kiểm tra xây dựng phương án tái cấu trúc gắn với chuẩn hóa quy trình và đẩy mạnh chuyển đổi số.</w:t>
-      </w:r>
-    </w:p>
-    <w:p>
-      <w:r>
-        <w:t>Đề án đề xuất duy trì quy mô dự kiến 67 nhân sự, phạm vi theo dõi 12 đơn vị và điều chỉnh phân công theo nhiệm vụ thực tế của các mảng. Đây là phương án đề xuất, chưa phải quyết định thành lập, giao thẩm quyền hoặc giao chỉ tiêu chính thức. Trước khi ban hành, cần đối chiếu văn bản quy định chức năng của Ban, phân cấp công tác Đoàn và quy định về điểm rèn luyện đang áp dụng tại Đại học.</w:t>
+        <w:t>Đề án đề xuất duy trì quy mô dự kiến 68 nhân sự, phạm vi theo dõi 12 đơn vị và điều chỉnh phân công theo nhiệm vụ thực tế của các mảng. Đây là phương án đề xuất, chưa phải quyết định thành lập, giao thẩm quyền hoặc giao chỉ tiêu chính thức. Trước khi ban hành, cần đối chiếu văn bản quy định chức năng của Ban, phân cấp công tác Đoàn và quy định về điểm rèn luyện đang áp dụng tại Đại học.</w:t>
       </w:r>
     </w:p>
     <w:p>
@@ -223,7 +218,7 @@
     </w:p>
     <w:p>
       <w:r>
-        <w:t>Lãnh đạo Ban gồm 01 Trưởng ban và 02 Phó Trưởng ban. Bốn mảng chuyên môn gồm: (1) Tổ chức - Đoàn vụ; (2) Đảng vụ - Chuyển đổi số; (3) Kiểm tra - Điểm rèn luyện; (4) Truyền thông - Sự kiện và Phát triển nội bộ. Tập thể giao ban điều hành gồm Lãnh đạo Ban và 04 Trưởng mảng, tổng cộng 07 đồng chí; không phải một cấp tổ chức mới.</w:t>
+        <w:t>Lãnh đạo Ban gồm 01 Trưởng ban và 03 Phó Trưởng ban. Bốn mảng chuyên môn gồm: (1) Tổ chức - Đoàn vụ; (2) Đảng vụ - Chuyển đổi số; (3) Kiểm tra - Điểm rèn luyện; (4) Truyền thông - Sự kiện và Phát triển nội bộ. Tập thể giao ban điều hành gồm Lãnh đạo Ban và 04 Trưởng mảng, tổng cộng 08 đồng chí; không phải một cấp tổ chức mới.</w:t>
       </w:r>
     </w:p>
     <w:p>
@@ -799,7 +794,7 @@
     </w:p>
     <w:p>
       <w:r>
-        <w:t>Duy trì tổng quy mô dự kiến 67 đồng chí, gồm 03 đồng chí Lãnh đạo Ban và 64 nhân sự các mảng. Việc bố trí cụ thể được rà soát sau giai đoạn thí điểm; không coi số lượng đề xuất là chỉ tiêu đã được phê duyệt.</w:t>
+        <w:t>Duy trì tổng quy mô dự kiến 68 đồng chí, gồm 04 đồng chí Lãnh đạo Ban và 64 nhân sự các mảng. Việc bố trí cụ thể được rà soát sau giai đoạn thí điểm; không coi số lượng đề xuất là chỉ tiêu đã được phê duyệt.</w:t>
       </w:r>
     </w:p>
     <w:tbl>
@@ -950,26 +945,22 @@
             <w:vAlign w:val="center"/>
           </w:tcPr>
           <w:p>
+            <w:r>
+              <w:t>3</w:t>
+            </w:r>
+          </w:p>
+        </w:tc>
+        <w:tc>
+          <w:tcPr>
+            <w:tcW w:w="1310" w:type="dxa"/>
+            <w:vAlign w:val="center"/>
+          </w:tcPr>
+          <w:p>
             <w:pPr>
               <w:pStyle w:val="TableText"/>
               <w:jc w:val="center"/>
             </w:pPr>
             <w:r>
-              <w:t>2</w:t>
-            </w:r>
-          </w:p>
-        </w:tc>
-        <w:tc>
-          <w:tcPr>
-            <w:tcW w:w="1310" w:type="dxa"/>
-            <w:vAlign w:val="center"/>
-          </w:tcPr>
-          <w:p>
-            <w:pPr>
-              <w:pStyle w:val="TableText"/>
-              <w:jc w:val="center"/>
-            </w:pPr>
-            <w:r>
               <w:t>0</w:t>
             </w:r>
           </w:p>
@@ -980,12 +971,8 @@
             <w:vAlign w:val="center"/>
           </w:tcPr>
           <w:p>
-            <w:pPr>
-              <w:pStyle w:val="TableText"/>
-              <w:jc w:val="center"/>
-            </w:pPr>
-            <w:r>
-              <w:t>3</w:t>
+            <w:r>
+              <w:t>4</w:t>
             </w:r>
           </w:p>
         </w:tc>
@@ -1345,26 +1332,22 @@
             <w:vAlign w:val="center"/>
           </w:tcPr>
           <w:p>
+            <w:r>
+              <w:t>8</w:t>
+            </w:r>
+          </w:p>
+        </w:tc>
+        <w:tc>
+          <w:tcPr>
+            <w:tcW w:w="1310" w:type="dxa"/>
+            <w:vAlign w:val="center"/>
+          </w:tcPr>
+          <w:p>
             <w:pPr>
               <w:pStyle w:val="TableText"/>
               <w:jc w:val="center"/>
             </w:pPr>
             <w:r>
-              <w:t>7</w:t>
-            </w:r>
-          </w:p>
-        </w:tc>
-        <w:tc>
-          <w:tcPr>
-            <w:tcW w:w="1310" w:type="dxa"/>
-            <w:vAlign w:val="center"/>
-          </w:tcPr>
-          <w:p>
-            <w:pPr>
-              <w:pStyle w:val="TableText"/>
-              <w:jc w:val="center"/>
-            </w:pPr>
-            <w:r>
               <w:t>55</w:t>
             </w:r>
           </w:p>
@@ -1375,12 +1358,8 @@
             <w:vAlign w:val="center"/>
           </w:tcPr>
           <w:p>
-            <w:pPr>
-              <w:pStyle w:val="TableText"/>
-              <w:jc w:val="center"/>
-            </w:pPr>
-            <w:r>
-              <w:t>67</w:t>
+            <w:r>
+              <w:t>68</w:t>
             </w:r>
           </w:p>
         </w:tc>
@@ -1518,7 +1497,7 @@
     </w:p>
     <w:p>
       <w:r>
-        <w:t>Việc thêm 01 Trưởng mảng so với phương án 03 mảng được bố trí trong tổng 67 người. Các nhóm nghiệp vụ trong mảng là hình thức phân công công việc, không mặc nhiên phát sinh chức danh lãnh đạo hoặc phụ cấp.</w:t>
+        <w:t>Việc thêm 01 Trưởng mảng so với phương án 03 mảng được bố trí trong tổng 68 người. Các nhóm nghiệp vụ trong mảng là hình thức phân công công việc, không mặc nhiên phát sinh chức danh lãnh đạo hoặc phụ cấp.</w:t>
       </w:r>
     </w:p>
     <w:p>
@@ -5984,6 +5963,64 @@
           </w:p>
         </w:tc>
       </w:tr>
+      <w:tr>
+        <w:tc>
+          <w:tcPr>
+            <w:tcW w:type="dxa" w:w="1559"/>
+          </w:tcPr>
+          <w:p>
+            <w:r>
+              <w:t>2</w:t>
+            </w:r>
+          </w:p>
+        </w:tc>
+        <w:tc>
+          <w:tcPr>
+            <w:tcW w:type="dxa" w:w="1559"/>
+          </w:tcPr>
+          <w:p>
+            <w:r>
+              <w:t>Hội nghị Triển khai Công tác và Giao ban Đầu mối 12 Đơn vị Cơ sở năm học 2026 - 2027</w:t>
+            </w:r>
+          </w:p>
+        </w:tc>
+        <w:tc>
+          <w:tcPr>
+            <w:tcW w:type="dxa" w:w="1559"/>
+          </w:tcPr>
+          <w:p>
+            <w:r>
+              <w:t>Tháng 9 - 10/2026</w:t>
+            </w:r>
+          </w:p>
+        </w:tc>
+        <w:tc>
+          <w:tcPr>
+            <w:tcW w:type="dxa" w:w="1559"/>
+          </w:tcPr>
+          <w:p>
+            <w:r>
+              <w:t>Mảng 1 chủ trì; Mảng 3, 4 phối hợp</w:t>
+            </w:r>
+          </w:p>
+        </w:tc>
+        <w:tc>
+          <w:tcPr>
+            <w:tcW w:type="dxa" w:w="1559"/>
+          </w:tcPr>
+          <w:p>
+            <w:r>
+              <w:t>Kế hoạch năm học, Biên bản giao ban &amp; Thiết lập kênh trao đổi 12 đơn vị</w:t>
+            </w:r>
+          </w:p>
+        </w:tc>
+        <w:tc>
+          <w:tcPr>
+            <w:tcW w:type="dxa" w:w="1559"/>
+          </w:tcPr>
+          <w:p/>
+        </w:tc>
+      </w:tr>
     </w:tbl>
     <w:p>
       <w:pPr>
@@ -6004,19 +6041,7 @@
         <w:spacing w:after="80" w:line="288" w:lineRule="auto"/>
       </w:pPr>
       <w:r>
-        <w:rPr>
-          <w:rFonts w:ascii="Times New Roman" w:hAnsi="Times New Roman"/>
-          <w:b/>
-          <w:color w:val="00458C"/>
-        </w:rPr>
-        <w:t xml:space="preserve">Mảng 1 (Tổ chức - Đoàn vụ, 20 đồng chí): </w:t>
-      </w:r>
-      <w:r>
-        <w:rPr>
-          <w:rFonts w:ascii="Times New Roman" w:hAnsi="Times New Roman"/>
-          <w:sz w:val="22"/>
-        </w:rPr>
-        <w:t>Đóng vai trò 'xương sống' hành chính của Ban; chủ trì 10/15 nhiệm vụ trọng tâm năm học. Phụ trách trọn gói quy trình phát triển Đoàn (02 đợt kết nạp), Đại hội chi đoàn &amp; thành lập chi đoàn K71, ra mắt Ban Cán sự K71, nghiệp vụ sổ Đoàn (tiếp nhận tháng 12, nhận xét tháng 5-6), thu đoàn phí K71 và công nợ K68-K70, làm thẻ đoàn viên, tổng hợp hồ sơ thi đua khen thưởng và các hội nghị kiện toàn nhân sự cơ sở.</w:t>
+        <w:t>Mảng 1 (Tổ chức - Đoàn vụ, 20 đồng chí): Đóng vai trò 'xương sống' hành chính của Ban; chủ trì 10/16 nhiệm vụ trọng tâm năm học. Phụ trách trọn gói quy trình phát triển Đoàn (02 đợt kết nạp), Đại hội chi đoàn &amp; thành lập chi đoàn K71, ra mắt Ban Cán sự K71, nghiệp vụ sổ Đoàn (tiếp nhận tháng 12, nhận xét tháng 5-6), thu đoàn phí K71 và công nợ K68-K70, làm thẻ đoàn viên, tổng hợp hồ sơ thi đua khen thưởng và các hội nghị kiện toàn nhân sự cơ sở.</w:t>
       </w:r>
     </w:p>
     <w:p>

</xml_diff>

<commit_message>
feat: rename departments attractively, remove Mang 1-4 labels, enrich recruitment JDs, and split inspection/party/reconstitution into 18 tasks
</commit_message>
<xml_diff>
--- a/De_An_Tai_Cau_Truc_Ban_TCKT_Doan_Vu.docx
+++ b/De_An_Tai_Cau_Truc_Ban_TCKT_Doan_Vu.docx
@@ -305,7 +305,7 @@
         </w:numPr>
       </w:pPr>
       <w:r>
-        <w:t>Hai Phó Trưởng ban có vị trí ngang nhau. Đề xuất phân công một đồng chí theo dõi Mảng 1, Mảng 2; đồng chí còn lại theo dõi Mảng 3, Mảng 4. Khi điều chỉnh phải thông báo phạm vi và thời điểm bàn giao.</w:t>
+        <w:t>Hai Phó Trưởng ban có vị trí ngang nhau. Đề xuất phân công một đồng chí theo dõi Mảng Tổ chức &amp; Phát triển Đoàn vụ, Mảng Xây dựng Đảng &amp; Chuyển đổi số; đồng chí còn lại theo dõi Mảng Giám sát Kiểm tra &amp; Điểm rèn luyện, Mảng Truyền thông - Sự kiện &amp; Phát triển Nội bộ. Khi điều chỉnh phải thông báo phạm vi và thời điểm bàn giao.</w:t>
       </w:r>
     </w:p>
     <w:p>
@@ -356,7 +356,7 @@
     </w:p>
     <w:p>
       <w:r>
-        <w:t>Mỗi Đoàn trường, Liên chi đoàn có 01 kênh phối hợp chung với Ban và 01 tổ đầu mối liên mảng. Thành phần thường trực phía Ban gồm 03 đại diện chuyên môn được lựa chọn từ Mảng 1, Mảng 2, Mảng 3. Mỗi mảng phân công 01 đồng chí phụ trách chính và 01 đồng chí dự phòng cùng chuyên môn; khi cần thiết có thể có cả hai đồng chí trong kênh nhưng phải công khai người trả lời chính.</w:t>
+        <w:t>Mỗi Đoàn trường, Liên chi đoàn có 01 kênh phối hợp chung với Ban và 01 tổ đầu mối liên mảng. Thành phần thường trực phía Ban gồm 03 đại diện chuyên môn được lựa chọn từ Mảng Tổ chức &amp; Phát triển Đoàn vụ, Mảng Xây dựng Đảng &amp; Chuyển đổi số, Mảng Giám sát Kiểm tra &amp; Điểm rèn luyện. Mỗi mảng phân công 01 đồng chí phụ trách chính và 01 đồng chí dự phòng cùng chuyên môn; khi cần thiết có thể có cả hai đồng chí trong kênh nhưng phải công khai người trả lời chính.</w:t>
       </w:r>
     </w:p>
     <w:p>
@@ -987,11 +987,8 @@
             <w:vAlign w:val="center"/>
           </w:tcPr>
           <w:p>
-            <w:pPr>
-              <w:pStyle w:val="TableText"/>
-            </w:pPr>
-            <w:r>
-              <w:t>Mảng 1. Tổ chức - Đoàn vụ</w:t>
+            <w:r>
+              <w:t>Mảng Tổ chức &amp; Phát triển Đoàn vụ</w:t>
             </w:r>
           </w:p>
         </w:tc>
@@ -1066,11 +1063,8 @@
             <w:vAlign w:val="center"/>
           </w:tcPr>
           <w:p>
-            <w:pPr>
-              <w:pStyle w:val="TableText"/>
-            </w:pPr>
-            <w:r>
-              <w:t>Mảng 2. Đảng vụ - Chuyển đổi số</w:t>
+            <w:r>
+              <w:t>Mảng Xây dựng Đảng &amp; Chuyển đổi số</w:t>
             </w:r>
           </w:p>
         </w:tc>
@@ -1145,11 +1139,8 @@
             <w:vAlign w:val="center"/>
           </w:tcPr>
           <w:p>
-            <w:pPr>
-              <w:pStyle w:val="TableText"/>
-            </w:pPr>
-            <w:r>
-              <w:t>Mảng 3. Kiểm tra - Điểm rèn luyện</w:t>
+            <w:r>
+              <w:t>Mảng Giám sát Kiểm tra &amp; Điểm rèn luyện</w:t>
             </w:r>
           </w:p>
         </w:tc>
@@ -1224,11 +1215,8 @@
             <w:vAlign w:val="center"/>
           </w:tcPr>
           <w:p>
-            <w:pPr>
-              <w:pStyle w:val="TableText"/>
-            </w:pPr>
-            <w:r>
-              <w:t>Mảng 4. Truyền thông - Sự kiện và Phát triển nội bộ</w:t>
+            <w:r>
+              <w:t>Mảng Truyền thông - Sự kiện &amp; Phát triển Nội bộ</w:t>
             </w:r>
           </w:p>
         </w:tc>
@@ -1387,13 +1375,7 @@
         </w:numPr>
       </w:pPr>
       <w:r>
-        <w:rPr>
-          <w:b/>
-        </w:rPr>
-        <w:t>Mảng 1:</w:t>
-      </w:r>
-      <w:r>
-        <w:t xml:space="preserve"> 18 thành viên triển khai tổ chức, nhân sự, đoàn vụ, quản lý đoàn viên và văn thư. Lựa chọn nhân sự trong lực lượng này để đảm nhiệm 12 lượt đầu mối; không tách 12 đầu mối thành bộ phận độc lập.</w:t>
+        <w:t>Mảng Tổ chức &amp; Phát triển Đoàn vụ: 18 thành viên triển khai tổ chức, nhân sự, đoàn vụ, quản lý đoàn viên và văn thư. Lựa chọn nhân sự trong lực lượng này để đảm nhiệm 12 lượt đầu mối; không tách 12 đầu mối thành bộ phận độc lập.</w:t>
       </w:r>
     </w:p>
     <w:p>
@@ -1405,45 +1387,7 @@
         </w:numPr>
       </w:pPr>
       <w:r>
-        <w:rPr>
-          <w:b/>
-        </w:rPr>
-        <w:t>Mảng 2:</w:t>
-      </w:r>
-      <w:r>
-        <w:t xml:space="preserve"> dự kiến 06 thành viên tập trung hồ sơ Đảng và 06 thành viên tập trung dữ liệu, công cụ số. Cử đầu mối đủ năng lực hướng dẫn ban đầu; yêu cầu vượt chuyên môn được chuyển người phụ trách </w:t>
-      </w:r>
-      <w:proofErr w:type="spellStart"/>
-      <w:r>
-        <w:t>nghiệp</w:t>
-      </w:r>
-      <w:proofErr w:type="spellEnd"/>
-      <w:r>
-        <w:t xml:space="preserve"> </w:t>
-      </w:r>
-      <w:proofErr w:type="spellStart"/>
-      <w:r>
-        <w:t>vụ</w:t>
-      </w:r>
-      <w:proofErr w:type="spellEnd"/>
-      <w:r>
-        <w:t xml:space="preserve"> </w:t>
-      </w:r>
-      <w:proofErr w:type="spellStart"/>
-      <w:r>
-        <w:t>trong</w:t>
-      </w:r>
-      <w:proofErr w:type="spellEnd"/>
-      <w:r>
-        <w:t xml:space="preserve"> </w:t>
-      </w:r>
-      <w:proofErr w:type="spellStart"/>
-      <w:r>
-        <w:t>mảng</w:t>
-      </w:r>
-      <w:proofErr w:type="spellEnd"/>
-      <w:r>
-        <w:t>.</w:t>
+        <w:t>Mảng Xây dựng Đảng &amp; Chuyển đổi số: dự kiến 06 thành viên tập trung hồ sơ Đảng và 06 thành viên tập trung dữ liệu, công cụ số. Cử đầu mối đủ năng lực hướng dẫn ban đầu; yêu cầu vượt chuyên môn được chuyển người phụ trách nghiệp vụ trong mảng.</w:t>
       </w:r>
     </w:p>
     <w:p>
@@ -1455,13 +1399,7 @@
         </w:numPr>
       </w:pPr>
       <w:r>
-        <w:rPr>
-          <w:b/>
-        </w:rPr>
-        <w:t>Mảng 3:</w:t>
-      </w:r>
-      <w:r>
-        <w:t xml:space="preserve"> dự kiến 10 thành viên tham gia thẩm định đề án và tác nghiệp ĐRL; 07 thành viên tham gia giám sát, hậu kiểm và xác minh phản ánh. Hai Phó Trưởng mảng theo dõi hai nhóm nhiệm vụ để tạo điều kiện kiểm tra chéo.</w:t>
+        <w:t>Mảng Giám sát Kiểm tra &amp; Điểm rèn luyện: dự kiến 10 thành viên tham gia thẩm định đề án và tác nghiệp ĐRL; 07 thành viên tham gia giám sát, hậu kiểm và xác minh phản ánh. Hai Phó Trưởng mảng theo dõi hai nhóm nhiệm vụ để tạo điều kiện kiểm tra chéo.</w:t>
       </w:r>
     </w:p>
     <w:p>
@@ -1473,13 +1411,7 @@
         </w:numPr>
       </w:pPr>
       <w:r>
-        <w:rPr>
-          <w:b/>
-        </w:rPr>
-        <w:t>Mảng 4:</w:t>
-      </w:r>
-      <w:r>
-        <w:t xml:space="preserve"> 08 thành viên được phân công theo năng lực nội dung, thiết kế, hình ảnh, tổ chức sự kiện và hoạt động nội bộ; xây dựng tổ thực hiện theo chương trình, không chia địa bàn.</w:t>
+        <w:t>Mảng Truyền thông - Sự kiện &amp; Phát triển Nội bộ: 08 thành viên được phân công theo năng lực nội dung, thiết kế, hình ảnh, tổ chức sự kiện và hoạt động nội bộ; xây dựng tổ thực hiện theo chương trình, không chia địa bàn.</w:t>
       </w:r>
     </w:p>
     <w:p>
@@ -1586,7 +1518,7 @@
         </w:numPr>
       </w:pPr>
       <w:r>
-        <w:t>Theo dõi số liệu tổ chức, đoàn viên, chuyển sinh hoạt Đoàn và đánh giá đoàn viên theo nhiệm vụ được giao. Chịu trách nhiệm kiểm tra tính đúng của dữ liệu quản lý đoàn viên (QLDV); Mảng 2 hỗ trợ công cụ, cấu trúc và kỹ thuật.</w:t>
+        <w:t>Theo dõi số liệu tổ chức, đoàn viên, chuyển sinh hoạt Đoàn và đánh giá đoàn viên theo nhiệm vụ được giao. Chịu trách nhiệm kiểm tra tính đúng của dữ liệu quản lý đoàn viên (QLDV); Mảng Xây dựng Đảng &amp; Chuyển đổi số hỗ trợ công cụ, cấu trúc và kỹ thuật.</w:t>
       </w:r>
     </w:p>
     <w:p>
@@ -1622,7 +1554,7 @@
         </w:numPr>
       </w:pPr>
       <w:r>
-        <w:t>Tổng hợp hồ sơ thi đua, khen thưởng thuộc nhiệm vụ của Ban; phối hợp Mảng 3 kiểm tra số liệu, minh chứng khi được yêu cầu.</w:t>
+        <w:t>Tổng hợp hồ sơ thi đua, khen thưởng thuộc nhiệm vụ của Ban; phối hợp Mảng Giám sát Kiểm tra &amp; Điểm rèn luyện kiểm tra số liệu, minh chứng khi được yêu cầu.</w:t>
       </w:r>
     </w:p>
     <w:p>
@@ -1650,13 +1582,7 @@
     </w:p>
     <w:p>
       <w:r>
-        <w:rPr>
-          <w:b/>
-        </w:rPr>
-        <w:t>Ranh giới trách nhiệm:</w:t>
-      </w:r>
-      <w:r>
-        <w:t xml:space="preserve"> Mảng kiểm tra hồ sơ Đoàn vụ trước khi trình. Hoạt động kiểm tra độc lập theo kế hoạch, xác minh sai lệch hoặc kiểm tra chéo do Mảng 3 chủ trì trong phạm vi được Lãnh đạo Ban giao; không yêu cầu mọi hồ sơ phải đi qua thêm một vòng kiểm tra không cần thiết.</w:t>
+        <w:t>Ranh giới trách nhiệm: Mảng kiểm tra hồ sơ Đoàn vụ trước khi trình. Hoạt động kiểm tra độc lập theo kế hoạch, xác minh sai lệch hoặc kiểm tra chéo do Mảng Giám sát Kiểm tra &amp; Điểm rèn luyện chủ trì trong phạm vi được Lãnh đạo Ban giao; không yêu cầu mọi hồ sơ phải đi qua thêm một vòng kiểm tra không cần thiết.</w:t>
       </w:r>
     </w:p>
     <w:p>
@@ -1978,7 +1904,7 @@
         </w:numPr>
       </w:pPr>
       <w:r>
-        <w:t>Cung cấp thông tin đã được kiểm soát cho Mảng 4 để tuyên truyền quy trình, thời hạn, điều kiện tham gia hoặc kết quả được phép công bố.</w:t>
+        <w:t>Cung cấp thông tin đã được kiểm soát cho Mảng Truyền thông - Sự kiện &amp; Phát triển Nội bộ để tuyên truyền quy trình, thời hạn, điều kiện tham gia hoặc kết quả được phép công bố.</w:t>
       </w:r>
     </w:p>
     <w:p>
@@ -2077,7 +2003,7 @@
         </w:numPr>
       </w:pPr>
       <w:r>
-        <w:t>Phối hợp Mảng 3 tuyên truyền hướng dẫn lập đề án, thời hạn gửi hồ sơ, điều kiện ghi nhận ĐRL, quy trình bổ sung và kênh tiếp nhận phản ánh; chỉ công bố mức điểm, trạng thái hoặc kết quả khi có thông tin được phê duyệt.</w:t>
+        <w:t>Phối hợp Mảng Giám sát Kiểm tra &amp; Điểm rèn luyện tuyên truyền hướng dẫn lập đề án, thời hạn gửi hồ sơ, điều kiện ghi nhận ĐRL, quy trình bổ sung và kênh tiếp nhận phản ánh; chỉ công bố mức điểm, trạng thái hoặc kết quả khi có thông tin được phê duyệt.</w:t>
       </w:r>
     </w:p>
     <w:p>
@@ -2089,7 +2015,7 @@
         </w:numPr>
       </w:pPr>
       <w:r>
-        <w:t>Phối hợp Mảng 1, Mảng 2 truyền thông hướng dẫn nghiệp vụ và mốc công tác được phép phổ biến; không công bố hồ sơ cá nhân, dữ liệu Đảng hoặc danh sách hạn chế truy cập.</w:t>
+        <w:t>Phối hợp Mảng Tổ chức &amp; Phát triển Đoàn vụ, Mảng Xây dựng Đảng &amp; Chuyển đổi số truyền thông hướng dẫn nghiệp vụ và mốc công tác được phép phổ biến; không công bố hồ sơ cá nhân, dữ liệu Đảng hoặc danh sách hạn chế truy cập.</w:t>
       </w:r>
     </w:p>
     <w:p>
@@ -2118,13 +2044,7 @@
     </w:p>
     <w:p>
       <w:r>
-        <w:rPr>
-          <w:b/>
-        </w:rPr>
-        <w:t>Quy trình phối hợp truyền thông:</w:t>
-      </w:r>
-      <w:r>
-        <w:t xml:space="preserve"> Mảng chủ trì lập phiếu yêu cầu gồm mục tiêu, đối tượng, nội dung đã xác nhận, căn cứ công bố, sản phẩm, hạn hoàn thành và người duyệt nghiệp vụ; Mảng 4 tiếp nhận, phân công, biên tập; mảng chủ trì duyệt tính chính xác; người được giao duyệt phát hành; Mảng 4 đăng tải và lưu bản cuối.</w:t>
+        <w:t>Quy trình phối hợp truyền thông: Mảng chủ trì lập phiếu yêu cầu gồm mục tiêu, đối tượng, nội dung đã xác nhận, căn cứ công bố, sản phẩm, hạn hoàn thành và người duyệt nghiệp vụ; Mảng Truyền thông - Sự kiện &amp; Phát triển Nội bộ tiếp nhận, phân công, biên tập; mảng chủ trì duyệt tính chính xác; người được giao duyệt phát hành; Mảng Truyền thông - Sự kiện &amp; Phát triển Nội bộ đăng tải và lưu bản cuối.</w:t>
       </w:r>
     </w:p>
     <w:p>
@@ -2406,11 +2326,8 @@
             <w:vAlign w:val="center"/>
           </w:tcPr>
           <w:p>
-            <w:pPr>
-              <w:pStyle w:val="TableText"/>
-            </w:pPr>
-            <w:r>
-              <w:t>Mảng 1</w:t>
+            <w:r>
+              <w:t>Mảng Tổ chức &amp; Phát triển Đoàn vụ</w:t>
             </w:r>
           </w:p>
         </w:tc>
@@ -2453,11 +2370,8 @@
             <w:vAlign w:val="center"/>
           </w:tcPr>
           <w:p>
-            <w:pPr>
-              <w:pStyle w:val="TableText"/>
-            </w:pPr>
-            <w:r>
-              <w:t>Mảng 2</w:t>
+            <w:r>
+              <w:t>Mảng Xây dựng Đảng &amp; Chuyển đổi số</w:t>
             </w:r>
           </w:p>
         </w:tc>
@@ -2500,11 +2414,8 @@
             <w:vAlign w:val="center"/>
           </w:tcPr>
           <w:p>
-            <w:pPr>
-              <w:pStyle w:val="TableText"/>
-            </w:pPr>
-            <w:r>
-              <w:t>Mảng 3</w:t>
+            <w:r>
+              <w:t>Mảng Giám sát Kiểm tra &amp; Điểm rèn luyện</w:t>
             </w:r>
           </w:p>
         </w:tc>
@@ -2547,11 +2458,8 @@
             <w:vAlign w:val="center"/>
           </w:tcPr>
           <w:p>
-            <w:pPr>
-              <w:pStyle w:val="TableText"/>
-            </w:pPr>
-            <w:r>
-              <w:t>Mảng 4</w:t>
+            <w:r>
+              <w:t>Mảng Truyền thông - Sự kiện &amp; Phát triển Nội bộ</w:t>
             </w:r>
           </w:p>
         </w:tc>
@@ -2652,7 +2560,7 @@
     </w:p>
     <w:p>
       <w:r>
-        <w:t>Mỗi hồ sơ có mã, loại việc, đơn vị, người xử lý, trạng thái, mốc tiếp theo, đường dẫn tài liệu và lịch sử bàn giao. Mảng 2 quản lý danh mục trường, còn mảng sở hữu nghiệp vụ xác nhận nội dung. Các bảng tổng hợp rộng chỉ thể hiện số lượng và tiến độ cần thiết; tệp hồ sơ chi tiết được phân quyền riêng.</w:t>
+        <w:t>Mỗi hồ sơ có mã, loại việc, đơn vị, người xử lý, trạng thái, mốc tiếp theo, đường dẫn tài liệu và lịch sử bàn giao. Mảng Xây dựng Đảng &amp; Chuyển đổi số quản lý danh mục trường, còn mảng sở hữu nghiệp vụ xác nhận nội dung. Các bảng tổng hợp rộng chỉ thể hiện số lượng và tiến độ cần thiết; tệp hồ sơ chi tiết được phân quyền riêng.</w:t>
       </w:r>
     </w:p>
     <w:p>
@@ -2687,7 +2595,7 @@
     </w:p>
     <w:p>
       <w:r>
-        <w:t>Đánh giá theo nhiệm vụ đã giao, sản phẩm được xác nhận và thời gian thực tế có thể tham gia. Đề xuất thang 100 điểm gồm 40 điểm chuyên môn, 30 điểm phối hợp, 20 điểm kỷ luật và 10 điểm cải tiến. Không áp tiêu chí phụ trách cơ sở cho người không được giao đầu mối, đặc biệt Mảng 4.</w:t>
+        <w:t>Đánh giá theo nhiệm vụ đã giao, sản phẩm được xác nhận và thời gian thực tế có thể tham gia. Đề xuất thang 100 điểm gồm 40 điểm chuyên môn, 30 điểm phối hợp, 20 điểm kỷ luật và 10 điểm cải tiến. Không áp tiêu chí phụ trách cơ sở cho người không được giao đầu mối, đặc biệt Mảng Truyền thông - Sự kiện &amp; Phát triển Nội bộ.</w:t>
       </w:r>
     </w:p>
     <w:tbl>
@@ -2987,7 +2895,7 @@
         </w:numPr>
       </w:pPr>
       <w:r>
-        <w:t>Mảng 1: hồ sơ đủ thành phần, văn bản được kiểm soát, dữ liệu QLDV đã đối soát, sổ việc và bàn giao.</w:t>
+        <w:t>Mảng Tổ chức &amp; Phát triển Đoàn vụ: hồ sơ đủ thành phần, văn bản được kiểm soát, dữ liệu QLDV đã đối soát, sổ việc và bàn giao.</w:t>
       </w:r>
     </w:p>
     <w:p>
@@ -2999,7 +2907,7 @@
         </w:numPr>
       </w:pPr>
       <w:r>
-        <w:t>Mảng 2: trạng thái hồ sơ chính xác; dữ liệu đủ trường; tệp tra cứu được; biên bản đối soát, phân quyền và kiểm tra sao lưu. Không dùng số trường hợp được kết nạp làm chỉ tiêu cá nhân khi kết quả phụ thuộc cấp có thẩm quyền.</w:t>
+        <w:t>Mảng Xây dựng Đảng &amp; Chuyển đổi số: trạng thái hồ sơ chính xác; dữ liệu đủ trường; tệp tra cứu được; biên bản đối soát, phân quyền và kiểm tra sao lưu. Không dùng số trường hợp được kết nạp làm chỉ tiêu cá nhân khi kết quả phụ thuộc cấp có thẩm quyền.</w:t>
       </w:r>
     </w:p>
     <w:p>
@@ -3011,7 +2919,7 @@
         </w:numPr>
       </w:pPr>
       <w:r>
-        <w:t>Mảng 3: phiếu thẩm định có căn cứ; tiến độ xử lý đề án; hậu kiểm và phản hồi có minh chứng. Không lấy số đề án được chấp thuận hoặc số điểm được cộng làm thước đo thành tích.</w:t>
+        <w:t>Mảng Giám sát Kiểm tra &amp; Điểm rèn luyện: phiếu thẩm định có căn cứ; tiến độ xử lý đề án; hậu kiểm và phản hồi có minh chứng. Không lấy số đề án được chấp thuận hoặc số điểm được cộng làm thước đo thành tích.</w:t>
       </w:r>
     </w:p>
     <w:p>
@@ -3023,7 +2931,7 @@
         </w:numPr>
       </w:pPr>
       <w:r>
-        <w:t>Mảng 4: sản phẩm đúng hạn, đúng nội dung duyệt, số lần phải sửa vì sai nghiệp vụ và kết quả nhiệm vụ nội bộ. Không chấm bằng tốc độ trả lời nhóm cơ sở; không chỉ dựa vào lượt thích, lượt xem.</w:t>
+        <w:t>Mảng Truyền thông - Sự kiện &amp; Phát triển Nội bộ: sản phẩm đúng hạn, đúng nội dung duyệt, số lần phải sửa vì sai nghiệp vụ và kết quả nhiệm vụ nội bộ. Không chấm bằng tốc độ trả lời nhóm cơ sở; không chỉ dựa vào lượt thích, lượt xem.</w:t>
       </w:r>
     </w:p>
     <w:p>
@@ -3723,18 +3631,8 @@
             </w:tcMar>
           </w:tcPr>
           <w:p>
-            <w:pPr>
-              <w:spacing w:line="276" w:lineRule="auto"/>
-              <w:jc w:val="center"/>
-            </w:pPr>
-            <w:r>
-              <w:rPr>
-                <w:rFonts w:ascii="Times New Roman" w:hAnsi="Times New Roman"/>
-                <w:b/>
-                <w:color w:val="005BAC"/>
-                <w:sz w:val="19"/>
-              </w:rPr>
-              <w:t>Mảng 1</w:t>
+            <w:r>
+              <w:t>Mảng Tổ chức &amp; Phát triển Đoàn vụ</w:t>
             </w:r>
           </w:p>
         </w:tc>
@@ -3750,16 +3648,8 @@
             </w:tcMar>
           </w:tcPr>
           <w:p>
-            <w:pPr>
-              <w:spacing w:line="276" w:lineRule="auto"/>
-              <w:jc w:val="center"/>
-            </w:pPr>
-            <w:r>
-              <w:rPr>
-                <w:rFonts w:ascii="Times New Roman" w:hAnsi="Times New Roman"/>
-                <w:sz w:val="19"/>
-              </w:rPr>
-              <w:t>Mảng 4</w:t>
+            <w:r>
+              <w:t>Mảng Truyền thông - Sự kiện &amp; Phát triển Nội bộ</w:t>
             </w:r>
           </w:p>
         </w:tc>
@@ -3878,18 +3768,8 @@
             </w:tcMar>
           </w:tcPr>
           <w:p>
-            <w:pPr>
-              <w:spacing w:line="276" w:lineRule="auto"/>
-              <w:jc w:val="center"/>
-            </w:pPr>
-            <w:r>
-              <w:rPr>
-                <w:rFonts w:ascii="Times New Roman" w:hAnsi="Times New Roman"/>
-                <w:b/>
-                <w:color w:val="005BAC"/>
-                <w:sz w:val="19"/>
-              </w:rPr>
-              <w:t>Mảng 1</w:t>
+            <w:r>
+              <w:t>Mảng Tổ chức &amp; Phát triển Đoàn vụ</w:t>
             </w:r>
           </w:p>
         </w:tc>
@@ -3905,16 +3785,8 @@
             </w:tcMar>
           </w:tcPr>
           <w:p>
-            <w:pPr>
-              <w:spacing w:line="276" w:lineRule="auto"/>
-              <w:jc w:val="center"/>
-            </w:pPr>
-            <w:r>
-              <w:rPr>
-                <w:rFonts w:ascii="Times New Roman" w:hAnsi="Times New Roman"/>
-                <w:sz w:val="19"/>
-              </w:rPr>
-              <w:t>Mảng 2</w:t>
+            <w:r>
+              <w:t>Mảng Xây dựng Đảng &amp; Chuyển đổi số</w:t>
             </w:r>
           </w:p>
         </w:tc>
@@ -4033,18 +3905,8 @@
             </w:tcMar>
           </w:tcPr>
           <w:p>
-            <w:pPr>
-              <w:spacing w:line="276" w:lineRule="auto"/>
-              <w:jc w:val="center"/>
-            </w:pPr>
-            <w:r>
-              <w:rPr>
-                <w:rFonts w:ascii="Times New Roman" w:hAnsi="Times New Roman"/>
-                <w:b/>
-                <w:color w:val="005BAC"/>
-                <w:sz w:val="19"/>
-              </w:rPr>
-              <w:t>Mảng 1</w:t>
+            <w:r>
+              <w:t>Mảng Tổ chức &amp; Phát triển Đoàn vụ</w:t>
             </w:r>
           </w:p>
         </w:tc>
@@ -4060,16 +3922,8 @@
             </w:tcMar>
           </w:tcPr>
           <w:p>
-            <w:pPr>
-              <w:spacing w:line="276" w:lineRule="auto"/>
-              <w:jc w:val="center"/>
-            </w:pPr>
-            <w:r>
-              <w:rPr>
-                <w:rFonts w:ascii="Times New Roman" w:hAnsi="Times New Roman"/>
-                <w:sz w:val="19"/>
-              </w:rPr>
-              <w:t>Mảng 4</w:t>
+            <w:r>
+              <w:t>Mảng Truyền thông - Sự kiện &amp; Phát triển Nội bộ</w:t>
             </w:r>
           </w:p>
         </w:tc>
@@ -4188,18 +4042,8 @@
             </w:tcMar>
           </w:tcPr>
           <w:p>
-            <w:pPr>
-              <w:spacing w:line="276" w:lineRule="auto"/>
-              <w:jc w:val="center"/>
-            </w:pPr>
-            <w:r>
-              <w:rPr>
-                <w:rFonts w:ascii="Times New Roman" w:hAnsi="Times New Roman"/>
-                <w:b/>
-                <w:color w:val="005BAC"/>
-                <w:sz w:val="19"/>
-              </w:rPr>
-              <w:t>Mảng 1</w:t>
+            <w:r>
+              <w:t>Mảng Tổ chức &amp; Phát triển Đoàn vụ</w:t>
             </w:r>
           </w:p>
         </w:tc>
@@ -4215,16 +4059,8 @@
             </w:tcMar>
           </w:tcPr>
           <w:p>
-            <w:pPr>
-              <w:spacing w:line="276" w:lineRule="auto"/>
-              <w:jc w:val="center"/>
-            </w:pPr>
-            <w:r>
-              <w:rPr>
-                <w:rFonts w:ascii="Times New Roman" w:hAnsi="Times New Roman"/>
-                <w:sz w:val="19"/>
-              </w:rPr>
-              <w:t>Mảng 2</w:t>
+            <w:r>
+              <w:t>Mảng Xây dựng Đảng &amp; Chuyển đổi số</w:t>
             </w:r>
           </w:p>
         </w:tc>
@@ -4343,18 +4179,8 @@
             </w:tcMar>
           </w:tcPr>
           <w:p>
-            <w:pPr>
-              <w:spacing w:line="276" w:lineRule="auto"/>
-              <w:jc w:val="center"/>
-            </w:pPr>
-            <w:r>
-              <w:rPr>
-                <w:rFonts w:ascii="Times New Roman" w:hAnsi="Times New Roman"/>
-                <w:b/>
-                <w:color w:val="005BAC"/>
-                <w:sz w:val="19"/>
-              </w:rPr>
-              <w:t>Mảng 1</w:t>
+            <w:r>
+              <w:t>Mảng Tổ chức &amp; Phát triển Đoàn vụ</w:t>
             </w:r>
           </w:p>
         </w:tc>
@@ -4370,16 +4196,8 @@
             </w:tcMar>
           </w:tcPr>
           <w:p>
-            <w:pPr>
-              <w:spacing w:line="276" w:lineRule="auto"/>
-              <w:jc w:val="center"/>
-            </w:pPr>
-            <w:r>
-              <w:rPr>
-                <w:rFonts w:ascii="Times New Roman" w:hAnsi="Times New Roman"/>
-                <w:sz w:val="19"/>
-              </w:rPr>
-              <w:t>Mảng 2</w:t>
+            <w:r>
+              <w:t>Mảng Xây dựng Đảng &amp; Chuyển đổi số</w:t>
             </w:r>
           </w:p>
         </w:tc>
@@ -4498,18 +4316,8 @@
             </w:tcMar>
           </w:tcPr>
           <w:p>
-            <w:pPr>
-              <w:spacing w:line="276" w:lineRule="auto"/>
-              <w:jc w:val="center"/>
-            </w:pPr>
-            <w:r>
-              <w:rPr>
-                <w:rFonts w:ascii="Times New Roman" w:hAnsi="Times New Roman"/>
-                <w:b/>
-                <w:color w:val="005BAC"/>
-                <w:sz w:val="19"/>
-              </w:rPr>
-              <w:t>Mảng 1</w:t>
+            <w:r>
+              <w:t>Mảng Tổ chức &amp; Phát triển Đoàn vụ</w:t>
             </w:r>
           </w:p>
         </w:tc>
@@ -4525,16 +4333,8 @@
             </w:tcMar>
           </w:tcPr>
           <w:p>
-            <w:pPr>
-              <w:spacing w:line="276" w:lineRule="auto"/>
-              <w:jc w:val="center"/>
-            </w:pPr>
-            <w:r>
-              <w:rPr>
-                <w:rFonts w:ascii="Times New Roman" w:hAnsi="Times New Roman"/>
-                <w:sz w:val="19"/>
-              </w:rPr>
-              <w:t>Mảng 4</w:t>
+            <w:r>
+              <w:t>Mảng Truyền thông - Sự kiện &amp; Phát triển Nội bộ</w:t>
             </w:r>
           </w:p>
         </w:tc>
@@ -4653,18 +4453,8 @@
             </w:tcMar>
           </w:tcPr>
           <w:p>
-            <w:pPr>
-              <w:spacing w:line="276" w:lineRule="auto"/>
-              <w:jc w:val="center"/>
-            </w:pPr>
-            <w:r>
-              <w:rPr>
-                <w:rFonts w:ascii="Times New Roman" w:hAnsi="Times New Roman"/>
-                <w:b/>
-                <w:color w:val="005BAC"/>
-                <w:sz w:val="19"/>
-              </w:rPr>
-              <w:t>Mảng 1</w:t>
+            <w:r>
+              <w:t>Mảng Tổ chức &amp; Phát triển Đoàn vụ</w:t>
             </w:r>
           </w:p>
         </w:tc>
@@ -4680,16 +4470,8 @@
             </w:tcMar>
           </w:tcPr>
           <w:p>
-            <w:pPr>
-              <w:spacing w:line="276" w:lineRule="auto"/>
-              <w:jc w:val="center"/>
-            </w:pPr>
-            <w:r>
-              <w:rPr>
-                <w:rFonts w:ascii="Times New Roman" w:hAnsi="Times New Roman"/>
-                <w:sz w:val="19"/>
-              </w:rPr>
-              <w:t>Mảng 2</w:t>
+            <w:r>
+              <w:t>Mảng Xây dựng Đảng &amp; Chuyển đổi số</w:t>
             </w:r>
           </w:p>
         </w:tc>
@@ -4835,16 +4617,8 @@
             </w:tcMar>
           </w:tcPr>
           <w:p>
-            <w:pPr>
-              <w:spacing w:line="276" w:lineRule="auto"/>
-              <w:jc w:val="center"/>
-            </w:pPr>
-            <w:r>
-              <w:rPr>
-                <w:rFonts w:ascii="Times New Roman" w:hAnsi="Times New Roman"/>
-                <w:sz w:val="19"/>
-              </w:rPr>
-              <w:t>Mảng 4</w:t>
+            <w:r>
+              <w:t>Mảng Truyền thông - Sự kiện &amp; Phát triển Nội bộ</w:t>
             </w:r>
           </w:p>
         </w:tc>
@@ -4963,18 +4737,8 @@
             </w:tcMar>
           </w:tcPr>
           <w:p>
-            <w:pPr>
-              <w:spacing w:line="276" w:lineRule="auto"/>
-              <w:jc w:val="center"/>
-            </w:pPr>
-            <w:r>
-              <w:rPr>
-                <w:rFonts w:ascii="Times New Roman" w:hAnsi="Times New Roman"/>
-                <w:b/>
-                <w:color w:val="005BAC"/>
-                <w:sz w:val="19"/>
-              </w:rPr>
-              <w:t>Mảng 1</w:t>
+            <w:r>
+              <w:t>Mảng Tổ chức &amp; Phát triển Đoàn vụ</w:t>
             </w:r>
           </w:p>
         </w:tc>
@@ -4990,16 +4754,8 @@
             </w:tcMar>
           </w:tcPr>
           <w:p>
-            <w:pPr>
-              <w:spacing w:line="276" w:lineRule="auto"/>
-              <w:jc w:val="center"/>
-            </w:pPr>
-            <w:r>
-              <w:rPr>
-                <w:rFonts w:ascii="Times New Roman" w:hAnsi="Times New Roman"/>
-                <w:sz w:val="19"/>
-              </w:rPr>
-              <w:t>Mảng 4</w:t>
+            <w:r>
+              <w:t>Mảng Truyền thông - Sự kiện &amp; Phát triển Nội bộ</w:t>
             </w:r>
           </w:p>
         </w:tc>
@@ -5118,18 +4874,8 @@
             </w:tcMar>
           </w:tcPr>
           <w:p>
-            <w:pPr>
-              <w:spacing w:line="276" w:lineRule="auto"/>
-              <w:jc w:val="center"/>
-            </w:pPr>
-            <w:r>
-              <w:rPr>
-                <w:rFonts w:ascii="Times New Roman" w:hAnsi="Times New Roman"/>
-                <w:b/>
-                <w:color w:val="005BAC"/>
-                <w:sz w:val="19"/>
-              </w:rPr>
-              <w:t>Mảng 1</w:t>
+            <w:r>
+              <w:t>Mảng Tổ chức &amp; Phát triển Đoàn vụ</w:t>
             </w:r>
           </w:p>
         </w:tc>
@@ -5145,16 +4891,8 @@
             </w:tcMar>
           </w:tcPr>
           <w:p>
-            <w:pPr>
-              <w:spacing w:line="276" w:lineRule="auto"/>
-              <w:jc w:val="center"/>
-            </w:pPr>
-            <w:r>
-              <w:rPr>
-                <w:rFonts w:ascii="Times New Roman" w:hAnsi="Times New Roman"/>
-                <w:sz w:val="19"/>
-              </w:rPr>
-              <w:t>Mảng 3</w:t>
+            <w:r>
+              <w:t>Mảng Giám sát Kiểm tra &amp; Điểm rèn luyện</w:t>
             </w:r>
           </w:p>
         </w:tc>
@@ -5273,18 +5011,8 @@
             </w:tcMar>
           </w:tcPr>
           <w:p>
-            <w:pPr>
-              <w:spacing w:line="276" w:lineRule="auto"/>
-              <w:jc w:val="center"/>
-            </w:pPr>
-            <w:r>
-              <w:rPr>
-                <w:rFonts w:ascii="Times New Roman" w:hAnsi="Times New Roman"/>
-                <w:b/>
-                <w:color w:val="005BAC"/>
-                <w:sz w:val="19"/>
-              </w:rPr>
-              <w:t>Mảng 3</w:t>
+            <w:r>
+              <w:t>Mảng Giám sát Kiểm tra &amp; Điểm rèn luyện</w:t>
             </w:r>
           </w:p>
         </w:tc>
@@ -5300,16 +5028,8 @@
             </w:tcMar>
           </w:tcPr>
           <w:p>
-            <w:pPr>
-              <w:spacing w:line="276" w:lineRule="auto"/>
-              <w:jc w:val="center"/>
-            </w:pPr>
-            <w:r>
-              <w:rPr>
-                <w:rFonts w:ascii="Times New Roman" w:hAnsi="Times New Roman"/>
-                <w:sz w:val="19"/>
-              </w:rPr>
-              <w:t>Mảng 1</w:t>
+            <w:r>
+              <w:t>Mảng Tổ chức &amp; Phát triển Đoàn vụ</w:t>
             </w:r>
           </w:p>
         </w:tc>
@@ -5428,18 +5148,8 @@
             </w:tcMar>
           </w:tcPr>
           <w:p>
-            <w:pPr>
-              <w:spacing w:line="276" w:lineRule="auto"/>
-              <w:jc w:val="center"/>
-            </w:pPr>
-            <w:r>
-              <w:rPr>
-                <w:rFonts w:ascii="Times New Roman" w:hAnsi="Times New Roman"/>
-                <w:b/>
-                <w:color w:val="005BAC"/>
-                <w:sz w:val="19"/>
-              </w:rPr>
-              <w:t>Mảng 1</w:t>
+            <w:r>
+              <w:t>Mảng Tổ chức &amp; Phát triển Đoàn vụ</w:t>
             </w:r>
           </w:p>
         </w:tc>
@@ -5583,18 +5293,8 @@
             </w:tcMar>
           </w:tcPr>
           <w:p>
-            <w:pPr>
-              <w:spacing w:line="276" w:lineRule="auto"/>
-              <w:jc w:val="center"/>
-            </w:pPr>
-            <w:r>
-              <w:rPr>
-                <w:rFonts w:ascii="Times New Roman" w:hAnsi="Times New Roman"/>
-                <w:b/>
-                <w:color w:val="005BAC"/>
-                <w:sz w:val="19"/>
-              </w:rPr>
-              <w:t>Mảng 2</w:t>
+            <w:r>
+              <w:t>Mảng Xây dựng Đảng &amp; Chuyển đổi số</w:t>
             </w:r>
           </w:p>
         </w:tc>
@@ -5610,16 +5310,8 @@
             </w:tcMar>
           </w:tcPr>
           <w:p>
-            <w:pPr>
-              <w:spacing w:line="276" w:lineRule="auto"/>
-              <w:jc w:val="center"/>
-            </w:pPr>
-            <w:r>
-              <w:rPr>
-                <w:rFonts w:ascii="Times New Roman" w:hAnsi="Times New Roman"/>
-                <w:sz w:val="19"/>
-              </w:rPr>
-              <w:t>Mảng 1</w:t>
+            <w:r>
+              <w:t>Mảng Tổ chức &amp; Phát triển Đoàn vụ</w:t>
             </w:r>
           </w:p>
         </w:tc>
@@ -5738,18 +5430,8 @@
             </w:tcMar>
           </w:tcPr>
           <w:p>
-            <w:pPr>
-              <w:spacing w:line="276" w:lineRule="auto"/>
-              <w:jc w:val="center"/>
-            </w:pPr>
-            <w:r>
-              <w:rPr>
-                <w:rFonts w:ascii="Times New Roman" w:hAnsi="Times New Roman"/>
-                <w:b/>
-                <w:color w:val="005BAC"/>
-                <w:sz w:val="19"/>
-              </w:rPr>
-              <w:t>Mảng 3</w:t>
+            <w:r>
+              <w:t>Mảng Giám sát Kiểm tra &amp; Điểm rèn luyện</w:t>
             </w:r>
           </w:p>
         </w:tc>
@@ -5765,16 +5447,8 @@
             </w:tcMar>
           </w:tcPr>
           <w:p>
-            <w:pPr>
-              <w:spacing w:line="276" w:lineRule="auto"/>
-              <w:jc w:val="center"/>
-            </w:pPr>
-            <w:r>
-              <w:rPr>
-                <w:rFonts w:ascii="Times New Roman" w:hAnsi="Times New Roman"/>
-                <w:sz w:val="19"/>
-              </w:rPr>
-              <w:t>Mảng 4</w:t>
+            <w:r>
+              <w:t>Mảng Truyền thông - Sự kiện &amp; Phát triển Nội bộ</w:t>
             </w:r>
           </w:p>
         </w:tc>
@@ -6000,7 +5674,7 @@
           </w:tcPr>
           <w:p>
             <w:r>
-              <w:t>Mảng 1 chủ trì; Mảng 3, 4 phối hợp</w:t>
+              <w:t>Mảng Tổ chức &amp; Phát triển Đoàn vụ chủ trì; Mảng Giám sát Kiểm tra &amp; Điểm rèn luyện, 4 phối hợp</w:t>
             </w:r>
           </w:p>
         </w:tc>
@@ -6011,6 +5685,180 @@
           <w:p>
             <w:r>
               <w:t>Kế hoạch năm học, Biên bản giao ban &amp; Thiết lập kênh trao đổi 12 đơn vị</w:t>
+            </w:r>
+          </w:p>
+        </w:tc>
+        <w:tc>
+          <w:tcPr>
+            <w:tcW w:type="dxa" w:w="1559"/>
+          </w:tcPr>
+          <w:p/>
+        </w:tc>
+      </w:tr>
+      <w:tr>
+        <w:tc>
+          <w:tcPr>
+            <w:tcW w:type="dxa" w:w="1559"/>
+          </w:tcPr>
+          <w:p>
+            <w:r>
+              <w:t>16</w:t>
+            </w:r>
+          </w:p>
+        </w:tc>
+        <w:tc>
+          <w:tcPr>
+            <w:tcW w:type="dxa" w:w="1559"/>
+          </w:tcPr>
+          <w:p>
+            <w:r>
+              <w:t>Kiểm tra Giấy tờ, Hồ sơ sau Đại hội Chi đoàn và Đại hội cơ sở</w:t>
+            </w:r>
+          </w:p>
+        </w:tc>
+        <w:tc>
+          <w:tcPr>
+            <w:tcW w:type="dxa" w:w="1559"/>
+          </w:tcPr>
+          <w:p>
+            <w:r>
+              <w:t>Tháng 10 - 12/2026</w:t>
+            </w:r>
+          </w:p>
+        </w:tc>
+        <w:tc>
+          <w:tcPr>
+            <w:tcW w:type="dxa" w:w="1559"/>
+          </w:tcPr>
+          <w:p>
+            <w:r>
+              <w:t>Mảng Giám sát Kiểm tra &amp; ĐRL chủ trì; Mảng Tổ chức &amp; Đoàn vụ phối hợp</w:t>
+            </w:r>
+          </w:p>
+        </w:tc>
+        <w:tc>
+          <w:tcPr>
+            <w:tcW w:type="dxa" w:w="1559"/>
+          </w:tcPr>
+          <w:p>
+            <w:r>
+              <w:t>Biên bản hậu kiểm hồ sơ đại hội; Danh mục chi đoàn đủ điều kiện chuẩn y</w:t>
+            </w:r>
+          </w:p>
+        </w:tc>
+        <w:tc>
+          <w:tcPr>
+            <w:tcW w:type="dxa" w:w="1559"/>
+          </w:tcPr>
+          <w:p/>
+        </w:tc>
+      </w:tr>
+      <w:tr>
+        <w:tc>
+          <w:tcPr>
+            <w:tcW w:type="dxa" w:w="1559"/>
+          </w:tcPr>
+          <w:p>
+            <w:r>
+              <w:t>17</w:t>
+            </w:r>
+          </w:p>
+        </w:tc>
+        <w:tc>
+          <w:tcPr>
+            <w:tcW w:type="dxa" w:w="1559"/>
+          </w:tcPr>
+          <w:p>
+            <w:r>
+              <w:t>Kiểm tra Giấy tờ và Thẩm định Hồ sơ sau Kiện toàn Cán bộ Đoàn</w:t>
+            </w:r>
+          </w:p>
+        </w:tc>
+        <w:tc>
+          <w:tcPr>
+            <w:tcW w:type="dxa" w:w="1559"/>
+          </w:tcPr>
+          <w:p>
+            <w:r>
+              <w:t>Xuyên suốt Cả năm</w:t>
+            </w:r>
+          </w:p>
+        </w:tc>
+        <w:tc>
+          <w:tcPr>
+            <w:tcW w:type="dxa" w:w="1559"/>
+          </w:tcPr>
+          <w:p>
+            <w:r>
+              <w:t>Mảng Giám sát Kiểm tra &amp; ĐRL chủ trì; Mảng Tổ chức &amp; Đoàn vụ phối hợp</w:t>
+            </w:r>
+          </w:p>
+        </w:tc>
+        <w:tc>
+          <w:tcPr>
+            <w:tcW w:type="dxa" w:w="1559"/>
+          </w:tcPr>
+          <w:p>
+            <w:r>
+              <w:t>Phiếu thẩm tra hồ sơ kiện toàn; Quyết định công nhận kiện toàn nhân sự</w:t>
+            </w:r>
+          </w:p>
+        </w:tc>
+        <w:tc>
+          <w:tcPr>
+            <w:tcW w:type="dxa" w:w="1559"/>
+          </w:tcPr>
+          <w:p/>
+        </w:tc>
+      </w:tr>
+      <w:tr>
+        <w:tc>
+          <w:tcPr>
+            <w:tcW w:type="dxa" w:w="1559"/>
+          </w:tcPr>
+          <w:p>
+            <w:r>
+              <w:t>18</w:t>
+            </w:r>
+          </w:p>
+        </w:tc>
+        <w:tc>
+          <w:tcPr>
+            <w:tcW w:type="dxa" w:w="1559"/>
+          </w:tcPr>
+          <w:p>
+            <w:r>
+              <w:t>Báo cáo Tổng kết &amp; Thi đua Khen thưởng Năm học 2026 - 2027</w:t>
+            </w:r>
+          </w:p>
+        </w:tc>
+        <w:tc>
+          <w:tcPr>
+            <w:tcW w:type="dxa" w:w="1559"/>
+          </w:tcPr>
+          <w:p>
+            <w:r>
+              <w:t>Tháng 06/2027</w:t>
+            </w:r>
+          </w:p>
+        </w:tc>
+        <w:tc>
+          <w:tcPr>
+            <w:tcW w:type="dxa" w:w="1559"/>
+          </w:tcPr>
+          <w:p>
+            <w:r>
+              <w:t>Mảng Tổ chức &amp; Đoàn vụ chủ trì; Các mảng chuyên môn phối hợp</w:t>
+            </w:r>
+          </w:p>
+        </w:tc>
+        <w:tc>
+          <w:tcPr>
+            <w:tcW w:type="dxa" w:w="1559"/>
+          </w:tcPr>
+          <w:p>
+            <w:r>
+              <w:t>Báo cáo tổng kết năm học; Kỷ yếu hoạt động; Quyết định khen thưởng</w:t>
             </w:r>
           </w:p>
         </w:tc>
@@ -6041,7 +5889,7 @@
         <w:spacing w:after="80" w:line="288" w:lineRule="auto"/>
       </w:pPr>
       <w:r>
-        <w:t>Mảng 1 (Tổ chức - Đoàn vụ, 20 đồng chí): Đóng vai trò 'xương sống' hành chính của Ban; chủ trì 10/16 nhiệm vụ trọng tâm năm học. Phụ trách trọn gói quy trình phát triển Đoàn (02 đợt kết nạp), Đại hội chi đoàn &amp; thành lập chi đoàn K71, ra mắt Ban Cán sự K71, nghiệp vụ sổ Đoàn (tiếp nhận tháng 12, nhận xét tháng 5-6), thu đoàn phí K71 và công nợ K68-K70, làm thẻ đoàn viên, tổng hợp hồ sơ thi đua khen thưởng và các hội nghị kiện toàn nhân sự cơ sở.</w:t>
+        <w:t>Mảng Tổ chức &amp; Phát triển Đoàn vụ (Tổ chức - Đoàn vụ, 20 đồng chí): Đóng vai trò 'xương sống' hành chính của Ban; chủ trì 10/18 nhiệm vụ trọng tâm năm học. Phụ trách trọn gói quy trình phát triển Đoàn (02 đợt kết nạp), Đại hội chi đoàn &amp; thành lập chi đoàn K71, ra mắt Ban Cán sự K71, nghiệp vụ sổ Đoàn (tiếp nhận tháng 12, nhận xét tháng 5-6), thu đoàn phí K71 và công nợ K68-K70, làm thẻ đoàn viên, tổng hợp hồ sơ thi đua khen thưởng và các hội nghị kiện toàn nhân sự cơ sở.</w:t>
       </w:r>
     </w:p>
     <w:p>
@@ -6050,19 +5898,7 @@
         <w:spacing w:after="80" w:line="288" w:lineRule="auto"/>
       </w:pPr>
       <w:r>
-        <w:rPr>
-          <w:rFonts w:ascii="Times New Roman" w:hAnsi="Times New Roman"/>
-          <w:b/>
-          <w:color w:val="00458C"/>
-        </w:rPr>
-        <w:t xml:space="preserve">Mảng 2 (Đảng vụ - Chuyển đổi số, 14 đồng chí): </w:t>
-      </w:r>
-      <w:r>
-        <w:rPr>
-          <w:rFonts w:ascii="Times New Roman" w:hAnsi="Times New Roman"/>
-          <w:sz w:val="22"/>
-        </w:rPr>
-        <w:t>Chủ trì toàn diện hạ tầng số và quy trình Đảng vụ. Đảm nhiệm vận hành phần mềm Quản lý đoàn viên (QLDV) và ứng dụng Thanh niên Việt Nam xuyên suốt cả năm học: giám sát đăng tải tài liệu sinh hoạt chi đoàn số hàng tháng, bảo đảm 100% ĐV đăng ký rèn luyện đoàn viên và được cấp thẻ/sổ điện tử, đánh giá xếp loại số; chủ trì thẩm tra, quản lý tiến độ hồ sơ phát triển Đảng, liên kết dữ liệu với Văn phòng Đảng ủy.</w:t>
+        <w:t>Mảng Xây dựng Đảng &amp; Chuyển đổi số (Đảng vụ - Chuyển đổi số, 14 đồng chí): Chủ trì toàn diện hạ tầng số và quy trình Đảng vụ. Đảm nhiệm vận hành phần mềm Quản lý đoàn viên (QLDV) và ứng dụng Thanh niên Việt Nam xuyên suốt cả năm học: giám sát đăng tải tài liệu sinh hoạt chi đoàn số hàng tháng, bảo đảm 100% ĐV đăng ký rèn luyện đoàn viên và được cấp thẻ/sổ điện tử, đánh giá xếp loại số; chủ trì thẩm tra, quản lý tiến độ hồ sơ phát triển Đảng, liên kết dữ liệu với Văn phòng Đảng ủy.</w:t>
       </w:r>
     </w:p>
     <w:p>
@@ -6071,19 +5907,7 @@
         <w:spacing w:after="80" w:line="288" w:lineRule="auto"/>
       </w:pPr>
       <w:r>
-        <w:rPr>
-          <w:rFonts w:ascii="Times New Roman" w:hAnsi="Times New Roman"/>
-          <w:b/>
-          <w:color w:val="00458C"/>
-        </w:rPr>
-        <w:t xml:space="preserve">Mảng 3 (Kiểm tra - Điểm rèn luyện, 20 đồng chí): </w:t>
-      </w:r>
-      <w:r>
-        <w:rPr>
-          <w:rFonts w:ascii="Times New Roman" w:hAnsi="Times New Roman"/>
-          <w:sz w:val="22"/>
-        </w:rPr>
-        <w:t>Chủ trì nghiệp vụ có tần suất tương tác lớn nhất của Ban. Thẩm định đề án, kiểm duyệt tính chất và cấp mã hoạt động ĐRL xuyên suốt cả năm học; trực ban giải quyết thắc mắc, khiếu nại minh chứng cho sinh viên; chủ trì Đoàn kiểm tra công tác Đoàn và phong trào thanh niên cuối năm đối với 12 cơ sở (tháng 6/2027); thẩm định minh chứng giấy tờ và tính hợp lệ của điểm thi đua.</w:t>
+        <w:t>Mảng Giám sát Kiểm tra &amp; Điểm rèn luyện (Kiểm tra - Điểm rèn luyện, 20 đồng chí): Chủ trì nghiệp vụ có tần suất tương tác lớn nhất của Ban. Thẩm định đề án, kiểm duyệt tính chất và cấp mã hoạt động ĐRL xuyên suốt cả năm học; trực ban giải quyết thắc mắc, khiếu nại minh chứng cho sinh viên; chủ trì Đoàn kiểm tra công tác Đoàn và phong trào thanh niên cuối năm đối với 12 cơ sở (tháng 6/2027); thẩm định minh chứng giấy tờ và tính hợp lệ của điểm thi đua.</w:t>
       </w:r>
     </w:p>
     <w:p>
@@ -6092,19 +5916,7 @@
         <w:spacing w:after="80" w:line="288" w:lineRule="auto"/>
       </w:pPr>
       <w:r>
-        <w:rPr>
-          <w:rFonts w:ascii="Times New Roman" w:hAnsi="Times New Roman"/>
-          <w:b/>
-          <w:color w:val="00458C"/>
-        </w:rPr>
-        <w:t xml:space="preserve">Mảng 4 (Truyền thông - Sự kiện và Phát triển nội bộ, 10 đồng chí): </w:t>
-      </w:r>
-      <w:r>
-        <w:rPr>
-          <w:rFonts w:ascii="Times New Roman" w:hAnsi="Times New Roman"/>
-          <w:sz w:val="22"/>
-        </w:rPr>
-        <w:t>Đồng hành hỗ trợ toàn diện các hoạt động của Ban và Đoàn Đại học: Xây dựng chiến dịch truyền thông tuyển thành viên (tháng 9/2026); tổ chức Lễ ra mắt Ban Cán sự K71; truyền thông 02 đợt kết nạp Đoàn viên mới; chủ trì công tác hậu cần, tài liệu, địa điểm cho Hội nghị tập huấn cán bộ Đoàn (tháng 4/2027); sản xuất ấn phẩm tổng kết năm học, kỷ yếu Ban và chăm lo đời sống nội bộ.</w:t>
+        <w:t>Mảng Truyền thông - Sự kiện &amp; Phát triển Nội bộ (Truyền thông - Sự kiện và Phát triển nội bộ, 10 đồng chí): Đồng hành hỗ trợ toàn diện các hoạt động của Ban và Đoàn Đại học: Xây dựng chiến dịch truyền thông tuyển thành viên (tháng 9/2026); tổ chức Lễ ra mắt Ban Cán sự K71; truyền thông 02 đợt kết nạp Đoàn viên mới; chủ trì công tác hậu cần, tài liệu, địa điểm cho Hội nghị tập huấn cán bộ Đoàn (tháng 4/2027); sản xuất ấn phẩm tổng kết năm học, kỷ yếu Ban và chăm lo đời sống nội bộ.</w:t>
       </w:r>
     </w:p>
     <w:p>
@@ -6399,17 +6211,8 @@
             </w:tcMar>
           </w:tcPr>
           <w:p>
-            <w:pPr>
-              <w:spacing w:line="276" w:lineRule="auto"/>
-              <w:jc w:val="center"/>
-            </w:pPr>
-            <w:r>
-              <w:rPr>
-                <w:rFonts w:ascii="Times New Roman" w:hAnsi="Times New Roman"/>
-                <w:b/>
-                <w:sz w:val="19"/>
-              </w:rPr>
-              <w:t>Mảng 1</w:t>
+            <w:r>
+              <w:t>Mảng Tổ chức &amp; Phát triển Đoàn vụ</w:t>
             </w:r>
           </w:p>
         </w:tc>
@@ -6532,17 +6335,8 @@
             </w:tcMar>
           </w:tcPr>
           <w:p>
-            <w:pPr>
-              <w:spacing w:line="276" w:lineRule="auto"/>
-              <w:jc w:val="center"/>
-            </w:pPr>
-            <w:r>
-              <w:rPr>
-                <w:rFonts w:ascii="Times New Roman" w:hAnsi="Times New Roman"/>
-                <w:b/>
-                <w:sz w:val="19"/>
-              </w:rPr>
-              <w:t>Mảng 1</w:t>
+            <w:r>
+              <w:t>Mảng Tổ chức &amp; Phát triển Đoàn vụ</w:t>
             </w:r>
           </w:p>
         </w:tc>
@@ -6669,17 +6463,8 @@
             </w:tcMar>
           </w:tcPr>
           <w:p>
-            <w:pPr>
-              <w:spacing w:line="276" w:lineRule="auto"/>
-              <w:jc w:val="center"/>
-            </w:pPr>
-            <w:r>
-              <w:rPr>
-                <w:rFonts w:ascii="Times New Roman" w:hAnsi="Times New Roman"/>
-                <w:b/>
-                <w:sz w:val="19"/>
-              </w:rPr>
-              <w:t>Mảng 2</w:t>
+            <w:r>
+              <w:t>Mảng Xây dựng Đảng &amp; Chuyển đổi số</w:t>
             </w:r>
           </w:p>
         </w:tc>
@@ -6806,17 +6591,8 @@
             </w:tcMar>
           </w:tcPr>
           <w:p>
-            <w:pPr>
-              <w:spacing w:line="276" w:lineRule="auto"/>
-              <w:jc w:val="center"/>
-            </w:pPr>
-            <w:r>
-              <w:rPr>
-                <w:rFonts w:ascii="Times New Roman" w:hAnsi="Times New Roman"/>
-                <w:b/>
-                <w:sz w:val="19"/>
-              </w:rPr>
-              <w:t>Mảng 1</w:t>
+            <w:r>
+              <w:t>Mảng Tổ chức &amp; Phát triển Đoàn vụ</w:t>
             </w:r>
           </w:p>
         </w:tc>
@@ -6939,17 +6715,8 @@
             </w:tcMar>
           </w:tcPr>
           <w:p>
-            <w:pPr>
-              <w:spacing w:line="276" w:lineRule="auto"/>
-              <w:jc w:val="center"/>
-            </w:pPr>
-            <w:r>
-              <w:rPr>
-                <w:rFonts w:ascii="Times New Roman" w:hAnsi="Times New Roman"/>
-                <w:b/>
-                <w:sz w:val="19"/>
-              </w:rPr>
-              <w:t>Mảng 1</w:t>
+            <w:r>
+              <w:t>Mảng Tổ chức &amp; Phát triển Đoàn vụ</w:t>
             </w:r>
           </w:p>
         </w:tc>
@@ -7070,19 +6837,10 @@
             </w:tcMar>
           </w:tcPr>
           <w:p>
-            <w:pPr>
-              <w:spacing w:line="276" w:lineRule="auto"/>
-              <w:jc w:val="center"/>
-            </w:pPr>
-            <w:r>
-              <w:rPr>
-                <w:rFonts w:ascii="Times New Roman" w:hAnsi="Times New Roman"/>
-                <w:b/>
-                <w:sz w:val="19"/>
-              </w:rPr>
-              <w:t>Mảng 3 (chủ trì)</w:t>
+            <w:r>
+              <w:t>Mảng Giám sát Kiểm tra &amp; Điểm rèn luyện (chủ trì)</w:t>
               <w:br/>
-              <w:t>Mảng 1 (p/h)</w:t>
+              <w:t>Mảng Tổ chức &amp; Phát triển Đoàn vụ (p/h)</w:t>
             </w:r>
           </w:p>
         </w:tc>
@@ -7213,17 +6971,8 @@
             </w:tcMar>
           </w:tcPr>
           <w:p>
-            <w:pPr>
-              <w:spacing w:line="276" w:lineRule="auto"/>
-              <w:jc w:val="center"/>
-            </w:pPr>
-            <w:r>
-              <w:rPr>
-                <w:rFonts w:ascii="Times New Roman" w:hAnsi="Times New Roman"/>
-                <w:b/>
-                <w:sz w:val="19"/>
-              </w:rPr>
-              <w:t>Mảng 2</w:t>
+            <w:r>
+              <w:t>Mảng Xây dựng Đảng &amp; Chuyển đổi số</w:t>
             </w:r>
           </w:p>
         </w:tc>
@@ -7620,17 +7369,8 @@
             </w:tcMar>
           </w:tcPr>
           <w:p>
-            <w:pPr>
-              <w:spacing w:line="276" w:lineRule="auto"/>
-              <w:jc w:val="center"/>
-            </w:pPr>
-            <w:r>
-              <w:rPr>
-                <w:rFonts w:ascii="Times New Roman" w:hAnsi="Times New Roman"/>
-                <w:b/>
-                <w:sz w:val="19"/>
-              </w:rPr>
-              <w:t>Mảng 1</w:t>
+            <w:r>
+              <w:t>Mảng Tổ chức &amp; Phát triển Đoàn vụ</w:t>
             </w:r>
           </w:p>
         </w:tc>
@@ -7755,17 +7495,8 @@
             </w:tcMar>
           </w:tcPr>
           <w:p>
-            <w:pPr>
-              <w:spacing w:line="276" w:lineRule="auto"/>
-              <w:jc w:val="center"/>
-            </w:pPr>
-            <w:r>
-              <w:rPr>
-                <w:rFonts w:ascii="Times New Roman" w:hAnsi="Times New Roman"/>
-                <w:b/>
-                <w:sz w:val="19"/>
-              </w:rPr>
-              <w:t>Mảng 3 (giám sát)</w:t>
+            <w:r>
+              <w:t>Mảng Giám sát Kiểm tra &amp; Điểm rèn luyện (giám sát)</w:t>
               <w:br/>
               <w:t>Toàn Ban</w:t>
             </w:r>

</xml_diff>

<commit_message>
feat: rename Xây dựng Đảng to Phát triển Đảng across all web files and docx
</commit_message>
<xml_diff>
--- a/De_An_Tai_Cau_Truc_Ban_TCKT_Doan_Vu.docx
+++ b/De_An_Tai_Cau_Truc_Ban_TCKT_Doan_Vu.docx
@@ -305,7 +305,7 @@
         </w:numPr>
       </w:pPr>
       <w:r>
-        <w:t>Hai Phó Trưởng ban có vị trí ngang nhau. Đề xuất phân công một đồng chí theo dõi Mảng Tổ chức &amp; Phát triển Đoàn vụ, Mảng Xây dựng Đảng &amp; Chuyển đổi số; đồng chí còn lại theo dõi Mảng Giám sát Kiểm tra &amp; Điểm rèn luyện, Mảng Truyền thông - Sự kiện &amp; Phát triển Nội bộ. Khi điều chỉnh phải thông báo phạm vi và thời điểm bàn giao.</w:t>
+        <w:t>Hai Phó Trưởng ban có vị trí ngang nhau. Đề xuất phân công một đồng chí theo dõi Mảng Tổ chức &amp; Phát triển Đoàn vụ, Mảng Phát triển Đảng &amp; Chuyển đổi số; đồng chí còn lại theo dõi Mảng Giám sát Kiểm tra &amp; Điểm rèn luyện, Mảng Truyền thông - Sự kiện &amp; Phát triển Nội bộ. Khi điều chỉnh phải thông báo phạm vi và thời điểm bàn giao.</w:t>
       </w:r>
     </w:p>
     <w:p>
@@ -356,7 +356,7 @@
     </w:p>
     <w:p>
       <w:r>
-        <w:t>Mỗi Đoàn trường, Liên chi đoàn có 01 kênh phối hợp chung với Ban và 01 tổ đầu mối liên mảng. Thành phần thường trực phía Ban gồm 03 đại diện chuyên môn được lựa chọn từ Mảng Tổ chức &amp; Phát triển Đoàn vụ, Mảng Xây dựng Đảng &amp; Chuyển đổi số, Mảng Giám sát Kiểm tra &amp; Điểm rèn luyện. Mỗi mảng phân công 01 đồng chí phụ trách chính và 01 đồng chí dự phòng cùng chuyên môn; khi cần thiết có thể có cả hai đồng chí trong kênh nhưng phải công khai người trả lời chính.</w:t>
+        <w:t>Mỗi Đoàn trường, Liên chi đoàn có 01 kênh phối hợp chung với Ban và 01 tổ đầu mối liên mảng. Thành phần thường trực phía Ban gồm 03 đại diện chuyên môn được lựa chọn từ Mảng Tổ chức &amp; Phát triển Đoàn vụ, Mảng Phát triển Đảng &amp; Chuyển đổi số, Mảng Giám sát Kiểm tra &amp; Điểm rèn luyện. Mỗi mảng phân công 01 đồng chí phụ trách chính và 01 đồng chí dự phòng cùng chuyên môn; khi cần thiết có thể có cả hai đồng chí trong kênh nhưng phải công khai người trả lời chính.</w:t>
       </w:r>
     </w:p>
     <w:p>
@@ -1064,7 +1064,7 @@
           </w:tcPr>
           <w:p>
             <w:r>
-              <w:t>Mảng Xây dựng Đảng &amp; Chuyển đổi số</w:t>
+              <w:t>Mảng Phát triển Đảng &amp; Chuyển đổi số</w:t>
             </w:r>
           </w:p>
         </w:tc>
@@ -1387,7 +1387,7 @@
         </w:numPr>
       </w:pPr>
       <w:r>
-        <w:t>Mảng Xây dựng Đảng &amp; Chuyển đổi số: dự kiến 06 thành viên tập trung hồ sơ Đảng và 06 thành viên tập trung dữ liệu, công cụ số. Cử đầu mối đủ năng lực hướng dẫn ban đầu; yêu cầu vượt chuyên môn được chuyển người phụ trách nghiệp vụ trong mảng.</w:t>
+        <w:t>Mảng Phát triển Đảng &amp; Chuyển đổi số: dự kiến 06 thành viên tập trung hồ sơ Đảng và 06 thành viên tập trung dữ liệu, công cụ số. Cử đầu mối đủ năng lực hướng dẫn ban đầu; yêu cầu vượt chuyên môn được chuyển người phụ trách nghiệp vụ trong mảng.</w:t>
       </w:r>
     </w:p>
     <w:p>
@@ -1518,7 +1518,7 @@
         </w:numPr>
       </w:pPr>
       <w:r>
-        <w:t>Theo dõi số liệu tổ chức, đoàn viên, chuyển sinh hoạt Đoàn và đánh giá đoàn viên theo nhiệm vụ được giao. Chịu trách nhiệm kiểm tra tính đúng của dữ liệu quản lý đoàn viên (QLDV); Mảng Xây dựng Đảng &amp; Chuyển đổi số hỗ trợ công cụ, cấu trúc và kỹ thuật.</w:t>
+        <w:t>Theo dõi số liệu tổ chức, đoàn viên, chuyển sinh hoạt Đoàn và đánh giá đoàn viên theo nhiệm vụ được giao. Chịu trách nhiệm kiểm tra tính đúng của dữ liệu quản lý đoàn viên (QLDV); Mảng Phát triển Đảng &amp; Chuyển đổi số hỗ trợ công cụ, cấu trúc và kỹ thuật.</w:t>
       </w:r>
     </w:p>
     <w:p>
@@ -2015,7 +2015,7 @@
         </w:numPr>
       </w:pPr>
       <w:r>
-        <w:t>Phối hợp Mảng Tổ chức &amp; Phát triển Đoàn vụ, Mảng Xây dựng Đảng &amp; Chuyển đổi số truyền thông hướng dẫn nghiệp vụ và mốc công tác được phép phổ biến; không công bố hồ sơ cá nhân, dữ liệu Đảng hoặc danh sách hạn chế truy cập.</w:t>
+        <w:t>Phối hợp Mảng Tổ chức &amp; Phát triển Đoàn vụ, Mảng Phát triển Đảng &amp; Chuyển đổi số truyền thông hướng dẫn nghiệp vụ và mốc công tác được phép phổ biến; không công bố hồ sơ cá nhân, dữ liệu Đảng hoặc danh sách hạn chế truy cập.</w:t>
       </w:r>
     </w:p>
     <w:p>
@@ -2371,7 +2371,7 @@
           </w:tcPr>
           <w:p>
             <w:r>
-              <w:t>Mảng Xây dựng Đảng &amp; Chuyển đổi số</w:t>
+              <w:t>Mảng Phát triển Đảng &amp; Chuyển đổi số</w:t>
             </w:r>
           </w:p>
         </w:tc>
@@ -2560,7 +2560,7 @@
     </w:p>
     <w:p>
       <w:r>
-        <w:t>Mỗi hồ sơ có mã, loại việc, đơn vị, người xử lý, trạng thái, mốc tiếp theo, đường dẫn tài liệu và lịch sử bàn giao. Mảng Xây dựng Đảng &amp; Chuyển đổi số quản lý danh mục trường, còn mảng sở hữu nghiệp vụ xác nhận nội dung. Các bảng tổng hợp rộng chỉ thể hiện số lượng và tiến độ cần thiết; tệp hồ sơ chi tiết được phân quyền riêng.</w:t>
+        <w:t>Mỗi hồ sơ có mã, loại việc, đơn vị, người xử lý, trạng thái, mốc tiếp theo, đường dẫn tài liệu và lịch sử bàn giao. Mảng Phát triển Đảng &amp; Chuyển đổi số quản lý danh mục trường, còn mảng sở hữu nghiệp vụ xác nhận nội dung. Các bảng tổng hợp rộng chỉ thể hiện số lượng và tiến độ cần thiết; tệp hồ sơ chi tiết được phân quyền riêng.</w:t>
       </w:r>
     </w:p>
     <w:p>
@@ -2907,7 +2907,7 @@
         </w:numPr>
       </w:pPr>
       <w:r>
-        <w:t>Mảng Xây dựng Đảng &amp; Chuyển đổi số: trạng thái hồ sơ chính xác; dữ liệu đủ trường; tệp tra cứu được; biên bản đối soát, phân quyền và kiểm tra sao lưu. Không dùng số trường hợp được kết nạp làm chỉ tiêu cá nhân khi kết quả phụ thuộc cấp có thẩm quyền.</w:t>
+        <w:t>Mảng Phát triển Đảng &amp; Chuyển đổi số: trạng thái hồ sơ chính xác; dữ liệu đủ trường; tệp tra cứu được; biên bản đối soát, phân quyền và kiểm tra sao lưu. Không dùng số trường hợp được kết nạp làm chỉ tiêu cá nhân khi kết quả phụ thuộc cấp có thẩm quyền.</w:t>
       </w:r>
     </w:p>
     <w:p>
@@ -3786,7 +3786,7 @@
           </w:tcPr>
           <w:p>
             <w:r>
-              <w:t>Mảng Xây dựng Đảng &amp; Chuyển đổi số</w:t>
+              <w:t>Mảng Phát triển Đảng &amp; Chuyển đổi số</w:t>
             </w:r>
           </w:p>
         </w:tc>
@@ -4060,7 +4060,7 @@
           </w:tcPr>
           <w:p>
             <w:r>
-              <w:t>Mảng Xây dựng Đảng &amp; Chuyển đổi số</w:t>
+              <w:t>Mảng Phát triển Đảng &amp; Chuyển đổi số</w:t>
             </w:r>
           </w:p>
         </w:tc>
@@ -4197,7 +4197,7 @@
           </w:tcPr>
           <w:p>
             <w:r>
-              <w:t>Mảng Xây dựng Đảng &amp; Chuyển đổi số</w:t>
+              <w:t>Mảng Phát triển Đảng &amp; Chuyển đổi số</w:t>
             </w:r>
           </w:p>
         </w:tc>
@@ -4471,7 +4471,7 @@
           </w:tcPr>
           <w:p>
             <w:r>
-              <w:t>Mảng Xây dựng Đảng &amp; Chuyển đổi số</w:t>
+              <w:t>Mảng Phát triển Đảng &amp; Chuyển đổi số</w:t>
             </w:r>
           </w:p>
         </w:tc>
@@ -5294,7 +5294,7 @@
           </w:tcPr>
           <w:p>
             <w:r>
-              <w:t>Mảng Xây dựng Đảng &amp; Chuyển đổi số</w:t>
+              <w:t>Mảng Phát triển Đảng &amp; Chuyển đổi số</w:t>
             </w:r>
           </w:p>
         </w:tc>
@@ -5898,7 +5898,7 @@
         <w:spacing w:after="80" w:line="288" w:lineRule="auto"/>
       </w:pPr>
       <w:r>
-        <w:t>Mảng Xây dựng Đảng &amp; Chuyển đổi số (Đảng vụ - Chuyển đổi số, 14 đồng chí): Chủ trì toàn diện hạ tầng số và quy trình Đảng vụ. Đảm nhiệm vận hành phần mềm Quản lý đoàn viên (QLDV) và ứng dụng Thanh niên Việt Nam xuyên suốt cả năm học: giám sát đăng tải tài liệu sinh hoạt chi đoàn số hàng tháng, bảo đảm 100% ĐV đăng ký rèn luyện đoàn viên và được cấp thẻ/sổ điện tử, đánh giá xếp loại số; chủ trì thẩm tra, quản lý tiến độ hồ sơ phát triển Đảng, liên kết dữ liệu với Văn phòng Đảng ủy.</w:t>
+        <w:t>Mảng Phát triển Đảng &amp; Chuyển đổi số (Đảng vụ - Chuyển đổi số, 14 đồng chí): Chủ trì toàn diện hạ tầng số và quy trình Đảng vụ. Đảm nhiệm vận hành phần mềm Quản lý đoàn viên (QLDV) và ứng dụng Thanh niên Việt Nam xuyên suốt cả năm học: giám sát đăng tải tài liệu sinh hoạt chi đoàn số hàng tháng, bảo đảm 100% ĐV đăng ký rèn luyện đoàn viên và được cấp thẻ/sổ điện tử, đánh giá xếp loại số; chủ trì thẩm tra, quản lý tiến độ hồ sơ phát triển Đảng, liên kết dữ liệu với Văn phòng Đảng ủy.</w:t>
       </w:r>
     </w:p>
     <w:p>
@@ -6464,7 +6464,7 @@
           </w:tcPr>
           <w:p>
             <w:r>
-              <w:t>Mảng Xây dựng Đảng &amp; Chuyển đổi số</w:t>
+              <w:t>Mảng Phát triển Đảng &amp; Chuyển đổi số</w:t>
             </w:r>
           </w:p>
         </w:tc>
@@ -6972,7 +6972,7 @@
           </w:tcPr>
           <w:p>
             <w:r>
-              <w:t>Mảng Xây dựng Đảng &amp; Chuyển đổi số</w:t>
+              <w:t>Mảng Phát triển Đảng &amp; Chuyển đổi số</w:t>
             </w:r>
           </w:p>
         </w:tc>

</xml_diff>

<commit_message>
docs: enrich chapter V recruitment descriptions, standardize 18 tasks and update docx and web
</commit_message>
<xml_diff>
--- a/De_An_Tai_Cau_Truc_Ban_TCKT_Doan_Vu.docx
+++ b/De_An_Tai_Cau_Truc_Ban_TCKT_Doan_Vu.docx
@@ -1442,8 +1442,13 @@
         <w:pStyle w:val="Heading1"/>
       </w:pPr>
       <w:r>
-        <w:lastRenderedPageBreak/>
-        <w:t>V. CHỨC NĂNG, NHIỆM VỤ VÀ SẢN PHẨM CỦA CÁC MẢNG</w:t>
+        <w:t>V. CHỨC NĂNG, NHIỆM VỤ VÀ MÔ TẢ TUYỂN DỤNG CÁC MẢNG</w:t>
+      </w:r>
+    </w:p>
+    <w:p>
+      <w:pPr/>
+      <w:r>
+        <w:t>Nhằm phát huy tối đa năng lực chuyên môn, khắc phục tình trạng chồng chéo và xây dựng lực lượng kế cận chất lượng cao, Ban Tổ chức – Kiểm tra được cơ cấu thành 04 Mảng chuyên môn độc lập nhưng gắn kết chặt chẽ. Mỗi mảng mang một sứ mệnh cốt lõi riêng biệt, cung cấp môi trường thực chiến toàn diện cho thành viên phát triển tư duy quản trị, kỹ năng hành chính pháp quy, làm chủ công nghệ số và bản lĩnh của người cán bộ Đoàn Bách khoa.</w:t>
       </w:r>
     </w:p>
     <w:p>
@@ -1451,35 +1456,90 @@
         <w:pStyle w:val="Heading2"/>
       </w:pPr>
       <w:r>
-        <w:t>1. Mảng Tổ chức - Đoàn vụ</w:t>
-      </w:r>
-    </w:p>
-    <w:p>
-      <w:r>
-        <w:rPr>
-          <w:b/>
-        </w:rPr>
-        <w:t>Chức năng:</w:t>
-      </w:r>
-      <w:r>
-        <w:t xml:space="preserve"> Tham mưu công tác tổ chức xây dựng Đoàn; hướng dẫn, theo dõi nghiệp vụ tổ chức, cán bộ, đoàn viên, đoàn vụ và công tác hành chính thuộc phạm vi được giao.</w:t>
-      </w:r>
-    </w:p>
-    <w:p>
-      <w:r>
-        <w:rPr>
-          <w:b/>
-        </w:rPr>
-        <w:t>Nhiệm vụ thường xuyên:</w:t>
+        <w:t>1. Mảng Tổ chức &amp; Phát triển Đoàn vụ (Định biên: 20 đồng chí: 01 Trưởng • 01 Phó • 18 Thành viên)</w:t>
+      </w:r>
+    </w:p>
+    <w:p>
+      <w:pPr/>
+      <w:r>
+        <w:t>Khẩu hiệu / Tôn chỉ: "Trái tim điều hành &amp; Huyết mạch tổ chức của Đoàn Đại học Bách khoa Hà Nội"</w:t>
+      </w:r>
+    </w:p>
+    <w:p>
+      <w:pPr/>
+      <w:r>
+        <w:t>🎯 Sứ mệnh cốt lõi: Nắm giữ "bộ khung xương sống" vận hành toàn trường với 12 cơ sở và hàng ngàn đoàn viên; quản lý hệ thống tổ chức, cán bộ, chuẩn hóa nề nếp sổ sách và điều phối thu nộp Đoàn phí.</w:t>
+      </w:r>
+    </w:p>
+    <w:p>
+      <w:pPr/>
+      <w:r>
+        <w:t>💼 Trải nghiệm thực tế - Bạn sẽ làm gì?</w:t>
       </w:r>
     </w:p>
     <w:p>
       <w:pPr>
         <w:pStyle w:val="ReportBullet"/>
-        <w:numPr>
-          <w:ilvl w:val="0"/>
-          <w:numId w:val="1"/>
-        </w:numPr>
+      </w:pPr>
+      <w:r>
+        <w:t>Trực tiếp phụ trách mạng lưới "Cặp bài trùng" 1-kèm-1 đồng hành, hướng dẫn nghiệp vụ cùng 12 Đoàn trường và Liên chi đoàn trực thuộc.</w:t>
+      </w:r>
+    </w:p>
+    <w:p>
+      <w:pPr>
+        <w:pStyle w:val="ReportBullet"/>
+      </w:pPr>
+      <w:r>
+        <w:t>Hướng dẫn, chỉ đạo và giám sát công tác tổ chức Đại hội Chi đoàn; hướng dẫn kiện toàn và tổ chức Lễ ra mắt Ban Cán sự tân sinh viên K71.</w:t>
+      </w:r>
+    </w:p>
+    <w:p>
+      <w:pPr>
+        <w:pStyle w:val="ReportBullet"/>
+      </w:pPr>
+      <w:r>
+        <w:t>Chủ trì tổ chức Hội nghị Triển khai Công tác và Giao ban Đầu mối 12 Đơn vị Cơ sở; chủ trì Lễ kết nạp Đoàn viên mới các đợt cao điểm (26/3, 19/5).</w:t>
+      </w:r>
+    </w:p>
+    <w:p>
+      <w:pPr>
+        <w:pStyle w:val="ReportBullet"/>
+      </w:pPr>
+      <w:r>
+        <w:t>Quản lý con dấu, trực văn thư hành chính, tiếp nhận hồ sơ, đối soát dữ liệu và đóng dấu nhận xét sổ Đoàn toàn trường.</w:t>
+      </w:r>
+    </w:p>
+    <w:p>
+      <w:pPr/>
+      <w:r>
+        <w:t>🌟 Giá trị nhận được &amp; Chân dung ứng viên tìm kiếm:</w:t>
+      </w:r>
+    </w:p>
+    <w:p>
+      <w:pPr>
+        <w:pStyle w:val="ReportBullet"/>
+      </w:pPr>
+      <w:r>
+        <w:t>Kỹ năng phát triển: Tư duy quản trị bộ máy, kỹ năng soạn thảo văn bản hành chính - pháp quy chuẩn mực cấp Đại học, kỹ năng làm việc với lãnh đạo và điều phối mạng lưới thủ lĩnh sinh viên.</w:t>
+      </w:r>
+    </w:p>
+    <w:p>
+      <w:pPr>
+        <w:pStyle w:val="ReportBullet"/>
+      </w:pPr>
+      <w:r>
+        <w:t>Chân dung ứng viên: Tỉ mỉ, chu đáo, tinh thần kỷ luật cao, giao tiếp tự tin, yêu thích công tác quản trị nhân sự và điều phối quy trình.</w:t>
+      </w:r>
+    </w:p>
+    <w:p>
+      <w:pPr/>
+      <w:r>
+        <w:t>Nhiệm vụ chuyên môn thường xuyên:</w:t>
+      </w:r>
+    </w:p>
+    <w:p>
+      <w:pPr>
+        <w:pStyle w:val="ReportBullet"/>
       </w:pPr>
       <w:r>
         <w:t>Hướng dẫn hồ sơ đại hội, hội nghị, bầu cử, kiện toàn Ban Chấp hành; kiểm tra thành phần, thể thức và đối chiếu thông tin nhân sự trước khi trình cấp có thẩm quyền.</w:t>
@@ -1488,10 +1548,6 @@
     <w:p>
       <w:pPr>
         <w:pStyle w:val="ReportBullet"/>
-        <w:numPr>
-          <w:ilvl w:val="0"/>
-          <w:numId w:val="1"/>
-        </w:numPr>
       </w:pPr>
       <w:r>
         <w:t>Tham mưu hồ sơ thành lập, chia tách, sáp nhập, giải thể tổ chức Đoàn và dự thảo văn bản chuẩn y, công nhận trong phạm vi phân công; không tự ban hành quyết định thay cấp có thẩm quyền.</w:t>
@@ -1500,248 +1556,206 @@
     <w:p>
       <w:pPr>
         <w:pStyle w:val="ReportBullet"/>
-        <w:numPr>
-          <w:ilvl w:val="0"/>
-          <w:numId w:val="1"/>
-        </w:numPr>
-      </w:pPr>
-      <w:r>
-        <w:t>Thực hiện nghiệp vụ phát triển đoàn viên mới, hướng dẫn hồ sơ kết nạp Đoàn, tổng hợp danh sách và phối hợp tổ chức bồi dưỡng theo kế hoạch. Nội dung này được bố trí thống nhất tại đầu mối Đoàn vụ, tách rõ với nhiệm vụ theo dõi hồ sơ phát triển Đảng.</w:t>
+      </w:pPr>
+      <w:r>
+        <w:t>Thực hiện nghiệp vụ phát triển đoàn viên mới, hướng dẫn hồ sơ kết nạp Đoàn, tổng hợp danh sách và phối hợp tổ chức bồi dưỡng theo kế hoạch. Bố trí thống nhất tại đầu mối Đoàn vụ, tách rõ với hồ sơ phát triển Đảng.</w:t>
       </w:r>
     </w:p>
     <w:p>
       <w:pPr>
         <w:pStyle w:val="ReportBullet"/>
-        <w:numPr>
-          <w:ilvl w:val="0"/>
-          <w:numId w:val="1"/>
-        </w:numPr>
-      </w:pPr>
-      <w:r>
-        <w:t>Theo dõi số liệu tổ chức, đoàn viên, chuyển sinh hoạt Đoàn và đánh giá đoàn viên theo nhiệm vụ được giao. Chịu trách nhiệm kiểm tra tính đúng của dữ liệu quản lý đoàn viên (QLDV); Mảng Phát triển Đảng &amp; Chuyển đổi số hỗ trợ công cụ, cấu trúc và kỹ thuật.</w:t>
+      </w:pPr>
+      <w:r>
+        <w:t>Theo dõi số liệu tổ chức, đoàn viên, chuyển sinh hoạt Đoàn và đánh giá đoàn viên theo nhiệm vụ được giao; kiểm tra tính xác thực dữ liệu cơ sở; phối hợp Mảng Phát triển Đảng &amp; Chuyển đổi số quản trị kỹ thuật.</w:t>
       </w:r>
     </w:p>
     <w:p>
       <w:pPr>
         <w:pStyle w:val="ReportBullet"/>
-        <w:numPr>
-          <w:ilvl w:val="0"/>
-          <w:numId w:val="1"/>
-        </w:numPr>
-      </w:pPr>
-      <w:r>
-        <w:t>Thực hiện văn thư, sổ công văn đi - đến, biên bản họp và lịch trực hành chính; tiếp nhận, chuyển và lưu văn bản, theo dõi hồ sơ tồn.</w:t>
+      </w:pPr>
+      <w:r>
+        <w:t>Thực hiện văn thư, sổ công văn đi - đến, biên bản họp và lịch trực hành chính; tiếp nhận, chuyển giao và lưu trữ hồ sơ, quản lý danh mục tồn đọng.</w:t>
       </w:r>
     </w:p>
     <w:p>
       <w:pPr>
         <w:pStyle w:val="ReportBullet"/>
-        <w:numPr>
-          <w:ilvl w:val="0"/>
-          <w:numId w:val="1"/>
-        </w:numPr>
-      </w:pPr>
-      <w:r>
-        <w:t>Quản lý, sử dụng con dấu và thực hiện nghiệp vụ xác nhận chỉ khi được giao nhiệm vụ hợp lệ; không mặc định Ban có con dấu riêng hoặc mọi thành viên được sử dụng con dấu.</w:t>
+      </w:pPr>
+      <w:r>
+        <w:t>Quản lý, sử dụng con dấu và thực hiện nghiệp vụ xác nhận theo đúng thẩm quyền được phân cấp; tuân thủ nghiêm ngặt quy chế quản lý con dấu.</w:t>
       </w:r>
     </w:p>
     <w:p>
       <w:pPr>
         <w:pStyle w:val="ReportBullet"/>
-        <w:numPr>
-          <w:ilvl w:val="0"/>
-          <w:numId w:val="1"/>
-        </w:numPr>
-      </w:pPr>
-      <w:r>
-        <w:t>Tổng hợp hồ sơ thi đua, khen thưởng thuộc nhiệm vụ của Ban; phối hợp Mảng Giám sát Kiểm tra &amp; Điểm rèn luyện kiểm tra số liệu, minh chứng khi được yêu cầu.</w:t>
+      </w:pPr>
+      <w:r>
+        <w:t>Tổng hợp hồ sơ thi đua, khen thưởng thuộc nhiệm vụ của Ban; phối hợp Mảng Giám sát Kiểm tra &amp; Điểm rèn luyện kiểm tra số liệu, minh chứng.</w:t>
       </w:r>
     </w:p>
     <w:p>
       <w:pPr>
         <w:pStyle w:val="ReportBullet"/>
-        <w:numPr>
-          <w:ilvl w:val="0"/>
-          <w:numId w:val="1"/>
-        </w:numPr>
-      </w:pPr>
-      <w:r>
-        <w:t>Cử đại diện tham gia 12 tổ đầu mối; trực hòm thư chung về mặt hành chính, phân luồng yêu cầu đến các mảng, không tự kết luận nghiệp vụ của mảng khác.</w:t>
-      </w:r>
-    </w:p>
-    <w:p>
-      <w:r>
-        <w:rPr>
-          <w:b/>
-        </w:rPr>
-        <w:t>Sản phẩm đầu ra:</w:t>
-      </w:r>
-      <w:r>
-        <w:t xml:space="preserve"> Sổ theo dõi tổ chức, nhân sự và đoàn viên; danh mục hồ sơ Đoàn vụ; hồ sơ, dự thảo văn bản đủ điều kiện trình; sổ văn bản đi - đến; biên bản và danh sách bàn giao; báo cáo số liệu định kỳ, danh sách tồn đọng có người xử lý và thời hạn.</w:t>
-      </w:r>
-    </w:p>
-    <w:p>
+      </w:pPr>
+      <w:r>
+        <w:t>Cử đại diện tham gia 12 tổ đầu mối cơ sở; trực hòm thư chung về mặt hành chính, phân luồng yêu cầu đến đúng mảng nghiệp vụ, không tự kết luận nghiệp vụ của mảng khác.</w:t>
+      </w:r>
+    </w:p>
+    <w:p>
+      <w:pPr/>
+      <w:r>
+        <w:t>Sản phẩm đầu ra: Sổ theo dõi tổ chức, nhân sự và đoàn viên; danh mục hồ sơ Đoàn vụ; hồ sơ, dự thảo văn bản đủ điều kiện trình; sổ văn bản đi - đến; biên bản và danh sách bàn giao; báo cáo số liệu định kỳ; 100% Sổ Đoàn được đối soát và chuẩn y.</w:t>
+      </w:r>
+    </w:p>
+    <w:p>
+      <w:pPr/>
       <w:r>
         <w:t>Ranh giới trách nhiệm: Mảng kiểm tra hồ sơ Đoàn vụ trước khi trình. Hoạt động kiểm tra độc lập theo kế hoạch, xác minh sai lệch hoặc kiểm tra chéo do Mảng Giám sát Kiểm tra &amp; Điểm rèn luyện chủ trì trong phạm vi được Lãnh đạo Ban giao; không yêu cầu mọi hồ sơ phải đi qua thêm một vòng kiểm tra không cần thiết.</w:t>
       </w:r>
     </w:p>
     <w:p>
-      <w:r>
-        <w:br w:type="page"/>
-      </w:r>
-    </w:p>
-    <w:p>
-      <w:pPr>
-        <w:pStyle w:val="Heading1"/>
-      </w:pPr>
-      <w:r>
-        <w:lastRenderedPageBreak/>
-        <w:t>V. CHỨC NĂNG, NHIỆM VỤ VÀ SẢN PHẨM CỦA CÁC MẢNG (tiếp)</w:t>
-      </w:r>
-    </w:p>
-    <w:p>
       <w:pPr>
         <w:pStyle w:val="Heading2"/>
       </w:pPr>
       <w:r>
-        <w:t>2. Mảng Đảng vụ - Chuyển đổi số</w:t>
-      </w:r>
-    </w:p>
-    <w:p>
-      <w:r>
-        <w:rPr>
-          <w:b/>
-        </w:rPr>
-        <w:t>Chức năng:</w:t>
-      </w:r>
-      <w:r>
-        <w:t xml:space="preserve"> Theo dõi, hỗ trợ nghiệp vụ hồ sơ phát triển Đảng theo phân công; chủ trì tham mưu số hóa và quản trị nền tảng dữ liệu phục vụ hoạt động của Ban, trong đó ưu tiên dữ liệu hồ sơ Đảng.</w:t>
-      </w:r>
-    </w:p>
-    <w:p>
-      <w:r>
-        <w:rPr>
-          <w:b/>
-        </w:rPr>
-        <w:t>Nhiệm vụ về hồ sơ Đảng:</w:t>
+        <w:t>2. Mảng Phát triển Đảng &amp; Chuyển đổi số (Định biên: 14 đồng chí: 01 Trưởng • 01 Phó • 12 Thành viên)</w:t>
+      </w:r>
+    </w:p>
+    <w:p>
+      <w:pPr/>
+      <w:r>
+        <w:t>Khẩu hiệu / Tôn chỉ: "Nơi ươm mầm Hạt giống đỏ &amp; Tiên phong kiến tạo Hạ tầng số Đoàn vụ"</w:t>
+      </w:r>
+    </w:p>
+    <w:p>
+      <w:pPr/>
+      <w:r>
+        <w:t>🎯 Sứ mệnh cốt lõi: Đảm nhận 2 mũi nhọn chiến lược hàng đầu: Công tác phát triển Đảng trong sinh viên (nhiệm vụ chính trị số 1) và Làm chủ công nghệ chuyển đổi số (App Thanh niên Việt Nam, Phần mềm Quản lý đoàn viên YUM).</w:t>
+      </w:r>
+    </w:p>
+    <w:p>
+      <w:pPr/>
+      <w:r>
+        <w:t>💼 Trải nghiệm thực tế - Bạn sẽ làm gì?</w:t>
       </w:r>
     </w:p>
     <w:p>
       <w:pPr>
         <w:pStyle w:val="ReportBullet"/>
-        <w:numPr>
-          <w:ilvl w:val="0"/>
-          <w:numId w:val="1"/>
-        </w:numPr>
-      </w:pPr>
-      <w:r>
-        <w:t>Tổng hợp danh sách đoàn viên ưu tú và hồ sơ thuộc diện Ban theo dõi; đối chiếu thông tin giữa danh sách cơ sở, hồ sơ được giao và kết quả phản hồi của cấp xử lý.</w:t>
+      </w:pPr>
+      <w:r>
+        <w:t>Hướng dẫn, thẩm tra và theo dõi tiến độ hồ sơ kết nạp Đảng, lý lịch cảm tình Đảng từ 12 cơ sở (Kiểm tra hồ sơ Đảng).</w:t>
       </w:r>
     </w:p>
     <w:p>
       <w:pPr>
         <w:pStyle w:val="ReportBullet"/>
-        <w:numPr>
-          <w:ilvl w:val="0"/>
-          <w:numId w:val="1"/>
-        </w:numPr>
-      </w:pPr>
-      <w:r>
-        <w:t>Kiểm tra thành phần theo danh mục được cơ quan có thẩm quyền hướng dẫn; ghi rõ nội dung thiếu, sai hoặc cần làm rõ. Ban không tự đặt thêm điều kiện, kết luận tiêu chuẩn chính trị hay thay thế nghiệp vụ thuộc cấp ủy.</w:t>
+      </w:pPr>
+      <w:r>
+        <w:t>Quản trị toàn diện hệ thống CSDL Quản lý đoàn viên; phân quyền tài khoản, chuẩn hóa cây tổ chức số toàn trường.</w:t>
       </w:r>
     </w:p>
     <w:p>
       <w:pPr>
         <w:pStyle w:val="ReportBullet"/>
-        <w:numPr>
-          <w:ilvl w:val="0"/>
-          <w:numId w:val="1"/>
-        </w:numPr>
-      </w:pPr>
-      <w:r>
-        <w:t>Theo dõi từng lần tiếp nhận, bổ sung, bàn giao và kết quả; xác định hồ sơ đang ở đầu mối/cấp xử lý nào, từ ngày nào, ai theo dõi và mốc cần đôn đốc.</w:t>
+      </w:pPr>
+      <w:r>
+        <w:t>Hỗ trợ kỹ thuật, số hóa quy trình nộp hồ sơ, đôn đốc rèn luyện đoàn viên trên App Thanh niên Việt Nam.</w:t>
       </w:r>
     </w:p>
     <w:p>
       <w:pPr>
         <w:pStyle w:val="ReportBullet"/>
-        <w:numPr>
-          <w:ilvl w:val="0"/>
-          <w:numId w:val="1"/>
-        </w:numPr>
-      </w:pPr>
-      <w:r>
-        <w:t>Tiếp nhận, bảo quản và bàn giao bản giấy theo sổ; liên kết mã hồ sơ giấy với hồ sơ điện tử được phép lưu. Hỗ trợ các đợt bồi dưỡng, tổng hợp danh sách khi được giao, không mặc định chủ trì toàn bộ công tác phát triển Đảng.</w:t>
-      </w:r>
-    </w:p>
-    <w:p>
-      <w:r>
-        <w:rPr>
-          <w:b/>
-        </w:rPr>
-        <w:t>Nhiệm vụ về chuyển đổi số:</w:t>
+      </w:pPr>
+      <w:r>
+        <w:t>Đối soát dữ liệu Đảng viên dự bị/chính thức và bảo vệ tuyệt đối an toàn thông tin nhạy cảm.</w:t>
+      </w:r>
+    </w:p>
+    <w:p>
+      <w:pPr/>
+      <w:r>
+        <w:t>🌟 Giá trị nhận được &amp; Chân dung ứng viên tìm kiếm:</w:t>
       </w:r>
     </w:p>
     <w:p>
       <w:pPr>
         <w:pStyle w:val="ReportBullet"/>
-        <w:numPr>
-          <w:ilvl w:val="0"/>
-          <w:numId w:val="1"/>
-        </w:numPr>
-      </w:pPr>
-      <w:proofErr w:type="spellStart"/>
-      <w:r>
-        <w:t>Số</w:t>
-      </w:r>
-      <w:proofErr w:type="spellEnd"/>
-      <w:r>
-        <w:t xml:space="preserve"> </w:t>
-      </w:r>
-      <w:proofErr w:type="spellStart"/>
-      <w:r>
-        <w:t>hóa</w:t>
-      </w:r>
-      <w:proofErr w:type="spellEnd"/>
-      <w:r>
-        <w:t xml:space="preserve"> </w:t>
-      </w:r>
-      <w:proofErr w:type="spellStart"/>
-      <w:r>
-        <w:t>gắn</w:t>
-      </w:r>
-      <w:proofErr w:type="spellEnd"/>
-      <w:r>
-        <w:t xml:space="preserve"> </w:t>
-      </w:r>
-      <w:proofErr w:type="spellStart"/>
-      <w:r>
-        <w:t>với</w:t>
-      </w:r>
-      <w:proofErr w:type="spellEnd"/>
-      <w:r>
-        <w:t xml:space="preserve"> khả năng tìm kiếm, theo dõi và đối soát, không chỉ quét hồ sơ. Tài liệu quét hoặc nhận dạng ký tự phải được con người kiểm tra trước khi sử dụng.</w:t>
+      </w:pPr>
+      <w:r>
+        <w:t>Kỹ năng phát triển: Nắm vững quy trình phát triển Đảng chuẩn mực – bước đệm vàng để bản thân sớm vinh dự đứng vào hàng ngũ của Đảng; làm chủ kỹ năng quản trị dữ liệu lớn (data management) và làm chủ hệ thống phần mềm nghiệp vụ.</w:t>
       </w:r>
     </w:p>
     <w:p>
       <w:pPr>
         <w:pStyle w:val="ReportBullet"/>
-        <w:numPr>
-          <w:ilvl w:val="0"/>
-          <w:numId w:val="1"/>
-        </w:numPr>
-      </w:pPr>
-      <w:r>
-        <w:t>Quản trị tài khoản, quyền truy cập, nhật ký chỉnh sửa, sao lưu và phục hồi trên nền tảng được đơn vị có thẩm quyền chấp thuận; hỗ trợ kỹ thuật cho QLDV, ĐRL, văn thư và hòm thư.</w:t>
+      </w:pPr>
+      <w:r>
+        <w:t>Chân dung ứng viên: Ý thức bảo mật thông tin tuyệt đối, tư duy logic, nhạy bén công nghệ, cẩn trọng, có chí hướng phấn đấu rèn luyện trở thành Đảng viên Đảng Cộng sản Việt Nam.</w:t>
+      </w:r>
+    </w:p>
+    <w:p>
+      <w:pPr/>
+      <w:r>
+        <w:t>Nhiệm vụ về hồ sơ phát triển Đảng:</w:t>
       </w:r>
     </w:p>
     <w:p>
       <w:pPr>
         <w:pStyle w:val="ReportBullet"/>
-        <w:numPr>
-          <w:ilvl w:val="0"/>
-          <w:numId w:val="1"/>
-        </w:numPr>
+      </w:pPr>
+      <w:r>
+        <w:t>Tổng hợp danh sách đoàn viên ưu tú và hồ sơ thuộc diện Ban theo dõi; đối chiếu thông tin giữa danh sách cơ sở, hồ sơ được giao và kết quả phản hồi của cấp ủy.</w:t>
+      </w:r>
+    </w:p>
+    <w:p>
+      <w:pPr>
+        <w:pStyle w:val="ReportBullet"/>
+      </w:pPr>
+      <w:r>
+        <w:t>Kiểm tra thành phần theo danh mục được cơ quan có thẩm quyền hướng dẫn; lập phiếu thẩm tra ghi rõ nội dung thiếu, sai hoặc cần bổ sung. Ban không tự đặt thêm điều kiện, kết luận tiêu chuẩn chính trị hay thay thế nghiệp vụ thuộc cấp ủy.</w:t>
+      </w:r>
+    </w:p>
+    <w:p>
+      <w:pPr>
+        <w:pStyle w:val="ReportBullet"/>
+      </w:pPr>
+      <w:r>
+        <w:t>Theo dõi từng lần tiếp nhận, bổ sung, bàn giao và kết quả; xác định hồ sơ đang ở đầu mối/cấp xử lý nào, từ ngày nào, ai theo dõi và mốc thời gian cần đôn đốc.</w:t>
+      </w:r>
+    </w:p>
+    <w:p>
+      <w:pPr>
+        <w:pStyle w:val="ReportBullet"/>
+      </w:pPr>
+      <w:r>
+        <w:t>Tiếp nhận, bảo quản và bàn giao bản giấy theo sổ; liên kết mã hồ sơ giấy với hồ sơ điện tử được phép lưu. Hỗ trợ các đợt bồi dưỡng cảm tình Đảng, tổng hợp danh sách khi được giao.</w:t>
+      </w:r>
+    </w:p>
+    <w:p>
+      <w:pPr/>
+      <w:r>
+        <w:t>Nhiệm vụ về chuyển đổi số &amp; Quản lý đoàn viên:</w:t>
+      </w:r>
+    </w:p>
+    <w:p>
+      <w:pPr>
+        <w:pStyle w:val="ReportBullet"/>
+      </w:pPr>
+      <w:r>
+        <w:t>Số hóa gắn với khả năng tìm kiếm, theo dõi và đối soát, không chỉ quét hồ sơ. Dữ liệu số hóa phải được kiểm tra xác thực trước khi cập nhật vào hệ thống chính thức.</w:t>
+      </w:r>
+    </w:p>
+    <w:p>
+      <w:pPr>
+        <w:pStyle w:val="ReportBullet"/>
+      </w:pPr>
+      <w:r>
+        <w:t>Quản trị tài khoản, quyền truy cập, nhật ký chỉnh sửa, sao lưu và phục hồi trên nền tảng Quản lý đoàn viên và App TNVN; hỗ trợ kỹ thuật cho các mảng nghiệp vụ.</w:t>
+      </w:r>
+    </w:p>
+    <w:p>
+      <w:pPr>
+        <w:pStyle w:val="ReportBullet"/>
       </w:pPr>
       <w:r>
         <w:t>Mỗi mảng là đơn vị chịu trách nhiệm dữ liệu nghiệp vụ của mình; quản trị kỹ thuật không đồng nghĩa với quyền xem toàn bộ nội dung hoặc quyền phê duyệt hồ sơ.</w:t>
@@ -1750,38 +1764,15 @@
     <w:p>
       <w:pPr>
         <w:pStyle w:val="ReportBullet"/>
-        <w:numPr>
-          <w:ilvl w:val="0"/>
-          <w:numId w:val="1"/>
-        </w:numPr>
-      </w:pPr>
-      <w:r>
-        <w:t>Chỉ thu thập, lưu trữ và chia sẻ dữ liệu thuộc nhiệm vụ được giao; không tự mở rộng thành cơ sở dữ liệu đảng viên toàn Đại học. Không tải hồ sơ nhạy cảm lên công cụ AI, tài khoản cá nhân hoặc dịch vụ chưa được chấp thuận.</w:t>
-      </w:r>
-    </w:p>
-    <w:p>
-      <w:r>
-        <w:rPr>
-          <w:b/>
-        </w:rPr>
-        <w:t>Sản phẩm đầu ra:</w:t>
-      </w:r>
-      <w:r>
-        <w:t xml:space="preserve"> Danh mục hồ sơ và bảng trạng thái theo cấp xử lý; biên bản bàn giao; kho hồ sơ được phân quyền; danh mục dữ liệu chuẩn; báo cáo tồn đọng; thống kê chất lượng dữ liệu; nhật ký sao lưu, kiểm tra phục hồi và bàn giao tài khoản.</w:t>
-      </w:r>
-    </w:p>
-    <w:p>
-      <w:r>
-        <w:br w:type="page"/>
-      </w:r>
-    </w:p>
-    <w:p>
-      <w:pPr>
-        <w:pStyle w:val="Heading1"/>
-      </w:pPr>
-      <w:r>
-        <w:lastRenderedPageBreak/>
-        <w:t>V. CHỨC NĂNG, NHIỆM VỤ VÀ SẢN PHẨM CỦA CÁC MẢNG (tiếp)</w:t>
+      </w:pPr>
+      <w:r>
+        <w:t>Chỉ thu thập, lưu trữ và chia sẻ dữ liệu thuộc nhiệm vụ được giao; tuân thủ nghiêm ngặt quy định bảo vệ dữ liệu cá nhân; tuyệt đối không tải hồ sơ nhạy cảm lên công cụ AI công cộng hoặc dịch vụ đám mây cá nhân chưa được phê duyệt.</w:t>
+      </w:r>
+    </w:p>
+    <w:p>
+      <w:pPr/>
+      <w:r>
+        <w:t>Sản phẩm đầu ra: Danh mục hồ sơ và bảng trạng thái theo cấp xử lý; phiếu thẩm tra hồ sơ Đảng; biên bản bàn giao; CSDL Quản lý đoàn viên đạt chuẩn 200 điểm thi đua; kho hồ sơ phân quyền bảo mật; nhật ký sao lưu an toàn.</w:t>
       </w:r>
     </w:p>
     <w:p>
@@ -1789,83 +1780,122 @@
         <w:pStyle w:val="Heading2"/>
       </w:pPr>
       <w:r>
-        <w:t>3. Mảng Kiểm tra - Điểm rèn luyện</w:t>
-      </w:r>
-    </w:p>
-    <w:p>
-      <w:r>
-        <w:rPr>
-          <w:b/>
-        </w:rPr>
-        <w:t>Chức năng:</w:t>
-      </w:r>
-      <w:r>
-        <w:t xml:space="preserve"> Tham mưu kiểm tra, giám sát trong phạm vi nhiệm vụ của Ban; tiếp nhận, thẩm định đề án và kiểm duyệt hoạt động liên quan đến điểm rèn luyện do đơn vị triển khai; thực hiện hoặc tham mưu phê duyệt theo phân cấp được giao.</w:t>
-      </w:r>
-    </w:p>
-    <w:p>
-      <w:r>
-        <w:rPr>
-          <w:b/>
-        </w:rPr>
-        <w:t>Nhiệm vụ trọng tâm:</w:t>
+        <w:t>3. Mảng Giám sát Kiểm tra &amp; Điểm rèn luyện (Định biên: 20 đồng chí: 01 Trưởng • 02 Phó • 17 Thành viên)</w:t>
+      </w:r>
+    </w:p>
+    <w:p>
+      <w:pPr/>
+      <w:r>
+        <w:t>Khẩu hiệu / Tôn chỉ: "Cán cân Kỷ cương - Công minh &amp; Người bảo vệ quyền lợi sinh viên Bách khoa"</w:t>
+      </w:r>
+    </w:p>
+    <w:p>
+      <w:pPr/>
+      <w:r>
+        <w:t>🎯 Sứ mệnh cốt lõi: Giữ vai trò "cơ quan kiểm toán - thanh tra" độc lập, bảo đảm kỷ cương Điều lệ Đoàn; đồng thời là đơn vị duy nhất thẩm định tiêu chuẩn và phê duyệt minh chứng Điểm rèn luyện (ĐRL) toàn trường.</w:t>
+      </w:r>
+    </w:p>
+    <w:p>
+      <w:pPr/>
+      <w:r>
+        <w:t>💼 Trải nghiệm thực tế - Bạn sẽ làm gì?</w:t>
       </w:r>
     </w:p>
     <w:p>
       <w:pPr>
         <w:pStyle w:val="ReportBullet"/>
-        <w:numPr>
-          <w:ilvl w:val="0"/>
-          <w:numId w:val="1"/>
-        </w:numPr>
-      </w:pPr>
-      <w:r>
-        <w:t>Rà soát đề án, kế hoạch hoạt động: đơn vị chủ trì, mục tiêu, đối tượng, nội dung, thời gian, địa điểm, cách tổ chức, tiêu chí xác nhận tham gia, minh chứng và nội dung đề nghị ghi nhận ĐRL.</w:t>
+      </w:pPr>
+      <w:r>
+        <w:t>Tiếp nhận, thẩm định các Đề án phong trào/sự kiện từ các CLB/Đội/Nhóm và 12 cơ sở để cấp mã ĐRL.</w:t>
       </w:r>
     </w:p>
     <w:p>
       <w:pPr>
         <w:pStyle w:val="ReportBullet"/>
-        <w:numPr>
-          <w:ilvl w:val="0"/>
-          <w:numId w:val="1"/>
-        </w:numPr>
-      </w:pPr>
-      <w:r>
-        <w:t>Đối chiếu với quy định và hướng dẫn đang áp dụng; làm rõ điều kiện hoặc phạm vi cần điều chỉnh; trình người có thẩm quyền. Chỉ thao tác phê duyệt trong phạm vi được phân công hoặc ủy quyền hợp lệ.</w:t>
+      </w:pPr>
+      <w:r>
+        <w:t>Thành lập Đoàn kiểm tra công tác Đoàn cuối năm, trực tiếp thẩm tra chất lượng sổ sách, hồ sơ, con dấu, tài chính tại 12 cơ sở.</w:t>
       </w:r>
     </w:p>
     <w:p>
       <w:pPr>
         <w:pStyle w:val="ReportBullet"/>
-        <w:numPr>
-          <w:ilvl w:val="0"/>
-          <w:numId w:val="1"/>
-        </w:numPr>
-      </w:pPr>
-      <w:r>
-        <w:t>Cấp mã, cập nhật thông tin hoạt động sau khi có căn cứ chấp thuận. Phân biệt chấp thuận đề án, cấp mã và xác nhận kết quả thực hiện; không coi cấp mã là bảo đảm mọi người đăng ký đều được ghi nhận điểm.</w:t>
+      </w:pPr>
+      <w:r>
+        <w:t>Hậu kiểm tính trung thực của minh chứng điểm danh sự kiện; trực tiếp thụ lý và giải quyết khiếu nại ĐRL cho sinh viên.</w:t>
       </w:r>
     </w:p>
     <w:p>
       <w:pPr>
         <w:pStyle w:val="ReportBullet"/>
-        <w:numPr>
-          <w:ilvl w:val="0"/>
-          <w:numId w:val="1"/>
-        </w:numPr>
-      </w:pPr>
-      <w:r>
-        <w:t>Theo dõi hoạt động do đơn vị tiến hành; lựa chọn kiểm tra hồ sơ, kiểm tra thực tế hoặc xác minh theo mức độ rủi ro và kế hoạch được duyệt. Trường hợp thay đổi nội dung quan trọng, yêu cầu đơn vị báo cáo để được xem xét lại.</w:t>
+      </w:pPr>
+      <w:r>
+        <w:t>Kiểm tra Giấy tờ, Hồ sơ sau Đại hội Chi đoàn &amp; Cơ sở: Rà soát biên bản, kết quả bầu cử, danh sách BCH đảm bảo tính pháp lý trước khi chuẩn y.</w:t>
       </w:r>
     </w:p>
     <w:p>
       <w:pPr>
         <w:pStyle w:val="ReportBullet"/>
-        <w:numPr>
-          <w:ilvl w:val="0"/>
-          <w:numId w:val="1"/>
-        </w:numPr>
+      </w:pPr>
+      <w:r>
+        <w:t>Kiểm tra Giấy tờ và Thẩm định Hồ sơ sau Kiện toàn Cán bộ Đoàn: Thẩm tra quy trình, biên bản lấy phiếu tín nhiệm và hồ sơ nhân sự kiện toàn xuyên suốt năm học.</w:t>
+      </w:r>
+    </w:p>
+    <w:p>
+      <w:pPr/>
+      <w:r>
+        <w:t>🌟 Giá trị nhận được &amp; Chân dung ứng viên tìm kiếm:</w:t>
+      </w:r>
+    </w:p>
+    <w:p>
+      <w:pPr>
+        <w:pStyle w:val="ReportBullet"/>
+      </w:pPr>
+      <w:r>
+        <w:t>Kỹ năng phát triển: Năng lực tư duy phản biện sắc bén, kỹ năng thẩm định dự án, quản trị rủi ro; thấu hiểu toàn diện quy chế ĐRL và học bổng – trở thành chuyên gia tư vấn sinh viên.</w:t>
+      </w:r>
+    </w:p>
+    <w:p>
+      <w:pPr>
+        <w:pStyle w:val="ReportBullet"/>
+      </w:pPr>
+      <w:r>
+        <w:t>Chân dung ứng viên: Công tâm, chính trực, khách quan, bản lĩnh vững vàng, tôn trọng nguyên tắc và luôn bảo vệ quyền lợi chính đáng của sinh viên.</w:t>
+      </w:r>
+    </w:p>
+    <w:p>
+      <w:pPr/>
+      <w:r>
+        <w:t>Nhiệm vụ chuyên môn thường xuyên:</w:t>
+      </w:r>
+    </w:p>
+    <w:p>
+      <w:pPr>
+        <w:pStyle w:val="ReportBullet"/>
+      </w:pPr>
+      <w:r>
+        <w:t>Tiếp nhận đề án hoạt động, phân loại đối tượng, quy mô, tính chất; đối chiếu với quy định và hướng dẫn hiện hành; lập phiếu thẩm định và đề xuất cấp mã hoạt động.</w:t>
+      </w:r>
+    </w:p>
+    <w:p>
+      <w:pPr>
+        <w:pStyle w:val="ReportBullet"/>
+      </w:pPr>
+      <w:r>
+        <w:t>Cấp mã, cập nhật thông tin hoạt động sau khi có căn cứ chấp thuận. Phân biệt rõ chấp thuận đề án, cấp mã và xác nhận kết quả thực hiện.</w:t>
+      </w:r>
+    </w:p>
+    <w:p>
+      <w:pPr>
+        <w:pStyle w:val="ReportBullet"/>
+      </w:pPr>
+      <w:r>
+        <w:t>Theo dõi việc tổ chức hoạt động; lựa chọn kiểm tra hồ sơ, kiểm tra thực tế hoặc xác minh đột xuất theo mức độ rủi ro.</w:t>
+      </w:r>
+    </w:p>
+    <w:p>
+      <w:pPr>
+        <w:pStyle w:val="ReportBullet"/>
       </w:pPr>
       <w:r>
         <w:t>Hậu kiểm danh sách, hình thức điểm danh và minh chứng; đối chiếu kết quả với đề án được duyệt, ghi nhận sai lệch, đề xuất xử lý hoặc điều chỉnh trong thẩm quyền.</w:t>
@@ -1874,73 +1904,45 @@
     <w:p>
       <w:pPr>
         <w:pStyle w:val="ReportBullet"/>
-        <w:numPr>
-          <w:ilvl w:val="0"/>
-          <w:numId w:val="1"/>
-        </w:numPr>
-      </w:pPr>
-      <w:r>
-        <w:t>Tiếp nhận phản ánh, kiến nghị, khiếu nại; phân loại thuộc thẩm quyền Ban hay phải chuyển đơn vị khác. Người xác minh lại không đồng thời là người tự kết luận về sai sót do chính mình xử lý trước đó.</w:t>
+      </w:pPr>
+      <w:r>
+        <w:t>Tiếp nhận phản ánh, kiến nghị, khiếu nại ĐRL; tổ chức xác minh độc lập; người xác minh không đồng thời là người tự kết luận về sai sót do chính mình xử lý trước đó.</w:t>
       </w:r>
     </w:p>
     <w:p>
       <w:pPr>
         <w:pStyle w:val="ReportBullet"/>
-        <w:numPr>
-          <w:ilvl w:val="0"/>
-          <w:numId w:val="1"/>
-        </w:numPr>
-      </w:pPr>
-      <w:r>
-        <w:t>Chủ trì các đợt kiểm tra công tác Đoàn theo phân công của Lãnh đạo Ban; phối hợp mảng sở hữu nghiệp vụ để xác định tiêu chí và kiến nghị khắc phục.</w:t>
+      </w:pPr>
+      <w:r>
+        <w:t>Chủ trì công tác kiểm tra định kỳ và đột xuất công tác Đoàn 12 cơ sở theo phân công của Lãnh đạo Ban; lập biên bản kiểm tra và bảng chấm điểm công khai.</w:t>
       </w:r>
     </w:p>
     <w:p>
       <w:pPr>
         <w:pStyle w:val="ReportBullet"/>
-        <w:numPr>
-          <w:ilvl w:val="0"/>
-          <w:numId w:val="1"/>
-        </w:numPr>
-      </w:pPr>
-      <w:r>
-        <w:t>Cung cấp thông tin đã được kiểm soát cho Mảng Truyền thông - Sự kiện &amp; Phát triển Nội bộ để tuyên truyền quy trình, thời hạn, điều kiện tham gia hoặc kết quả được phép công bố.</w:t>
-      </w:r>
-    </w:p>
-    <w:p>
-      <w:r>
-        <w:rPr>
-          <w:b/>
-        </w:rPr>
-        <w:t>Sản phẩm đầu ra:</w:t>
-      </w:r>
-      <w:r>
-        <w:t xml:space="preserve"> Phiếu thẩm định; danh mục đề án và quyết định xử lý; mã hoạt động gắn căn cứ duyệt; kế hoạch/biên bản kiểm tra; kết quả hậu kiểm; sổ phản ánh, kiến nghị; báo cáo tổng hợp trong phạm vi Ban phụ trách.</w:t>
-      </w:r>
-    </w:p>
-    <w:p>
-      <w:r>
-        <w:rPr>
-          <w:b/>
-        </w:rPr>
-        <w:t>Ranh giới trách nhiệm:</w:t>
-      </w:r>
-      <w:r>
-        <w:t xml:space="preserve"> Không thay thế đơn vị tổ chức hoạt động, không tự quyết định toàn bộ điểm rèn luyện sinh viên hoặc giải quyết vụ việc vượt phân cấp. Đối với chương trình do Ban tổ chức, phải bố trí người thẩm định, kiểm tra độc lập với nhóm trực tiếp thực hiện.</w:t>
-      </w:r>
-    </w:p>
-    <w:p>
-      <w:r>
-        <w:br w:type="page"/>
-      </w:r>
-    </w:p>
-    <w:p>
-      <w:pPr>
-        <w:pStyle w:val="Heading1"/>
-      </w:pPr>
-      <w:r>
-        <w:lastRenderedPageBreak/>
-        <w:t>V. CHỨC NĂNG, NHIỆM VỤ VÀ SẢN PHẨM CỦA CÁC MẢNG (tiếp)</w:t>
+      </w:pPr>
+      <w:r>
+        <w:t>Chủ trì thẩm tra giấy tờ, hồ sơ sau Đại hội Chi đoàn, Đại hội cơ sở và hồ sơ sau Kiện toàn cán bộ Đoàn toàn trường trước khi trình chuẩn y.</w:t>
+      </w:r>
+    </w:p>
+    <w:p>
+      <w:pPr>
+        <w:pStyle w:val="ReportBullet"/>
+      </w:pPr>
+      <w:r>
+        <w:t>Cung cấp thông tin đã kiểm soát cho Mảng Truyền thông - Sự kiện &amp; Phát triển Nội bộ để tuyên truyền quy trình, thời hạn, điều kiện tham gia hoặc kết quả được phép công bố.</w:t>
+      </w:r>
+    </w:p>
+    <w:p>
+      <w:pPr/>
+      <w:r>
+        <w:t>Sản phẩm đầu ra: Phiếu thẩm định đề án; danh mục đề án được duyệt; mã hoạt động gắn căn cứ duyệt; biên bản hậu kiểm hồ sơ sau Đại hội; phiếu thẩm tra hồ sơ sau Kiện toàn; 12 Biên bản kiểm tra công tác Đoàn cuối năm; sổ theo dõi và quyết định giải quyết 100% khiếu nại ĐRL.</w:t>
+      </w:r>
+    </w:p>
+    <w:p>
+      <w:pPr/>
+      <w:r>
+        <w:t>Ranh giới trách nhiệm: Không thay thế đơn vị tổ chức hoạt động, không tự quyết định toàn bộ điểm rèn luyện sinh viên hoặc giải quyết vụ việc vượt phân cấp. Đối với chương trình do Ban tổ chức, phải bố trí nhân sự thẩm định, kiểm tra độc lập với nhóm trực tiếp thực hiện.</w:t>
       </w:r>
     </w:p>
     <w:p>
@@ -1948,35 +1950,90 @@
         <w:pStyle w:val="Heading2"/>
       </w:pPr>
       <w:r>
-        <w:t>4. Mảng Truyền thông - Sự kiện và Phát triển nội bộ</w:t>
-      </w:r>
-    </w:p>
-    <w:p>
-      <w:r>
-        <w:rPr>
-          <w:b/>
-        </w:rPr>
-        <w:t>Chức năng:</w:t>
-      </w:r>
-      <w:r>
-        <w:t xml:space="preserve"> Thực hiện tuyên truyền nhiệm vụ, hoạt động của Ban; phối hợp thông tin về nghiệp vụ điểm rèn luyện; tham mưu tổ chức sự kiện của Ban và hoạt động xây dựng tập thể, bồi dưỡng, gắn kết thành viên.</w:t>
-      </w:r>
-    </w:p>
-    <w:p>
-      <w:r>
-        <w:rPr>
-          <w:b/>
-        </w:rPr>
-        <w:t>Nhiệm vụ thường xuyên:</w:t>
+        <w:t>4. Mảng Truyền thông - Sự kiện &amp; Phát triển Nội bộ (Định biên: 10 đồng chí: 01 Trưởng • 01 Phó • 08 Thành viên)</w:t>
+      </w:r>
+    </w:p>
+    <w:p>
+      <w:pPr/>
+      <w:r>
+        <w:t>Khẩu hiệu / Tôn chỉ: "Ngọn lửa Gắn kết Văn hóa &amp; Tiếng nói Thương hiệu Bản lĩnh TCKT"</w:t>
+      </w:r>
+    </w:p>
+    <w:p>
+      <w:pPr/>
+      <w:r>
+        <w:t>🎯 Sứ mệnh cốt lõi: Xóa bỏ định kiến "Tổ chức - Kiểm tra là khô khan", xây dựng hình ảnh TCKT hiện đại, sắc bén và uy tín; đồng thời giữ lửa văn hóa, chăm lo đời sống tinh thần và gắn kết 68 nhân sự trong Ban.</w:t>
+      </w:r>
+    </w:p>
+    <w:p>
+      <w:pPr/>
+      <w:r>
+        <w:t>💼 Trải nghiệm thực tế - Bạn sẽ làm gì?</w:t>
       </w:r>
     </w:p>
     <w:p>
       <w:pPr>
         <w:pStyle w:val="ReportBullet"/>
-        <w:numPr>
-          <w:ilvl w:val="0"/>
-          <w:numId w:val="1"/>
-        </w:numPr>
+      </w:pPr>
+      <w:r>
+        <w:t>Sáng tạo ấn phẩm đồ họa, video, infographic phổ biến văn bản, nghiệp vụ Đoàn vụ hấp dẫn, trực quan.</w:t>
+      </w:r>
+    </w:p>
+    <w:p>
+      <w:pPr>
+        <w:pStyle w:val="ReportBullet"/>
+      </w:pPr>
+      <w:r>
+        <w:t>Lên ý tưởng, kịch bản và tổ chức các sự kiện nội bộ: Teambuilding, Training kỹ năng, Sinh nhật Ban, Gala Tổng kết.</w:t>
+      </w:r>
+    </w:p>
+    <w:p>
+      <w:pPr>
+        <w:pStyle w:val="ReportBullet"/>
+      </w:pPr>
+      <w:r>
+        <w:t>Quản trị toàn diện fanpage và kênh truyền thông đối ngoại chính thức của Ban TCKT.</w:t>
+      </w:r>
+    </w:p>
+    <w:p>
+      <w:pPr>
+        <w:pStyle w:val="ReportBullet"/>
+      </w:pPr>
+      <w:r>
+        <w:t>Đồng hành cùng các mảng trong các chiến dịch truyền thông cao điểm: Tuyển thành viên, Đại hội, Chuẩn hóa ĐRL, Phát triển Đảng.</w:t>
+      </w:r>
+    </w:p>
+    <w:p>
+      <w:pPr/>
+      <w:r>
+        <w:t>🌟 Giá trị nhận được &amp; Chân dung ứng viên tìm kiếm:</w:t>
+      </w:r>
+    </w:p>
+    <w:p>
+      <w:pPr>
+        <w:pStyle w:val="ReportBullet"/>
+      </w:pPr>
+      <w:r>
+        <w:t>Kỹ năng phát triển: Thực chiến Content Marketing, Graphic Design, Video Editing, Event Management; kỹ năng truyền cảm hứng và kết nối con người.</w:t>
+      </w:r>
+    </w:p>
+    <w:p>
+      <w:pPr>
+        <w:pStyle w:val="ReportBullet"/>
+      </w:pPr>
+      <w:r>
+        <w:t>Chân dung ứng viên: Sáng tạo, năng động, có năng khiếu mỹ thuật / viết lách / MC hoạt náo, luôn tràn đầy năng lượng tích cực và nhiệt huyết tuổi trẻ.</w:t>
+      </w:r>
+    </w:p>
+    <w:p>
+      <w:pPr/>
+      <w:r>
+        <w:t>Nhiệm vụ chuyên môn thường xuyên:</w:t>
+      </w:r>
+    </w:p>
+    <w:p>
+      <w:pPr>
+        <w:pStyle w:val="ReportBullet"/>
       </w:pPr>
       <w:r>
         <w:t>Xây dựng kế hoạch tuyên truyền theo tháng, theo chương trình; quản trị kênh truyền thông và hình ảnh của Ban trong phạm vi được giao.</w:t>
@@ -1985,10 +2042,6 @@
     <w:p>
       <w:pPr>
         <w:pStyle w:val="ReportBullet"/>
-        <w:numPr>
-          <w:ilvl w:val="0"/>
-          <w:numId w:val="1"/>
-        </w:numPr>
       </w:pPr>
       <w:r>
         <w:t>Biên tập tin, bài, thiết kế ấn phẩm, ghi hình, lưu trữ tư liệu phục vụ hoạt động; bảo đảm nội dung đúng định hướng, chính xác, dễ tiếp cận đối với cán bộ Đoàn và sinh viên.</w:t>
@@ -1997,10 +2050,6 @@
     <w:p>
       <w:pPr>
         <w:pStyle w:val="ReportBullet"/>
-        <w:numPr>
-          <w:ilvl w:val="0"/>
-          <w:numId w:val="1"/>
-        </w:numPr>
       </w:pPr>
       <w:r>
         <w:t>Phối hợp Mảng Giám sát Kiểm tra &amp; Điểm rèn luyện tuyên truyền hướng dẫn lập đề án, thời hạn gửi hồ sơ, điều kiện ghi nhận ĐRL, quy trình bổ sung và kênh tiếp nhận phản ánh; chỉ công bố mức điểm, trạng thái hoặc kết quả khi có thông tin được phê duyệt.</w:t>
@@ -2009,10 +2058,6 @@
     <w:p>
       <w:pPr>
         <w:pStyle w:val="ReportBullet"/>
-        <w:numPr>
-          <w:ilvl w:val="0"/>
-          <w:numId w:val="1"/>
-        </w:numPr>
       </w:pPr>
       <w:r>
         <w:t>Phối hợp Mảng Tổ chức &amp; Phát triển Đoàn vụ, Mảng Phát triển Đảng &amp; Chuyển đổi số truyền thông hướng dẫn nghiệp vụ và mốc công tác được phép phổ biến; không công bố hồ sơ cá nhân, dữ liệu Đảng hoặc danh sách hạn chế truy cập.</w:t>
@@ -2021,10 +2066,6 @@
     <w:p>
       <w:pPr>
         <w:pStyle w:val="ReportBullet"/>
-        <w:numPr>
-          <w:ilvl w:val="0"/>
-          <w:numId w:val="1"/>
-        </w:numPr>
       </w:pPr>
       <w:r>
         <w:t>Tham mưu và tổ chức các hoạt động sinh hoạt chuyên đề, tập huấn, tổng kết, giao lưu, giới thiệu thành viên mới và hoạt động tăng cường đoàn kết theo kế hoạch được duyệt.</w:t>
@@ -2033,39 +2074,27 @@
     <w:p>
       <w:pPr>
         <w:pStyle w:val="ReportBullet"/>
-        <w:numPr>
-          <w:ilvl w:val="0"/>
-          <w:numId w:val="1"/>
-        </w:numPr>
       </w:pPr>
       <w:r>
         <w:t>Chuẩn bị chương trình, phân công thực hiện, hậu cần và dự toán cho sự kiện của Ban theo nhiệm vụ; đánh giá kết quả sau chương trình. Không mặc định nhận toàn bộ việc tổ chức sự kiện của các đơn vị cơ sở.</w:t>
       </w:r>
     </w:p>
     <w:p>
+      <w:pPr/>
       <w:r>
         <w:t>Quy trình phối hợp truyền thông: Mảng chủ trì lập phiếu yêu cầu gồm mục tiêu, đối tượng, nội dung đã xác nhận, căn cứ công bố, sản phẩm, hạn hoàn thành và người duyệt nghiệp vụ; Mảng Truyền thông - Sự kiện &amp; Phát triển Nội bộ tiếp nhận, phân công, biên tập; mảng chủ trì duyệt tính chính xác; người được giao duyệt phát hành; Mảng Truyền thông - Sự kiện &amp; Phát triển Nội bộ đăng tải và lưu bản cuối.</w:t>
       </w:r>
     </w:p>
     <w:p>
-      <w:r>
-        <w:t>Truyền thông hoạt động được bố trí theo kế hoạch, mức độ ưu tiên và nguồn lực; không phải mọi đề án được duyệt đều phát sinh yêu cầu Ban phải sản xuất ấn phẩm riêng. Nếu cần phối hợp trực tiếp với cơ sở, chỉ định người theo chương trình hoặc thời gian xác định, không đưa vào danh sách đầu mối thường trực.</w:t>
-      </w:r>
-    </w:p>
-    <w:p>
-      <w:r>
-        <w:rPr>
-          <w:b/>
-        </w:rPr>
-        <w:t>Sản phẩm đầu ra:</w:t>
-      </w:r>
-      <w:r>
-        <w:t xml:space="preserve"> Kế hoạch tuyên truyền; lịch đăng; tin, bài và ấn phẩm đã được duyệt; kho tư liệu được phép sử dụng; kế hoạch, phân công, dự toán được duyệt và báo cáo tổng kết sự kiện; nội dung bồi dưỡng, sinh hoạt và phản hồi của thành viên.</w:t>
-      </w:r>
-    </w:p>
-    <w:p>
-      <w:r>
-        <w:br w:type="page"/>
+      <w:pPr/>
+      <w:r>
+        <w:t>Sản phẩm đầu ra: Kế hoạch tuyên truyền; lịch đăng; tin, bài và ấn phẩm đã được duyệt; kho tư liệu được phép sử dụng; kế hoạch, phân công, dự toán được duyệt và báo cáo tổng kết sự kiện; nội dung bồi dưỡng, sinh hoạt và phản hồi của thành viên.</w:t>
+      </w:r>
+    </w:p>
+    <w:p>
+      <w:pPr/>
+      <w:r>
+        <w:t>Ranh giới trách nhiệm: Truyền thông hoạt động được bố trí theo kế hoạch, mức độ ưu tiên và nguồn lực; không phải mọi đề án được duyệt đều phát sinh yêu cầu Ban phải sản xuất ấn phẩm riêng. Nếu cần phối hợp trực tiếp với cơ sở, chỉ định người theo chương trình hoặc thời gian xác định, không đưa vào danh sách đầu mối thường trực.</w:t>
       </w:r>
     </w:p>
     <w:p>
@@ -3320,6 +3349,7 @@
     </w:p>
     <w:p>
       <w:pPr>
+        <w:pStyle w:val="Heading1"/>
         <w:spacing w:before="360" w:after="120"/>
       </w:pPr>
       <w:r>
@@ -3336,20 +3366,16 @@
         <w:ind w:firstLine="562"/>
       </w:pPr>
       <w:r>
-        <w:t>Nhằm cụ thể hóa Đề án Tái cấu trúc thành chương trình hành động thực tiễn trong năm học 2026 - 2027, Ban Tổ chức - Kiểm tra xác lập Kế hoạch hoạt động trọng tâm gồm 15 đầu việc lớn phân kỳ theo 12 tháng, đồng thời phân công trách nhiệm chủ trì, phối hợp rõ ràng cho 04 Mảng chuyên môn và ban hành Bộ Tiêu chí chấm điểm thi đua cơ sở (thang điểm 950 điểm chuẩn kèm điểm thưởng và điểm phạt) làm căn cứ đánh giá, xếp loại thi đua cuối năm đối với 12 Đoàn trường, Liên chi đoàn trực thuộc.</w:t>
-      </w:r>
-    </w:p>
-    <w:p>
-      <w:pPr>
+        <w:t>Nhằm cụ thể hóa Đề án Tái cấu trúc thành chương trình hành động thực tiễn trong năm học 2026 - 2027, Ban Tổ chức - Kiểm tra xác lập Kế hoạch hoạt động trọng tâm gồm 18 nhiệm vụ trọng tâm phân kỳ theo 12 tháng, đồng thời phân công trách nhiệm chủ trì, phối hợp rõ ràng cho 04 Mảng chuyên môn và ban hành Bộ Tiêu chí chấm điểm thi đua cơ sở (thang điểm 950 điểm chuẩn kèm điểm thưởng và điểm phạt) làm căn cứ đánh giá, xếp loại thi đua cuối năm đối với 12 Đoàn trường, Liên chi đoàn trực thuộc.</w:t>
+      </w:r>
+    </w:p>
+    <w:p>
+      <w:pPr>
+        <w:pStyle w:val="Heading2"/>
         <w:spacing w:before="240" w:after="80"/>
       </w:pPr>
       <w:r>
-        <w:rPr>
-          <w:rFonts w:ascii="Times New Roman" w:hAnsi="Times New Roman"/>
-          <w:b/>
-          <w:sz w:val="26"/>
-        </w:rPr>
-        <w:t>1. Ma trận Kế hoạch 15 Hoạt động trọng tâm và Phân công 04 Mảng chuyên môn</w:t>
+        <w:t>1. Ma trận Kế hoạch 18 Hoạt động trọng tâm và Phân công 04 Mảng chuyên môn</w:t>
       </w:r>
     </w:p>
     <w:p>
@@ -3358,7 +3384,7 @@
         <w:ind w:firstLine="562"/>
       </w:pPr>
       <w:r>
-        <w:t>Dưới đây là bảng phân công chi tiết 15 hoạt động lớn của Ban TCKT trong năm học 2026 - 2027 gắn với mảng chủ trì, mảng phối hợp và sản phẩm đầu ra bắt buộc:</w:t>
+        <w:t>Dưới đây là bảng phân công chi tiết 18 hoạt động trọng tâm của Ban TCKT trong năm học 2026 - 2027 gắn với mảng chủ trì, mảng phối hợp và sản phẩm đầu ra bắt buộc:</w:t>
       </w:r>
     </w:p>
     <w:tbl>
@@ -3545,90 +3571,37 @@
       <w:tr>
         <w:tc>
           <w:tcPr>
-            <w:tcW w:type="dxa" w:w="576"/>
-            <w:shd w:fill="F8FAFC"/>
-            <w:tcMar>
-              <w:top w:w="80" w:type="dxa"/>
-              <w:bottom w:w="80" w:type="dxa"/>
-              <w:left w:w="70" w:type="dxa"/>
-              <w:right w:w="70" w:type="dxa"/>
-            </w:tcMar>
-          </w:tcPr>
-          <w:p>
-            <w:pPr>
-              <w:spacing w:line="276" w:lineRule="auto"/>
-              <w:jc w:val="center"/>
-            </w:pPr>
-            <w:r>
-              <w:rPr>
-                <w:rFonts w:ascii="Times New Roman" w:hAnsi="Times New Roman"/>
-                <w:b/>
-                <w:sz w:val="19"/>
-              </w:rPr>
+            <w:tcW w:type="dxa" w:w="1559"/>
+          </w:tcPr>
+          <w:p>
+            <w:r>
               <w:t>1</w:t>
             </w:r>
           </w:p>
         </w:tc>
         <w:tc>
           <w:tcPr>
-            <w:tcW w:type="dxa" w:w="3168"/>
-            <w:shd w:fill="F8FAFC"/>
-            <w:tcMar>
-              <w:top w:w="80" w:type="dxa"/>
-              <w:bottom w:w="80" w:type="dxa"/>
-              <w:left w:w="70" w:type="dxa"/>
-              <w:right w:w="70" w:type="dxa"/>
-            </w:tcMar>
-          </w:tcPr>
-          <w:p>
-            <w:pPr>
-              <w:spacing w:line="276" w:lineRule="auto"/>
-              <w:jc w:val="left"/>
-            </w:pPr>
-            <w:r>
-              <w:rPr>
-                <w:rFonts w:ascii="Times New Roman" w:hAnsi="Times New Roman"/>
-                <w:sz w:val="19"/>
-              </w:rPr>
+            <w:tcW w:type="dxa" w:w="1559"/>
+          </w:tcPr>
+          <w:p>
+            <w:r>
               <w:t>Tuyển thành viên các Ban chuyên môn Đoàn Đại học</w:t>
             </w:r>
           </w:p>
         </w:tc>
         <w:tc>
           <w:tcPr>
-            <w:tcW w:type="dxa" w:w="1296"/>
-            <w:shd w:fill="F8FAFC"/>
-            <w:tcMar>
-              <w:top w:w="80" w:type="dxa"/>
-              <w:bottom w:w="80" w:type="dxa"/>
-              <w:left w:w="70" w:type="dxa"/>
-              <w:right w:w="70" w:type="dxa"/>
-            </w:tcMar>
-          </w:tcPr>
-          <w:p>
-            <w:pPr>
-              <w:spacing w:line="276" w:lineRule="auto"/>
-              <w:jc w:val="center"/>
-            </w:pPr>
-            <w:r>
-              <w:rPr>
-                <w:rFonts w:ascii="Times New Roman" w:hAnsi="Times New Roman"/>
-                <w:sz w:val="19"/>
-              </w:rPr>
-              <w:t>9/2026</w:t>
-            </w:r>
-          </w:p>
-        </w:tc>
-        <w:tc>
-          <w:tcPr>
-            <w:tcW w:type="dxa" w:w="1440"/>
-            <w:shd w:fill="F8FAFC"/>
-            <w:tcMar>
-              <w:top w:w="80" w:type="dxa"/>
-              <w:bottom w:w="80" w:type="dxa"/>
-              <w:left w:w="70" w:type="dxa"/>
-              <w:right w:w="70" w:type="dxa"/>
-            </w:tcMar>
+            <w:tcW w:type="dxa" w:w="1559"/>
+          </w:tcPr>
+          <w:p>
+            <w:r>
+              <w:t>Tháng 9/2026</w:t>
+            </w:r>
+          </w:p>
+        </w:tc>
+        <w:tc>
+          <w:tcPr>
+            <w:tcW w:type="dxa" w:w="1559"/>
           </w:tcPr>
           <w:p>
             <w:r>
@@ -3638,14 +3611,7 @@
         </w:tc>
         <w:tc>
           <w:tcPr>
-            <w:tcW w:type="dxa" w:w="1296"/>
-            <w:shd w:fill="F8FAFC"/>
-            <w:tcMar>
-              <w:top w:w="80" w:type="dxa"/>
-              <w:bottom w:w="80" w:type="dxa"/>
-              <w:left w:w="70" w:type="dxa"/>
-              <w:right w:w="70" w:type="dxa"/>
-            </w:tcMar>
+            <w:tcW w:type="dxa" w:w="1559"/>
           </w:tcPr>
           <w:p>
             <w:r>
@@ -3655,26 +3621,11 @@
         </w:tc>
         <w:tc>
           <w:tcPr>
-            <w:tcW w:type="dxa" w:w="2016"/>
-            <w:shd w:fill="F8FAFC"/>
-            <w:tcMar>
-              <w:top w:w="80" w:type="dxa"/>
-              <w:bottom w:w="80" w:type="dxa"/>
-              <w:left w:w="70" w:type="dxa"/>
-              <w:right w:w="70" w:type="dxa"/>
-            </w:tcMar>
-          </w:tcPr>
-          <w:p>
-            <w:pPr>
-              <w:spacing w:line="276" w:lineRule="auto"/>
-              <w:jc w:val="left"/>
-            </w:pPr>
-            <w:r>
-              <w:rPr>
-                <w:rFonts w:ascii="Times New Roman" w:hAnsi="Times New Roman"/>
-                <w:sz w:val="19"/>
-              </w:rPr>
-              <w:t>Danh sách trúng tuyển; hồ sơ nhân sự Ban.</w:t>
+            <w:tcW w:type="dxa" w:w="1559"/>
+          </w:tcPr>
+          <w:p>
+            <w:r>
+              <w:t>Quyết định công nhận &amp; Danh sách trúng tuyển; Hồ sơ nhân sự Ban.</w:t>
             </w:r>
           </w:p>
         </w:tc>
@@ -3682,90 +3633,37 @@
       <w:tr>
         <w:tc>
           <w:tcPr>
-            <w:tcW w:type="dxa" w:w="576"/>
-            <w:shd w:fill="FFFFFF"/>
-            <w:tcMar>
-              <w:top w:w="80" w:type="dxa"/>
-              <w:bottom w:w="80" w:type="dxa"/>
-              <w:left w:w="70" w:type="dxa"/>
-              <w:right w:w="70" w:type="dxa"/>
-            </w:tcMar>
-          </w:tcPr>
-          <w:p>
-            <w:pPr>
-              <w:spacing w:line="276" w:lineRule="auto"/>
-              <w:jc w:val="center"/>
-            </w:pPr>
-            <w:r>
-              <w:rPr>
-                <w:rFonts w:ascii="Times New Roman" w:hAnsi="Times New Roman"/>
-                <w:b/>
-                <w:sz w:val="19"/>
-              </w:rPr>
+            <w:tcW w:type="dxa" w:w="1559"/>
+          </w:tcPr>
+          <w:p>
+            <w:r>
               <w:t>2</w:t>
             </w:r>
           </w:p>
         </w:tc>
         <w:tc>
           <w:tcPr>
-            <w:tcW w:type="dxa" w:w="3168"/>
-            <w:shd w:fill="FFFFFF"/>
-            <w:tcMar>
-              <w:top w:w="80" w:type="dxa"/>
-              <w:bottom w:w="80" w:type="dxa"/>
-              <w:left w:w="70" w:type="dxa"/>
-              <w:right w:w="70" w:type="dxa"/>
-            </w:tcMar>
-          </w:tcPr>
-          <w:p>
-            <w:pPr>
-              <w:spacing w:line="276" w:lineRule="auto"/>
-              <w:jc w:val="left"/>
-            </w:pPr>
-            <w:r>
-              <w:rPr>
-                <w:rFonts w:ascii="Times New Roman" w:hAnsi="Times New Roman"/>
-                <w:sz w:val="19"/>
-              </w:rPr>
-              <w:t>Đại hội các Chi đoàn + Thành lập Chi đoàn K71</w:t>
-            </w:r>
-          </w:p>
-        </w:tc>
-        <w:tc>
-          <w:tcPr>
-            <w:tcW w:type="dxa" w:w="1296"/>
-            <w:shd w:fill="FFFFFF"/>
-            <w:tcMar>
-              <w:top w:w="80" w:type="dxa"/>
-              <w:bottom w:w="80" w:type="dxa"/>
-              <w:left w:w="70" w:type="dxa"/>
-              <w:right w:w="70" w:type="dxa"/>
-            </w:tcMar>
-          </w:tcPr>
-          <w:p>
-            <w:pPr>
-              <w:spacing w:line="276" w:lineRule="auto"/>
-              <w:jc w:val="center"/>
-            </w:pPr>
-            <w:r>
-              <w:rPr>
-                <w:rFonts w:ascii="Times New Roman" w:hAnsi="Times New Roman"/>
-                <w:sz w:val="19"/>
-              </w:rPr>
-              <w:t>10 - 11/2026</w:t>
-            </w:r>
-          </w:p>
-        </w:tc>
-        <w:tc>
-          <w:tcPr>
-            <w:tcW w:type="dxa" w:w="1440"/>
-            <w:shd w:fill="FFFFFF"/>
-            <w:tcMar>
-              <w:top w:w="80" w:type="dxa"/>
-              <w:bottom w:w="80" w:type="dxa"/>
-              <w:left w:w="70" w:type="dxa"/>
-              <w:right w:w="70" w:type="dxa"/>
-            </w:tcMar>
+            <w:tcW w:type="dxa" w:w="1559"/>
+          </w:tcPr>
+          <w:p>
+            <w:r>
+              <w:t>Hội nghị Triển khai Công tác và Giao ban Đầu mối 12 Đơn vị Cơ sở năm học 2026 - 2027</w:t>
+            </w:r>
+          </w:p>
+        </w:tc>
+        <w:tc>
+          <w:tcPr>
+            <w:tcW w:type="dxa" w:w="1559"/>
+          </w:tcPr>
+          <w:p>
+            <w:r>
+              <w:t>Tháng 9 - 10/2026</w:t>
+            </w:r>
+          </w:p>
+        </w:tc>
+        <w:tc>
+          <w:tcPr>
+            <w:tcW w:type="dxa" w:w="1559"/>
           </w:tcPr>
           <w:p>
             <w:r>
@@ -3775,43 +3673,21 @@
         </w:tc>
         <w:tc>
           <w:tcPr>
-            <w:tcW w:type="dxa" w:w="1296"/>
-            <w:shd w:fill="FFFFFF"/>
-            <w:tcMar>
-              <w:top w:w="80" w:type="dxa"/>
-              <w:bottom w:w="80" w:type="dxa"/>
-              <w:left w:w="70" w:type="dxa"/>
-              <w:right w:w="70" w:type="dxa"/>
-            </w:tcMar>
-          </w:tcPr>
-          <w:p>
-            <w:r>
-              <w:t>Mảng Phát triển Đảng &amp; Chuyển đổi số</w:t>
-            </w:r>
-          </w:p>
-        </w:tc>
-        <w:tc>
-          <w:tcPr>
-            <w:tcW w:type="dxa" w:w="2016"/>
-            <w:shd w:fill="FFFFFF"/>
-            <w:tcMar>
-              <w:top w:w="80" w:type="dxa"/>
-              <w:bottom w:w="80" w:type="dxa"/>
-              <w:left w:w="70" w:type="dxa"/>
-              <w:right w:w="70" w:type="dxa"/>
-            </w:tcMar>
-          </w:tcPr>
-          <w:p>
-            <w:pPr>
-              <w:spacing w:line="276" w:lineRule="auto"/>
-              <w:jc w:val="left"/>
-            </w:pPr>
-            <w:r>
-              <w:rPr>
-                <w:rFonts w:ascii="Times New Roman" w:hAnsi="Times New Roman"/>
-                <w:sz w:val="19"/>
-              </w:rPr>
-              <w:t>Nghị quyết chuẩn y BCH; cây tổ chức K71 trên QLDV.</w:t>
+            <w:tcW w:type="dxa" w:w="1559"/>
+          </w:tcPr>
+          <w:p>
+            <w:r>
+              <w:t>Mảng Giám sát Kiểm tra &amp; Điểm rèn luyện, Mảng Truyền thông - Sự kiện &amp; Phát triển Nội bộ</w:t>
+            </w:r>
+          </w:p>
+        </w:tc>
+        <w:tc>
+          <w:tcPr>
+            <w:tcW w:type="dxa" w:w="1559"/>
+          </w:tcPr>
+          <w:p>
+            <w:r>
+              <w:t>Kế hoạch công tác năm học, Biên bản giao ban &amp; Kênh kết nối 12 cơ sở.</w:t>
             </w:r>
           </w:p>
         </w:tc>
@@ -3819,90 +3695,37 @@
       <w:tr>
         <w:tc>
           <w:tcPr>
-            <w:tcW w:type="dxa" w:w="576"/>
-            <w:shd w:fill="F8FAFC"/>
-            <w:tcMar>
-              <w:top w:w="80" w:type="dxa"/>
-              <w:bottom w:w="80" w:type="dxa"/>
-              <w:left w:w="70" w:type="dxa"/>
-              <w:right w:w="70" w:type="dxa"/>
-            </w:tcMar>
-          </w:tcPr>
-          <w:p>
-            <w:pPr>
-              <w:spacing w:line="276" w:lineRule="auto"/>
-              <w:jc w:val="center"/>
-            </w:pPr>
-            <w:r>
-              <w:rPr>
-                <w:rFonts w:ascii="Times New Roman" w:hAnsi="Times New Roman"/>
-                <w:b/>
-                <w:sz w:val="19"/>
-              </w:rPr>
+            <w:tcW w:type="dxa" w:w="1559"/>
+          </w:tcPr>
+          <w:p>
+            <w:r>
               <w:t>3</w:t>
             </w:r>
           </w:p>
         </w:tc>
         <w:tc>
           <w:tcPr>
-            <w:tcW w:type="dxa" w:w="3168"/>
-            <w:shd w:fill="F8FAFC"/>
-            <w:tcMar>
-              <w:top w:w="80" w:type="dxa"/>
-              <w:bottom w:w="80" w:type="dxa"/>
-              <w:left w:w="70" w:type="dxa"/>
-              <w:right w:w="70" w:type="dxa"/>
-            </w:tcMar>
-          </w:tcPr>
-          <w:p>
-            <w:pPr>
-              <w:spacing w:line="276" w:lineRule="auto"/>
-              <w:jc w:val="left"/>
-            </w:pPr>
-            <w:r>
-              <w:rPr>
-                <w:rFonts w:ascii="Times New Roman" w:hAnsi="Times New Roman"/>
-                <w:sz w:val="19"/>
-              </w:rPr>
-              <w:t>Ra mắt Ban Cán sự năm nhất K71</w:t>
-            </w:r>
-          </w:p>
-        </w:tc>
-        <w:tc>
-          <w:tcPr>
-            <w:tcW w:type="dxa" w:w="1296"/>
-            <w:shd w:fill="F8FAFC"/>
-            <w:tcMar>
-              <w:top w:w="80" w:type="dxa"/>
-              <w:bottom w:w="80" w:type="dxa"/>
-              <w:left w:w="70" w:type="dxa"/>
-              <w:right w:w="70" w:type="dxa"/>
-            </w:tcMar>
-          </w:tcPr>
-          <w:p>
-            <w:pPr>
-              <w:spacing w:line="276" w:lineRule="auto"/>
-              <w:jc w:val="center"/>
-            </w:pPr>
-            <w:r>
-              <w:rPr>
-                <w:rFonts w:ascii="Times New Roman" w:hAnsi="Times New Roman"/>
-                <w:sz w:val="19"/>
-              </w:rPr>
-              <w:t>11/2026</w:t>
-            </w:r>
-          </w:p>
-        </w:tc>
-        <w:tc>
-          <w:tcPr>
-            <w:tcW w:type="dxa" w:w="1440"/>
-            <w:shd w:fill="F8FAFC"/>
-            <w:tcMar>
-              <w:top w:w="80" w:type="dxa"/>
-              <w:bottom w:w="80" w:type="dxa"/>
-              <w:left w:w="70" w:type="dxa"/>
-              <w:right w:w="70" w:type="dxa"/>
-            </w:tcMar>
+            <w:tcW w:type="dxa" w:w="1559"/>
+          </w:tcPr>
+          <w:p>
+            <w:r>
+              <w:t>Đại hội các Chi đoàn &amp; Thành lập Chi đoàn K71</w:t>
+            </w:r>
+          </w:p>
+        </w:tc>
+        <w:tc>
+          <w:tcPr>
+            <w:tcW w:type="dxa" w:w="1559"/>
+          </w:tcPr>
+          <w:p>
+            <w:r>
+              <w:t>Tháng 10 - 11/2026</w:t>
+            </w:r>
+          </w:p>
+        </w:tc>
+        <w:tc>
+          <w:tcPr>
+            <w:tcW w:type="dxa" w:w="1559"/>
           </w:tcPr>
           <w:p>
             <w:r>
@@ -3912,43 +3735,21 @@
         </w:tc>
         <w:tc>
           <w:tcPr>
-            <w:tcW w:type="dxa" w:w="1296"/>
-            <w:shd w:fill="F8FAFC"/>
-            <w:tcMar>
-              <w:top w:w="80" w:type="dxa"/>
-              <w:bottom w:w="80" w:type="dxa"/>
-              <w:left w:w="70" w:type="dxa"/>
-              <w:right w:w="70" w:type="dxa"/>
-            </w:tcMar>
-          </w:tcPr>
-          <w:p>
-            <w:r>
-              <w:t>Mảng Truyền thông - Sự kiện &amp; Phát triển Nội bộ</w:t>
-            </w:r>
-          </w:p>
-        </w:tc>
-        <w:tc>
-          <w:tcPr>
-            <w:tcW w:type="dxa" w:w="2016"/>
-            <w:shd w:fill="F8FAFC"/>
-            <w:tcMar>
-              <w:top w:w="80" w:type="dxa"/>
-              <w:bottom w:w="80" w:type="dxa"/>
-              <w:left w:w="70" w:type="dxa"/>
-              <w:right w:w="70" w:type="dxa"/>
-            </w:tcMar>
-          </w:tcPr>
-          <w:p>
-            <w:pPr>
-              <w:spacing w:line="276" w:lineRule="auto"/>
-              <w:jc w:val="left"/>
-            </w:pPr>
-            <w:r>
-              <w:rPr>
-                <w:rFonts w:ascii="Times New Roman" w:hAnsi="Times New Roman"/>
-                <w:sz w:val="19"/>
-              </w:rPr>
-              <w:t>Hội nghị ra mắt; danh sách Ban Cán sự các lớp K71.</w:t>
+            <w:tcW w:type="dxa" w:w="1559"/>
+          </w:tcPr>
+          <w:p>
+            <w:r>
+              <w:t>Mảng Phát triển Đảng &amp; Chuyển đổi số</w:t>
+            </w:r>
+          </w:p>
+        </w:tc>
+        <w:tc>
+          <w:tcPr>
+            <w:tcW w:type="dxa" w:w="1559"/>
+          </w:tcPr>
+          <w:p>
+            <w:r>
+              <w:t>Quyết định chuẩn y BCH; Cây tổ chức K71 hoàn thiện trên hệ thống QLDV.</w:t>
             </w:r>
           </w:p>
         </w:tc>
@@ -3956,90 +3757,37 @@
       <w:tr>
         <w:tc>
           <w:tcPr>
-            <w:tcW w:type="dxa" w:w="576"/>
-            <w:shd w:fill="FFFFFF"/>
-            <w:tcMar>
-              <w:top w:w="80" w:type="dxa"/>
-              <w:bottom w:w="80" w:type="dxa"/>
-              <w:left w:w="70" w:type="dxa"/>
-              <w:right w:w="70" w:type="dxa"/>
-            </w:tcMar>
-          </w:tcPr>
-          <w:p>
-            <w:pPr>
-              <w:spacing w:line="276" w:lineRule="auto"/>
-              <w:jc w:val="center"/>
-            </w:pPr>
-            <w:r>
-              <w:rPr>
-                <w:rFonts w:ascii="Times New Roman" w:hAnsi="Times New Roman"/>
-                <w:b/>
-                <w:sz w:val="19"/>
-              </w:rPr>
+            <w:tcW w:type="dxa" w:w="1559"/>
+          </w:tcPr>
+          <w:p>
+            <w:r>
               <w:t>4</w:t>
             </w:r>
           </w:p>
         </w:tc>
         <w:tc>
           <w:tcPr>
-            <w:tcW w:type="dxa" w:w="3168"/>
-            <w:shd w:fill="FFFFFF"/>
-            <w:tcMar>
-              <w:top w:w="80" w:type="dxa"/>
-              <w:bottom w:w="80" w:type="dxa"/>
-              <w:left w:w="70" w:type="dxa"/>
-              <w:right w:w="70" w:type="dxa"/>
-            </w:tcMar>
-          </w:tcPr>
-          <w:p>
-            <w:pPr>
-              <w:spacing w:line="276" w:lineRule="auto"/>
-              <w:jc w:val="left"/>
-            </w:pPr>
-            <w:r>
-              <w:rPr>
-                <w:rFonts w:ascii="Times New Roman" w:hAnsi="Times New Roman"/>
-                <w:sz w:val="19"/>
-              </w:rPr>
-              <w:t>Đóng dấu tiếp nhận sổ Đoàn K71</w:t>
-            </w:r>
-          </w:p>
-        </w:tc>
-        <w:tc>
-          <w:tcPr>
-            <w:tcW w:type="dxa" w:w="1296"/>
-            <w:shd w:fill="FFFFFF"/>
-            <w:tcMar>
-              <w:top w:w="80" w:type="dxa"/>
-              <w:bottom w:w="80" w:type="dxa"/>
-              <w:left w:w="70" w:type="dxa"/>
-              <w:right w:w="70" w:type="dxa"/>
-            </w:tcMar>
-          </w:tcPr>
-          <w:p>
-            <w:pPr>
-              <w:spacing w:line="276" w:lineRule="auto"/>
-              <w:jc w:val="center"/>
-            </w:pPr>
-            <w:r>
-              <w:rPr>
-                <w:rFonts w:ascii="Times New Roman" w:hAnsi="Times New Roman"/>
-                <w:sz w:val="19"/>
-              </w:rPr>
-              <w:t>12/2026</w:t>
-            </w:r>
-          </w:p>
-        </w:tc>
-        <w:tc>
-          <w:tcPr>
-            <w:tcW w:type="dxa" w:w="1440"/>
-            <w:shd w:fill="FFFFFF"/>
-            <w:tcMar>
-              <w:top w:w="80" w:type="dxa"/>
-              <w:bottom w:w="80" w:type="dxa"/>
-              <w:left w:w="70" w:type="dxa"/>
-              <w:right w:w="70" w:type="dxa"/>
-            </w:tcMar>
+            <w:tcW w:type="dxa" w:w="1559"/>
+          </w:tcPr>
+          <w:p>
+            <w:r>
+              <w:t>Ra mắt Ban Cán sự năm nhất K71</w:t>
+            </w:r>
+          </w:p>
+        </w:tc>
+        <w:tc>
+          <w:tcPr>
+            <w:tcW w:type="dxa" w:w="1559"/>
+          </w:tcPr>
+          <w:p>
+            <w:r>
+              <w:t>Tháng 11/2026</w:t>
+            </w:r>
+          </w:p>
+        </w:tc>
+        <w:tc>
+          <w:tcPr>
+            <w:tcW w:type="dxa" w:w="1559"/>
           </w:tcPr>
           <w:p>
             <w:r>
@@ -4049,43 +3797,21 @@
         </w:tc>
         <w:tc>
           <w:tcPr>
-            <w:tcW w:type="dxa" w:w="1296"/>
-            <w:shd w:fill="FFFFFF"/>
-            <w:tcMar>
-              <w:top w:w="80" w:type="dxa"/>
-              <w:bottom w:w="80" w:type="dxa"/>
-              <w:left w:w="70" w:type="dxa"/>
-              <w:right w:w="70" w:type="dxa"/>
-            </w:tcMar>
-          </w:tcPr>
-          <w:p>
-            <w:r>
-              <w:t>Mảng Phát triển Đảng &amp; Chuyển đổi số</w:t>
-            </w:r>
-          </w:p>
-        </w:tc>
-        <w:tc>
-          <w:tcPr>
-            <w:tcW w:type="dxa" w:w="2016"/>
-            <w:shd w:fill="FFFFFF"/>
-            <w:tcMar>
-              <w:top w:w="80" w:type="dxa"/>
-              <w:bottom w:w="80" w:type="dxa"/>
-              <w:left w:w="70" w:type="dxa"/>
-              <w:right w:w="70" w:type="dxa"/>
-            </w:tcMar>
-          </w:tcPr>
-          <w:p>
-            <w:pPr>
-              <w:spacing w:line="276" w:lineRule="auto"/>
-              <w:jc w:val="left"/>
-            </w:pPr>
-            <w:r>
-              <w:rPr>
-                <w:rFonts w:ascii="Times New Roman" w:hAnsi="Times New Roman"/>
-                <w:sz w:val="19"/>
-              </w:rPr>
-              <w:t>100% sổ Đoàn K71 được vào sổ và đóng dấu tiếp nhận.</w:t>
+            <w:tcW w:type="dxa" w:w="1559"/>
+          </w:tcPr>
+          <w:p>
+            <w:r>
+              <w:t>Mảng Truyền thông - Sự kiện &amp; Phát triển Nội bộ</w:t>
+            </w:r>
+          </w:p>
+        </w:tc>
+        <w:tc>
+          <w:tcPr>
+            <w:tcW w:type="dxa" w:w="1559"/>
+          </w:tcPr>
+          <w:p>
+            <w:r>
+              <w:t>Danh bạ Ban Cán sự K71; Sự kiện / Hội nghị ra mắt tân cán bộ lớp.</w:t>
             </w:r>
           </w:p>
         </w:tc>
@@ -4093,90 +3819,47 @@
       <w:tr>
         <w:tc>
           <w:tcPr>
-            <w:tcW w:type="dxa" w:w="576"/>
-            <w:shd w:fill="F8FAFC"/>
-            <w:tcMar>
-              <w:top w:w="80" w:type="dxa"/>
-              <w:bottom w:w="80" w:type="dxa"/>
-              <w:left w:w="70" w:type="dxa"/>
-              <w:right w:w="70" w:type="dxa"/>
-            </w:tcMar>
-          </w:tcPr>
-          <w:p>
-            <w:pPr>
-              <w:spacing w:line="276" w:lineRule="auto"/>
-              <w:jc w:val="center"/>
-            </w:pPr>
-            <w:r>
-              <w:rPr>
-                <w:rFonts w:ascii="Times New Roman" w:hAnsi="Times New Roman"/>
-                <w:b/>
-                <w:sz w:val="19"/>
-              </w:rPr>
+            <w:tcW w:type="dxa" w:w="1559"/>
+          </w:tcPr>
+          <w:p>
+            <w:r>
               <w:t>5</w:t>
             </w:r>
           </w:p>
         </w:tc>
         <w:tc>
           <w:tcPr>
-            <w:tcW w:type="dxa" w:w="3168"/>
-            <w:shd w:fill="F8FAFC"/>
-            <w:tcMar>
-              <w:top w:w="80" w:type="dxa"/>
-              <w:bottom w:w="80" w:type="dxa"/>
-              <w:left w:w="70" w:type="dxa"/>
-              <w:right w:w="70" w:type="dxa"/>
-            </w:tcMar>
-          </w:tcPr>
-          <w:p>
-            <w:pPr>
-              <w:spacing w:line="276" w:lineRule="auto"/>
-              <w:jc w:val="left"/>
-            </w:pPr>
-            <w:r>
-              <w:rPr>
-                <w:rFonts w:ascii="Times New Roman" w:hAnsi="Times New Roman"/>
-                <w:sz w:val="19"/>
-              </w:rPr>
-              <w:t>Hỗ trợ thu Đoàn phí K71 và công nợ K70, K69, K68</w:t>
-            </w:r>
-          </w:p>
-        </w:tc>
-        <w:tc>
-          <w:tcPr>
-            <w:tcW w:type="dxa" w:w="1296"/>
-            <w:shd w:fill="F8FAFC"/>
-            <w:tcMar>
-              <w:top w:w="80" w:type="dxa"/>
-              <w:bottom w:w="80" w:type="dxa"/>
-              <w:left w:w="70" w:type="dxa"/>
-              <w:right w:w="70" w:type="dxa"/>
-            </w:tcMar>
-          </w:tcPr>
-          <w:p>
-            <w:pPr>
-              <w:spacing w:line="276" w:lineRule="auto"/>
-              <w:jc w:val="center"/>
-            </w:pPr>
-            <w:r>
-              <w:rPr>
-                <w:rFonts w:ascii="Times New Roman" w:hAnsi="Times New Roman"/>
-                <w:sz w:val="19"/>
-              </w:rPr>
-              <w:t>01/2027</w:t>
-            </w:r>
-          </w:p>
-        </w:tc>
-        <w:tc>
-          <w:tcPr>
-            <w:tcW w:type="dxa" w:w="1440"/>
-            <w:shd w:fill="F8FAFC"/>
-            <w:tcMar>
-              <w:top w:w="80" w:type="dxa"/>
-              <w:bottom w:w="80" w:type="dxa"/>
-              <w:left w:w="70" w:type="dxa"/>
-              <w:right w:w="70" w:type="dxa"/>
-            </w:tcMar>
+            <w:tcW w:type="dxa" w:w="1559"/>
+          </w:tcPr>
+          <w:p>
+            <w:r>
+              <w:t>Kiểm tra Giấy tờ, Hồ sơ sau Đại hội Chi đoàn và Cơ sở</w:t>
+            </w:r>
+          </w:p>
+        </w:tc>
+        <w:tc>
+          <w:tcPr>
+            <w:tcW w:type="dxa" w:w="1559"/>
+          </w:tcPr>
+          <w:p>
+            <w:r>
+              <w:t>Tháng 10 - 12/2026</w:t>
+            </w:r>
+          </w:p>
+        </w:tc>
+        <w:tc>
+          <w:tcPr>
+            <w:tcW w:type="dxa" w:w="1559"/>
+          </w:tcPr>
+          <w:p>
+            <w:r>
+              <w:t>Mảng Giám sát Kiểm tra &amp; Điểm rèn luyện</w:t>
+            </w:r>
+          </w:p>
+        </w:tc>
+        <w:tc>
+          <w:tcPr>
+            <w:tcW w:type="dxa" w:w="1559"/>
           </w:tcPr>
           <w:p>
             <w:r>
@@ -4186,43 +3869,11 @@
         </w:tc>
         <w:tc>
           <w:tcPr>
-            <w:tcW w:type="dxa" w:w="1296"/>
-            <w:shd w:fill="F8FAFC"/>
-            <w:tcMar>
-              <w:top w:w="80" w:type="dxa"/>
-              <w:bottom w:w="80" w:type="dxa"/>
-              <w:left w:w="70" w:type="dxa"/>
-              <w:right w:w="70" w:type="dxa"/>
-            </w:tcMar>
-          </w:tcPr>
-          <w:p>
-            <w:r>
-              <w:t>Mảng Phát triển Đảng &amp; Chuyển đổi số</w:t>
-            </w:r>
-          </w:p>
-        </w:tc>
-        <w:tc>
-          <w:tcPr>
-            <w:tcW w:type="dxa" w:w="2016"/>
-            <w:shd w:fill="F8FAFC"/>
-            <w:tcMar>
-              <w:top w:w="80" w:type="dxa"/>
-              <w:bottom w:w="80" w:type="dxa"/>
-              <w:left w:w="70" w:type="dxa"/>
-              <w:right w:w="70" w:type="dxa"/>
-            </w:tcMar>
-          </w:tcPr>
-          <w:p>
-            <w:pPr>
-              <w:spacing w:line="276" w:lineRule="auto"/>
-              <w:jc w:val="left"/>
-            </w:pPr>
-            <w:r>
-              <w:rPr>
-                <w:rFonts w:ascii="Times New Roman" w:hAnsi="Times New Roman"/>
-                <w:sz w:val="19"/>
-              </w:rPr>
-              <w:t>Biên lai thu; bảng tổng hợp đối soát đoàn phí 12 đơn vị.</w:t>
+            <w:tcW w:type="dxa" w:w="1559"/>
+          </w:tcPr>
+          <w:p>
+            <w:r>
+              <w:t>Biên bản hậu kiểm hồ sơ đại hội; Danh mục chi đoàn đủ điều kiện chuẩn y.</w:t>
             </w:r>
           </w:p>
         </w:tc>
@@ -4230,90 +3881,37 @@
       <w:tr>
         <w:tc>
           <w:tcPr>
-            <w:tcW w:type="dxa" w:w="576"/>
-            <w:shd w:fill="FFFFFF"/>
-            <w:tcMar>
-              <w:top w:w="80" w:type="dxa"/>
-              <w:bottom w:w="80" w:type="dxa"/>
-              <w:left w:w="70" w:type="dxa"/>
-              <w:right w:w="70" w:type="dxa"/>
-            </w:tcMar>
-          </w:tcPr>
-          <w:p>
-            <w:pPr>
-              <w:spacing w:line="276" w:lineRule="auto"/>
-              <w:jc w:val="center"/>
-            </w:pPr>
-            <w:r>
-              <w:rPr>
-                <w:rFonts w:ascii="Times New Roman" w:hAnsi="Times New Roman"/>
-                <w:b/>
-                <w:sz w:val="19"/>
-              </w:rPr>
+            <w:tcW w:type="dxa" w:w="1559"/>
+          </w:tcPr>
+          <w:p>
+            <w:r>
               <w:t>6</w:t>
             </w:r>
           </w:p>
         </w:tc>
         <w:tc>
           <w:tcPr>
-            <w:tcW w:type="dxa" w:w="3168"/>
-            <w:shd w:fill="FFFFFF"/>
-            <w:tcMar>
-              <w:top w:w="80" w:type="dxa"/>
-              <w:bottom w:w="80" w:type="dxa"/>
-              <w:left w:w="70" w:type="dxa"/>
-              <w:right w:w="70" w:type="dxa"/>
-            </w:tcMar>
-          </w:tcPr>
-          <w:p>
-            <w:pPr>
-              <w:spacing w:line="276" w:lineRule="auto"/>
-              <w:jc w:val="left"/>
-            </w:pPr>
-            <w:r>
-              <w:rPr>
-                <w:rFonts w:ascii="Times New Roman" w:hAnsi="Times New Roman"/>
-                <w:sz w:val="19"/>
-              </w:rPr>
-              <w:t>Kết nạp Đoàn viên mới đợt 1 (chào mừng 26/3)</w:t>
-            </w:r>
-          </w:p>
-        </w:tc>
-        <w:tc>
-          <w:tcPr>
-            <w:tcW w:type="dxa" w:w="1296"/>
-            <w:shd w:fill="FFFFFF"/>
-            <w:tcMar>
-              <w:top w:w="80" w:type="dxa"/>
-              <w:bottom w:w="80" w:type="dxa"/>
-              <w:left w:w="70" w:type="dxa"/>
-              <w:right w:w="70" w:type="dxa"/>
-            </w:tcMar>
-          </w:tcPr>
-          <w:p>
-            <w:pPr>
-              <w:spacing w:line="276" w:lineRule="auto"/>
-              <w:jc w:val="center"/>
-            </w:pPr>
-            <w:r>
-              <w:rPr>
-                <w:rFonts w:ascii="Times New Roman" w:hAnsi="Times New Roman"/>
-                <w:sz w:val="19"/>
-              </w:rPr>
-              <w:t>03/2027</w:t>
-            </w:r>
-          </w:p>
-        </w:tc>
-        <w:tc>
-          <w:tcPr>
-            <w:tcW w:type="dxa" w:w="1440"/>
-            <w:shd w:fill="FFFFFF"/>
-            <w:tcMar>
-              <w:top w:w="80" w:type="dxa"/>
-              <w:bottom w:w="80" w:type="dxa"/>
-              <w:left w:w="70" w:type="dxa"/>
-              <w:right w:w="70" w:type="dxa"/>
-            </w:tcMar>
+            <w:tcW w:type="dxa" w:w="1559"/>
+          </w:tcPr>
+          <w:p>
+            <w:r>
+              <w:t>Đóng dấu tiếp nhận sổ Đoàn K71</w:t>
+            </w:r>
+          </w:p>
+        </w:tc>
+        <w:tc>
+          <w:tcPr>
+            <w:tcW w:type="dxa" w:w="1559"/>
+          </w:tcPr>
+          <w:p>
+            <w:r>
+              <w:t>Tháng 12/2026</w:t>
+            </w:r>
+          </w:p>
+        </w:tc>
+        <w:tc>
+          <w:tcPr>
+            <w:tcW w:type="dxa" w:w="1559"/>
           </w:tcPr>
           <w:p>
             <w:r>
@@ -4323,43 +3921,21 @@
         </w:tc>
         <w:tc>
           <w:tcPr>
-            <w:tcW w:type="dxa" w:w="1296"/>
-            <w:shd w:fill="FFFFFF"/>
-            <w:tcMar>
-              <w:top w:w="80" w:type="dxa"/>
-              <w:bottom w:w="80" w:type="dxa"/>
-              <w:left w:w="70" w:type="dxa"/>
-              <w:right w:w="70" w:type="dxa"/>
-            </w:tcMar>
-          </w:tcPr>
-          <w:p>
-            <w:r>
-              <w:t>Mảng Truyền thông - Sự kiện &amp; Phát triển Nội bộ</w:t>
-            </w:r>
-          </w:p>
-        </w:tc>
-        <w:tc>
-          <w:tcPr>
-            <w:tcW w:type="dxa" w:w="2016"/>
-            <w:shd w:fill="FFFFFF"/>
-            <w:tcMar>
-              <w:top w:w="80" w:type="dxa"/>
-              <w:bottom w:w="80" w:type="dxa"/>
-              <w:left w:w="70" w:type="dxa"/>
-              <w:right w:w="70" w:type="dxa"/>
-            </w:tcMar>
-          </w:tcPr>
-          <w:p>
-            <w:pPr>
-              <w:spacing w:line="276" w:lineRule="auto"/>
-              <w:jc w:val="left"/>
-            </w:pPr>
-            <w:r>
-              <w:rPr>
-                <w:rFonts w:ascii="Times New Roman" w:hAnsi="Times New Roman"/>
-                <w:sz w:val="19"/>
-              </w:rPr>
-              <w:t>Hồ sơ kết nạp đợt 1; Nghị quyết kết nạp; lễ trao huy hiệu.</w:t>
+            <w:tcW w:type="dxa" w:w="1559"/>
+          </w:tcPr>
+          <w:p>
+            <w:r>
+              <w:t>Mảng Phát triển Đảng &amp; Chuyển đổi số</w:t>
+            </w:r>
+          </w:p>
+        </w:tc>
+        <w:tc>
+          <w:tcPr>
+            <w:tcW w:type="dxa" w:w="1559"/>
+          </w:tcPr>
+          <w:p>
+            <w:r>
+              <w:t>100% Sổ Đoàn K71 được vào sổ theo dõi và đóng dấu tiếp nhận hợp lệ.</w:t>
             </w:r>
           </w:p>
         </w:tc>
@@ -4367,90 +3943,37 @@
       <w:tr>
         <w:tc>
           <w:tcPr>
-            <w:tcW w:type="dxa" w:w="576"/>
-            <w:shd w:fill="F8FAFC"/>
-            <w:tcMar>
-              <w:top w:w="80" w:type="dxa"/>
-              <w:bottom w:w="80" w:type="dxa"/>
-              <w:left w:w="70" w:type="dxa"/>
-              <w:right w:w="70" w:type="dxa"/>
-            </w:tcMar>
-          </w:tcPr>
-          <w:p>
-            <w:pPr>
-              <w:spacing w:line="276" w:lineRule="auto"/>
-              <w:jc w:val="center"/>
-            </w:pPr>
-            <w:r>
-              <w:rPr>
-                <w:rFonts w:ascii="Times New Roman" w:hAnsi="Times New Roman"/>
-                <w:b/>
-                <w:sz w:val="19"/>
-              </w:rPr>
+            <w:tcW w:type="dxa" w:w="1559"/>
+          </w:tcPr>
+          <w:p>
+            <w:r>
               <w:t>7</w:t>
             </w:r>
           </w:p>
         </w:tc>
         <w:tc>
           <w:tcPr>
-            <w:tcW w:type="dxa" w:w="3168"/>
-            <w:shd w:fill="F8FAFC"/>
-            <w:tcMar>
-              <w:top w:w="80" w:type="dxa"/>
-              <w:bottom w:w="80" w:type="dxa"/>
-              <w:left w:w="70" w:type="dxa"/>
-              <w:right w:w="70" w:type="dxa"/>
-            </w:tcMar>
-          </w:tcPr>
-          <w:p>
-            <w:pPr>
-              <w:spacing w:line="276" w:lineRule="auto"/>
-              <w:jc w:val="left"/>
-            </w:pPr>
-            <w:r>
-              <w:rPr>
-                <w:rFonts w:ascii="Times New Roman" w:hAnsi="Times New Roman"/>
-                <w:sz w:val="19"/>
-              </w:rPr>
-              <w:t>Làm thẻ Đoàn viên K71</w:t>
-            </w:r>
-          </w:p>
-        </w:tc>
-        <w:tc>
-          <w:tcPr>
-            <w:tcW w:type="dxa" w:w="1296"/>
-            <w:shd w:fill="F8FAFC"/>
-            <w:tcMar>
-              <w:top w:w="80" w:type="dxa"/>
-              <w:bottom w:w="80" w:type="dxa"/>
-              <w:left w:w="70" w:type="dxa"/>
-              <w:right w:w="70" w:type="dxa"/>
-            </w:tcMar>
-          </w:tcPr>
-          <w:p>
-            <w:pPr>
-              <w:spacing w:line="276" w:lineRule="auto"/>
-              <w:jc w:val="center"/>
-            </w:pPr>
-            <w:r>
-              <w:rPr>
-                <w:rFonts w:ascii="Times New Roman" w:hAnsi="Times New Roman"/>
-                <w:sz w:val="19"/>
-              </w:rPr>
-              <w:t>02 - 03/2027</w:t>
-            </w:r>
-          </w:p>
-        </w:tc>
-        <w:tc>
-          <w:tcPr>
-            <w:tcW w:type="dxa" w:w="1440"/>
-            <w:shd w:fill="F8FAFC"/>
-            <w:tcMar>
-              <w:top w:w="80" w:type="dxa"/>
-              <w:bottom w:w="80" w:type="dxa"/>
-              <w:left w:w="70" w:type="dxa"/>
-              <w:right w:w="70" w:type="dxa"/>
-            </w:tcMar>
+            <w:tcW w:type="dxa" w:w="1559"/>
+          </w:tcPr>
+          <w:p>
+            <w:r>
+              <w:t>Hỗ trợ thu Đoàn phí K71 và công nợ K70, K69, K68</w:t>
+            </w:r>
+          </w:p>
+        </w:tc>
+        <w:tc>
+          <w:tcPr>
+            <w:tcW w:type="dxa" w:w="1559"/>
+          </w:tcPr>
+          <w:p>
+            <w:r>
+              <w:t>Tháng 01/2027</w:t>
+            </w:r>
+          </w:p>
+        </w:tc>
+        <w:tc>
+          <w:tcPr>
+            <w:tcW w:type="dxa" w:w="1559"/>
           </w:tcPr>
           <w:p>
             <w:r>
@@ -4460,14 +3983,7 @@
         </w:tc>
         <w:tc>
           <w:tcPr>
-            <w:tcW w:type="dxa" w:w="1296"/>
-            <w:shd w:fill="F8FAFC"/>
-            <w:tcMar>
-              <w:top w:w="80" w:type="dxa"/>
-              <w:bottom w:w="80" w:type="dxa"/>
-              <w:left w:w="70" w:type="dxa"/>
-              <w:right w:w="70" w:type="dxa"/>
-            </w:tcMar>
+            <w:tcW w:type="dxa" w:w="1559"/>
           </w:tcPr>
           <w:p>
             <w:r>
@@ -4477,26 +3993,11 @@
         </w:tc>
         <w:tc>
           <w:tcPr>
-            <w:tcW w:type="dxa" w:w="2016"/>
-            <w:shd w:fill="F8FAFC"/>
-            <w:tcMar>
-              <w:top w:w="80" w:type="dxa"/>
-              <w:bottom w:w="80" w:type="dxa"/>
-              <w:left w:w="70" w:type="dxa"/>
-              <w:right w:w="70" w:type="dxa"/>
-            </w:tcMar>
-          </w:tcPr>
-          <w:p>
-            <w:pPr>
-              <w:spacing w:line="276" w:lineRule="auto"/>
-              <w:jc w:val="left"/>
-            </w:pPr>
-            <w:r>
-              <w:rPr>
-                <w:rFonts w:ascii="Times New Roman" w:hAnsi="Times New Roman"/>
-                <w:sz w:val="19"/>
-              </w:rPr>
-              <w:t>Thẻ đoàn viên vật lý &amp; thẻ đoàn viên điện tử QLDV.</w:t>
+            <w:tcW w:type="dxa" w:w="1559"/>
+          </w:tcPr>
+          <w:p>
+            <w:r>
+              <w:t>Biên lai thu đoàn phí; Bảng tổng hợp đối soát đoàn phí 12 đơn vị.</w:t>
             </w:r>
           </w:p>
         </w:tc>
@@ -4504,146 +4005,61 @@
       <w:tr>
         <w:tc>
           <w:tcPr>
-            <w:tcW w:type="dxa" w:w="576"/>
-            <w:shd w:fill="FFFFFF"/>
-            <w:tcMar>
-              <w:top w:w="80" w:type="dxa"/>
-              <w:bottom w:w="80" w:type="dxa"/>
-              <w:left w:w="70" w:type="dxa"/>
-              <w:right w:w="70" w:type="dxa"/>
-            </w:tcMar>
-          </w:tcPr>
-          <w:p>
-            <w:pPr>
-              <w:spacing w:line="276" w:lineRule="auto"/>
-              <w:jc w:val="center"/>
-            </w:pPr>
-            <w:r>
-              <w:rPr>
-                <w:rFonts w:ascii="Times New Roman" w:hAnsi="Times New Roman"/>
-                <w:b/>
-                <w:sz w:val="19"/>
-              </w:rPr>
+            <w:tcW w:type="dxa" w:w="1559"/>
+          </w:tcPr>
+          <w:p>
+            <w:r>
               <w:t>8</w:t>
             </w:r>
           </w:p>
         </w:tc>
         <w:tc>
           <w:tcPr>
-            <w:tcW w:type="dxa" w:w="3168"/>
-            <w:shd w:fill="FFFFFF"/>
-            <w:tcMar>
-              <w:top w:w="80" w:type="dxa"/>
-              <w:bottom w:w="80" w:type="dxa"/>
-              <w:left w:w="70" w:type="dxa"/>
-              <w:right w:w="70" w:type="dxa"/>
-            </w:tcMar>
-          </w:tcPr>
-          <w:p>
-            <w:pPr>
-              <w:spacing w:line="276" w:lineRule="auto"/>
-              <w:jc w:val="left"/>
-            </w:pPr>
-            <w:r>
-              <w:rPr>
-                <w:rFonts w:ascii="Times New Roman" w:hAnsi="Times New Roman"/>
-                <w:sz w:val="19"/>
-              </w:rPr>
-              <w:t>Tập huấn cán bộ Đoàn, cán bộ TCKT cơ sở</w:t>
-            </w:r>
-          </w:p>
-        </w:tc>
-        <w:tc>
-          <w:tcPr>
-            <w:tcW w:type="dxa" w:w="1296"/>
-            <w:shd w:fill="FFFFFF"/>
-            <w:tcMar>
-              <w:top w:w="80" w:type="dxa"/>
-              <w:bottom w:w="80" w:type="dxa"/>
-              <w:left w:w="70" w:type="dxa"/>
-              <w:right w:w="70" w:type="dxa"/>
-            </w:tcMar>
-          </w:tcPr>
-          <w:p>
-            <w:pPr>
-              <w:spacing w:line="276" w:lineRule="auto"/>
-              <w:jc w:val="center"/>
-            </w:pPr>
-            <w:r>
-              <w:rPr>
-                <w:rFonts w:ascii="Times New Roman" w:hAnsi="Times New Roman"/>
-                <w:sz w:val="19"/>
-              </w:rPr>
-              <w:t>04/2027</w:t>
-            </w:r>
-          </w:p>
-        </w:tc>
-        <w:tc>
-          <w:tcPr>
-            <w:tcW w:type="dxa" w:w="1440"/>
-            <w:shd w:fill="FFFFFF"/>
-            <w:tcMar>
-              <w:top w:w="80" w:type="dxa"/>
-              <w:bottom w:w="80" w:type="dxa"/>
-              <w:left w:w="70" w:type="dxa"/>
-              <w:right w:w="70" w:type="dxa"/>
-            </w:tcMar>
-          </w:tcPr>
-          <w:p>
-            <w:pPr>
-              <w:spacing w:line="276" w:lineRule="auto"/>
-              <w:jc w:val="center"/>
-            </w:pPr>
-            <w:r>
-              <w:rPr>
-                <w:rFonts w:ascii="Times New Roman" w:hAnsi="Times New Roman"/>
-                <w:b/>
-                <w:color w:val="005BAC"/>
-                <w:sz w:val="19"/>
-              </w:rPr>
-              <w:t>M1, M2, M3</w:t>
-            </w:r>
-          </w:p>
-        </w:tc>
-        <w:tc>
-          <w:tcPr>
-            <w:tcW w:type="dxa" w:w="1296"/>
-            <w:shd w:fill="FFFFFF"/>
-            <w:tcMar>
-              <w:top w:w="80" w:type="dxa"/>
-              <w:bottom w:w="80" w:type="dxa"/>
-              <w:left w:w="70" w:type="dxa"/>
-              <w:right w:w="70" w:type="dxa"/>
-            </w:tcMar>
-          </w:tcPr>
-          <w:p>
-            <w:r>
-              <w:t>Mảng Truyền thông - Sự kiện &amp; Phát triển Nội bộ</w:t>
-            </w:r>
-          </w:p>
-        </w:tc>
-        <w:tc>
-          <w:tcPr>
-            <w:tcW w:type="dxa" w:w="2016"/>
-            <w:shd w:fill="FFFFFF"/>
-            <w:tcMar>
-              <w:top w:w="80" w:type="dxa"/>
-              <w:bottom w:w="80" w:type="dxa"/>
-              <w:left w:w="70" w:type="dxa"/>
-              <w:right w:w="70" w:type="dxa"/>
-            </w:tcMar>
-          </w:tcPr>
-          <w:p>
-            <w:pPr>
-              <w:spacing w:line="276" w:lineRule="auto"/>
-              <w:jc w:val="left"/>
-            </w:pPr>
-            <w:r>
-              <w:rPr>
-                <w:rFonts w:ascii="Times New Roman" w:hAnsi="Times New Roman"/>
-                <w:sz w:val="19"/>
-              </w:rPr>
-              <w:t>Tài liệu tập huấn; biên bản kiểm tra nhận thức cán bộ.</w:t>
+            <w:tcW w:type="dxa" w:w="1559"/>
+          </w:tcPr>
+          <w:p>
+            <w:r>
+              <w:t>Làm thẻ Đoàn viên K71 (Vật lý &amp; Điện tử)</w:t>
+            </w:r>
+          </w:p>
+        </w:tc>
+        <w:tc>
+          <w:tcPr>
+            <w:tcW w:type="dxa" w:w="1559"/>
+          </w:tcPr>
+          <w:p>
+            <w:r>
+              <w:t>Tháng 02 - 03/2027</w:t>
+            </w:r>
+          </w:p>
+        </w:tc>
+        <w:tc>
+          <w:tcPr>
+            <w:tcW w:type="dxa" w:w="1559"/>
+          </w:tcPr>
+          <w:p>
+            <w:r>
+              <w:t>Mảng Tổ chức &amp; Phát triển Đoàn vụ</w:t>
+            </w:r>
+          </w:p>
+        </w:tc>
+        <w:tc>
+          <w:tcPr>
+            <w:tcW w:type="dxa" w:w="1559"/>
+          </w:tcPr>
+          <w:p>
+            <w:r>
+              <w:t>Mảng Phát triển Đảng &amp; Chuyển đổi số</w:t>
+            </w:r>
+          </w:p>
+        </w:tc>
+        <w:tc>
+          <w:tcPr>
+            <w:tcW w:type="dxa" w:w="1559"/>
+          </w:tcPr>
+          <w:p>
+            <w:r>
+              <w:t>100% Đoàn viên K71 có thẻ Đoàn viên vật lý &amp; thẻ số trên App TNVN.</w:t>
             </w:r>
           </w:p>
         </w:tc>
@@ -4651,90 +4067,37 @@
       <w:tr>
         <w:tc>
           <w:tcPr>
-            <w:tcW w:type="dxa" w:w="576"/>
-            <w:shd w:fill="F8FAFC"/>
-            <w:tcMar>
-              <w:top w:w="80" w:type="dxa"/>
-              <w:bottom w:w="80" w:type="dxa"/>
-              <w:left w:w="70" w:type="dxa"/>
-              <w:right w:w="70" w:type="dxa"/>
-            </w:tcMar>
-          </w:tcPr>
-          <w:p>
-            <w:pPr>
-              <w:spacing w:line="276" w:lineRule="auto"/>
-              <w:jc w:val="center"/>
-            </w:pPr>
-            <w:r>
-              <w:rPr>
-                <w:rFonts w:ascii="Times New Roman" w:hAnsi="Times New Roman"/>
-                <w:b/>
-                <w:sz w:val="19"/>
-              </w:rPr>
+            <w:tcW w:type="dxa" w:w="1559"/>
+          </w:tcPr>
+          <w:p>
+            <w:r>
               <w:t>9</w:t>
             </w:r>
           </w:p>
         </w:tc>
         <w:tc>
           <w:tcPr>
-            <w:tcW w:type="dxa" w:w="3168"/>
-            <w:shd w:fill="F8FAFC"/>
-            <w:tcMar>
-              <w:top w:w="80" w:type="dxa"/>
-              <w:bottom w:w="80" w:type="dxa"/>
-              <w:left w:w="70" w:type="dxa"/>
-              <w:right w:w="70" w:type="dxa"/>
-            </w:tcMar>
-          </w:tcPr>
-          <w:p>
-            <w:pPr>
-              <w:spacing w:line="276" w:lineRule="auto"/>
-              <w:jc w:val="left"/>
-            </w:pPr>
-            <w:r>
-              <w:rPr>
-                <w:rFonts w:ascii="Times New Roman" w:hAnsi="Times New Roman"/>
-                <w:sz w:val="19"/>
-              </w:rPr>
-              <w:t>Kết nạp Đoàn viên mới đợt 2 (chào mừng 19/5)</w:t>
-            </w:r>
-          </w:p>
-        </w:tc>
-        <w:tc>
-          <w:tcPr>
-            <w:tcW w:type="dxa" w:w="1296"/>
-            <w:shd w:fill="F8FAFC"/>
-            <w:tcMar>
-              <w:top w:w="80" w:type="dxa"/>
-              <w:bottom w:w="80" w:type="dxa"/>
-              <w:left w:w="70" w:type="dxa"/>
-              <w:right w:w="70" w:type="dxa"/>
-            </w:tcMar>
-          </w:tcPr>
-          <w:p>
-            <w:pPr>
-              <w:spacing w:line="276" w:lineRule="auto"/>
-              <w:jc w:val="center"/>
-            </w:pPr>
-            <w:r>
-              <w:rPr>
-                <w:rFonts w:ascii="Times New Roman" w:hAnsi="Times New Roman"/>
-                <w:sz w:val="19"/>
-              </w:rPr>
-              <w:t>05/2027</w:t>
-            </w:r>
-          </w:p>
-        </w:tc>
-        <w:tc>
-          <w:tcPr>
-            <w:tcW w:type="dxa" w:w="1440"/>
-            <w:shd w:fill="F8FAFC"/>
-            <w:tcMar>
-              <w:top w:w="80" w:type="dxa"/>
-              <w:bottom w:w="80" w:type="dxa"/>
-              <w:left w:w="70" w:type="dxa"/>
-              <w:right w:w="70" w:type="dxa"/>
-            </w:tcMar>
+            <w:tcW w:type="dxa" w:w="1559"/>
+          </w:tcPr>
+          <w:p>
+            <w:r>
+              <w:t>Kết nạp Đoàn viên mới đợt 1 (chào mừng 26/3)</w:t>
+            </w:r>
+          </w:p>
+        </w:tc>
+        <w:tc>
+          <w:tcPr>
+            <w:tcW w:type="dxa" w:w="1559"/>
+          </w:tcPr>
+          <w:p>
+            <w:r>
+              <w:t>Tháng 03/2027</w:t>
+            </w:r>
+          </w:p>
+        </w:tc>
+        <w:tc>
+          <w:tcPr>
+            <w:tcW w:type="dxa" w:w="1559"/>
           </w:tcPr>
           <w:p>
             <w:r>
@@ -4744,14 +4107,7 @@
         </w:tc>
         <w:tc>
           <w:tcPr>
-            <w:tcW w:type="dxa" w:w="1296"/>
-            <w:shd w:fill="F8FAFC"/>
-            <w:tcMar>
-              <w:top w:w="80" w:type="dxa"/>
-              <w:bottom w:w="80" w:type="dxa"/>
-              <w:left w:w="70" w:type="dxa"/>
-              <w:right w:w="70" w:type="dxa"/>
-            </w:tcMar>
+            <w:tcW w:type="dxa" w:w="1559"/>
           </w:tcPr>
           <w:p>
             <w:r>
@@ -4761,26 +4117,11 @@
         </w:tc>
         <w:tc>
           <w:tcPr>
-            <w:tcW w:type="dxa" w:w="2016"/>
-            <w:shd w:fill="F8FAFC"/>
-            <w:tcMar>
-              <w:top w:w="80" w:type="dxa"/>
-              <w:bottom w:w="80" w:type="dxa"/>
-              <w:left w:w="70" w:type="dxa"/>
-              <w:right w:w="70" w:type="dxa"/>
-            </w:tcMar>
-          </w:tcPr>
-          <w:p>
-            <w:pPr>
-              <w:spacing w:line="276" w:lineRule="auto"/>
-              <w:jc w:val="left"/>
-            </w:pPr>
-            <w:r>
-              <w:rPr>
-                <w:rFonts w:ascii="Times New Roman" w:hAnsi="Times New Roman"/>
-                <w:sz w:val="19"/>
-              </w:rPr>
-              <w:t>Hồ sơ kết nạp đợt 2; Nghị quyết và sổ theo dõi đoàn viên.</w:t>
+            <w:tcW w:type="dxa" w:w="1559"/>
+          </w:tcPr>
+          <w:p>
+            <w:r>
+              <w:t>Hồ sơ kết nạp đợt 1; Nghị quyết chuẩn y kết nạp; Lễ trao huy hiệu 26/3.</w:t>
             </w:r>
           </w:p>
         </w:tc>
@@ -4788,136 +4129,61 @@
       <w:tr>
         <w:tc>
           <w:tcPr>
-            <w:tcW w:type="dxa" w:w="576"/>
-            <w:shd w:fill="FFFFFF"/>
-            <w:tcMar>
-              <w:top w:w="80" w:type="dxa"/>
-              <w:bottom w:w="80" w:type="dxa"/>
-              <w:left w:w="70" w:type="dxa"/>
-              <w:right w:w="70" w:type="dxa"/>
-            </w:tcMar>
-          </w:tcPr>
-          <w:p>
-            <w:pPr>
-              <w:spacing w:line="276" w:lineRule="auto"/>
-              <w:jc w:val="center"/>
-            </w:pPr>
-            <w:r>
-              <w:rPr>
-                <w:rFonts w:ascii="Times New Roman" w:hAnsi="Times New Roman"/>
-                <w:b/>
-                <w:sz w:val="19"/>
-              </w:rPr>
+            <w:tcW w:type="dxa" w:w="1559"/>
+          </w:tcPr>
+          <w:p>
+            <w:r>
               <w:t>10</w:t>
             </w:r>
           </w:p>
         </w:tc>
         <w:tc>
           <w:tcPr>
-            <w:tcW w:type="dxa" w:w="3168"/>
-            <w:shd w:fill="FFFFFF"/>
-            <w:tcMar>
-              <w:top w:w="80" w:type="dxa"/>
-              <w:bottom w:w="80" w:type="dxa"/>
-              <w:left w:w="70" w:type="dxa"/>
-              <w:right w:w="70" w:type="dxa"/>
-            </w:tcMar>
-          </w:tcPr>
-          <w:p>
-            <w:pPr>
-              <w:spacing w:line="276" w:lineRule="auto"/>
-              <w:jc w:val="left"/>
-            </w:pPr>
-            <w:r>
-              <w:rPr>
-                <w:rFonts w:ascii="Times New Roman" w:hAnsi="Times New Roman"/>
-                <w:sz w:val="19"/>
-              </w:rPr>
-              <w:t>Đóng dấu nhận xét năm học sổ Đoàn cuối năm</w:t>
-            </w:r>
-          </w:p>
-        </w:tc>
-        <w:tc>
-          <w:tcPr>
-            <w:tcW w:type="dxa" w:w="1296"/>
-            <w:shd w:fill="FFFFFF"/>
-            <w:tcMar>
-              <w:top w:w="80" w:type="dxa"/>
-              <w:bottom w:w="80" w:type="dxa"/>
-              <w:left w:w="70" w:type="dxa"/>
-              <w:right w:w="70" w:type="dxa"/>
-            </w:tcMar>
-          </w:tcPr>
-          <w:p>
-            <w:pPr>
-              <w:spacing w:line="276" w:lineRule="auto"/>
-              <w:jc w:val="center"/>
-            </w:pPr>
-            <w:r>
-              <w:rPr>
-                <w:rFonts w:ascii="Times New Roman" w:hAnsi="Times New Roman"/>
-                <w:sz w:val="19"/>
-              </w:rPr>
-              <w:t>05 - 06/2027</w:t>
-            </w:r>
-          </w:p>
-        </w:tc>
-        <w:tc>
-          <w:tcPr>
-            <w:tcW w:type="dxa" w:w="1440"/>
-            <w:shd w:fill="FFFFFF"/>
-            <w:tcMar>
-              <w:top w:w="80" w:type="dxa"/>
-              <w:bottom w:w="80" w:type="dxa"/>
-              <w:left w:w="70" w:type="dxa"/>
-              <w:right w:w="70" w:type="dxa"/>
-            </w:tcMar>
-          </w:tcPr>
-          <w:p>
-            <w:r>
-              <w:t>Mảng Tổ chức &amp; Phát triển Đoàn vụ</w:t>
-            </w:r>
-          </w:p>
-        </w:tc>
-        <w:tc>
-          <w:tcPr>
-            <w:tcW w:type="dxa" w:w="1296"/>
-            <w:shd w:fill="FFFFFF"/>
-            <w:tcMar>
-              <w:top w:w="80" w:type="dxa"/>
-              <w:bottom w:w="80" w:type="dxa"/>
-              <w:left w:w="70" w:type="dxa"/>
-              <w:right w:w="70" w:type="dxa"/>
-            </w:tcMar>
-          </w:tcPr>
-          <w:p>
-            <w:r>
-              <w:t>Mảng Giám sát Kiểm tra &amp; Điểm rèn luyện</w:t>
-            </w:r>
-          </w:p>
-        </w:tc>
-        <w:tc>
-          <w:tcPr>
-            <w:tcW w:type="dxa" w:w="2016"/>
-            <w:shd w:fill="FFFFFF"/>
-            <w:tcMar>
-              <w:top w:w="80" w:type="dxa"/>
-              <w:bottom w:w="80" w:type="dxa"/>
-              <w:left w:w="70" w:type="dxa"/>
-              <w:right w:w="70" w:type="dxa"/>
-            </w:tcMar>
-          </w:tcPr>
-          <w:p>
-            <w:pPr>
-              <w:spacing w:line="276" w:lineRule="auto"/>
-              <w:jc w:val="left"/>
-            </w:pPr>
-            <w:r>
-              <w:rPr>
-                <w:rFonts w:ascii="Times New Roman" w:hAnsi="Times New Roman"/>
-                <w:sz w:val="19"/>
-              </w:rPr>
-              <w:t>100% sổ Đoàn cơ sở được nhận xét phân loại và đóng dấu.</w:t>
+            <w:tcW w:type="dxa" w:w="1559"/>
+          </w:tcPr>
+          <w:p>
+            <w:r>
+              <w:t>Tập huấn cán bộ Đoàn, cán bộ TCKT cơ sở</w:t>
+            </w:r>
+          </w:p>
+        </w:tc>
+        <w:tc>
+          <w:tcPr>
+            <w:tcW w:type="dxa" w:w="1559"/>
+          </w:tcPr>
+          <w:p>
+            <w:r>
+              <w:t>Tháng 04/2027</w:t>
+            </w:r>
+          </w:p>
+        </w:tc>
+        <w:tc>
+          <w:tcPr>
+            <w:tcW w:type="dxa" w:w="1559"/>
+          </w:tcPr>
+          <w:p>
+            <w:r>
+              <w:t>Mảng Tổ chức &amp; Phát triển Đoàn vụ, Mảng Phát triển Đảng &amp; Chuyển đổi số, Mảng Giám sát Kiểm tra &amp; Điểm rèn luyện</w:t>
+            </w:r>
+          </w:p>
+        </w:tc>
+        <w:tc>
+          <w:tcPr>
+            <w:tcW w:type="dxa" w:w="1559"/>
+          </w:tcPr>
+          <w:p>
+            <w:r>
+              <w:t>Mảng Truyền thông - Sự kiện &amp; Phát triển Nội bộ</w:t>
+            </w:r>
+          </w:p>
+        </w:tc>
+        <w:tc>
+          <w:tcPr>
+            <w:tcW w:type="dxa" w:w="1559"/>
+          </w:tcPr>
+          <w:p>
+            <w:r>
+              <w:t>Bộ tài liệu tập huấn chuẩn; Biên bản đánh giá nhận thức cán bộ cơ sở.</w:t>
             </w:r>
           </w:p>
         </w:tc>
@@ -4925,107 +4191,37 @@
       <w:tr>
         <w:tc>
           <w:tcPr>
-            <w:tcW w:type="dxa" w:w="576"/>
-            <w:shd w:fill="F8FAFC"/>
-            <w:tcMar>
-              <w:top w:w="80" w:type="dxa"/>
-              <w:bottom w:w="80" w:type="dxa"/>
-              <w:left w:w="70" w:type="dxa"/>
-              <w:right w:w="70" w:type="dxa"/>
-            </w:tcMar>
-          </w:tcPr>
-          <w:p>
-            <w:pPr>
-              <w:spacing w:line="276" w:lineRule="auto"/>
-              <w:jc w:val="center"/>
-            </w:pPr>
-            <w:r>
-              <w:rPr>
-                <w:rFonts w:ascii="Times New Roman" w:hAnsi="Times New Roman"/>
-                <w:b/>
-                <w:sz w:val="19"/>
-              </w:rPr>
+            <w:tcW w:type="dxa" w:w="1559"/>
+          </w:tcPr>
+          <w:p>
+            <w:r>
               <w:t>11</w:t>
             </w:r>
           </w:p>
         </w:tc>
         <w:tc>
           <w:tcPr>
-            <w:tcW w:type="dxa" w:w="3168"/>
-            <w:shd w:fill="F8FAFC"/>
-            <w:tcMar>
-              <w:top w:w="80" w:type="dxa"/>
-              <w:bottom w:w="80" w:type="dxa"/>
-              <w:left w:w="70" w:type="dxa"/>
-              <w:right w:w="70" w:type="dxa"/>
-            </w:tcMar>
-          </w:tcPr>
-          <w:p>
-            <w:pPr>
-              <w:spacing w:line="276" w:lineRule="auto"/>
-              <w:jc w:val="left"/>
-            </w:pPr>
-            <w:r>
-              <w:rPr>
-                <w:rFonts w:ascii="Times New Roman" w:hAnsi="Times New Roman"/>
-                <w:sz w:val="19"/>
-              </w:rPr>
-              <w:t>Kiểm tra công tác Đoàn cuối năm (12 cơ sở)</w:t>
-            </w:r>
-          </w:p>
-        </w:tc>
-        <w:tc>
-          <w:tcPr>
-            <w:tcW w:type="dxa" w:w="1296"/>
-            <w:shd w:fill="F8FAFC"/>
-            <w:tcMar>
-              <w:top w:w="80" w:type="dxa"/>
-              <w:bottom w:w="80" w:type="dxa"/>
-              <w:left w:w="70" w:type="dxa"/>
-              <w:right w:w="70" w:type="dxa"/>
-            </w:tcMar>
-          </w:tcPr>
-          <w:p>
-            <w:pPr>
-              <w:spacing w:line="276" w:lineRule="auto"/>
-              <w:jc w:val="center"/>
-            </w:pPr>
-            <w:r>
-              <w:rPr>
-                <w:rFonts w:ascii="Times New Roman" w:hAnsi="Times New Roman"/>
-                <w:sz w:val="19"/>
-              </w:rPr>
-              <w:t>06/2027</w:t>
-            </w:r>
-          </w:p>
-        </w:tc>
-        <w:tc>
-          <w:tcPr>
-            <w:tcW w:type="dxa" w:w="1440"/>
-            <w:shd w:fill="F8FAFC"/>
-            <w:tcMar>
-              <w:top w:w="80" w:type="dxa"/>
-              <w:bottom w:w="80" w:type="dxa"/>
-              <w:left w:w="70" w:type="dxa"/>
-              <w:right w:w="70" w:type="dxa"/>
-            </w:tcMar>
-          </w:tcPr>
-          <w:p>
-            <w:r>
-              <w:t>Mảng Giám sát Kiểm tra &amp; Điểm rèn luyện</w:t>
-            </w:r>
-          </w:p>
-        </w:tc>
-        <w:tc>
-          <w:tcPr>
-            <w:tcW w:type="dxa" w:w="1296"/>
-            <w:shd w:fill="F8FAFC"/>
-            <w:tcMar>
-              <w:top w:w="80" w:type="dxa"/>
-              <w:bottom w:w="80" w:type="dxa"/>
-              <w:left w:w="70" w:type="dxa"/>
-              <w:right w:w="70" w:type="dxa"/>
-            </w:tcMar>
+            <w:tcW w:type="dxa" w:w="1559"/>
+          </w:tcPr>
+          <w:p>
+            <w:r>
+              <w:t>Kết nạp Đoàn viên mới đợt 2 (chào mừng 19/5)</w:t>
+            </w:r>
+          </w:p>
+        </w:tc>
+        <w:tc>
+          <w:tcPr>
+            <w:tcW w:type="dxa" w:w="1559"/>
+          </w:tcPr>
+          <w:p>
+            <w:r>
+              <w:t>Tháng 05/2027</w:t>
+            </w:r>
+          </w:p>
+        </w:tc>
+        <w:tc>
+          <w:tcPr>
+            <w:tcW w:type="dxa" w:w="1559"/>
           </w:tcPr>
           <w:p>
             <w:r>
@@ -5035,26 +4231,21 @@
         </w:tc>
         <w:tc>
           <w:tcPr>
-            <w:tcW w:type="dxa" w:w="2016"/>
-            <w:shd w:fill="F8FAFC"/>
-            <w:tcMar>
-              <w:top w:w="80" w:type="dxa"/>
-              <w:bottom w:w="80" w:type="dxa"/>
-              <w:left w:w="70" w:type="dxa"/>
-              <w:right w:w="70" w:type="dxa"/>
-            </w:tcMar>
-          </w:tcPr>
-          <w:p>
-            <w:pPr>
-              <w:spacing w:line="276" w:lineRule="auto"/>
-              <w:jc w:val="left"/>
-            </w:pPr>
-            <w:r>
-              <w:rPr>
-                <w:rFonts w:ascii="Times New Roman" w:hAnsi="Times New Roman"/>
-                <w:sz w:val="19"/>
-              </w:rPr>
-              <w:t>12 Biên bản kiểm tra; bảng chấm điểm giấy tờ 12 đơn vị.</w:t>
+            <w:tcW w:type="dxa" w:w="1559"/>
+          </w:tcPr>
+          <w:p>
+            <w:r>
+              <w:t>Mảng Truyền thông - Sự kiện &amp; Phát triển Nội bộ</w:t>
+            </w:r>
+          </w:p>
+        </w:tc>
+        <w:tc>
+          <w:tcPr>
+            <w:tcW w:type="dxa" w:w="1559"/>
+          </w:tcPr>
+          <w:p>
+            <w:r>
+              <w:t>Hồ sơ kết nạp đợt 2; Nghị quyết và sổ theo dõi đoàn viên mới kết nạp.</w:t>
             </w:r>
           </w:p>
         </w:tc>
@@ -5062,90 +4253,37 @@
       <w:tr>
         <w:tc>
           <w:tcPr>
-            <w:tcW w:type="dxa" w:w="576"/>
-            <w:shd w:fill="FFFFFF"/>
-            <w:tcMar>
-              <w:top w:w="80" w:type="dxa"/>
-              <w:bottom w:w="80" w:type="dxa"/>
-              <w:left w:w="70" w:type="dxa"/>
-              <w:right w:w="70" w:type="dxa"/>
-            </w:tcMar>
-          </w:tcPr>
-          <w:p>
-            <w:pPr>
-              <w:spacing w:line="276" w:lineRule="auto"/>
-              <w:jc w:val="center"/>
-            </w:pPr>
-            <w:r>
-              <w:rPr>
-                <w:rFonts w:ascii="Times New Roman" w:hAnsi="Times New Roman"/>
-                <w:b/>
-                <w:sz w:val="19"/>
-              </w:rPr>
+            <w:tcW w:type="dxa" w:w="1559"/>
+          </w:tcPr>
+          <w:p>
+            <w:r>
               <w:t>12</w:t>
             </w:r>
           </w:p>
         </w:tc>
         <w:tc>
           <w:tcPr>
-            <w:tcW w:type="dxa" w:w="3168"/>
-            <w:shd w:fill="FFFFFF"/>
-            <w:tcMar>
-              <w:top w:w="80" w:type="dxa"/>
-              <w:bottom w:w="80" w:type="dxa"/>
-              <w:left w:w="70" w:type="dxa"/>
-              <w:right w:w="70" w:type="dxa"/>
-            </w:tcMar>
-          </w:tcPr>
-          <w:p>
-            <w:pPr>
-              <w:spacing w:line="276" w:lineRule="auto"/>
-              <w:jc w:val="left"/>
-            </w:pPr>
-            <w:r>
-              <w:rPr>
-                <w:rFonts w:ascii="Times New Roman" w:hAnsi="Times New Roman"/>
-                <w:sz w:val="19"/>
-              </w:rPr>
-              <w:t>Báo cáo tổng kết, thi đua khen thưởng 2026 - 2027</w:t>
-            </w:r>
-          </w:p>
-        </w:tc>
-        <w:tc>
-          <w:tcPr>
-            <w:tcW w:type="dxa" w:w="1296"/>
-            <w:shd w:fill="FFFFFF"/>
-            <w:tcMar>
-              <w:top w:w="80" w:type="dxa"/>
-              <w:bottom w:w="80" w:type="dxa"/>
-              <w:left w:w="70" w:type="dxa"/>
-              <w:right w:w="70" w:type="dxa"/>
-            </w:tcMar>
-          </w:tcPr>
-          <w:p>
-            <w:pPr>
-              <w:spacing w:line="276" w:lineRule="auto"/>
-              <w:jc w:val="center"/>
-            </w:pPr>
-            <w:r>
-              <w:rPr>
-                <w:rFonts w:ascii="Times New Roman" w:hAnsi="Times New Roman"/>
-                <w:sz w:val="19"/>
-              </w:rPr>
-              <w:t>06/2027</w:t>
-            </w:r>
-          </w:p>
-        </w:tc>
-        <w:tc>
-          <w:tcPr>
-            <w:tcW w:type="dxa" w:w="1440"/>
-            <w:shd w:fill="FFFFFF"/>
-            <w:tcMar>
-              <w:top w:w="80" w:type="dxa"/>
-              <w:bottom w:w="80" w:type="dxa"/>
-              <w:left w:w="70" w:type="dxa"/>
-              <w:right w:w="70" w:type="dxa"/>
-            </w:tcMar>
+            <w:tcW w:type="dxa" w:w="1559"/>
+          </w:tcPr>
+          <w:p>
+            <w:r>
+              <w:t>Đóng dấu nhận xét năm học sổ Đoàn cuối năm</w:t>
+            </w:r>
+          </w:p>
+        </w:tc>
+        <w:tc>
+          <w:tcPr>
+            <w:tcW w:type="dxa" w:w="1559"/>
+          </w:tcPr>
+          <w:p>
+            <w:r>
+              <w:t>Tháng 05 - 06/2027</w:t>
+            </w:r>
+          </w:p>
+        </w:tc>
+        <w:tc>
+          <w:tcPr>
+            <w:tcW w:type="dxa" w:w="1559"/>
           </w:tcPr>
           <w:p>
             <w:r>
@@ -5155,51 +4293,21 @@
         </w:tc>
         <w:tc>
           <w:tcPr>
-            <w:tcW w:type="dxa" w:w="1296"/>
-            <w:shd w:fill="FFFFFF"/>
-            <w:tcMar>
-              <w:top w:w="80" w:type="dxa"/>
-              <w:bottom w:w="80" w:type="dxa"/>
-              <w:left w:w="70" w:type="dxa"/>
-              <w:right w:w="70" w:type="dxa"/>
-            </w:tcMar>
-          </w:tcPr>
-          <w:p>
-            <w:pPr>
-              <w:spacing w:line="276" w:lineRule="auto"/>
-              <w:jc w:val="center"/>
-            </w:pPr>
-            <w:r>
-              <w:rPr>
-                <w:rFonts w:ascii="Times New Roman" w:hAnsi="Times New Roman"/>
-                <w:sz w:val="19"/>
-              </w:rPr>
-              <w:t>M3, M4</w:t>
-            </w:r>
-          </w:p>
-        </w:tc>
-        <w:tc>
-          <w:tcPr>
-            <w:tcW w:type="dxa" w:w="2016"/>
-            <w:shd w:fill="FFFFFF"/>
-            <w:tcMar>
-              <w:top w:w="80" w:type="dxa"/>
-              <w:bottom w:w="80" w:type="dxa"/>
-              <w:left w:w="70" w:type="dxa"/>
-              <w:right w:w="70" w:type="dxa"/>
-            </w:tcMar>
-          </w:tcPr>
-          <w:p>
-            <w:pPr>
-              <w:spacing w:line="276" w:lineRule="auto"/>
-              <w:jc w:val="left"/>
-            </w:pPr>
-            <w:r>
-              <w:rPr>
-                <w:rFonts w:ascii="Times New Roman" w:hAnsi="Times New Roman"/>
-                <w:sz w:val="19"/>
-              </w:rPr>
-              <w:t>Báo cáo tổng kết Ban; quyết định khen thưởng; kỷ yếu năm.</w:t>
+            <w:tcW w:type="dxa" w:w="1559"/>
+          </w:tcPr>
+          <w:p>
+            <w:r>
+              <w:t>Mảng Giám sát Kiểm tra &amp; Điểm rèn luyện</w:t>
+            </w:r>
+          </w:p>
+        </w:tc>
+        <w:tc>
+          <w:tcPr>
+            <w:tcW w:type="dxa" w:w="1559"/>
+          </w:tcPr>
+          <w:p>
+            <w:r>
+              <w:t>100% Sổ Đoàn cơ sở được nhận xét phân loại và đóng dấu hoàn thành.</w:t>
             </w:r>
           </w:p>
         </w:tc>
@@ -5207,107 +4315,47 @@
       <w:tr>
         <w:tc>
           <w:tcPr>
-            <w:tcW w:type="dxa" w:w="576"/>
-            <w:shd w:fill="F8FAFC"/>
-            <w:tcMar>
-              <w:top w:w="80" w:type="dxa"/>
-              <w:bottom w:w="80" w:type="dxa"/>
-              <w:left w:w="70" w:type="dxa"/>
-              <w:right w:w="70" w:type="dxa"/>
-            </w:tcMar>
-          </w:tcPr>
-          <w:p>
-            <w:pPr>
-              <w:spacing w:line="276" w:lineRule="auto"/>
-              <w:jc w:val="center"/>
-            </w:pPr>
-            <w:r>
-              <w:rPr>
-                <w:rFonts w:ascii="Times New Roman" w:hAnsi="Times New Roman"/>
-                <w:b/>
-                <w:sz w:val="19"/>
-              </w:rPr>
+            <w:tcW w:type="dxa" w:w="1559"/>
+          </w:tcPr>
+          <w:p>
+            <w:r>
               <w:t>13</w:t>
             </w:r>
           </w:p>
         </w:tc>
         <w:tc>
           <w:tcPr>
-            <w:tcW w:type="dxa" w:w="3168"/>
-            <w:shd w:fill="F8FAFC"/>
-            <w:tcMar>
-              <w:top w:w="80" w:type="dxa"/>
-              <w:bottom w:w="80" w:type="dxa"/>
-              <w:left w:w="70" w:type="dxa"/>
-              <w:right w:w="70" w:type="dxa"/>
-            </w:tcMar>
-          </w:tcPr>
-          <w:p>
-            <w:pPr>
-              <w:spacing w:line="276" w:lineRule="auto"/>
-              <w:jc w:val="left"/>
-            </w:pPr>
-            <w:r>
-              <w:rPr>
-                <w:rFonts w:ascii="Times New Roman" w:hAnsi="Times New Roman"/>
-                <w:sz w:val="19"/>
-              </w:rPr>
-              <w:t>Triển khai phần mềm Quản lý đoàn viên &amp; App TNVN</w:t>
-            </w:r>
-          </w:p>
-        </w:tc>
-        <w:tc>
-          <w:tcPr>
-            <w:tcW w:type="dxa" w:w="1296"/>
-            <w:shd w:fill="F8FAFC"/>
-            <w:tcMar>
-              <w:top w:w="80" w:type="dxa"/>
-              <w:bottom w:w="80" w:type="dxa"/>
-              <w:left w:w="70" w:type="dxa"/>
-              <w:right w:w="70" w:type="dxa"/>
-            </w:tcMar>
-          </w:tcPr>
-          <w:p>
-            <w:pPr>
-              <w:spacing w:line="276" w:lineRule="auto"/>
-              <w:jc w:val="center"/>
-            </w:pPr>
-            <w:r>
-              <w:rPr>
-                <w:rFonts w:ascii="Times New Roman" w:hAnsi="Times New Roman"/>
-                <w:sz w:val="19"/>
-              </w:rPr>
-              <w:t>Cả năm</w:t>
-            </w:r>
-          </w:p>
-        </w:tc>
-        <w:tc>
-          <w:tcPr>
-            <w:tcW w:type="dxa" w:w="1440"/>
-            <w:shd w:fill="F8FAFC"/>
-            <w:tcMar>
-              <w:top w:w="80" w:type="dxa"/>
-              <w:bottom w:w="80" w:type="dxa"/>
-              <w:left w:w="70" w:type="dxa"/>
-              <w:right w:w="70" w:type="dxa"/>
-            </w:tcMar>
-          </w:tcPr>
-          <w:p>
-            <w:r>
-              <w:t>Mảng Phát triển Đảng &amp; Chuyển đổi số</w:t>
-            </w:r>
-          </w:p>
-        </w:tc>
-        <w:tc>
-          <w:tcPr>
-            <w:tcW w:type="dxa" w:w="1296"/>
-            <w:shd w:fill="F8FAFC"/>
-            <w:tcMar>
-              <w:top w:w="80" w:type="dxa"/>
-              <w:bottom w:w="80" w:type="dxa"/>
-              <w:left w:w="70" w:type="dxa"/>
-              <w:right w:w="70" w:type="dxa"/>
-            </w:tcMar>
+            <w:tcW w:type="dxa" w:w="1559"/>
+          </w:tcPr>
+          <w:p>
+            <w:r>
+              <w:t>Kiểm tra công tác Đoàn cuối năm (12 cơ sở)</w:t>
+            </w:r>
+          </w:p>
+        </w:tc>
+        <w:tc>
+          <w:tcPr>
+            <w:tcW w:type="dxa" w:w="1559"/>
+          </w:tcPr>
+          <w:p>
+            <w:r>
+              <w:t>Tháng 06/2027</w:t>
+            </w:r>
+          </w:p>
+        </w:tc>
+        <w:tc>
+          <w:tcPr>
+            <w:tcW w:type="dxa" w:w="1559"/>
+          </w:tcPr>
+          <w:p>
+            <w:r>
+              <w:t>Mảng Giám sát Kiểm tra &amp; Điểm rèn luyện</w:t>
+            </w:r>
+          </w:p>
+        </w:tc>
+        <w:tc>
+          <w:tcPr>
+            <w:tcW w:type="dxa" w:w="1559"/>
           </w:tcPr>
           <w:p>
             <w:r>
@@ -5317,26 +4365,11 @@
         </w:tc>
         <w:tc>
           <w:tcPr>
-            <w:tcW w:type="dxa" w:w="2016"/>
-            <w:shd w:fill="F8FAFC"/>
-            <w:tcMar>
-              <w:top w:w="80" w:type="dxa"/>
-              <w:bottom w:w="80" w:type="dxa"/>
-              <w:left w:w="70" w:type="dxa"/>
-              <w:right w:w="70" w:type="dxa"/>
-            </w:tcMar>
-          </w:tcPr>
-          <w:p>
-            <w:pPr>
-              <w:spacing w:line="276" w:lineRule="auto"/>
-              <w:jc w:val="left"/>
-            </w:pPr>
-            <w:r>
-              <w:rPr>
-                <w:rFonts w:ascii="Times New Roman" w:hAnsi="Times New Roman"/>
-                <w:sz w:val="19"/>
-              </w:rPr>
-              <w:t>Tài liệu SHCĐ hàng tháng; 100% ĐV đánh giá xếp loại số.</w:t>
+            <w:tcW w:type="dxa" w:w="1559"/>
+          </w:tcPr>
+          <w:p>
+            <w:r>
+              <w:t>12 Biên bản kiểm tra; Bảng chấm điểm giấy tờ sổ sách 12 đơn vị (200đ).</w:t>
             </w:r>
           </w:p>
         </w:tc>
@@ -5344,136 +4377,61 @@
       <w:tr>
         <w:tc>
           <w:tcPr>
-            <w:tcW w:type="dxa" w:w="576"/>
-            <w:shd w:fill="FFFFFF"/>
-            <w:tcMar>
-              <w:top w:w="80" w:type="dxa"/>
-              <w:bottom w:w="80" w:type="dxa"/>
-              <w:left w:w="70" w:type="dxa"/>
-              <w:right w:w="70" w:type="dxa"/>
-            </w:tcMar>
-          </w:tcPr>
-          <w:p>
-            <w:pPr>
-              <w:spacing w:line="276" w:lineRule="auto"/>
-              <w:jc w:val="center"/>
-            </w:pPr>
-            <w:r>
-              <w:rPr>
-                <w:rFonts w:ascii="Times New Roman" w:hAnsi="Times New Roman"/>
-                <w:b/>
-                <w:sz w:val="19"/>
-              </w:rPr>
+            <w:tcW w:type="dxa" w:w="1559"/>
+          </w:tcPr>
+          <w:p>
+            <w:r>
               <w:t>14</w:t>
             </w:r>
           </w:p>
         </w:tc>
         <w:tc>
           <w:tcPr>
-            <w:tcW w:type="dxa" w:w="3168"/>
-            <w:shd w:fill="FFFFFF"/>
-            <w:tcMar>
-              <w:top w:w="80" w:type="dxa"/>
-              <w:bottom w:w="80" w:type="dxa"/>
-              <w:left w:w="70" w:type="dxa"/>
-              <w:right w:w="70" w:type="dxa"/>
-            </w:tcMar>
-          </w:tcPr>
-          <w:p>
-            <w:pPr>
-              <w:spacing w:line="276" w:lineRule="auto"/>
-              <w:jc w:val="left"/>
-            </w:pPr>
-            <w:r>
-              <w:rPr>
-                <w:rFonts w:ascii="Times New Roman" w:hAnsi="Times New Roman"/>
-                <w:sz w:val="19"/>
-              </w:rPr>
-              <w:t>Tạo hoạt động &amp; duyệt minh chứng ĐRL cho SV</w:t>
-            </w:r>
-          </w:p>
-        </w:tc>
-        <w:tc>
-          <w:tcPr>
-            <w:tcW w:type="dxa" w:w="1296"/>
-            <w:shd w:fill="FFFFFF"/>
-            <w:tcMar>
-              <w:top w:w="80" w:type="dxa"/>
-              <w:bottom w:w="80" w:type="dxa"/>
-              <w:left w:w="70" w:type="dxa"/>
-              <w:right w:w="70" w:type="dxa"/>
-            </w:tcMar>
-          </w:tcPr>
-          <w:p>
-            <w:pPr>
-              <w:spacing w:line="276" w:lineRule="auto"/>
-              <w:jc w:val="center"/>
-            </w:pPr>
-            <w:r>
-              <w:rPr>
-                <w:rFonts w:ascii="Times New Roman" w:hAnsi="Times New Roman"/>
-                <w:sz w:val="19"/>
-              </w:rPr>
-              <w:t>Cả năm</w:t>
-            </w:r>
-          </w:p>
-        </w:tc>
-        <w:tc>
-          <w:tcPr>
-            <w:tcW w:type="dxa" w:w="1440"/>
-            <w:shd w:fill="FFFFFF"/>
-            <w:tcMar>
-              <w:top w:w="80" w:type="dxa"/>
-              <w:bottom w:w="80" w:type="dxa"/>
-              <w:left w:w="70" w:type="dxa"/>
-              <w:right w:w="70" w:type="dxa"/>
-            </w:tcMar>
-          </w:tcPr>
-          <w:p>
-            <w:r>
-              <w:t>Mảng Giám sát Kiểm tra &amp; Điểm rèn luyện</w:t>
-            </w:r>
-          </w:p>
-        </w:tc>
-        <w:tc>
-          <w:tcPr>
-            <w:tcW w:type="dxa" w:w="1296"/>
-            <w:shd w:fill="FFFFFF"/>
-            <w:tcMar>
-              <w:top w:w="80" w:type="dxa"/>
-              <w:bottom w:w="80" w:type="dxa"/>
-              <w:left w:w="70" w:type="dxa"/>
-              <w:right w:w="70" w:type="dxa"/>
-            </w:tcMar>
-          </w:tcPr>
-          <w:p>
-            <w:r>
-              <w:t>Mảng Truyền thông - Sự kiện &amp; Phát triển Nội bộ</w:t>
-            </w:r>
-          </w:p>
-        </w:tc>
-        <w:tc>
-          <w:tcPr>
-            <w:tcW w:type="dxa" w:w="2016"/>
-            <w:shd w:fill="FFFFFF"/>
-            <w:tcMar>
-              <w:top w:w="80" w:type="dxa"/>
-              <w:bottom w:w="80" w:type="dxa"/>
-              <w:left w:w="70" w:type="dxa"/>
-              <w:right w:w="70" w:type="dxa"/>
-            </w:tcMar>
-          </w:tcPr>
-          <w:p>
-            <w:pPr>
-              <w:spacing w:line="276" w:lineRule="auto"/>
-              <w:jc w:val="left"/>
-            </w:pPr>
-            <w:r>
-              <w:rPr>
-                <w:rFonts w:ascii="Times New Roman" w:hAnsi="Times New Roman"/>
-                <w:sz w:val="19"/>
-              </w:rPr>
-              <w:t>Danh mục mã ĐRL; biên bản hậu kiểm; kết quả giải quyết khiếu nại.</w:t>
+            <w:tcW w:type="dxa" w:w="1559"/>
+          </w:tcPr>
+          <w:p>
+            <w:r>
+              <w:t>Triển khai phần mềm Quản lý đoàn viên &amp; App Thanh niên Việt Nam</w:t>
+            </w:r>
+          </w:p>
+        </w:tc>
+        <w:tc>
+          <w:tcPr>
+            <w:tcW w:type="dxa" w:w="1559"/>
+          </w:tcPr>
+          <w:p>
+            <w:r>
+              <w:t>Xuyên suốt Cả năm</w:t>
+            </w:r>
+          </w:p>
+        </w:tc>
+        <w:tc>
+          <w:tcPr>
+            <w:tcW w:type="dxa" w:w="1559"/>
+          </w:tcPr>
+          <w:p>
+            <w:r>
+              <w:t>Mảng Phát triển Đảng &amp; Chuyển đổi số</w:t>
+            </w:r>
+          </w:p>
+        </w:tc>
+        <w:tc>
+          <w:tcPr>
+            <w:tcW w:type="dxa" w:w="1559"/>
+          </w:tcPr>
+          <w:p>
+            <w:r>
+              <w:t>Mảng Tổ chức &amp; Phát triển Đoàn vụ</w:t>
+            </w:r>
+          </w:p>
+        </w:tc>
+        <w:tc>
+          <w:tcPr>
+            <w:tcW w:type="dxa" w:w="1559"/>
+          </w:tcPr>
+          <w:p>
+            <w:r>
+              <w:t>Tài liệu SHCĐ hàng tháng; 100% Đoàn viên đánh giá xếp loại số chuẩn hóa.</w:t>
             </w:r>
           </w:p>
         </w:tc>
@@ -5481,158 +4439,61 @@
       <w:tr>
         <w:tc>
           <w:tcPr>
-            <w:tcW w:type="dxa" w:w="576"/>
-            <w:shd w:fill="F8FAFC"/>
-            <w:tcMar>
-              <w:top w:w="80" w:type="dxa"/>
-              <w:bottom w:w="80" w:type="dxa"/>
-              <w:left w:w="70" w:type="dxa"/>
-              <w:right w:w="70" w:type="dxa"/>
-            </w:tcMar>
-          </w:tcPr>
-          <w:p>
-            <w:pPr>
-              <w:spacing w:line="276" w:lineRule="auto"/>
-              <w:jc w:val="center"/>
-            </w:pPr>
-            <w:r>
-              <w:rPr>
-                <w:rFonts w:ascii="Times New Roman" w:hAnsi="Times New Roman"/>
-                <w:b/>
-                <w:sz w:val="19"/>
-              </w:rPr>
+            <w:tcW w:type="dxa" w:w="1559"/>
+          </w:tcPr>
+          <w:p>
+            <w:r>
               <w:t>15</w:t>
             </w:r>
           </w:p>
         </w:tc>
         <w:tc>
           <w:tcPr>
-            <w:tcW w:type="dxa" w:w="3168"/>
-            <w:shd w:fill="F8FAFC"/>
-            <w:tcMar>
-              <w:top w:w="80" w:type="dxa"/>
-              <w:bottom w:w="80" w:type="dxa"/>
-              <w:left w:w="70" w:type="dxa"/>
-              <w:right w:w="70" w:type="dxa"/>
-            </w:tcMar>
-          </w:tcPr>
-          <w:p>
-            <w:pPr>
-              <w:spacing w:line="276" w:lineRule="auto"/>
-              <w:jc w:val="left"/>
-            </w:pPr>
-            <w:r>
-              <w:rPr>
-                <w:rFonts w:ascii="Times New Roman" w:hAnsi="Times New Roman"/>
-                <w:sz w:val="19"/>
-              </w:rPr>
-              <w:t>Công tác kiểm tra, Đảng vụ, kiện toàn xuyên suốt</w:t>
-            </w:r>
-          </w:p>
-        </w:tc>
-        <w:tc>
-          <w:tcPr>
-            <w:tcW w:type="dxa" w:w="1296"/>
-            <w:shd w:fill="F8FAFC"/>
-            <w:tcMar>
-              <w:top w:w="80" w:type="dxa"/>
-              <w:bottom w:w="80" w:type="dxa"/>
-              <w:left w:w="70" w:type="dxa"/>
-              <w:right w:w="70" w:type="dxa"/>
-            </w:tcMar>
-          </w:tcPr>
-          <w:p>
-            <w:pPr>
-              <w:spacing w:line="276" w:lineRule="auto"/>
-              <w:jc w:val="center"/>
-            </w:pPr>
-            <w:r>
-              <w:rPr>
-                <w:rFonts w:ascii="Times New Roman" w:hAnsi="Times New Roman"/>
-                <w:sz w:val="19"/>
-              </w:rPr>
-              <w:t>Cả năm</w:t>
-            </w:r>
-          </w:p>
-        </w:tc>
-        <w:tc>
-          <w:tcPr>
-            <w:tcW w:type="dxa" w:w="1440"/>
-            <w:shd w:fill="F8FAFC"/>
-            <w:tcMar>
-              <w:top w:w="80" w:type="dxa"/>
-              <w:bottom w:w="80" w:type="dxa"/>
-              <w:left w:w="70" w:type="dxa"/>
-              <w:right w:w="70" w:type="dxa"/>
-            </w:tcMar>
-          </w:tcPr>
-          <w:p>
-            <w:pPr>
-              <w:spacing w:line="276" w:lineRule="auto"/>
-              <w:jc w:val="center"/>
-            </w:pPr>
-            <w:r>
-              <w:rPr>
-                <w:rFonts w:ascii="Times New Roman" w:hAnsi="Times New Roman"/>
-                <w:b/>
-                <w:color w:val="005BAC"/>
-                <w:sz w:val="19"/>
-              </w:rPr>
-              <w:t>M2 (Đảng)</w:t>
-              <w:br/>
-              <w:t>M3 (Kiểm tra)</w:t>
-              <w:br/>
-              <w:t>M1 (Kiện toàn)</w:t>
-            </w:r>
-          </w:p>
-        </w:tc>
-        <w:tc>
-          <w:tcPr>
-            <w:tcW w:type="dxa" w:w="1296"/>
-            <w:shd w:fill="F8FAFC"/>
-            <w:tcMar>
-              <w:top w:w="80" w:type="dxa"/>
-              <w:bottom w:w="80" w:type="dxa"/>
-              <w:left w:w="70" w:type="dxa"/>
-              <w:right w:w="70" w:type="dxa"/>
-            </w:tcMar>
-          </w:tcPr>
-          <w:p>
-            <w:pPr>
-              <w:spacing w:line="276" w:lineRule="auto"/>
-              <w:jc w:val="center"/>
-            </w:pPr>
-            <w:r>
-              <w:rPr>
-                <w:rFonts w:ascii="Times New Roman" w:hAnsi="Times New Roman"/>
-                <w:sz w:val="19"/>
-              </w:rPr>
-              <w:t>Lãnh đạo Ban</w:t>
-            </w:r>
-          </w:p>
-        </w:tc>
-        <w:tc>
-          <w:tcPr>
-            <w:tcW w:type="dxa" w:w="2016"/>
-            <w:shd w:fill="F8FAFC"/>
-            <w:tcMar>
-              <w:top w:w="80" w:type="dxa"/>
-              <w:bottom w:w="80" w:type="dxa"/>
-              <w:left w:w="70" w:type="dxa"/>
-              <w:right w:w="70" w:type="dxa"/>
-            </w:tcMar>
-          </w:tcPr>
-          <w:p>
-            <w:pPr>
-              <w:spacing w:line="276" w:lineRule="auto"/>
-              <w:jc w:val="left"/>
-            </w:pPr>
-            <w:r>
-              <w:rPr>
-                <w:rFonts w:ascii="Times New Roman" w:hAnsi="Times New Roman"/>
-                <w:sz w:val="19"/>
-              </w:rPr>
-              <w:t>Báo cáo tiến độ hồ sơ Đảng; thông báo kết luận kiểm tra; QĐ chuẩn y.</w:t>
+            <w:tcW w:type="dxa" w:w="1559"/>
+          </w:tcPr>
+          <w:p>
+            <w:r>
+              <w:t>Tạo hoạt động &amp; duyệt minh chứng ĐRL cho sinh viên</w:t>
+            </w:r>
+          </w:p>
+        </w:tc>
+        <w:tc>
+          <w:tcPr>
+            <w:tcW w:type="dxa" w:w="1559"/>
+          </w:tcPr>
+          <w:p>
+            <w:r>
+              <w:t>Xuyên suốt Cả năm</w:t>
+            </w:r>
+          </w:p>
+        </w:tc>
+        <w:tc>
+          <w:tcPr>
+            <w:tcW w:type="dxa" w:w="1559"/>
+          </w:tcPr>
+          <w:p>
+            <w:r>
+              <w:t>Mảng Giám sát Kiểm tra &amp; Điểm rèn luyện</w:t>
+            </w:r>
+          </w:p>
+        </w:tc>
+        <w:tc>
+          <w:tcPr>
+            <w:tcW w:type="dxa" w:w="1559"/>
+          </w:tcPr>
+          <w:p>
+            <w:r>
+              <w:t>Mảng Truyền thông - Sự kiện &amp; Phát triển Nội bộ</w:t>
+            </w:r>
+          </w:p>
+        </w:tc>
+        <w:tc>
+          <w:tcPr>
+            <w:tcW w:type="dxa" w:w="1559"/>
+          </w:tcPr>
+          <w:p>
+            <w:r>
+              <w:t>Danh mục mã ĐRL cấp chuẩn; Biên bản hậu kiểm; Xử lý 100% khiếu nại.</w:t>
             </w:r>
           </w:p>
         </w:tc>
@@ -5644,7 +4505,7 @@
           </w:tcPr>
           <w:p>
             <w:r>
-              <w:t>2</w:t>
+              <w:t>16</w:t>
             </w:r>
           </w:p>
         </w:tc>
@@ -5654,7 +4515,7 @@
           </w:tcPr>
           <w:p>
             <w:r>
-              <w:t>Hội nghị Triển khai Công tác và Giao ban Đầu mối 12 Đơn vị Cơ sở năm học 2026 - 2027</w:t>
+              <w:t>Kiểm tra và Thẩm tra Hồ sơ Phát triển Đảng</w:t>
             </w:r>
           </w:p>
         </w:tc>
@@ -5664,7 +4525,7 @@
           </w:tcPr>
           <w:p>
             <w:r>
-              <w:t>Tháng 9 - 10/2026</w:t>
+              <w:t>Xuyên suốt Cả năm</w:t>
             </w:r>
           </w:p>
         </w:tc>
@@ -5674,7 +4535,7 @@
           </w:tcPr>
           <w:p>
             <w:r>
-              <w:t>Mảng Tổ chức &amp; Phát triển Đoàn vụ chủ trì; Mảng Giám sát Kiểm tra &amp; Điểm rèn luyện, 4 phối hợp</w:t>
+              <w:t>Mảng Phát triển Đảng &amp; Chuyển đổi số</w:t>
             </w:r>
           </w:p>
         </w:tc>
@@ -5684,7 +4545,7 @@
           </w:tcPr>
           <w:p>
             <w:r>
-              <w:t>Kế hoạch năm học, Biên bản giao ban &amp; Thiết lập kênh trao đổi 12 đơn vị</w:t>
+              <w:t>Mảng Giám sát Kiểm tra &amp; Điểm rèn luyện</w:t>
             </w:r>
           </w:p>
         </w:tc>
@@ -5692,7 +4553,11 @@
           <w:tcPr>
             <w:tcW w:type="dxa" w:w="1559"/>
           </w:tcPr>
-          <w:p/>
+          <w:p>
+            <w:r>
+              <w:t>Phiếu thẩm tra hồ sơ Đảng; Bảng theo dõi tiến độ kết nạp Đảng 12 đơn vị.</w:t>
+            </w:r>
+          </w:p>
         </w:tc>
       </w:tr>
       <w:tr>
@@ -5702,7 +4567,7 @@
           </w:tcPr>
           <w:p>
             <w:r>
-              <w:t>16</w:t>
+              <w:t>17</w:t>
             </w:r>
           </w:p>
         </w:tc>
@@ -5712,7 +4577,7 @@
           </w:tcPr>
           <w:p>
             <w:r>
-              <w:t>Kiểm tra Giấy tờ, Hồ sơ sau Đại hội Chi đoàn và Đại hội cơ sở</w:t>
+              <w:t>Kiểm tra Giấy tờ và Thẩm định Hồ sơ sau Kiện toàn Cán bộ Đoàn</w:t>
             </w:r>
           </w:p>
         </w:tc>
@@ -5722,7 +4587,7 @@
           </w:tcPr>
           <w:p>
             <w:r>
-              <w:t>Tháng 10 - 12/2026</w:t>
+              <w:t>Xuyên suốt Cả năm</w:t>
             </w:r>
           </w:p>
         </w:tc>
@@ -5732,7 +4597,7 @@
           </w:tcPr>
           <w:p>
             <w:r>
-              <w:t>Mảng Giám sát Kiểm tra &amp; ĐRL chủ trì; Mảng Tổ chức &amp; Đoàn vụ phối hợp</w:t>
+              <w:t>Mảng Giám sát Kiểm tra &amp; Điểm rèn luyện</w:t>
             </w:r>
           </w:p>
         </w:tc>
@@ -5742,7 +4607,7 @@
           </w:tcPr>
           <w:p>
             <w:r>
-              <w:t>Biên bản hậu kiểm hồ sơ đại hội; Danh mục chi đoàn đủ điều kiện chuẩn y</w:t>
+              <w:t>Mảng Tổ chức &amp; Phát triển Đoàn vụ</w:t>
             </w:r>
           </w:p>
         </w:tc>
@@ -5750,7 +4615,11 @@
           <w:tcPr>
             <w:tcW w:type="dxa" w:w="1559"/>
           </w:tcPr>
-          <w:p/>
+          <w:p>
+            <w:r>
+              <w:t>Phiếu thẩm tra hồ sơ kiện toàn; Quyết định chuẩn y/công nhận kiện toàn.</w:t>
+            </w:r>
+          </w:p>
         </w:tc>
       </w:tr>
       <w:tr>
@@ -5760,7 +4629,7 @@
           </w:tcPr>
           <w:p>
             <w:r>
-              <w:t>17</w:t>
+              <w:t>18</w:t>
             </w:r>
           </w:p>
         </w:tc>
@@ -5770,7 +4639,7 @@
           </w:tcPr>
           <w:p>
             <w:r>
-              <w:t>Kiểm tra Giấy tờ và Thẩm định Hồ sơ sau Kiện toàn Cán bộ Đoàn</w:t>
+              <w:t>Báo cáo Tổng kết &amp; Thi đua Khen thưởng Năm học 2026 - 2027</w:t>
             </w:r>
           </w:p>
         </w:tc>
@@ -5780,7 +4649,7 @@
           </w:tcPr>
           <w:p>
             <w:r>
-              <w:t>Xuyên suốt Cả năm</w:t>
+              <w:t>Tháng 06/2027</w:t>
             </w:r>
           </w:p>
         </w:tc>
@@ -5790,7 +4659,7 @@
           </w:tcPr>
           <w:p>
             <w:r>
-              <w:t>Mảng Giám sát Kiểm tra &amp; ĐRL chủ trì; Mảng Tổ chức &amp; Đoàn vụ phối hợp</w:t>
+              <w:t>Mảng Tổ chức &amp; Phát triển Đoàn vụ</w:t>
             </w:r>
           </w:p>
         </w:tc>
@@ -5800,7 +4669,7 @@
           </w:tcPr>
           <w:p>
             <w:r>
-              <w:t>Phiếu thẩm tra hồ sơ kiện toàn; Quyết định công nhận kiện toàn nhân sự</w:t>
+              <w:t>Các Mảng chuyên môn trong Ban</w:t>
             </w:r>
           </w:p>
         </w:tc>
@@ -5808,70 +4677,17 @@
           <w:tcPr>
             <w:tcW w:type="dxa" w:w="1559"/>
           </w:tcPr>
-          <w:p/>
-        </w:tc>
-      </w:tr>
-      <w:tr>
-        <w:tc>
-          <w:tcPr>
-            <w:tcW w:type="dxa" w:w="1559"/>
-          </w:tcPr>
-          <w:p>
-            <w:r>
-              <w:t>18</w:t>
-            </w:r>
-          </w:p>
-        </w:tc>
-        <w:tc>
-          <w:tcPr>
-            <w:tcW w:type="dxa" w:w="1559"/>
-          </w:tcPr>
-          <w:p>
-            <w:r>
-              <w:t>Báo cáo Tổng kết &amp; Thi đua Khen thưởng Năm học 2026 - 2027</w:t>
-            </w:r>
-          </w:p>
-        </w:tc>
-        <w:tc>
-          <w:tcPr>
-            <w:tcW w:type="dxa" w:w="1559"/>
-          </w:tcPr>
-          <w:p>
-            <w:r>
-              <w:t>Tháng 06/2027</w:t>
-            </w:r>
-          </w:p>
-        </w:tc>
-        <w:tc>
-          <w:tcPr>
-            <w:tcW w:type="dxa" w:w="1559"/>
-          </w:tcPr>
-          <w:p>
-            <w:r>
-              <w:t>Mảng Tổ chức &amp; Đoàn vụ chủ trì; Các mảng chuyên môn phối hợp</w:t>
-            </w:r>
-          </w:p>
-        </w:tc>
-        <w:tc>
-          <w:tcPr>
-            <w:tcW w:type="dxa" w:w="1559"/>
-          </w:tcPr>
-          <w:p>
-            <w:r>
-              <w:t>Báo cáo tổng kết năm học; Kỷ yếu hoạt động; Quyết định khen thưởng</w:t>
-            </w:r>
-          </w:p>
-        </w:tc>
-        <w:tc>
-          <w:tcPr>
-            <w:tcW w:type="dxa" w:w="1559"/>
-          </w:tcPr>
-          <w:p/>
+          <w:p>
+            <w:r>
+              <w:t>Báo cáo tổng kết Ban; Kỷ yếu năm học; Quyết định khen thưởng thi đua.</w:t>
+            </w:r>
+          </w:p>
         </w:tc>
       </w:tr>
     </w:tbl>
     <w:p>
       <w:pPr>
+        <w:pStyle w:val="Heading2"/>
         <w:spacing w:before="280" w:after="80"/>
       </w:pPr>
       <w:r>
@@ -5889,7 +4705,7 @@
         <w:spacing w:after="80" w:line="288" w:lineRule="auto"/>
       </w:pPr>
       <w:r>
-        <w:t>Mảng Tổ chức &amp; Phát triển Đoàn vụ (Tổ chức - Đoàn vụ, 20 đồng chí): Đóng vai trò 'xương sống' hành chính của Ban; chủ trì 10/18 nhiệm vụ trọng tâm năm học. Phụ trách trọn gói quy trình phát triển Đoàn (02 đợt kết nạp), Đại hội chi đoàn &amp; thành lập chi đoàn K71, ra mắt Ban Cán sự K71, nghiệp vụ sổ Đoàn (tiếp nhận tháng 12, nhận xét tháng 5-6), thu đoàn phí K71 và công nợ K68-K70, làm thẻ đoàn viên, tổng hợp hồ sơ thi đua khen thưởng và các hội nghị kiện toàn nhân sự cơ sở.</w:t>
+        <w:t>Mảng Tổ chức &amp; Phát triển Đoàn vụ (20 đồng chí: 01 Trưởng • 01 Phó • 18 Thành viên): Đóng vai trò 'xương sống' hành chính của Ban; chủ trì 10/18 nhiệm vụ trọng tâm năm học. Phụ trách trọn gói quy trình phát triển Đoàn (02 đợt kết nạp), Đại hội chi đoàn &amp; thành lập chi đoàn K71, ra mắt Ban Cán sự K71, nghiệp vụ sổ Đoàn (tiếp nhận tháng 12, nhận xét tháng 5-6), thu đoàn phí K71 và công nợ K68-K70, làm thẻ đoàn viên, tổng hợp hồ sơ thi đua khen thưởng và các hội nghị kiện toàn nhân sự cơ sở.</w:t>
       </w:r>
     </w:p>
     <w:p>
@@ -5898,7 +4714,7 @@
         <w:spacing w:after="80" w:line="288" w:lineRule="auto"/>
       </w:pPr>
       <w:r>
-        <w:t>Mảng Phát triển Đảng &amp; Chuyển đổi số (Đảng vụ - Chuyển đổi số, 14 đồng chí): Chủ trì toàn diện hạ tầng số và quy trình Đảng vụ. Đảm nhiệm vận hành phần mềm Quản lý đoàn viên (QLDV) và ứng dụng Thanh niên Việt Nam xuyên suốt cả năm học: giám sát đăng tải tài liệu sinh hoạt chi đoàn số hàng tháng, bảo đảm 100% ĐV đăng ký rèn luyện đoàn viên và được cấp thẻ/sổ điện tử, đánh giá xếp loại số; chủ trì thẩm tra, quản lý tiến độ hồ sơ phát triển Đảng, liên kết dữ liệu với Văn phòng Đảng ủy.</w:t>
+        <w:t>Mảng Phát triển Đảng &amp; Chuyển đổi số (14 đồng chí: 01 Trưởng • 01 Phó • 12 Thành viên): Chủ trì toàn diện hạ tầng số và quy trình Đảng vụ. Đảm nhiệm vận hành phần mềm Quản lý đoàn viên (QLDV) và ứng dụng Thanh niên Việt Nam xuyên suốt cả năm học: giám sát đăng tải tài liệu sinh hoạt chi đoàn số hàng tháng, bảo đảm 100% ĐV đăng ký rèn luyện đoàn viên và được cấp thẻ/sổ điện tử, đánh giá xếp loại số; chủ trì thẩm tra, quản lý tiến độ hồ sơ phát triển Đảng, liên kết dữ liệu với Văn phòng Đảng ủy.</w:t>
       </w:r>
     </w:p>
     <w:p>
@@ -5907,7 +4723,7 @@
         <w:spacing w:after="80" w:line="288" w:lineRule="auto"/>
       </w:pPr>
       <w:r>
-        <w:t>Mảng Giám sát Kiểm tra &amp; Điểm rèn luyện (Kiểm tra - Điểm rèn luyện, 20 đồng chí): Chủ trì nghiệp vụ có tần suất tương tác lớn nhất của Ban. Thẩm định đề án, kiểm duyệt tính chất và cấp mã hoạt động ĐRL xuyên suốt cả năm học; trực ban giải quyết thắc mắc, khiếu nại minh chứng cho sinh viên; chủ trì Đoàn kiểm tra công tác Đoàn và phong trào thanh niên cuối năm đối với 12 cơ sở (tháng 6/2027); thẩm định minh chứng giấy tờ và tính hợp lệ của điểm thi đua.</w:t>
+        <w:t>Mảng Giám sát Kiểm tra &amp; Điểm rèn luyện (20 đồng chí: 01 Trưởng • 02 Phó • 17 Thành viên): Chủ trì nghiệp vụ có tần suất tương tác lớn nhất của Ban. Thẩm định đề án, kiểm duyệt tính chất và cấp mã hoạt động ĐRL xuyên suốt cả năm học; trực ban giải quyết thắc mắc, khiếu nại minh chứng cho sinh viên; chủ trì Đoàn kiểm tra công tác Đoàn và phong trào thanh niên cuối năm đối với 12 cơ sở (tháng 6/2027); thẩm định minh chứng giấy tờ và tính hợp lệ của điểm thi đua.</w:t>
       </w:r>
     </w:p>
     <w:p>
@@ -5916,11 +4732,12 @@
         <w:spacing w:after="80" w:line="288" w:lineRule="auto"/>
       </w:pPr>
       <w:r>
-        <w:t>Mảng Truyền thông - Sự kiện &amp; Phát triển Nội bộ (Truyền thông - Sự kiện và Phát triển nội bộ, 10 đồng chí): Đồng hành hỗ trợ toàn diện các hoạt động của Ban và Đoàn Đại học: Xây dựng chiến dịch truyền thông tuyển thành viên (tháng 9/2026); tổ chức Lễ ra mắt Ban Cán sự K71; truyền thông 02 đợt kết nạp Đoàn viên mới; chủ trì công tác hậu cần, tài liệu, địa điểm cho Hội nghị tập huấn cán bộ Đoàn (tháng 4/2027); sản xuất ấn phẩm tổng kết năm học, kỷ yếu Ban và chăm lo đời sống nội bộ.</w:t>
-      </w:r>
-    </w:p>
-    <w:p>
-      <w:pPr>
+        <w:t>Mảng Truyền thông - Sự kiện &amp; Phát triển Nội bộ (10 đồng chí: 01 Trưởng • 01 Phó • 08 Thành viên): Đồng hành hỗ trợ toàn diện các hoạt động của Ban và Đoàn Đại học: Xây dựng chiến dịch truyền thông tuyển thành viên (tháng 9/2026); tổ chức Lễ ra mắt Ban Cán sự K71; truyền thông 02 đợt kết nạp Đoàn viên mới; chủ trì công tác hậu cần, tài liệu, địa điểm cho Hội nghị tập huấn cán bộ Đoàn (tháng 4/2027); sản xuất ấn phẩm tổng kết năm học, kỷ yếu Ban và chăm lo đời sống nội bộ.</w:t>
+      </w:r>
+    </w:p>
+    <w:p>
+      <w:pPr>
+        <w:pStyle w:val="Heading2"/>
         <w:spacing w:before="280" w:after="80"/>
       </w:pPr>
       <w:r>

</xml_diff>